<commit_message>
added a sensitivity analysis and more comments from reviewers
</commit_message>
<xml_diff>
--- a/Docs/00_CanJFS/R1_18062026/00_R1_CanJFS_MainDocument.docx
+++ b/Docs/00_CanJFS/R1_18062026/00_R1_CanJFS_MainDocument.docx
@@ -1130,14 +1130,7 @@
         <w:rPr>
           <w:rFonts w:ascii="Garamond" w:hAnsi="Garamond" w:cs="Times New Roman"/>
         </w:rPr>
-        <w:t xml:space="preserve">. Populations of adult salmon migrating upstream within large river basins are often comprised of multiple distinct sub-stocks (or populations) which vary in their relative abundance and life-history, but which co-migrate within overlapping temporal windows. Downstream fisheries that harvest migrating individuals therefore </w:t>
-      </w:r>
-      <w:r>
-        <w:rPr>
-          <w:rFonts w:ascii="Garamond" w:hAnsi="Garamond" w:cs="Times New Roman"/>
-        </w:rPr>
-        <w:lastRenderedPageBreak/>
-        <w:t xml:space="preserve">risk overexploitation of vulnerable populations which commingle with more robust ones </w:t>
+        <w:t xml:space="preserve">. Populations of adult salmon migrating upstream within large river basins are often comprised of multiple distinct sub-stocks (or populations) which vary in their relative abundance and life-history, but which co-migrate within overlapping temporal windows. Downstream fisheries that harvest migrating individuals therefore risk overexploitation of vulnerable populations which commingle with more robust ones </w:t>
       </w:r>
       <w:r>
         <w:rPr>
@@ -1205,6 +1198,7 @@
           <w:rPr>
             <w:rFonts w:ascii="Garamond" w:hAnsi="Garamond" w:cs="Times New Roman"/>
           </w:rPr>
+          <w:lastRenderedPageBreak/>
           <w:t>extended fishing pressure</w:t>
         </w:r>
       </w:ins>
@@ -1647,101 +1641,101 @@
         <w:rPr>
           <w:rFonts w:ascii="Garamond" w:hAnsi="Garamond" w:cs="Times New Roman"/>
         </w:rPr>
-        <w:t xml:space="preserve">However, several species of Pacific salmon, including </w:t>
+        <w:t xml:space="preserve">However, several species of Pacific salmon, including Chinook salmon, have declined precipitously in recent years throughout western Alaska watersheds </w:t>
+      </w:r>
+      <w:r>
+        <w:rPr>
+          <w:rFonts w:ascii="Garamond" w:hAnsi="Garamond" w:cs="Times New Roman"/>
+        </w:rPr>
+        <w:fldChar w:fldCharType="begin"/>
+      </w:r>
+      <w:r>
+        <w:rPr>
+          <w:rFonts w:ascii="Garamond" w:hAnsi="Garamond" w:cs="Times New Roman"/>
+        </w:rPr>
+        <w:instrText xml:space="preserve"> ADDIN ZOTERO_ITEM CSL_CITATION {"citationID":"iRZI1YuK","properties":{"formattedCitation":"(KRITFC, 2024; Lamborn et al., 2025a; Ohlberger et al., 2018)","plainCitation":"(KRITFC, 2024; Lamborn et al., 2025a; Ohlberger et al., 2018)","noteIndex":0},"citationItems":[{"id":6026,"uris":["http://zotero.org/users/8421274/items/DS4UXWQI"],"itemData":{"id":6026,"type":"report","title":"Kuskokwim River Salmon Situation Report","URL":"https://static1.squarespace.com/static/5afdc3d5e74940913f78773d/t/66e4bb2dfcc5d24880434ff7/1726266166559/2023+Kusko+Situation+Report_4.19.24+final.pdf","author":[{"family":"KRITFC","given":""}],"accessed":{"date-parts":[["2025",12,31]]},"issued":{"date-parts":[["2024"]]}}},{"id":5644,"uris":["http://zotero.org/users/8421274/items/68HTP6NW"],"itemData":{"id":5644,"type":"article-journal","abstract":"Across Alaska, there have been synchronous declines in the abundance, mean age, and size of Chinook salmon (Oncorhynchus tshawytscha, Salmonidae), a species with immense social and ecological importance. The decline of Chinook salmon, and regulations addressing declines, have drastically impacted people who rely on Alaska's fisheries. Despite their importance, the drivers causing Chinook salmon declines are still not well understood. Therefore, to improve our understanding of the likely drivers of these large-scale synchronous declines, we synthesised the peer-reviewed Chinook salmon literature published between 2010 and 2024 using a weight-of-evidence approach. We identified 94 variables used to explain the trends in abundance and demographics of Chinook salmon. Each variable's association with trends in Chinook salmon was individually assessed and integrated using a standardised method. Results of this synthesis suggest the drivers for large-scale synchronous declines have occurred in the North Pacific Ocean. Specifically, we found marine predation, size selective harvest, and pink salmon (Oncorhynchus gorbuscha) abundance are the factors most strongly associated with reduced size and age. Results also suggest ocean productivity–specifically winter sea surface temperature and the North Pacific Gyre Oscillation–are the most frequently identified predictors of regional Chinook salmon abundance. In addition to addressing freshwater factors like adult heat stress and juvenile predation, we suggest research, policy, and management focus on how to better understand and address the interactions between ocean productivity, marine predation, size selective harvest, and pink salmon abundance to improve the condition of Chinook salmon, and the people and ecosystems benefiting from them.","container-title":"Fish and Fisheries","DOI":"10.1111/faf.12895","ISSN":"1467-2979","issue":"4","language":"en","license":"© 2025 The Author(s). Fish and Fisheries published by John Wiley &amp; Sons Ltd.","note":"_eprint: https://onlinelibrary.wiley.com/doi/pdf/10.1111/faf.12895","page":"520-532","source":"Wiley Online Library","title":"A Synthesis of Factors Related to Trends in Abundance and Demography of Alaska Chinook Salmon (Oncorhynchus tshawytscha, Salmonidae): Implications for Research, Management, and Policy","title-short":"A Synthesis of Factors Related to Trends in Abundance and Demography of Alaska Chinook Salmon (Oncorhynchus tshawytscha, Salmonidae)","volume":"26","author":[{"family":"Lamborn","given":"Chase C."},{"family":"Ohlberger","given":"Jan"},{"family":"Walsworth","given":"Timothy E."},{"family":"Westley","given":"Peter A. H."},{"family":"Cunningham","given":"Curry J."},{"family":"Wynsma","given":"Sam"},{"family":"Smith","given":"Jordan W."}],"issued":{"date-parts":[["2025"]]}}},{"id":4421,"uris":["http://zotero.org/users/8421274/items/PUA9GF7A"],"itemData":{"id":4421,"type":"article-journal","abstract":"The demographic structure of populations is affected by life history strategies and how these interact with natural and anthropogenic factors such as exploitation, climate change, and biotic interactions. Previous work suggests that the mean size and age of some North American populations of Chinook salmon (Oncorhynchus tshawytscha, Salmonidae) are declining. These trends are of concern because Chinook salmon are highly valued commercially for their exceptional size and because the loss of the largest and oldest individuals may lead to reduced population productivity. Using long-term data from wild and hatchery populations, we quantified changes in the demographic structure of Chinook salmon populations over the past four decades across the Northeast Pacific Ocean, from California through western Alaska. Our results show that wild and hatchery fish are becoming smaller and younger throughout most of the Pacific coast. Proportions of older age classes have decreased over time in most regions. Simultaneously, the length-at-age of older fish has declined while the length-at-age of younger fish has typically increased. However, negative size trends of older ages were weak or non-existent at the southern end of the range. While it remains to be explored whether these trends are caused by changes in climate, fishing practices or species interactions such as predation, our qualitative review of the potential causes of demographic change suggests that selective removal of large fish has likely contributed to the apparent widespread declines in average body sizes.","container-title":"Fish and Fisheries","DOI":"10.1111/faf.12272","ISSN":"1467-2979","issue":"3","language":"en","license":"© 2018 The Authors. Fish and Fisheries published by John Wiley &amp; Sons Ltd.","note":"_eprint: https://onlinelibrary.wiley.com/doi/pdf/10.1111/faf.12272","page":"533-546","source":"Wiley Online Library","title":"Demographic changes in Chinook salmon across the Northeast Pacific Ocean","volume":"19","author":[{"family":"Ohlberger","given":"Jan"},{"family":"Ward","given":"Eric J"},{"family":"Schindler","given":"Daniel E"},{"family":"Lewis","given":"Bert"}],"issued":{"date-parts":[["2018"]]}}}],"schema":"https://github.com/citation-style-language/schema/raw/master/csl-citation.json"} </w:instrText>
+      </w:r>
+      <w:r>
+        <w:rPr>
+          <w:rFonts w:ascii="Garamond" w:hAnsi="Garamond" w:cs="Times New Roman"/>
+        </w:rPr>
+        <w:fldChar w:fldCharType="separate"/>
+      </w:r>
+      <w:r>
+        <w:rPr>
+          <w:rFonts w:ascii="Garamond" w:hAnsi="Garamond" w:cs="Times New Roman"/>
+          <w:noProof/>
+        </w:rPr>
+        <w:t>(KRITFC, 2024; Lamborn et al., 2025a; Ohlberger et al., 2018)</w:t>
+      </w:r>
+      <w:r>
+        <w:rPr>
+          <w:rFonts w:ascii="Garamond" w:hAnsi="Garamond" w:cs="Times New Roman"/>
+        </w:rPr>
+        <w:fldChar w:fldCharType="end"/>
+      </w:r>
+      <w:r>
+        <w:rPr>
+          <w:rFonts w:ascii="Garamond" w:hAnsi="Garamond" w:cs="Times New Roman"/>
+        </w:rPr>
+        <w:t xml:space="preserve">, triggering a conservation crisis and leading to heavy restrictions on subsistence harvest </w:t>
+      </w:r>
+      <w:r>
+        <w:rPr>
+          <w:rFonts w:ascii="Garamond" w:hAnsi="Garamond" w:cs="Times New Roman"/>
+        </w:rPr>
+        <w:fldChar w:fldCharType="begin"/>
+      </w:r>
+      <w:r>
+        <w:rPr>
+          <w:rFonts w:ascii="Garamond" w:hAnsi="Garamond" w:cs="Times New Roman"/>
+        </w:rPr>
+        <w:instrText xml:space="preserve"> ADDIN ZOTERO_ITEM CSL_CITATION {"citationID":"0TbEctqr","properties":{"formattedCitation":"(Brown &amp; Godduhn, 2015; Lamborn et al., 2025b; Ohlberger et al., 2018)","plainCitation":"(Brown &amp; Godduhn, 2015; Lamborn et al., 2025b; Ohlberger et al., 2018)","noteIndex":0},"citationItems":[{"id":4428,"uris":["http://zotero.org/users/8421274/items/2WA8NCRM"],"itemData":{"id":4428,"type":"article-journal","language":"en","source":"Zotero","title":"Socioeconomic effects of declining salmon runs on the Yukon River","author":[{"family":"Brown","given":"Caroline L"},{"family":"Godduhn","given":"Anna"}],"issued":{"date-parts":[["2015"]]}}},{"id":5379,"uris":["http://zotero.org/users/8421274/items/6TRPLVW4"],"itemData":{"id":5379,"type":"article-journal","abstract":"Across Alaska, there have been synchronous declines in the abundance, mean age, and size of Chinook salmon (Oncorhynchus tshawytscha, Salmonidae), a species with immense social and ecological importance. The decline of Chinook salmon, and regulations addressing declines, have drastically impacted people who rely on Alaska's fisheries. Despite their importance, the drivers causing Chinook salmon declines are still not well understood. Therefore, to improve our understanding of the likely drivers of these large-scale synchronous declines, we synthesised the peer-reviewed Chinook salmon literature published between 2010 and 2024 using a weight-of-evidence approach. We identified 94 variables used to explain the trends in abundance and demographics of Chinook salmon. Each variable's association with trends in Chinook salmon was individually assessed and integrated using a standardised method. Results of this synthesis suggest the drivers for large-scale synchronous declines have occurred in the North Pacific Ocean. Specifically, we found marine predation, size selective harvest, and pink salmon (Oncorhynchus gorbuscha) abundance are the factors most strongly associated with reduced size and age. Results also suggest ocean productivity–specifically winter sea surface temperature and the North Pacific Gyre Oscillation–are the most frequently identified predictors of regional Chinook salmon abundance. In addition to addressing freshwater factors like adult heat stress and juvenile predation, we suggest research, policy, and management focus on how to better understand and address the interactions between ocean productivity, marine predation, size selective harvest, and pink salmon abundance to improve the condition of Chinook salmon, and the people and ecosystems benefiting from them.","container-title":"Fish and Fisheries","DOI":"10.1111/faf.12895","ISSN":"1467-2979","issue":"n/a","language":"en","license":"© 2025 The Author(s). Fish and Fisheries published by John Wiley &amp; Sons Ltd.","note":"_eprint: https://onlinelibrary.wiley.com/doi/pdf/10.1111/faf.12895","source":"Wiley Online Library","title":"A Synthesis of Factors Related to Trends in Abundance and Demography of Alaska Chinook Salmon (Oncorhynchus tshawytscha, Salmonidae): Implications for Research, Management, and Policy","title-short":"A Synthesis of Factors Related to Trends in Abundance and Demography of Alaska Chinook Salmon (Oncorhynchus tshawytscha, Salmonidae)","URL":"https://onlinelibrary.wiley.com/doi/abs/10.1111/faf.12895","volume":"n/a","author":[{"family":"Lamborn","given":"Chase C."},{"family":"Ohlberger","given":"Jan"},{"family":"Walsworth","given":"Timothy E."},{"family":"Westley","given":"Peter A. H."},{"family":"Cunningham","given":"Curry J."},{"family":"Wynsma","given":"Sam"},{"family":"Smith","given":"Jordan W."}],"accessed":{"date-parts":[["2025",6,4]]},"issued":{"date-parts":[["2025"]]}}},{"id":4421,"uris":["http://zotero.org/users/8421274/items/PUA9GF7A"],"itemData":{"id":4421,"type":"article-journal","abstract":"The demographic structure of populations is affected by life history strategies and how these interact with natural and anthropogenic factors such as exploitation, climate change, and biotic interactions. Previous work suggests that the mean size and age of some North American populations of Chinook salmon (Oncorhynchus tshawytscha, Salmonidae) are declining. These trends are of concern because Chinook salmon are highly valued commercially for their exceptional size and because the loss of the largest and oldest individuals may lead to reduced population productivity. Using long-term data from wild and hatchery populations, we quantified changes in the demographic structure of Chinook salmon populations over the past four decades across the Northeast Pacific Ocean, from California through western Alaska. Our results show that wild and hatchery fish are becoming smaller and younger throughout most of the Pacific coast. Proportions of older age classes have decreased over time in most regions. Simultaneously, the length-at-age of older fish has declined while the length-at-age of younger fish has typically increased. However, negative size trends of older ages were weak or non-existent at the southern end of the range. While it remains to be explored whether these trends are caused by changes in climate, fishing practices or species interactions such as predation, our qualitative review of the potential causes of demographic change suggests that selective removal of large fish has likely contributed to the apparent widespread declines in average body sizes.","container-title":"Fish and Fisheries","DOI":"10.1111/faf.12272","ISSN":"1467-2979","issue":"3","language":"en","license":"© 2018 The Authors. Fish and Fisheries published by John Wiley &amp; Sons Ltd.","note":"_eprint: https://onlinelibrary.wiley.com/doi/pdf/10.1111/faf.12272","page":"533-546","source":"Wiley Online Library","title":"Demographic changes in Chinook salmon across the Northeast Pacific Ocean","volume":"19","author":[{"family":"Ohlberger","given":"Jan"},{"family":"Ward","given":"Eric J"},{"family":"Schindler","given":"Daniel E"},{"family":"Lewis","given":"Bert"}],"issued":{"date-parts":[["2018"]]}}}],"schema":"https://github.com/citation-style-language/schema/raw/master/csl-citation.json"} </w:instrText>
+      </w:r>
+      <w:r>
+        <w:rPr>
+          <w:rFonts w:ascii="Garamond" w:hAnsi="Garamond" w:cs="Times New Roman"/>
+        </w:rPr>
+        <w:fldChar w:fldCharType="separate"/>
+      </w:r>
+      <w:r>
+        <w:rPr>
+          <w:rFonts w:ascii="Garamond" w:hAnsi="Garamond" w:cs="Times New Roman"/>
+          <w:noProof/>
+        </w:rPr>
+        <w:t>(Brown &amp; Godduhn, 2015; Lamborn et al., 2025b; Ohlberger et al., 2018)</w:t>
+      </w:r>
+      <w:r>
+        <w:rPr>
+          <w:rFonts w:ascii="Garamond" w:hAnsi="Garamond" w:cs="Times New Roman"/>
+        </w:rPr>
+        <w:fldChar w:fldCharType="end"/>
+      </w:r>
+      <w:r>
+        <w:rPr>
+          <w:rFonts w:ascii="Garamond" w:hAnsi="Garamond" w:cs="Times New Roman"/>
+        </w:rPr>
+        <w:t>. In the Kuskokwim River basin, a large (127,000 km</w:t>
+      </w:r>
+      <w:r>
+        <w:rPr>
+          <w:rFonts w:ascii="Garamond" w:hAnsi="Garamond" w:cs="Times New Roman"/>
+          <w:vertAlign w:val="superscript"/>
+        </w:rPr>
+        <w:t>2</w:t>
+      </w:r>
+      <w:r>
+        <w:rPr>
+          <w:rFonts w:ascii="Garamond" w:hAnsi="Garamond" w:cs="Times New Roman"/>
+        </w:rPr>
+        <w:t xml:space="preserve">) free-flowing watershed in western Alaska, Chinook salmon populations support subsistence fishing opportunities </w:t>
       </w:r>
       <w:r>
         <w:rPr>
           <w:rFonts w:ascii="Garamond" w:hAnsi="Garamond" w:cs="Times New Roman"/>
         </w:rPr>
         <w:lastRenderedPageBreak/>
-        <w:t xml:space="preserve">Chinook salmon, have declined precipitously in recent years throughout western Alaska watersheds </w:t>
-      </w:r>
-      <w:r>
-        <w:rPr>
-          <w:rFonts w:ascii="Garamond" w:hAnsi="Garamond" w:cs="Times New Roman"/>
-        </w:rPr>
-        <w:fldChar w:fldCharType="begin"/>
-      </w:r>
-      <w:r>
-        <w:rPr>
-          <w:rFonts w:ascii="Garamond" w:hAnsi="Garamond" w:cs="Times New Roman"/>
-        </w:rPr>
-        <w:instrText xml:space="preserve"> ADDIN ZOTERO_ITEM CSL_CITATION {"citationID":"iRZI1YuK","properties":{"formattedCitation":"(KRITFC, 2024; Lamborn et al., 2025a; Ohlberger et al., 2018)","plainCitation":"(KRITFC, 2024; Lamborn et al., 2025a; Ohlberger et al., 2018)","noteIndex":0},"citationItems":[{"id":6026,"uris":["http://zotero.org/users/8421274/items/DS4UXWQI"],"itemData":{"id":6026,"type":"report","title":"Kuskokwim River Salmon Situation Report","URL":"https://static1.squarespace.com/static/5afdc3d5e74940913f78773d/t/66e4bb2dfcc5d24880434ff7/1726266166559/2023+Kusko+Situation+Report_4.19.24+final.pdf","author":[{"family":"KRITFC","given":""}],"accessed":{"date-parts":[["2025",12,31]]},"issued":{"date-parts":[["2024"]]}}},{"id":5644,"uris":["http://zotero.org/users/8421274/items/68HTP6NW"],"itemData":{"id":5644,"type":"article-journal","abstract":"Across Alaska, there have been synchronous declines in the abundance, mean age, and size of Chinook salmon (Oncorhynchus tshawytscha, Salmonidae), a species with immense social and ecological importance. The decline of Chinook salmon, and regulations addressing declines, have drastically impacted people who rely on Alaska's fisheries. Despite their importance, the drivers causing Chinook salmon declines are still not well understood. Therefore, to improve our understanding of the likely drivers of these large-scale synchronous declines, we synthesised the peer-reviewed Chinook salmon literature published between 2010 and 2024 using a weight-of-evidence approach. We identified 94 variables used to explain the trends in abundance and demographics of Chinook salmon. Each variable's association with trends in Chinook salmon was individually assessed and integrated using a standardised method. Results of this synthesis suggest the drivers for large-scale synchronous declines have occurred in the North Pacific Ocean. Specifically, we found marine predation, size selective harvest, and pink salmon (Oncorhynchus gorbuscha) abundance are the factors most strongly associated with reduced size and age. Results also suggest ocean productivity–specifically winter sea surface temperature and the North Pacific Gyre Oscillation–are the most frequently identified predictors of regional Chinook salmon abundance. In addition to addressing freshwater factors like adult heat stress and juvenile predation, we suggest research, policy, and management focus on how to better understand and address the interactions between ocean productivity, marine predation, size selective harvest, and pink salmon abundance to improve the condition of Chinook salmon, and the people and ecosystems benefiting from them.","container-title":"Fish and Fisheries","DOI":"10.1111/faf.12895","ISSN":"1467-2979","issue":"4","language":"en","license":"© 2025 The Author(s). Fish and Fisheries published by John Wiley &amp; Sons Ltd.","note":"_eprint: https://onlinelibrary.wiley.com/doi/pdf/10.1111/faf.12895","page":"520-532","source":"Wiley Online Library","title":"A Synthesis of Factors Related to Trends in Abundance and Demography of Alaska Chinook Salmon (Oncorhynchus tshawytscha, Salmonidae): Implications for Research, Management, and Policy","title-short":"A Synthesis of Factors Related to Trends in Abundance and Demography of Alaska Chinook Salmon (Oncorhynchus tshawytscha, Salmonidae)","volume":"26","author":[{"family":"Lamborn","given":"Chase C."},{"family":"Ohlberger","given":"Jan"},{"family":"Walsworth","given":"Timothy E."},{"family":"Westley","given":"Peter A. H."},{"family":"Cunningham","given":"Curry J."},{"family":"Wynsma","given":"Sam"},{"family":"Smith","given":"Jordan W."}],"issued":{"date-parts":[["2025"]]}}},{"id":4421,"uris":["http://zotero.org/users/8421274/items/PUA9GF7A"],"itemData":{"id":4421,"type":"article-journal","abstract":"The demographic structure of populations is affected by life history strategies and how these interact with natural and anthropogenic factors such as exploitation, climate change, and biotic interactions. Previous work suggests that the mean size and age of some North American populations of Chinook salmon (Oncorhynchus tshawytscha, Salmonidae) are declining. These trends are of concern because Chinook salmon are highly valued commercially for their exceptional size and because the loss of the largest and oldest individuals may lead to reduced population productivity. Using long-term data from wild and hatchery populations, we quantified changes in the demographic structure of Chinook salmon populations over the past four decades across the Northeast Pacific Ocean, from California through western Alaska. Our results show that wild and hatchery fish are becoming smaller and younger throughout most of the Pacific coast. Proportions of older age classes have decreased over time in most regions. Simultaneously, the length-at-age of older fish has declined while the length-at-age of younger fish has typically increased. However, negative size trends of older ages were weak or non-existent at the southern end of the range. While it remains to be explored whether these trends are caused by changes in climate, fishing practices or species interactions such as predation, our qualitative review of the potential causes of demographic change suggests that selective removal of large fish has likely contributed to the apparent widespread declines in average body sizes.","container-title":"Fish and Fisheries","DOI":"10.1111/faf.12272","ISSN":"1467-2979","issue":"3","language":"en","license":"© 2018 The Authors. Fish and Fisheries published by John Wiley &amp; Sons Ltd.","note":"_eprint: https://onlinelibrary.wiley.com/doi/pdf/10.1111/faf.12272","page":"533-546","source":"Wiley Online Library","title":"Demographic changes in Chinook salmon across the Northeast Pacific Ocean","volume":"19","author":[{"family":"Ohlberger","given":"Jan"},{"family":"Ward","given":"Eric J"},{"family":"Schindler","given":"Daniel E"},{"family":"Lewis","given":"Bert"}],"issued":{"date-parts":[["2018"]]}}}],"schema":"https://github.com/citation-style-language/schema/raw/master/csl-citation.json"} </w:instrText>
-      </w:r>
-      <w:r>
-        <w:rPr>
-          <w:rFonts w:ascii="Garamond" w:hAnsi="Garamond" w:cs="Times New Roman"/>
-        </w:rPr>
-        <w:fldChar w:fldCharType="separate"/>
-      </w:r>
-      <w:r>
-        <w:rPr>
-          <w:rFonts w:ascii="Garamond" w:hAnsi="Garamond" w:cs="Times New Roman"/>
-          <w:noProof/>
-        </w:rPr>
-        <w:t>(KRITFC, 2024; Lamborn et al., 2025a; Ohlberger et al., 2018)</w:t>
-      </w:r>
-      <w:r>
-        <w:rPr>
-          <w:rFonts w:ascii="Garamond" w:hAnsi="Garamond" w:cs="Times New Roman"/>
-        </w:rPr>
-        <w:fldChar w:fldCharType="end"/>
-      </w:r>
-      <w:r>
-        <w:rPr>
-          <w:rFonts w:ascii="Garamond" w:hAnsi="Garamond" w:cs="Times New Roman"/>
-        </w:rPr>
-        <w:t xml:space="preserve">, triggering a conservation crisis and leading to heavy restrictions on subsistence harvest </w:t>
-      </w:r>
-      <w:r>
-        <w:rPr>
-          <w:rFonts w:ascii="Garamond" w:hAnsi="Garamond" w:cs="Times New Roman"/>
-        </w:rPr>
-        <w:fldChar w:fldCharType="begin"/>
-      </w:r>
-      <w:r>
-        <w:rPr>
-          <w:rFonts w:ascii="Garamond" w:hAnsi="Garamond" w:cs="Times New Roman"/>
-        </w:rPr>
-        <w:instrText xml:space="preserve"> ADDIN ZOTERO_ITEM CSL_CITATION {"citationID":"0TbEctqr","properties":{"formattedCitation":"(Brown &amp; Godduhn, 2015; Lamborn et al., 2025b; Ohlberger et al., 2018)","plainCitation":"(Brown &amp; Godduhn, 2015; Lamborn et al., 2025b; Ohlberger et al., 2018)","noteIndex":0},"citationItems":[{"id":4428,"uris":["http://zotero.org/users/8421274/items/2WA8NCRM"],"itemData":{"id":4428,"type":"article-journal","language":"en","source":"Zotero","title":"Socioeconomic effects of declining salmon runs on the Yukon River","author":[{"family":"Brown","given":"Caroline L"},{"family":"Godduhn","given":"Anna"}],"issued":{"date-parts":[["2015"]]}}},{"id":5379,"uris":["http://zotero.org/users/8421274/items/6TRPLVW4"],"itemData":{"id":5379,"type":"article-journal","abstract":"Across Alaska, there have been synchronous declines in the abundance, mean age, and size of Chinook salmon (Oncorhynchus tshawytscha, Salmonidae), a species with immense social and ecological importance. The decline of Chinook salmon, and regulations addressing declines, have drastically impacted people who rely on Alaska's fisheries. Despite their importance, the drivers causing Chinook salmon declines are still not well understood. Therefore, to improve our understanding of the likely drivers of these large-scale synchronous declines, we synthesised the peer-reviewed Chinook salmon literature published between 2010 and 2024 using a weight-of-evidence approach. We identified 94 variables used to explain the trends in abundance and demographics of Chinook salmon. Each variable's association with trends in Chinook salmon was individually assessed and integrated using a standardised method. Results of this synthesis suggest the drivers for large-scale synchronous declines have occurred in the North Pacific Ocean. Specifically, we found marine predation, size selective harvest, and pink salmon (Oncorhynchus gorbuscha) abundance are the factors most strongly associated with reduced size and age. Results also suggest ocean productivity–specifically winter sea surface temperature and the North Pacific Gyre Oscillation–are the most frequently identified predictors of regional Chinook salmon abundance. In addition to addressing freshwater factors like adult heat stress and juvenile predation, we suggest research, policy, and management focus on how to better understand and address the interactions between ocean productivity, marine predation, size selective harvest, and pink salmon abundance to improve the condition of Chinook salmon, and the people and ecosystems benefiting from them.","container-title":"Fish and Fisheries","DOI":"10.1111/faf.12895","ISSN":"1467-2979","issue":"n/a","language":"en","license":"© 2025 The Author(s). Fish and Fisheries published by John Wiley &amp; Sons Ltd.","note":"_eprint: https://onlinelibrary.wiley.com/doi/pdf/10.1111/faf.12895","source":"Wiley Online Library","title":"A Synthesis of Factors Related to Trends in Abundance and Demography of Alaska Chinook Salmon (Oncorhynchus tshawytscha, Salmonidae): Implications for Research, Management, and Policy","title-short":"A Synthesis of Factors Related to Trends in Abundance and Demography of Alaska Chinook Salmon (Oncorhynchus tshawytscha, Salmonidae)","URL":"https://onlinelibrary.wiley.com/doi/abs/10.1111/faf.12895","volume":"n/a","author":[{"family":"Lamborn","given":"Chase C."},{"family":"Ohlberger","given":"Jan"},{"family":"Walsworth","given":"Timothy E."},{"family":"Westley","given":"Peter A. H."},{"family":"Cunningham","given":"Curry J."},{"family":"Wynsma","given":"Sam"},{"family":"Smith","given":"Jordan W."}],"accessed":{"date-parts":[["2025",6,4]]},"issued":{"date-parts":[["2025"]]}}},{"id":4421,"uris":["http://zotero.org/users/8421274/items/PUA9GF7A"],"itemData":{"id":4421,"type":"article-journal","abstract":"The demographic structure of populations is affected by life history strategies and how these interact with natural and anthropogenic factors such as exploitation, climate change, and biotic interactions. Previous work suggests that the mean size and age of some North American populations of Chinook salmon (Oncorhynchus tshawytscha, Salmonidae) are declining. These trends are of concern because Chinook salmon are highly valued commercially for their exceptional size and because the loss of the largest and oldest individuals may lead to reduced population productivity. Using long-term data from wild and hatchery populations, we quantified changes in the demographic structure of Chinook salmon populations over the past four decades across the Northeast Pacific Ocean, from California through western Alaska. Our results show that wild and hatchery fish are becoming smaller and younger throughout most of the Pacific coast. Proportions of older age classes have decreased over time in most regions. Simultaneously, the length-at-age of older fish has declined while the length-at-age of younger fish has typically increased. However, negative size trends of older ages were weak or non-existent at the southern end of the range. While it remains to be explored whether these trends are caused by changes in climate, fishing practices or species interactions such as predation, our qualitative review of the potential causes of demographic change suggests that selective removal of large fish has likely contributed to the apparent widespread declines in average body sizes.","container-title":"Fish and Fisheries","DOI":"10.1111/faf.12272","ISSN":"1467-2979","issue":"3","language":"en","license":"© 2018 The Authors. Fish and Fisheries published by John Wiley &amp; Sons Ltd.","note":"_eprint: https://onlinelibrary.wiley.com/doi/pdf/10.1111/faf.12272","page":"533-546","source":"Wiley Online Library","title":"Demographic changes in Chinook salmon across the Northeast Pacific Ocean","volume":"19","author":[{"family":"Ohlberger","given":"Jan"},{"family":"Ward","given":"Eric J"},{"family":"Schindler","given":"Daniel E"},{"family":"Lewis","given":"Bert"}],"issued":{"date-parts":[["2018"]]}}}],"schema":"https://github.com/citation-style-language/schema/raw/master/csl-citation.json"} </w:instrText>
-      </w:r>
-      <w:r>
-        <w:rPr>
-          <w:rFonts w:ascii="Garamond" w:hAnsi="Garamond" w:cs="Times New Roman"/>
-        </w:rPr>
-        <w:fldChar w:fldCharType="separate"/>
-      </w:r>
-      <w:r>
-        <w:rPr>
-          <w:rFonts w:ascii="Garamond" w:hAnsi="Garamond" w:cs="Times New Roman"/>
-          <w:noProof/>
-        </w:rPr>
-        <w:t>(Brown &amp; Godduhn, 2015; Lamborn et al., 2025b; Ohlberger et al., 2018)</w:t>
-      </w:r>
-      <w:r>
-        <w:rPr>
-          <w:rFonts w:ascii="Garamond" w:hAnsi="Garamond" w:cs="Times New Roman"/>
-        </w:rPr>
-        <w:fldChar w:fldCharType="end"/>
-      </w:r>
-      <w:r>
-        <w:rPr>
-          <w:rFonts w:ascii="Garamond" w:hAnsi="Garamond" w:cs="Times New Roman"/>
-        </w:rPr>
-        <w:t>. In the Kuskokwim River basin, a large (127,000 km</w:t>
-      </w:r>
-      <w:r>
-        <w:rPr>
-          <w:rFonts w:ascii="Garamond" w:hAnsi="Garamond" w:cs="Times New Roman"/>
-          <w:vertAlign w:val="superscript"/>
-        </w:rPr>
-        <w:t>2</w:t>
-      </w:r>
-      <w:r>
-        <w:rPr>
-          <w:rFonts w:ascii="Garamond" w:hAnsi="Garamond" w:cs="Times New Roman"/>
-        </w:rPr>
-        <w:t xml:space="preserve">) free-flowing watershed in western Alaska, Chinook salmon populations support subsistence fishing opportunities for dozens of rural communities, comprised by a majority of Alaska Natives </w:t>
+        <w:t xml:space="preserve">for dozens of rural communities, comprised by a majority of Alaska Natives </w:t>
       </w:r>
       <w:r>
         <w:rPr>
@@ -2110,14 +2104,7 @@
           <w:rPr>
             <w:rFonts w:ascii="Garamond" w:hAnsi="Garamond" w:cs="Times New Roman"/>
           </w:rPr>
-          <w:t xml:space="preserve">By protecting upriver stocks, managers aim to support basin-wide </w:t>
-        </w:r>
-        <w:r>
-          <w:rPr>
-            <w:rFonts w:ascii="Garamond" w:hAnsi="Garamond" w:cs="Times New Roman"/>
-          </w:rPr>
-          <w:lastRenderedPageBreak/>
-          <w:t xml:space="preserve">escapement goals, provide more equitable harvest opportunities to upstream communities, and protect upper river stocks which are at heightened risk of overharvest but contribute disproportionately to stabilizing downstream fishery dynamics. </w:t>
+          <w:t xml:space="preserve">By protecting upriver stocks, managers aim to support basin-wide escapement goals, provide more equitable harvest opportunities to upstream communities, and protect upper river stocks which are at heightened risk of overharvest but contribute disproportionately to stabilizing downstream fishery dynamics. </w:t>
         </w:r>
       </w:moveFrom>
       <w:moveFromRangeEnd w:id="79"/>
@@ -2158,7 +2145,14 @@
           <w:rPr>
             <w:rFonts w:ascii="Garamond" w:hAnsi="Garamond" w:cs="Times New Roman"/>
           </w:rPr>
-          <w:t>Genetic approaches, which have been widely used to investigate population structure and provenance in other Pacific salmon species, cannot be used to estimate provenance in the Kuskokwim because Chinook salmon exhibit low genetic differentiation across the basin, while ongoing telemetry studies are logistically constrained in their ability to characterize migration dynamics across such a large and remote watershed.</w:t>
+          <w:t xml:space="preserve">Genetic approaches, which have been widely used to investigate population structure and provenance in other Pacific salmon species, cannot be used to estimate provenance in the Kuskokwim because Chinook salmon exhibit low genetic differentiation across the basin, while ongoing telemetry studies are logistically constrained in their ability to characterize migration </w:t>
+        </w:r>
+        <w:r>
+          <w:rPr>
+            <w:rFonts w:ascii="Garamond" w:hAnsi="Garamond" w:cs="Times New Roman"/>
+          </w:rPr>
+          <w:lastRenderedPageBreak/>
+          <w:t>dynamics across such a large and remote watershed.</w:t>
         </w:r>
       </w:ins>
       <w:ins w:id="86" w:author="Benjamin J. Makhlouf" w:date="2026-06-18T18:35:00Z" w16du:dateUtc="2026-06-19T01:35:00Z">
@@ -2302,14 +2296,7 @@
         <w:rPr>
           <w:rFonts w:ascii="Garamond" w:hAnsi="Garamond" w:cs="Times New Roman"/>
         </w:rPr>
-        <w:t xml:space="preserve">Otolith-based methods for estimating provenance therefore offer a novel approach to: (1) identify the spatiotemporal structure of returning populations in the Kuskokwim River basin, and </w:t>
-      </w:r>
-      <w:r>
-        <w:rPr>
-          <w:rFonts w:ascii="Garamond" w:hAnsi="Garamond" w:cs="Times New Roman"/>
-        </w:rPr>
-        <w:lastRenderedPageBreak/>
-        <w:t>(2) evaluate potential impacts of front-end closures on conserving population diversity within salmon stock complexes returning to large, remote, watersheds.</w:t>
+        <w:t>Otolith-based methods for estimating provenance therefore offer a novel approach to: (1) identify the spatiotemporal structure of returning populations in the Kuskokwim River basin, and (2) evaluate potential impacts of front-end closures on conserving population diversity within salmon stock complexes returning to large, remote, watersheds.</w:t>
       </w:r>
     </w:p>
     <w:p>
@@ -2406,7 +2393,14 @@
         <w:rPr>
           <w:rFonts w:ascii="Garamond" w:hAnsi="Garamond" w:cs="Times New Roman"/>
         </w:rPr>
-        <w:t xml:space="preserve"> to inform management decisions for fisheries throughout the river. Fish </w:t>
+        <w:t xml:space="preserve"> to inform management decisions for </w:t>
+      </w:r>
+      <w:r>
+        <w:rPr>
+          <w:rFonts w:ascii="Garamond" w:hAnsi="Garamond" w:cs="Times New Roman"/>
+        </w:rPr>
+        <w:lastRenderedPageBreak/>
+        <w:t xml:space="preserve">fisheries throughout the river. Fish </w:t>
       </w:r>
       <w:ins w:id="101" w:author="Benjamin J. Makhlouf" w:date="2026-06-19T15:58:00Z" w16du:dateUtc="2026-06-19T22:58:00Z">
         <w:r>
@@ -2587,16 +2581,7 @@
           <w:kern w:val="0"/>
           <w14:ligatures w14:val="none"/>
         </w:rPr>
-        <w:t xml:space="preserve">. Prepared samples were analyzed at the University of Utah Strontium Isotope Laboratory using laser ablation inductively coupled plasma mass spectrometry (LA-ICP-MS). Laser ablation was conducted along a transect from the otolith </w:t>
-      </w:r>
-      <w:r>
-        <w:rPr>
-          <w:rFonts w:ascii="Garamond" w:eastAsia="Times New Roman" w:hAnsi="Garamond" w:cs="Times New Roman"/>
-          <w:kern w:val="0"/>
-          <w14:ligatures w14:val="none"/>
-        </w:rPr>
-        <w:lastRenderedPageBreak/>
-        <w:t xml:space="preserve">core to just beyond the onset of marine growth (identified by the dark annuli check indicative of marine entry) </w:t>
+        <w:t xml:space="preserve">. Prepared samples were analyzed at the University of Utah Strontium Isotope Laboratory using laser ablation inductively coupled plasma mass spectrometry (LA-ICP-MS). Laser ablation was conducted along a transect from the otolith core to just beyond the onset of marine growth (identified by the dark annuli check indicative of marine entry) </w:t>
       </w:r>
       <w:r>
         <w:rPr>
@@ -2652,7 +2637,328 @@
           <w:kern w:val="0"/>
           <w14:ligatures w14:val="none"/>
         </w:rPr>
-        <w:t>The resulting data represent a continuously integrated measurement of Sr</w:t>
+        <w:t xml:space="preserve">The resulting data represent a continuously integrated measurement of </w:t>
+      </w:r>
+      <w:ins w:id="106" w:author="Benjamin J. Makhlouf" w:date="2026-07-08T12:03:00Z" w16du:dateUtc="2026-07-08T19:03:00Z">
+        <w:r>
+          <w:rPr>
+            <w:rFonts w:ascii="Garamond" w:eastAsia="Times New Roman" w:hAnsi="Garamond" w:cs="Times New Roman"/>
+            <w:kern w:val="0"/>
+            <w:vertAlign w:val="superscript"/>
+            <w14:ligatures w14:val="none"/>
+          </w:rPr>
+          <w:t>87</w:t>
+        </w:r>
+        <w:r>
+          <w:rPr>
+            <w:rFonts w:ascii="Garamond" w:eastAsia="Times New Roman" w:hAnsi="Garamond" w:cs="Times New Roman"/>
+            <w:kern w:val="0"/>
+            <w14:ligatures w14:val="none"/>
+          </w:rPr>
+          <w:t>Sr/</w:t>
+        </w:r>
+        <w:r>
+          <w:rPr>
+            <w:rFonts w:ascii="Garamond" w:eastAsia="Times New Roman" w:hAnsi="Garamond" w:cs="Times New Roman"/>
+            <w:kern w:val="0"/>
+            <w:vertAlign w:val="superscript"/>
+            <w14:ligatures w14:val="none"/>
+          </w:rPr>
+          <w:t>86</w:t>
+        </w:r>
+        <w:r>
+          <w:rPr>
+            <w:rFonts w:ascii="Garamond" w:eastAsia="Times New Roman" w:hAnsi="Garamond" w:cs="Times New Roman"/>
+            <w:kern w:val="0"/>
+            <w14:ligatures w14:val="none"/>
+          </w:rPr>
+          <w:t xml:space="preserve">Sr </w:t>
+        </w:r>
+      </w:ins>
+      <w:del w:id="107" w:author="Benjamin J. Makhlouf" w:date="2026-07-08T12:03:00Z" w16du:dateUtc="2026-07-08T19:03:00Z">
+        <w:r>
+          <w:rPr>
+            <w:rFonts w:ascii="Garamond" w:eastAsia="Times New Roman" w:hAnsi="Garamond" w:cs="Times New Roman"/>
+            <w:kern w:val="0"/>
+            <w14:ligatures w14:val="none"/>
+          </w:rPr>
+          <w:delText>Sr</w:delText>
+        </w:r>
+        <w:r>
+          <w:rPr>
+            <w:rFonts w:ascii="Garamond" w:eastAsia="Times New Roman" w:hAnsi="Garamond" w:cs="Times New Roman"/>
+            <w:kern w:val="0"/>
+            <w:vertAlign w:val="superscript"/>
+            <w14:ligatures w14:val="none"/>
+          </w:rPr>
+          <w:delText>87</w:delText>
+        </w:r>
+        <w:r>
+          <w:rPr>
+            <w:rFonts w:ascii="Garamond" w:eastAsia="Times New Roman" w:hAnsi="Garamond" w:cs="Times New Roman"/>
+            <w:kern w:val="0"/>
+            <w14:ligatures w14:val="none"/>
+          </w:rPr>
+          <w:delText>/Sr</w:delText>
+        </w:r>
+        <w:r>
+          <w:rPr>
+            <w:rFonts w:ascii="Garamond" w:eastAsia="Times New Roman" w:hAnsi="Garamond" w:cs="Times New Roman"/>
+            <w:kern w:val="0"/>
+            <w:vertAlign w:val="superscript"/>
+            <w14:ligatures w14:val="none"/>
+          </w:rPr>
+          <w:delText>86</w:delText>
+        </w:r>
+        <w:r>
+          <w:rPr>
+            <w:rFonts w:ascii="Garamond" w:eastAsia="Times New Roman" w:hAnsi="Garamond" w:cs="Times New Roman"/>
+            <w:kern w:val="0"/>
+            <w14:ligatures w14:val="none"/>
+          </w:rPr>
+          <w:delText xml:space="preserve"> </w:delText>
+        </w:r>
+      </w:del>
+      <w:r>
+        <w:rPr>
+          <w:rFonts w:ascii="Garamond" w:eastAsia="Times New Roman" w:hAnsi="Garamond" w:cs="Times New Roman"/>
+          <w:kern w:val="0"/>
+          <w14:ligatures w14:val="none"/>
+        </w:rPr>
+        <w:t xml:space="preserve">from early development until marine entry </w:t>
+      </w:r>
+      <w:r>
+        <w:rPr>
+          <w:rFonts w:ascii="Garamond" w:eastAsia="Times New Roman" w:hAnsi="Garamond" w:cs="Times New Roman"/>
+          <w:kern w:val="0"/>
+          <w14:ligatures w14:val="none"/>
+        </w:rPr>
+        <w:fldChar w:fldCharType="begin"/>
+      </w:r>
+      <w:r>
+        <w:rPr>
+          <w:rFonts w:ascii="Garamond" w:eastAsia="Times New Roman" w:hAnsi="Garamond" w:cs="Times New Roman"/>
+          <w:kern w:val="0"/>
+          <w14:ligatures w14:val="none"/>
+        </w:rPr>
+        <w:instrText xml:space="preserve"> ADDIN ZOTERO_ITEM CSL_CITATION {"citationID":"drNJXJRw","properties":{"formattedCitation":"(Brennan et al., 2015; Campana, 1999; Capo et al., 1998)","plainCitation":"(Brennan et al., 2015; Campana, 1999; Capo et al., 1998)","noteIndex":0},"citationItems":[{"id":"25Y35S3t/lIyU3UG4","uris":["http://zotero.org/users/8421274/items/IY3FLHLM"],"itemData":{"id":"dI01jIsp/qEdWN4pU","type":"article-journal","abstract":"Strontium isotopes simultaneously delineate fine-scale natal habitats and migrations of Pacific salmon harvested during a coastal commercial fishery., Highly migratory organisms present major challenges to conservation efforts. This is especially true for exploited anadromous fish species, which exhibit long-range dispersals from natal sites, complex population structures, and extensive mixing of distinct populations during exploitation. By tracing the migratory histories of individual Chinook salmon caught in fisheries using strontium isotopes, we determined the relative production of natal habitats at fine spatial scales and different life histories. Although strontium isotopes have been widely used in provenance research, we present a new robust framework to simultaneously assess natal sources and migrations of individuals within fishery harvests through time. Our results pave the way for investigating how fine-scale habitat production and life histories of salmon respond to perturbations—providing crucial insights for conservation.","container-title":"Science Advances","DOI":"10.1126/sciadv.1400124","ISSN":"2375-2548","issue":"4","journalAbbreviation":"Sci Adv","note":"PMID: 26601173\nPMCID: PMC4640640","page":"e1400124","source":"PubMed Central","title":"Strontium isotopes delineate fine-scale natal origins and migration histories of Pacific salmon","volume":"1","author":[{"family":"Brennan","given":"Sean R."},{"family":"Zimmerman","given":"Christian E."},{"family":"Fernandez","given":"Diego P."},{"family":"Cerling","given":"Thure E."},{"family":"McPhee","given":"Megan V."},{"family":"Wooller","given":"Matthew J."}],"issued":{"date-parts":[["2015",5,15]]}}},{"id":1441,"uris":["http://zotero.org/users/8421274/items/PHNAKZ8D"],"itemData":{"id":1441,"type":"article-journal","abstract":"The fish otolith (earstone) has long been known as a timekeeper, but interest in its use as a metabolically inert environmental recorder has accelerated in recent years. In part due to technological advances, applications such as stock identification, determination of rnigralon pathways, reconstruction of temperature and salinity history, age validation, detection of anadromy, use as a natural tag and chemical mass marking have been developed, some of which are difficult or impossible to implement using alternative techniques. Microsamphg and the latest advances in beam-based probes allow many elemental assays to be coupled with daily or annual growth increments, thus providing a detailed chronologcal record of the environment. However, few workers have critically assessed the assumptions upon which the environmental reconstructions are based, or considered the possibility that elemental incorporation into the otolith may proceed differently than that into other calcified structures. This paper reviews current applications and their assumptions and suggests future directions. Particular attention is given to the premises that the elemental and isotopic composition of the otolith reflects that of the environment, and the effect of physiological filters on the resulting composition. The roles of temperature, elemental uptake into the fish and the process of otolith crystahzation are also assessed. Drawing upon recent advances in geochemistry and paleoclirnate research as points of contrast, it appears that not all applications of otolith chemistry are firmly based, although others are destined to become powerful and perhaps routine tools for the mainstream fish biologst.","container-title":"Marine Ecology Progress Series","DOI":"10.3354/meps188263","ISSN":"0171-8630, 1616-1599","journalAbbreviation":"Mar. Ecol. Prog. Ser.","language":"en","page":"263-297","source":"DOI.org (Crossref)","title":"Chemistry and composition of fish otoliths:pathways, mechanisms and applications","title-short":"Chemistry and composition of fish otoliths","volume":"188","author":[{"family":"Campana","given":"Se"}],"issued":{"date-parts":[["1999"]]}}},{"id":1457,"uris":["http://zotero.org/users/8421274/items/TDIQBP7K"],"itemData":{"id":1457,"type":"article-journal","abstract":"The strontium (Sr) isotope method can be a powerful tool in studies of chemical weathering and soil genesis, cation provenance and mobility, and the chronostratigraphic correlation of marine sediments. It is a sensitive geochemical tracer, applicable to large-scale ecosystem studies as well as to centimeter-scaled examination of cation mobility within a soil profile. The 87Sr/86Sr ratios of natural materials reflect the sources of strontium available during their formation. Isotopically distinct inputs from precipitation, dryfall, soil parent material, and surface or groundwater allow determination of the relative proportions of those materials entering or leaving an ecosystem. The isotopic compositions of labile (soil exchange complex and soil solution) strontium and Sr in vegetation reflect the sources of cations available to plants. Strontium isotopes can be used to track the biogeochemical cycling of nutrient cations such as calcium. The extent of cation contributions from in situ weathering and external additions to soil from dust and rain can also be resolved with this method. In this paper, we review the geochemistry and isotopic systematics of strontium, and discuss the use of this method as a tracer of earth surface processes.","container-title":"Geoderma","DOI":"10.1016/S0016-7061(97)00102-X","ISSN":"0016-7061","issue":"1","journalAbbreviation":"Geoderma","language":"en","page":"197-225","source":"ScienceDirect","title":"Strontium isotopes as tracers of ecosystem processes: theory and methods","title-short":"Strontium isotopes as tracers of ecosystem processes","volume":"82","author":[{"family":"Capo","given":"Rosemary C."},{"family":"Stewart","given":"Brian W."},{"family":"Chadwick","given":"Oliver A."}],"issued":{"date-parts":[["1998",2,1]]}}}],"schema":"https://github.com/citation-style-language/schema/raw/master/csl-citation.json"} </w:instrText>
+      </w:r>
+      <w:r>
+        <w:rPr>
+          <w:rFonts w:ascii="Garamond" w:eastAsia="Times New Roman" w:hAnsi="Garamond" w:cs="Times New Roman"/>
+          <w:kern w:val="0"/>
+          <w14:ligatures w14:val="none"/>
+        </w:rPr>
+        <w:fldChar w:fldCharType="separate"/>
+      </w:r>
+      <w:r>
+        <w:rPr>
+          <w:rFonts w:ascii="Garamond" w:eastAsia="Times New Roman" w:hAnsi="Garamond" w:cs="Times New Roman"/>
+          <w:noProof/>
+          <w:kern w:val="0"/>
+          <w14:ligatures w14:val="none"/>
+        </w:rPr>
+        <w:t>(Brennan et al., 2015; Campana, 1999</w:t>
+      </w:r>
+      <w:del w:id="108" w:author="Benjamin J. Makhlouf" w:date="2026-07-08T12:10:00Z" w16du:dateUtc="2026-07-08T19:10:00Z">
+        <w:r>
+          <w:rPr>
+            <w:rFonts w:ascii="Garamond" w:eastAsia="Times New Roman" w:hAnsi="Garamond" w:cs="Times New Roman"/>
+            <w:noProof/>
+            <w:kern w:val="0"/>
+            <w14:ligatures w14:val="none"/>
+          </w:rPr>
+          <w:delText>; Capo et al., 1998</w:delText>
+        </w:r>
+      </w:del>
+      <w:r>
+        <w:rPr>
+          <w:rFonts w:ascii="Garamond" w:eastAsia="Times New Roman" w:hAnsi="Garamond" w:cs="Times New Roman"/>
+          <w:noProof/>
+          <w:kern w:val="0"/>
+          <w14:ligatures w14:val="none"/>
+        </w:rPr>
+        <w:t>)</w:t>
+      </w:r>
+      <w:r>
+        <w:rPr>
+          <w:rFonts w:ascii="Garamond" w:eastAsia="Times New Roman" w:hAnsi="Garamond" w:cs="Times New Roman"/>
+          <w:kern w:val="0"/>
+          <w14:ligatures w14:val="none"/>
+        </w:rPr>
+        <w:fldChar w:fldCharType="end"/>
+      </w:r>
+      <w:r>
+        <w:rPr>
+          <w:rFonts w:ascii="Garamond" w:eastAsia="Times New Roman" w:hAnsi="Garamond" w:cs="Times New Roman"/>
+          <w:kern w:val="0"/>
+          <w14:ligatures w14:val="none"/>
+        </w:rPr>
+        <w:t xml:space="preserve">. From these data, the </w:t>
+      </w:r>
+      <w:ins w:id="109" w:author="Benjamin J. Makhlouf" w:date="2026-07-08T12:03:00Z" w16du:dateUtc="2026-07-08T19:03:00Z">
+        <w:r>
+          <w:rPr>
+            <w:rFonts w:ascii="Garamond" w:eastAsia="Times New Roman" w:hAnsi="Garamond" w:cs="Times New Roman"/>
+            <w:kern w:val="0"/>
+            <w:vertAlign w:val="superscript"/>
+            <w14:ligatures w14:val="none"/>
+          </w:rPr>
+          <w:t>87</w:t>
+        </w:r>
+      </w:ins>
+      <w:r>
+        <w:rPr>
+          <w:rFonts w:ascii="Garamond" w:eastAsia="Times New Roman" w:hAnsi="Garamond" w:cs="Times New Roman"/>
+          <w:kern w:val="0"/>
+          <w14:ligatures w14:val="none"/>
+        </w:rPr>
+        <w:t>Sr</w:t>
+      </w:r>
+      <w:del w:id="110" w:author="Benjamin J. Makhlouf" w:date="2026-07-08T12:03:00Z" w16du:dateUtc="2026-07-08T19:03:00Z">
+        <w:r>
+          <w:rPr>
+            <w:rFonts w:ascii="Garamond" w:eastAsia="Times New Roman" w:hAnsi="Garamond" w:cs="Times New Roman"/>
+            <w:kern w:val="0"/>
+            <w:vertAlign w:val="superscript"/>
+            <w14:ligatures w14:val="none"/>
+          </w:rPr>
+          <w:delText>87</w:delText>
+        </w:r>
+      </w:del>
+      <w:r>
+        <w:rPr>
+          <w:rFonts w:ascii="Garamond" w:eastAsia="Times New Roman" w:hAnsi="Garamond" w:cs="Times New Roman"/>
+          <w:kern w:val="0"/>
+          <w14:ligatures w14:val="none"/>
+        </w:rPr>
+        <w:t>/</w:t>
+      </w:r>
+      <w:ins w:id="111" w:author="Benjamin J. Makhlouf" w:date="2026-07-08T12:03:00Z" w16du:dateUtc="2026-07-08T19:03:00Z">
+        <w:r>
+          <w:rPr>
+            <w:rFonts w:ascii="Garamond" w:eastAsia="Times New Roman" w:hAnsi="Garamond" w:cs="Times New Roman"/>
+            <w:kern w:val="0"/>
+            <w:vertAlign w:val="superscript"/>
+            <w14:ligatures w14:val="none"/>
+          </w:rPr>
+          <w:t>86</w:t>
+        </w:r>
+      </w:ins>
+      <w:r>
+        <w:rPr>
+          <w:rFonts w:ascii="Garamond" w:eastAsia="Times New Roman" w:hAnsi="Garamond" w:cs="Times New Roman"/>
+          <w:kern w:val="0"/>
+          <w14:ligatures w14:val="none"/>
+        </w:rPr>
+        <w:t>Sr</w:t>
+      </w:r>
+      <w:del w:id="112" w:author="Benjamin J. Makhlouf" w:date="2026-07-08T12:03:00Z" w16du:dateUtc="2026-07-08T19:03:00Z">
+        <w:r>
+          <w:rPr>
+            <w:rFonts w:ascii="Garamond" w:eastAsia="Times New Roman" w:hAnsi="Garamond" w:cs="Times New Roman"/>
+            <w:kern w:val="0"/>
+            <w:vertAlign w:val="superscript"/>
+            <w14:ligatures w14:val="none"/>
+          </w:rPr>
+          <w:delText>86</w:delText>
+        </w:r>
+      </w:del>
+      <w:r>
+        <w:rPr>
+          <w:rFonts w:ascii="Garamond" w:eastAsia="Times New Roman" w:hAnsi="Garamond" w:cs="Times New Roman"/>
+          <w:kern w:val="0"/>
+          <w14:ligatures w14:val="none"/>
+        </w:rPr>
+        <w:t xml:space="preserve"> value associated with the natal freshwater rearing period was extracted by examining patterns of change in </w:t>
+      </w:r>
+      <w:ins w:id="113" w:author="Benjamin J. Makhlouf" w:date="2026-07-08T12:04:00Z" w16du:dateUtc="2026-07-08T19:04:00Z">
+        <w:r>
+          <w:rPr>
+            <w:rFonts w:ascii="Garamond" w:eastAsia="Times New Roman" w:hAnsi="Garamond" w:cs="Times New Roman"/>
+            <w:kern w:val="0"/>
+            <w:vertAlign w:val="superscript"/>
+            <w14:ligatures w14:val="none"/>
+          </w:rPr>
+          <w:t>87</w:t>
+        </w:r>
+        <w:r>
+          <w:rPr>
+            <w:rFonts w:ascii="Garamond" w:eastAsia="Times New Roman" w:hAnsi="Garamond" w:cs="Times New Roman"/>
+            <w:kern w:val="0"/>
+            <w14:ligatures w14:val="none"/>
+          </w:rPr>
+          <w:t>Sr/</w:t>
+        </w:r>
+        <w:r>
+          <w:rPr>
+            <w:rFonts w:ascii="Garamond" w:eastAsia="Times New Roman" w:hAnsi="Garamond" w:cs="Times New Roman"/>
+            <w:kern w:val="0"/>
+            <w:vertAlign w:val="superscript"/>
+            <w14:ligatures w14:val="none"/>
+          </w:rPr>
+          <w:t>86</w:t>
+        </w:r>
+        <w:r>
+          <w:rPr>
+            <w:rFonts w:ascii="Garamond" w:eastAsia="Times New Roman" w:hAnsi="Garamond" w:cs="Times New Roman"/>
+            <w:kern w:val="0"/>
+            <w14:ligatures w14:val="none"/>
+          </w:rPr>
+          <w:t xml:space="preserve">Sr </w:t>
+        </w:r>
+      </w:ins>
+      <w:del w:id="114" w:author="Benjamin J. Makhlouf" w:date="2026-07-08T12:04:00Z" w16du:dateUtc="2026-07-08T19:04:00Z">
+        <w:r>
+          <w:rPr>
+            <w:rFonts w:ascii="Garamond" w:eastAsia="Times New Roman" w:hAnsi="Garamond" w:cs="Times New Roman"/>
+            <w:kern w:val="0"/>
+            <w14:ligatures w14:val="none"/>
+          </w:rPr>
+          <w:delText>Sr</w:delText>
+        </w:r>
+        <w:r>
+          <w:rPr>
+            <w:rFonts w:ascii="Garamond" w:eastAsia="Times New Roman" w:hAnsi="Garamond" w:cs="Times New Roman"/>
+            <w:kern w:val="0"/>
+            <w:vertAlign w:val="superscript"/>
+            <w14:ligatures w14:val="none"/>
+          </w:rPr>
+          <w:delText>87</w:delText>
+        </w:r>
+        <w:r>
+          <w:rPr>
+            <w:rFonts w:ascii="Garamond" w:eastAsia="Times New Roman" w:hAnsi="Garamond" w:cs="Times New Roman"/>
+            <w:kern w:val="0"/>
+            <w14:ligatures w14:val="none"/>
+          </w:rPr>
+          <w:delText>/Sr</w:delText>
+        </w:r>
+        <w:r>
+          <w:rPr>
+            <w:rFonts w:ascii="Garamond" w:eastAsia="Times New Roman" w:hAnsi="Garamond" w:cs="Times New Roman"/>
+            <w:kern w:val="0"/>
+            <w:vertAlign w:val="superscript"/>
+            <w14:ligatures w14:val="none"/>
+          </w:rPr>
+          <w:delText>86</w:delText>
+        </w:r>
+        <w:r>
+          <w:rPr>
+            <w:rFonts w:ascii="Garamond" w:eastAsia="Times New Roman" w:hAnsi="Garamond" w:cs="Times New Roman"/>
+            <w:kern w:val="0"/>
+            <w14:ligatures w14:val="none"/>
+          </w:rPr>
+          <w:delText xml:space="preserve"> </w:delText>
+        </w:r>
+      </w:del>
+      <w:r>
+        <w:rPr>
+          <w:rFonts w:ascii="Garamond" w:eastAsia="Times New Roman" w:hAnsi="Garamond" w:cs="Times New Roman"/>
+          <w:kern w:val="0"/>
+          <w14:ligatures w14:val="none"/>
+        </w:rPr>
+        <w:t>and Sr</w:t>
       </w:r>
       <w:r>
         <w:rPr>
@@ -2661,7 +2967,7 @@
           <w:vertAlign w:val="superscript"/>
           <w14:ligatures w14:val="none"/>
         </w:rPr>
-        <w:t>87</w:t>
+        <w:t>88</w:t>
       </w:r>
       <w:r>
         <w:rPr>
@@ -2669,160 +2975,9 @@
           <w:kern w:val="0"/>
           <w14:ligatures w14:val="none"/>
         </w:rPr>
-        <w:t>/Sr</w:t>
-      </w:r>
-      <w:r>
-        <w:rPr>
-          <w:rFonts w:ascii="Garamond" w:eastAsia="Times New Roman" w:hAnsi="Garamond" w:cs="Times New Roman"/>
-          <w:kern w:val="0"/>
-          <w:vertAlign w:val="superscript"/>
-          <w14:ligatures w14:val="none"/>
-        </w:rPr>
-        <w:t>86</w:t>
-      </w:r>
-      <w:r>
-        <w:rPr>
-          <w:rFonts w:ascii="Garamond" w:eastAsia="Times New Roman" w:hAnsi="Garamond" w:cs="Times New Roman"/>
-          <w:kern w:val="0"/>
-          <w14:ligatures w14:val="none"/>
-        </w:rPr>
-        <w:t xml:space="preserve"> from early development until marine entry </w:t>
-      </w:r>
-      <w:r>
-        <w:rPr>
-          <w:rFonts w:ascii="Garamond" w:eastAsia="Times New Roman" w:hAnsi="Garamond" w:cs="Times New Roman"/>
-          <w:kern w:val="0"/>
-          <w14:ligatures w14:val="none"/>
-        </w:rPr>
-        <w:fldChar w:fldCharType="begin"/>
-      </w:r>
-      <w:r>
-        <w:rPr>
-          <w:rFonts w:ascii="Garamond" w:eastAsia="Times New Roman" w:hAnsi="Garamond" w:cs="Times New Roman"/>
-          <w:kern w:val="0"/>
-          <w14:ligatures w14:val="none"/>
-        </w:rPr>
-        <w:instrText xml:space="preserve"> ADDIN ZOTERO_ITEM CSL_CITATION {"citationID":"drNJXJRw","properties":{"formattedCitation":"(Brennan et al., 2015; Campana, 1999; Capo et al., 1998)","plainCitation":"(Brennan et al., 2015; Campana, 1999; Capo et al., 1998)","noteIndex":0},"citationItems":[{"id":"25Y35S3t/lIyU3UG4","uris":["http://zotero.org/users/8421274/items/IY3FLHLM"],"itemData":{"id":"dI01jIsp/qEdWN4pU","type":"article-journal","abstract":"Strontium isotopes simultaneously delineate fine-scale natal habitats and migrations of Pacific salmon harvested during a coastal commercial fishery., Highly migratory organisms present major challenges to conservation efforts. This is especially true for exploited anadromous fish species, which exhibit long-range dispersals from natal sites, complex population structures, and extensive mixing of distinct populations during exploitation. By tracing the migratory histories of individual Chinook salmon caught in fisheries using strontium isotopes, we determined the relative production of natal habitats at fine spatial scales and different life histories. Although strontium isotopes have been widely used in provenance research, we present a new robust framework to simultaneously assess natal sources and migrations of individuals within fishery harvests through time. Our results pave the way for investigating how fine-scale habitat production and life histories of salmon respond to perturbations—providing crucial insights for conservation.","container-title":"Science Advances","DOI":"10.1126/sciadv.1400124","ISSN":"2375-2548","issue":"4","journalAbbreviation":"Sci Adv","note":"PMID: 26601173\nPMCID: PMC4640640","page":"e1400124","source":"PubMed Central","title":"Strontium isotopes delineate fine-scale natal origins and migration histories of Pacific salmon","volume":"1","author":[{"family":"Brennan","given":"Sean R."},{"family":"Zimmerman","given":"Christian E."},{"family":"Fernandez","given":"Diego P."},{"family":"Cerling","given":"Thure E."},{"family":"McPhee","given":"Megan V."},{"family":"Wooller","given":"Matthew J."}],"issued":{"date-parts":[["2015",5,15]]}}},{"id":1441,"uris":["http://zotero.org/users/8421274/items/PHNAKZ8D"],"itemData":{"id":1441,"type":"article-journal","abstract":"The fish otolith (earstone) has long been known as a timekeeper, but interest in its use as a metabolically inert environmental recorder has accelerated in recent years. In part due to technological advances, applications such as stock identification, determination of rnigralon pathways, reconstruction of temperature and salinity history, age validation, detection of anadromy, use as a natural tag and chemical mass marking have been developed, some of which are difficult or impossible to implement using alternative techniques. Microsamphg and the latest advances in beam-based probes allow many elemental assays to be coupled with daily or annual growth increments, thus providing a detailed chronologcal record of the environment. However, few workers have critically assessed the assumptions upon which the environmental reconstructions are based, or considered the possibility that elemental incorporation into the otolith may proceed differently than that into other calcified structures. This paper reviews current applications and their assumptions and suggests future directions. Particular attention is given to the premises that the elemental and isotopic composition of the otolith reflects that of the environment, and the effect of physiological filters on the resulting composition. The roles of temperature, elemental uptake into the fish and the process of otolith crystahzation are also assessed. Drawing upon recent advances in geochemistry and paleoclirnate research as points of contrast, it appears that not all applications of otolith chemistry are firmly based, although others are destined to become powerful and perhaps routine tools for the mainstream fish biologst.","container-title":"Marine Ecology Progress Series","DOI":"10.3354/meps188263","ISSN":"0171-8630, 1616-1599","journalAbbreviation":"Mar. Ecol. Prog. Ser.","language":"en","page":"263-297","source":"DOI.org (Crossref)","title":"Chemistry and composition of fish otoliths:pathways, mechanisms and applications","title-short":"Chemistry and composition of fish otoliths","volume":"188","author":[{"family":"Campana","given":"Se"}],"issued":{"date-parts":[["1999"]]}}},{"id":1457,"uris":["http://zotero.org/users/8421274/items/TDIQBP7K"],"itemData":{"id":1457,"type":"article-journal","abstract":"The strontium (Sr) isotope method can be a powerful tool in studies of chemical weathering and soil genesis, cation provenance and mobility, and the chronostratigraphic correlation of marine sediments. It is a sensitive geochemical tracer, applicable to large-scale ecosystem studies as well as to centimeter-scaled examination of cation mobility within a soil profile. The 87Sr/86Sr ratios of natural materials reflect the sources of strontium available during their formation. Isotopically distinct inputs from precipitation, dryfall, soil parent material, and surface or groundwater allow determination of the relative proportions of those materials entering or leaving an ecosystem. The isotopic compositions of labile (soil exchange complex and soil solution) strontium and Sr in vegetation reflect the sources of cations available to plants. Strontium isotopes can be used to track the biogeochemical cycling of nutrient cations such as calcium. The extent of cation contributions from in situ weathering and external additions to soil from dust and rain can also be resolved with this method. In this paper, we review the geochemistry and isotopic systematics of strontium, and discuss the use of this method as a tracer of earth surface processes.","container-title":"Geoderma","DOI":"10.1016/S0016-7061(97)00102-X","ISSN":"0016-7061","issue":"1","journalAbbreviation":"Geoderma","language":"en","page":"197-225","source":"ScienceDirect","title":"Strontium isotopes as tracers of ecosystem processes: theory and methods","title-short":"Strontium isotopes as tracers of ecosystem processes","volume":"82","author":[{"family":"Capo","given":"Rosemary C."},{"family":"Stewart","given":"Brian W."},{"family":"Chadwick","given":"Oliver A."}],"issued":{"date-parts":[["1998",2,1]]}}}],"schema":"https://github.com/citation-style-language/schema/raw/master/csl-citation.json"} </w:instrText>
-      </w:r>
-      <w:r>
-        <w:rPr>
-          <w:rFonts w:ascii="Garamond" w:eastAsia="Times New Roman" w:hAnsi="Garamond" w:cs="Times New Roman"/>
-          <w:kern w:val="0"/>
-          <w14:ligatures w14:val="none"/>
-        </w:rPr>
-        <w:fldChar w:fldCharType="separate"/>
-      </w:r>
-      <w:r>
-        <w:rPr>
-          <w:rFonts w:ascii="Garamond" w:eastAsia="Times New Roman" w:hAnsi="Garamond" w:cs="Times New Roman"/>
-          <w:noProof/>
-          <w:kern w:val="0"/>
-          <w14:ligatures w14:val="none"/>
-        </w:rPr>
-        <w:t>(Brennan et al., 2015; Campana, 1999; Capo et al., 1998)</w:t>
-      </w:r>
-      <w:r>
-        <w:rPr>
-          <w:rFonts w:ascii="Garamond" w:eastAsia="Times New Roman" w:hAnsi="Garamond" w:cs="Times New Roman"/>
-          <w:kern w:val="0"/>
-          <w14:ligatures w14:val="none"/>
-        </w:rPr>
-        <w:fldChar w:fldCharType="end"/>
-      </w:r>
-      <w:r>
-        <w:rPr>
-          <w:rFonts w:ascii="Garamond" w:eastAsia="Times New Roman" w:hAnsi="Garamond" w:cs="Times New Roman"/>
-          <w:kern w:val="0"/>
-          <w14:ligatures w14:val="none"/>
-        </w:rPr>
-        <w:t>. From these data, the Sr</w:t>
-      </w:r>
-      <w:r>
-        <w:rPr>
-          <w:rFonts w:ascii="Garamond" w:eastAsia="Times New Roman" w:hAnsi="Garamond" w:cs="Times New Roman"/>
-          <w:kern w:val="0"/>
-          <w:vertAlign w:val="superscript"/>
-          <w14:ligatures w14:val="none"/>
-        </w:rPr>
-        <w:t>87</w:t>
-      </w:r>
-      <w:r>
-        <w:rPr>
-          <w:rFonts w:ascii="Garamond" w:eastAsia="Times New Roman" w:hAnsi="Garamond" w:cs="Times New Roman"/>
-          <w:kern w:val="0"/>
-          <w14:ligatures w14:val="none"/>
-        </w:rPr>
-        <w:t>/Sr</w:t>
-      </w:r>
-      <w:r>
-        <w:rPr>
-          <w:rFonts w:ascii="Garamond" w:eastAsia="Times New Roman" w:hAnsi="Garamond" w:cs="Times New Roman"/>
-          <w:kern w:val="0"/>
-          <w:vertAlign w:val="superscript"/>
-          <w14:ligatures w14:val="none"/>
-        </w:rPr>
-        <w:t>86</w:t>
-      </w:r>
-      <w:r>
-        <w:rPr>
-          <w:rFonts w:ascii="Garamond" w:eastAsia="Times New Roman" w:hAnsi="Garamond" w:cs="Times New Roman"/>
-          <w:kern w:val="0"/>
-          <w14:ligatures w14:val="none"/>
-        </w:rPr>
-        <w:t xml:space="preserve"> value associated with the natal freshwater rearing period was extracted by examining patterns of change in Sr</w:t>
-      </w:r>
-      <w:r>
-        <w:rPr>
-          <w:rFonts w:ascii="Garamond" w:eastAsia="Times New Roman" w:hAnsi="Garamond" w:cs="Times New Roman"/>
-          <w:kern w:val="0"/>
-          <w:vertAlign w:val="superscript"/>
-          <w14:ligatures w14:val="none"/>
-        </w:rPr>
-        <w:t>87</w:t>
-      </w:r>
-      <w:r>
-        <w:rPr>
-          <w:rFonts w:ascii="Garamond" w:eastAsia="Times New Roman" w:hAnsi="Garamond" w:cs="Times New Roman"/>
-          <w:kern w:val="0"/>
-          <w14:ligatures w14:val="none"/>
-        </w:rPr>
-        <w:t>/Sr</w:t>
-      </w:r>
-      <w:r>
-        <w:rPr>
-          <w:rFonts w:ascii="Garamond" w:eastAsia="Times New Roman" w:hAnsi="Garamond" w:cs="Times New Roman"/>
-          <w:kern w:val="0"/>
-          <w:vertAlign w:val="superscript"/>
-          <w14:ligatures w14:val="none"/>
-        </w:rPr>
-        <w:t>86</w:t>
-      </w:r>
-      <w:r>
-        <w:rPr>
-          <w:rFonts w:ascii="Garamond" w:eastAsia="Times New Roman" w:hAnsi="Garamond" w:cs="Times New Roman"/>
-          <w:kern w:val="0"/>
-          <w14:ligatures w14:val="none"/>
-        </w:rPr>
-        <w:t xml:space="preserve"> and Sr</w:t>
-      </w:r>
-      <w:r>
-        <w:rPr>
-          <w:rFonts w:ascii="Garamond" w:eastAsia="Times New Roman" w:hAnsi="Garamond" w:cs="Times New Roman"/>
-          <w:kern w:val="0"/>
-          <w:vertAlign w:val="superscript"/>
-          <w14:ligatures w14:val="none"/>
-        </w:rPr>
-        <w:t>88</w:t>
-      </w:r>
-      <w:r>
-        <w:rPr>
-          <w:rFonts w:ascii="Garamond" w:eastAsia="Times New Roman" w:hAnsi="Garamond" w:cs="Times New Roman"/>
-          <w:kern w:val="0"/>
-          <w14:ligatures w14:val="none"/>
-        </w:rPr>
         <w:t xml:space="preserve"> between the core and freshwater region, morphological features of the otolith visible along the ablation path, and known distances from the core</w:t>
       </w:r>
-      <w:ins w:id="106" w:author="Benjamin J. Makhlouf" w:date="2026-06-18T19:47:00Z" w16du:dateUtc="2026-06-19T02:47:00Z">
+      <w:ins w:id="115" w:author="Benjamin J. Makhlouf" w:date="2026-06-18T19:47:00Z" w16du:dateUtc="2026-06-19T02:47:00Z">
         <w:r>
           <w:rPr>
             <w:rFonts w:ascii="Garamond" w:eastAsia="Times New Roman" w:hAnsi="Garamond" w:cs="Times New Roman"/>
@@ -2837,7 +2992,7 @@
             <w:kern w:val="0"/>
             <w:highlight w:val="yellow"/>
             <w14:ligatures w14:val="none"/>
-            <w:rPrChange w:id="107" w:author="Benjamin J. Makhlouf" w:date="2026-06-18T19:47:00Z" w16du:dateUtc="2026-06-19T02:47:00Z">
+            <w:rPrChange w:id="116" w:author="Benjamin J. Makhlouf" w:date="2026-06-18T19:47:00Z" w16du:dateUtc="2026-06-19T02:47:00Z">
               <w:rPr>
                 <w:rFonts w:ascii="Garamond" w:eastAsia="Times New Roman" w:hAnsi="Garamond" w:cs="Times New Roman"/>
                 <w:kern w:val="0"/>
@@ -2845,7 +3000,36 @@
               </w:rPr>
             </w:rPrChange>
           </w:rPr>
-          <w:t>(X to Y)</w:t>
+          <w:t>(</w:t>
+        </w:r>
+      </w:ins>
+      <w:ins w:id="117" w:author="Benjamin J. Makhlouf" w:date="2026-07-08T12:13:00Z" w16du:dateUtc="2026-07-08T19:13:00Z">
+        <w:r>
+          <w:rPr>
+            <w:rFonts w:ascii="Garamond" w:eastAsia="Times New Roman" w:hAnsi="Garamond" w:cs="Times New Roman"/>
+            <w:kern w:val="0"/>
+            <w:highlight w:val="yellow"/>
+            <w14:ligatures w14:val="none"/>
+          </w:rPr>
+          <w:t>~120-150 µm</w:t>
+        </w:r>
+      </w:ins>
+      <w:ins w:id="118" w:author="Benjamin J. Makhlouf" w:date="2026-06-18T19:47:00Z" w16du:dateUtc="2026-06-19T02:47:00Z">
+        <w:r>
+          <w:rPr>
+            <w:rFonts w:ascii="Garamond" w:eastAsia="Times New Roman" w:hAnsi="Garamond" w:cs="Times New Roman"/>
+            <w:kern w:val="0"/>
+            <w:highlight w:val="yellow"/>
+            <w14:ligatures w14:val="none"/>
+            <w:rPrChange w:id="119" w:author="Benjamin J. Makhlouf" w:date="2026-06-18T19:47:00Z" w16du:dateUtc="2026-06-19T02:47:00Z">
+              <w:rPr>
+                <w:rFonts w:ascii="Garamond" w:eastAsia="Times New Roman" w:hAnsi="Garamond" w:cs="Times New Roman"/>
+                <w:kern w:val="0"/>
+                <w14:ligatures w14:val="none"/>
+              </w:rPr>
+            </w:rPrChange>
+          </w:rPr>
+          <w:t>)</w:t>
         </w:r>
       </w:ins>
       <w:r>
@@ -2905,7 +3089,7 @@
         </w:rPr>
         <w:t>.</w:t>
       </w:r>
-      <w:ins w:id="108" w:author="Benjamin J. Makhlouf" w:date="2026-06-18T19:45:00Z" w16du:dateUtc="2026-06-19T02:45:00Z">
+      <w:ins w:id="120" w:author="Benjamin J. Makhlouf" w:date="2026-06-18T19:45:00Z" w16du:dateUtc="2026-06-19T02:45:00Z">
         <w:r>
           <w:rPr>
             <w:rFonts w:ascii="Garamond" w:eastAsia="Times New Roman" w:hAnsi="Garamond" w:cs="Times New Roman"/>
@@ -2915,15 +3099,7 @@
           <w:t xml:space="preserve"> </w:t>
         </w:r>
       </w:ins>
-      <w:ins w:id="109" w:author="Benjamin J. Makhlouf" w:date="2026-06-18T19:47:00Z" w16du:dateUtc="2026-06-19T02:47:00Z">
-        <w:r>
-          <w:rPr>
-            <w:rFonts w:ascii="Garamond" w:eastAsia="Times New Roman" w:hAnsi="Garamond" w:cs="Times New Roman"/>
-            <w:kern w:val="0"/>
-            <w14:ligatures w14:val="none"/>
-          </w:rPr>
-          <w:t>Sr</w:t>
-        </w:r>
+      <w:ins w:id="121" w:author="Benjamin J. Makhlouf" w:date="2026-07-08T12:05:00Z" w16du:dateUtc="2026-07-08T19:05:00Z">
         <w:r>
           <w:rPr>
             <w:rFonts w:ascii="Garamond" w:eastAsia="Times New Roman" w:hAnsi="Garamond" w:cs="Times New Roman"/>
@@ -2934,27 +3110,79 @@
           <w:t>88</w:t>
         </w:r>
       </w:ins>
-      <w:ins w:id="110" w:author="Benjamin J. Makhlouf" w:date="2026-06-18T19:48:00Z" w16du:dateUtc="2026-06-19T02:48:00Z">
+      <w:ins w:id="122" w:author="Benjamin J. Makhlouf" w:date="2026-06-18T19:47:00Z" w16du:dateUtc="2026-06-19T02:47:00Z">
         <w:r>
           <w:rPr>
             <w:rFonts w:ascii="Garamond" w:eastAsia="Times New Roman" w:hAnsi="Garamond" w:cs="Times New Roman"/>
             <w:kern w:val="0"/>
             <w14:ligatures w14:val="none"/>
           </w:rPr>
-          <w:t xml:space="preserve"> can be used as a proxy for Sr concentration, which is expected to be much higher in the marine environment as well as the materna</w:t>
-        </w:r>
-      </w:ins>
-      <w:ins w:id="111" w:author="Benjamin J. Makhlouf" w:date="2026-06-18T19:49:00Z" w16du:dateUtc="2026-06-19T02:49:00Z">
+          <w:t>Sr</w:t>
+        </w:r>
+      </w:ins>
+      <w:ins w:id="123" w:author="Benjamin J. Makhlouf" w:date="2026-06-18T19:48:00Z" w16du:dateUtc="2026-06-19T02:48:00Z">
         <w:r>
           <w:rPr>
             <w:rFonts w:ascii="Garamond" w:eastAsia="Times New Roman" w:hAnsi="Garamond" w:cs="Times New Roman"/>
             <w:kern w:val="0"/>
             <w14:ligatures w14:val="none"/>
           </w:rPr>
-          <w:t xml:space="preserve">lly influenced core. As a result, the Sr88 signal of the otolith data was used to guide manual selection of the natal origin region following depletion of the maternal signature, indicated by decreased Sr88 concentrations. </w:t>
-        </w:r>
-      </w:ins>
-      <w:del w:id="112" w:author="Benjamin J. Makhlouf" w:date="2026-06-18T19:45:00Z" w16du:dateUtc="2026-06-19T02:45:00Z">
+          <w:t xml:space="preserve"> can be used as a proxy for Sr concentration, which is expected to be much higher in the marine environment as well as the materna</w:t>
+        </w:r>
+      </w:ins>
+      <w:ins w:id="124" w:author="Benjamin J. Makhlouf" w:date="2026-06-18T19:49:00Z" w16du:dateUtc="2026-06-19T02:49:00Z">
+        <w:r>
+          <w:rPr>
+            <w:rFonts w:ascii="Garamond" w:eastAsia="Times New Roman" w:hAnsi="Garamond" w:cs="Times New Roman"/>
+            <w:kern w:val="0"/>
+            <w14:ligatures w14:val="none"/>
+          </w:rPr>
+          <w:t xml:space="preserve">lly influenced core. As a result, the </w:t>
+        </w:r>
+      </w:ins>
+      <w:ins w:id="125" w:author="Benjamin J. Makhlouf" w:date="2026-07-08T12:05:00Z" w16du:dateUtc="2026-07-08T19:05:00Z">
+        <w:r>
+          <w:rPr>
+            <w:rFonts w:ascii="Garamond" w:eastAsia="Times New Roman" w:hAnsi="Garamond" w:cs="Times New Roman"/>
+            <w:kern w:val="0"/>
+            <w:vertAlign w:val="superscript"/>
+            <w14:ligatures w14:val="none"/>
+          </w:rPr>
+          <w:t>88</w:t>
+        </w:r>
+      </w:ins>
+      <w:ins w:id="126" w:author="Benjamin J. Makhlouf" w:date="2026-06-18T19:49:00Z" w16du:dateUtc="2026-06-19T02:49:00Z">
+        <w:r>
+          <w:rPr>
+            <w:rFonts w:ascii="Garamond" w:eastAsia="Times New Roman" w:hAnsi="Garamond" w:cs="Times New Roman"/>
+            <w:kern w:val="0"/>
+            <w14:ligatures w14:val="none"/>
+          </w:rPr>
+          <w:t xml:space="preserve">Sr signal of the otolith data was used to guide manual selection of the natal origin region following depletion of the maternal signature, indicated by decreased </w:t>
+        </w:r>
+      </w:ins>
+      <w:ins w:id="127" w:author="Benjamin J. Makhlouf" w:date="2026-07-08T12:05:00Z" w16du:dateUtc="2026-07-08T19:05:00Z">
+        <w:r>
+          <w:rPr>
+            <w:rFonts w:ascii="Garamond" w:eastAsia="Times New Roman" w:hAnsi="Garamond" w:cs="Times New Roman"/>
+            <w:kern w:val="0"/>
+            <w:vertAlign w:val="superscript"/>
+            <w14:ligatures w14:val="none"/>
+          </w:rPr>
+          <w:t>88</w:t>
+        </w:r>
+      </w:ins>
+      <w:ins w:id="128" w:author="Benjamin J. Makhlouf" w:date="2026-06-18T19:49:00Z" w16du:dateUtc="2026-06-19T02:49:00Z">
+        <w:r>
+          <w:rPr>
+            <w:rFonts w:ascii="Garamond" w:eastAsia="Times New Roman" w:hAnsi="Garamond" w:cs="Times New Roman"/>
+            <w:kern w:val="0"/>
+            <w14:ligatures w14:val="none"/>
+          </w:rPr>
+          <w:t xml:space="preserve">Sr concentrations. </w:t>
+        </w:r>
+      </w:ins>
+      <w:del w:id="129" w:author="Benjamin J. Makhlouf" w:date="2026-06-18T19:45:00Z" w16du:dateUtc="2026-06-19T02:45:00Z">
         <w:r>
           <w:rPr>
             <w:rFonts w:ascii="Garamond" w:eastAsia="Times New Roman" w:hAnsi="Garamond" w:cs="Times New Roman"/>
@@ -3013,41 +3241,95 @@
           <w:kern w:val="0"/>
           <w14:ligatures w14:val="none"/>
         </w:rPr>
-        <w:t>A strontium isoscape of the Kuskokwim River basin (Fig. 1) was constructed by French et al. (2020) in which spatial variation in Sr</w:t>
-      </w:r>
-      <w:r>
-        <w:rPr>
-          <w:rFonts w:ascii="Garamond" w:eastAsia="Times New Roman" w:hAnsi="Garamond" w:cs="Times New Roman"/>
-          <w:kern w:val="0"/>
-          <w:vertAlign w:val="superscript"/>
-          <w14:ligatures w14:val="none"/>
-        </w:rPr>
-        <w:t>87</w:t>
-      </w:r>
+        <w:t xml:space="preserve">A strontium isoscape of the Kuskokwim River basin (Fig. 1) was constructed by French et al. (2020) in which spatial variation in </w:t>
+      </w:r>
+      <w:ins w:id="130" w:author="Benjamin J. Makhlouf" w:date="2026-07-08T12:04:00Z" w16du:dateUtc="2026-07-08T19:04:00Z">
+        <w:r>
+          <w:rPr>
+            <w:rFonts w:ascii="Garamond" w:eastAsia="Times New Roman" w:hAnsi="Garamond" w:cs="Times New Roman"/>
+            <w:kern w:val="0"/>
+            <w:vertAlign w:val="superscript"/>
+            <w14:ligatures w14:val="none"/>
+          </w:rPr>
+          <w:t>87</w:t>
+        </w:r>
+        <w:r>
+          <w:rPr>
+            <w:rFonts w:ascii="Garamond" w:eastAsia="Times New Roman" w:hAnsi="Garamond" w:cs="Times New Roman"/>
+            <w:kern w:val="0"/>
+            <w14:ligatures w14:val="none"/>
+          </w:rPr>
+          <w:t>Sr/</w:t>
+        </w:r>
+        <w:r>
+          <w:rPr>
+            <w:rFonts w:ascii="Garamond" w:eastAsia="Times New Roman" w:hAnsi="Garamond" w:cs="Times New Roman"/>
+            <w:kern w:val="0"/>
+            <w:vertAlign w:val="superscript"/>
+            <w14:ligatures w14:val="none"/>
+          </w:rPr>
+          <w:t>86</w:t>
+        </w:r>
+        <w:r>
+          <w:rPr>
+            <w:rFonts w:ascii="Garamond" w:eastAsia="Times New Roman" w:hAnsi="Garamond" w:cs="Times New Roman"/>
+            <w:kern w:val="0"/>
+            <w14:ligatures w14:val="none"/>
+          </w:rPr>
+          <w:t xml:space="preserve">Sr </w:t>
+        </w:r>
+      </w:ins>
+      <w:del w:id="131" w:author="Benjamin J. Makhlouf" w:date="2026-07-08T12:04:00Z" w16du:dateUtc="2026-07-08T19:04:00Z">
+        <w:r>
+          <w:rPr>
+            <w:rFonts w:ascii="Garamond" w:eastAsia="Times New Roman" w:hAnsi="Garamond" w:cs="Times New Roman"/>
+            <w:kern w:val="0"/>
+            <w14:ligatures w14:val="none"/>
+          </w:rPr>
+          <w:delText>Sr</w:delText>
+        </w:r>
+        <w:r>
+          <w:rPr>
+            <w:rFonts w:ascii="Garamond" w:eastAsia="Times New Roman" w:hAnsi="Garamond" w:cs="Times New Roman"/>
+            <w:kern w:val="0"/>
+            <w:vertAlign w:val="superscript"/>
+            <w14:ligatures w14:val="none"/>
+          </w:rPr>
+          <w:delText>87</w:delText>
+        </w:r>
+        <w:r>
+          <w:rPr>
+            <w:rFonts w:ascii="Garamond" w:eastAsia="Times New Roman" w:hAnsi="Garamond" w:cs="Times New Roman"/>
+            <w:kern w:val="0"/>
+            <w14:ligatures w14:val="none"/>
+          </w:rPr>
+          <w:delText>/Sr</w:delText>
+        </w:r>
+        <w:r>
+          <w:rPr>
+            <w:rFonts w:ascii="Garamond" w:eastAsia="Times New Roman" w:hAnsi="Garamond" w:cs="Times New Roman"/>
+            <w:kern w:val="0"/>
+            <w:vertAlign w:val="superscript"/>
+            <w14:ligatures w14:val="none"/>
+          </w:rPr>
+          <w:delText>86</w:delText>
+        </w:r>
+        <w:r>
+          <w:rPr>
+            <w:rFonts w:ascii="Garamond" w:eastAsia="Times New Roman" w:hAnsi="Garamond" w:cs="Times New Roman"/>
+            <w:kern w:val="0"/>
+            <w14:ligatures w14:val="none"/>
+          </w:rPr>
+          <w:delText xml:space="preserve"> </w:delText>
+        </w:r>
+      </w:del>
       <w:r>
         <w:rPr>
           <w:rFonts w:ascii="Garamond" w:eastAsia="Times New Roman" w:hAnsi="Garamond" w:cs="Times New Roman"/>
           <w:kern w:val="0"/>
           <w14:ligatures w14:val="none"/>
         </w:rPr>
-        <w:t>/Sr</w:t>
-      </w:r>
-      <w:r>
-        <w:rPr>
-          <w:rFonts w:ascii="Garamond" w:eastAsia="Times New Roman" w:hAnsi="Garamond" w:cs="Times New Roman"/>
-          <w:kern w:val="0"/>
-          <w:vertAlign w:val="superscript"/>
-          <w14:ligatures w14:val="none"/>
-        </w:rPr>
-        <w:t>86</w:t>
-      </w:r>
-      <w:r>
-        <w:rPr>
-          <w:rFonts w:ascii="Garamond" w:eastAsia="Times New Roman" w:hAnsi="Garamond" w:cs="Times New Roman"/>
-          <w:kern w:val="0"/>
-          <w14:ligatures w14:val="none"/>
-        </w:rPr>
-        <w:t xml:space="preserve"> ratios across the river basin was modeled using spatial stream network modeling (SSNM) derived from water samples collected throughout the river basin </w:t>
+        <w:t xml:space="preserve">ratios across the river basin was modeled using spatial stream network modeling (SSNM) derived from water samples collected throughout the river basin </w:t>
       </w:r>
       <w:r>
         <w:rPr>
@@ -3096,39 +3378,91 @@
           <w:kern w:val="0"/>
           <w14:ligatures w14:val="none"/>
         </w:rPr>
-        <w:t>. The resulting isoscape includes estimates of Sr</w:t>
-      </w:r>
-      <w:r>
-        <w:rPr>
-          <w:rFonts w:ascii="Garamond" w:eastAsia="Times New Roman" w:hAnsi="Garamond" w:cs="Times New Roman"/>
-          <w:kern w:val="0"/>
-          <w:vertAlign w:val="superscript"/>
-          <w14:ligatures w14:val="none"/>
-        </w:rPr>
-        <w:t>87</w:t>
-      </w:r>
-      <w:r>
-        <w:rPr>
-          <w:rFonts w:ascii="Garamond" w:eastAsia="Times New Roman" w:hAnsi="Garamond" w:cs="Times New Roman"/>
-          <w:kern w:val="0"/>
-          <w14:ligatures w14:val="none"/>
-        </w:rPr>
-        <w:t>/Sr</w:t>
-      </w:r>
-      <w:r>
-        <w:rPr>
-          <w:rFonts w:ascii="Garamond" w:eastAsia="Times New Roman" w:hAnsi="Garamond" w:cs="Times New Roman"/>
-          <w:kern w:val="0"/>
-          <w:vertAlign w:val="superscript"/>
-          <w14:ligatures w14:val="none"/>
-        </w:rPr>
-        <w:t>86</w:t>
-      </w:r>
-      <w:r>
-        <w:rPr>
-          <w:rFonts w:ascii="Garamond" w:hAnsi="Garamond" w:cs="Times New Roman"/>
-        </w:rPr>
-        <w:t xml:space="preserve"> ratios and associated uncertainty for roughly every 1km of river length across the basin (Fig. 1)</w:t>
+        <w:t xml:space="preserve">. The resulting isoscape includes estimates of </w:t>
+      </w:r>
+      <w:ins w:id="132" w:author="Benjamin J. Makhlouf" w:date="2026-07-08T12:04:00Z" w16du:dateUtc="2026-07-08T19:04:00Z">
+        <w:r>
+          <w:rPr>
+            <w:rFonts w:ascii="Garamond" w:eastAsia="Times New Roman" w:hAnsi="Garamond" w:cs="Times New Roman"/>
+            <w:kern w:val="0"/>
+            <w:vertAlign w:val="superscript"/>
+            <w14:ligatures w14:val="none"/>
+          </w:rPr>
+          <w:t>87</w:t>
+        </w:r>
+        <w:r>
+          <w:rPr>
+            <w:rFonts w:ascii="Garamond" w:eastAsia="Times New Roman" w:hAnsi="Garamond" w:cs="Times New Roman"/>
+            <w:kern w:val="0"/>
+            <w14:ligatures w14:val="none"/>
+          </w:rPr>
+          <w:t>Sr/</w:t>
+        </w:r>
+        <w:r>
+          <w:rPr>
+            <w:rFonts w:ascii="Garamond" w:eastAsia="Times New Roman" w:hAnsi="Garamond" w:cs="Times New Roman"/>
+            <w:kern w:val="0"/>
+            <w:vertAlign w:val="superscript"/>
+            <w14:ligatures w14:val="none"/>
+          </w:rPr>
+          <w:t>86</w:t>
+        </w:r>
+        <w:r>
+          <w:rPr>
+            <w:rFonts w:ascii="Garamond" w:eastAsia="Times New Roman" w:hAnsi="Garamond" w:cs="Times New Roman"/>
+            <w:kern w:val="0"/>
+            <w14:ligatures w14:val="none"/>
+          </w:rPr>
+          <w:t xml:space="preserve">Sr </w:t>
+        </w:r>
+      </w:ins>
+      <w:del w:id="133" w:author="Benjamin J. Makhlouf" w:date="2026-07-08T12:04:00Z" w16du:dateUtc="2026-07-08T19:04:00Z">
+        <w:r>
+          <w:rPr>
+            <w:rFonts w:ascii="Garamond" w:eastAsia="Times New Roman" w:hAnsi="Garamond" w:cs="Times New Roman"/>
+            <w:kern w:val="0"/>
+            <w14:ligatures w14:val="none"/>
+          </w:rPr>
+          <w:delText>Sr</w:delText>
+        </w:r>
+        <w:r>
+          <w:rPr>
+            <w:rFonts w:ascii="Garamond" w:eastAsia="Times New Roman" w:hAnsi="Garamond" w:cs="Times New Roman"/>
+            <w:kern w:val="0"/>
+            <w:vertAlign w:val="superscript"/>
+            <w14:ligatures w14:val="none"/>
+          </w:rPr>
+          <w:delText>87</w:delText>
+        </w:r>
+        <w:r>
+          <w:rPr>
+            <w:rFonts w:ascii="Garamond" w:eastAsia="Times New Roman" w:hAnsi="Garamond" w:cs="Times New Roman"/>
+            <w:kern w:val="0"/>
+            <w14:ligatures w14:val="none"/>
+          </w:rPr>
+          <w:delText>/Sr</w:delText>
+        </w:r>
+        <w:r>
+          <w:rPr>
+            <w:rFonts w:ascii="Garamond" w:eastAsia="Times New Roman" w:hAnsi="Garamond" w:cs="Times New Roman"/>
+            <w:kern w:val="0"/>
+            <w:vertAlign w:val="superscript"/>
+            <w14:ligatures w14:val="none"/>
+          </w:rPr>
+          <w:delText>86</w:delText>
+        </w:r>
+        <w:r>
+          <w:rPr>
+            <w:rFonts w:ascii="Garamond" w:hAnsi="Garamond" w:cs="Times New Roman"/>
+          </w:rPr>
+          <w:delText xml:space="preserve"> </w:delText>
+        </w:r>
+      </w:del>
+      <w:r>
+        <w:rPr>
+          <w:rFonts w:ascii="Garamond" w:hAnsi="Garamond" w:cs="Times New Roman"/>
+        </w:rPr>
+        <w:t>ratios and associated uncertainty for roughly every 1km of river length across the basin (Fig. 1)</w:t>
       </w:r>
       <w:r>
         <w:rPr>
@@ -3191,14 +3525,7 @@
         <w:rPr>
           <w:rFonts w:ascii="Garamond" w:hAnsi="Garamond" w:cs="Times New Roman"/>
         </w:rPr>
-        <w:t xml:space="preserve">To prevent over-assignment to tributaries with exceptionally low prediction error, uncertainty values were constrained to 0.0006 and above. This threshold was selected by visually examining the histogram for a cutoff which adjusted the values for a small </w:t>
-      </w:r>
-      <w:r>
-        <w:rPr>
-          <w:rFonts w:ascii="Garamond" w:hAnsi="Garamond" w:cs="Times New Roman"/>
-        </w:rPr>
-        <w:lastRenderedPageBreak/>
-        <w:t xml:space="preserve">number of exceedingly low uncertainty tributaries (those near extensive sampling) while maintaining the general error distribution from the original SSN model. </w:t>
+        <w:t xml:space="preserve">To prevent over-assignment to tributaries with exceptionally low prediction error, uncertainty values were constrained to 0.0006 and above. This threshold was selected by visually examining the histogram for a cutoff which adjusted the values for a small number of exceedingly low uncertainty tributaries (those near extensive sampling) while maintaining the general error distribution from the original SSN model. </w:t>
       </w:r>
     </w:p>
     <w:p>
@@ -3264,43 +3591,97 @@
           <w:kern w:val="0"/>
           <w14:ligatures w14:val="none"/>
         </w:rPr>
-        <w:t>. This approach considers the relationship between extracted natal origin otolith Sr</w:t>
-      </w:r>
-      <w:r>
-        <w:rPr>
-          <w:rFonts w:ascii="Garamond" w:eastAsia="Times New Roman" w:hAnsi="Garamond" w:cs="Times New Roman"/>
-          <w:kern w:val="0"/>
-          <w:vertAlign w:val="superscript"/>
-          <w14:ligatures w14:val="none"/>
-        </w:rPr>
-        <w:t>87</w:t>
-      </w:r>
+        <w:t xml:space="preserve">. This approach considers the relationship between extracted natal origin otolith </w:t>
+      </w:r>
+      <w:ins w:id="134" w:author="Benjamin J. Makhlouf" w:date="2026-07-08T12:04:00Z" w16du:dateUtc="2026-07-08T19:04:00Z">
+        <w:r>
+          <w:rPr>
+            <w:rFonts w:ascii="Garamond" w:eastAsia="Times New Roman" w:hAnsi="Garamond" w:cs="Times New Roman"/>
+            <w:kern w:val="0"/>
+            <w:vertAlign w:val="superscript"/>
+            <w14:ligatures w14:val="none"/>
+          </w:rPr>
+          <w:t>87</w:t>
+        </w:r>
+        <w:r>
+          <w:rPr>
+            <w:rFonts w:ascii="Garamond" w:eastAsia="Times New Roman" w:hAnsi="Garamond" w:cs="Times New Roman"/>
+            <w:kern w:val="0"/>
+            <w14:ligatures w14:val="none"/>
+          </w:rPr>
+          <w:t>Sr/</w:t>
+        </w:r>
+        <w:r>
+          <w:rPr>
+            <w:rFonts w:ascii="Garamond" w:eastAsia="Times New Roman" w:hAnsi="Garamond" w:cs="Times New Roman"/>
+            <w:kern w:val="0"/>
+            <w:vertAlign w:val="superscript"/>
+            <w14:ligatures w14:val="none"/>
+          </w:rPr>
+          <w:t>86</w:t>
+        </w:r>
+        <w:r>
+          <w:rPr>
+            <w:rFonts w:ascii="Garamond" w:eastAsia="Times New Roman" w:hAnsi="Garamond" w:cs="Times New Roman"/>
+            <w:kern w:val="0"/>
+            <w14:ligatures w14:val="none"/>
+          </w:rPr>
+          <w:t xml:space="preserve">Sr </w:t>
+        </w:r>
+      </w:ins>
+      <w:del w:id="135" w:author="Benjamin J. Makhlouf" w:date="2026-07-08T12:04:00Z" w16du:dateUtc="2026-07-08T19:04:00Z">
+        <w:r>
+          <w:rPr>
+            <w:rFonts w:ascii="Garamond" w:eastAsia="Times New Roman" w:hAnsi="Garamond" w:cs="Times New Roman"/>
+            <w:kern w:val="0"/>
+            <w14:ligatures w14:val="none"/>
+          </w:rPr>
+          <w:delText>Sr</w:delText>
+        </w:r>
+        <w:r>
+          <w:rPr>
+            <w:rFonts w:ascii="Garamond" w:eastAsia="Times New Roman" w:hAnsi="Garamond" w:cs="Times New Roman"/>
+            <w:kern w:val="0"/>
+            <w:vertAlign w:val="superscript"/>
+            <w14:ligatures w14:val="none"/>
+          </w:rPr>
+          <w:delText>87</w:delText>
+        </w:r>
+        <w:r>
+          <w:rPr>
+            <w:rFonts w:ascii="Garamond" w:eastAsia="Times New Roman" w:hAnsi="Garamond" w:cs="Times New Roman"/>
+            <w:kern w:val="0"/>
+            <w14:ligatures w14:val="none"/>
+          </w:rPr>
+          <w:delText>/Sr</w:delText>
+        </w:r>
+        <w:r>
+          <w:rPr>
+            <w:rFonts w:ascii="Garamond" w:eastAsia="Times New Roman" w:hAnsi="Garamond" w:cs="Times New Roman"/>
+            <w:kern w:val="0"/>
+            <w:vertAlign w:val="superscript"/>
+            <w14:ligatures w14:val="none"/>
+          </w:rPr>
+          <w:delText>86</w:delText>
+        </w:r>
+        <w:r>
+          <w:rPr>
+            <w:rFonts w:ascii="Garamond" w:eastAsia="Times New Roman" w:hAnsi="Garamond" w:cs="Times New Roman"/>
+            <w:kern w:val="0"/>
+            <w14:ligatures w14:val="none"/>
+          </w:rPr>
+          <w:delText xml:space="preserve"> </w:delText>
+        </w:r>
+      </w:del>
       <w:r>
         <w:rPr>
           <w:rFonts w:ascii="Garamond" w:eastAsia="Times New Roman" w:hAnsi="Garamond" w:cs="Times New Roman"/>
           <w:kern w:val="0"/>
           <w14:ligatures w14:val="none"/>
         </w:rPr>
-        <w:t>/Sr</w:t>
-      </w:r>
-      <w:r>
-        <w:rPr>
-          <w:rFonts w:ascii="Garamond" w:eastAsia="Times New Roman" w:hAnsi="Garamond" w:cs="Times New Roman"/>
-          <w:kern w:val="0"/>
-          <w:vertAlign w:val="superscript"/>
-          <w14:ligatures w14:val="none"/>
-        </w:rPr>
-        <w:t>86</w:t>
-      </w:r>
-      <w:r>
-        <w:rPr>
-          <w:rFonts w:ascii="Garamond" w:eastAsia="Times New Roman" w:hAnsi="Garamond" w:cs="Times New Roman"/>
-          <w:kern w:val="0"/>
-          <w14:ligatures w14:val="none"/>
-        </w:rPr>
-        <w:t xml:space="preserve"> values as well as several variance generating processes</w:t>
-      </w:r>
-      <w:ins w:id="113" w:author="Benjamin J. Makhlouf" w:date="2026-06-22T08:33:00Z" w16du:dateUtc="2026-06-22T15:33:00Z">
+        <w:t>values as well as several variance generating processes</w:t>
+      </w:r>
+      <w:ins w:id="136" w:author="Benjamin J. Makhlouf" w:date="2026-06-22T08:33:00Z" w16du:dateUtc="2026-06-22T15:33:00Z">
         <w:r>
           <w:rPr>
             <w:rFonts w:ascii="Garamond" w:eastAsia="Times New Roman" w:hAnsi="Garamond" w:cs="Times New Roman"/>
@@ -3310,12 +3691,12 @@
           <w:t>.</w:t>
         </w:r>
       </w:ins>
-      <w:ins w:id="114" w:author="Benjamin J. Makhlouf" w:date="2026-06-22T08:49:00Z" w16du:dateUtc="2026-06-22T15:49:00Z">
+      <w:ins w:id="137" w:author="Benjamin J. Makhlouf" w:date="2026-06-22T08:49:00Z" w16du:dateUtc="2026-06-22T15:49:00Z">
         <w:r>
           <w:t xml:space="preserve"> </w:t>
         </w:r>
       </w:ins>
-      <w:ins w:id="115" w:author="Benjamin J. Makhlouf" w:date="2026-06-22T08:49:00Z">
+      <w:ins w:id="138" w:author="Benjamin J. Makhlouf" w:date="2026-06-22T08:49:00Z">
         <w:r>
           <w:rPr>
             <w:rFonts w:ascii="Garamond" w:eastAsia="Times New Roman" w:hAnsi="Garamond" w:cs="Times New Roman"/>
@@ -3325,7 +3706,7 @@
           <w:t>These sources include analytical error (variation among repeated standard measurements; 0.000055), within-population error (variation among individuals at the same site; 0.00016), and isoscape error (uncertainty in isoscape model predictions; basin-wide mean = 0.00072)</w:t>
         </w:r>
       </w:ins>
-      <w:ins w:id="116" w:author="Benjamin J. Makhlouf" w:date="2026-06-22T10:03:00Z" w16du:dateUtc="2026-06-22T17:03:00Z">
+      <w:ins w:id="139" w:author="Benjamin J. Makhlouf" w:date="2026-06-22T10:03:00Z" w16du:dateUtc="2026-06-22T17:03:00Z">
         <w:r>
           <w:rPr>
             <w:rFonts w:ascii="Garamond" w:eastAsia="Times New Roman" w:hAnsi="Garamond" w:cs="Times New Roman"/>
@@ -3335,7 +3716,7 @@
           <w:t xml:space="preserve"> </w:t>
         </w:r>
       </w:ins>
-      <w:ins w:id="117" w:author="Benjamin J. Makhlouf" w:date="2026-06-22T10:05:00Z" w16du:dateUtc="2026-06-22T17:05:00Z">
+      <w:ins w:id="140" w:author="Benjamin J. Makhlouf" w:date="2026-06-22T10:05:00Z" w16du:dateUtc="2026-06-22T17:05:00Z">
         <w:r>
           <w:rPr>
             <w:rFonts w:ascii="Garamond" w:eastAsia="Times New Roman" w:hAnsi="Garamond" w:cs="Times New Roman"/>
@@ -3345,7 +3726,7 @@
           <w:t xml:space="preserve">(Brennan et al., 2015, French at al., X). </w:t>
         </w:r>
       </w:ins>
-      <w:del w:id="118" w:author="Benjamin J. Makhlouf" w:date="2026-06-22T08:33:00Z" w16du:dateUtc="2026-06-22T15:33:00Z">
+      <w:del w:id="141" w:author="Benjamin J. Makhlouf" w:date="2026-06-22T08:33:00Z" w16du:dateUtc="2026-06-22T15:33:00Z">
         <w:r>
           <w:rPr>
             <w:rFonts w:ascii="Garamond" w:eastAsia="Times New Roman" w:hAnsi="Garamond" w:cs="Times New Roman"/>
@@ -3361,7 +3742,7 @@
           <w:delText>analytical</w:delText>
         </w:r>
       </w:del>
-      <w:del w:id="119" w:author="Benjamin J. Makhlouf" w:date="2026-06-22T10:06:00Z" w16du:dateUtc="2026-06-22T17:06:00Z">
+      <w:del w:id="142" w:author="Benjamin J. Makhlouf" w:date="2026-06-22T10:06:00Z" w16du:dateUtc="2026-06-22T17:06:00Z">
         <w:r>
           <w:rPr>
             <w:rFonts w:ascii="Garamond" w:hAnsi="Garamond" w:cs="Times New Roman"/>
@@ -3578,6 +3959,7 @@
         <w:rPr>
           <w:rFonts w:ascii="Garamond" w:hAnsi="Garamond" w:cs="Times New Roman"/>
         </w:rPr>
+        <w:lastRenderedPageBreak/>
         <w:t xml:space="preserve">Posterior probability values for each tributary (j) were then calculated using Bayes’ theorem </w:t>
       </w:r>
       <w:r>
@@ -4035,7 +4417,25 @@
           <w:i/>
           <w:iCs/>
         </w:rPr>
-        <w:t>r_j</w:t>
+        <w:t>r</w:t>
+      </w:r>
+      <w:del w:id="143" w:author="Benjamin J. Makhlouf" w:date="2026-07-08T14:55:00Z" w16du:dateUtc="2026-07-08T21:55:00Z">
+        <w:r>
+          <w:rPr>
+            <w:rFonts w:ascii="Garamond" w:hAnsi="Garamond" w:cs="Times New Roman"/>
+            <w:i/>
+            <w:iCs/>
+          </w:rPr>
+          <w:delText>_</w:delText>
+        </w:r>
+      </w:del>
+      <w:r>
+        <w:rPr>
+          <w:rFonts w:ascii="Garamond" w:hAnsi="Garamond" w:cs="Times New Roman"/>
+          <w:i/>
+          <w:iCs/>
+        </w:rPr>
+        <w:t>j</w:t>
       </w:r>
       <w:r>
         <w:rPr>
@@ -4124,7 +4524,6 @@
           <w:kern w:val="0"/>
           <w14:ligatures w14:val="none"/>
         </w:rPr>
-        <w:lastRenderedPageBreak/>
         <w:t xml:space="preserve">Several priors were included to limit assignments to areas within the river basin suitable for spawning Chinook salmon. </w:t>
       </w:r>
       <w:r>
@@ -4361,9 +4760,10 @@
         <w:rPr>
           <w:rFonts w:ascii="Garamond" w:hAnsi="Garamond" w:cs="Times New Roman"/>
         </w:rPr>
+        <w:lastRenderedPageBreak/>
         <w:t xml:space="preserve">To estimate the spatial distribution of returns across a </w:t>
       </w:r>
-      <w:ins w:id="120" w:author="Benjamin J. Makhlouf" w:date="2026-06-22T10:08:00Z" w16du:dateUtc="2026-06-22T17:08:00Z">
+      <w:ins w:id="144" w:author="Benjamin J. Makhlouf" w:date="2026-06-22T10:08:00Z" w16du:dateUtc="2026-06-22T17:08:00Z">
         <w:r>
           <w:rPr>
             <w:rFonts w:ascii="Garamond" w:hAnsi="Garamond" w:cs="Times New Roman"/>
@@ -4377,7 +4777,7 @@
         </w:rPr>
         <w:t>subset of the</w:t>
       </w:r>
-      <w:ins w:id="121" w:author="Benjamin J. Makhlouf" w:date="2026-06-22T10:08:00Z" w16du:dateUtc="2026-06-22T17:08:00Z">
+      <w:ins w:id="145" w:author="Benjamin J. Makhlouf" w:date="2026-06-22T10:08:00Z" w16du:dateUtc="2026-06-22T17:08:00Z">
         <w:r>
           <w:rPr>
             <w:rFonts w:ascii="Garamond" w:hAnsi="Garamond" w:cs="Times New Roman"/>
@@ -4391,7 +4791,7 @@
           <w:t xml:space="preserve"> migration</w:t>
         </w:r>
       </w:ins>
-      <w:del w:id="122" w:author="Benjamin J. Makhlouf" w:date="2026-06-22T10:08:00Z" w16du:dateUtc="2026-06-22T17:08:00Z">
+      <w:del w:id="146" w:author="Benjamin J. Makhlouf" w:date="2026-06-22T10:08:00Z" w16du:dateUtc="2026-06-22T17:08:00Z">
         <w:r>
           <w:rPr>
             <w:rFonts w:ascii="Garamond" w:hAnsi="Garamond" w:cs="Times New Roman"/>
@@ -4442,7 +4842,7 @@
         </w:rPr>
         <w:t xml:space="preserve">. We produced these estimates for four predefined temporal </w:t>
       </w:r>
-      <w:ins w:id="123" w:author="Benjamin J. Makhlouf" w:date="2026-06-19T06:36:00Z" w16du:dateUtc="2026-06-19T13:36:00Z">
+      <w:ins w:id="147" w:author="Benjamin J. Makhlouf" w:date="2026-06-19T06:36:00Z" w16du:dateUtc="2026-06-19T13:36:00Z">
         <w:r>
           <w:rPr>
             <w:rFonts w:ascii="Garamond" w:hAnsi="Garamond" w:cs="Times New Roman"/>
@@ -4450,7 +4850,7 @@
           <w:t xml:space="preserve">ranges that roughly represent quartiles of the </w:t>
         </w:r>
       </w:ins>
-      <w:del w:id="124" w:author="Benjamin J. Makhlouf" w:date="2026-06-19T06:36:00Z" w16du:dateUtc="2026-06-19T13:36:00Z">
+      <w:del w:id="148" w:author="Benjamin J. Makhlouf" w:date="2026-06-19T06:36:00Z" w16du:dateUtc="2026-06-19T13:36:00Z">
         <w:r>
           <w:rPr>
             <w:rFonts w:ascii="Garamond" w:hAnsi="Garamond" w:cs="Times New Roman"/>
@@ -4464,7 +4864,7 @@
         </w:rPr>
         <w:t xml:space="preserve"> of the salmon migration season based on capture date: Q1 (run start through June 11), Q2 (June 12-21), Q3 (June 22-July 1), and Q4 (July 2 onward). These dates were chosen to roughly split the full run </w:t>
       </w:r>
-      <w:ins w:id="125" w:author="Benjamin J. Makhlouf" w:date="2026-06-19T06:37:00Z" w16du:dateUtc="2026-06-19T13:37:00Z">
+      <w:ins w:id="149" w:author="Benjamin J. Makhlouf" w:date="2026-06-19T06:37:00Z" w16du:dateUtc="2026-06-19T13:37:00Z">
         <w:r>
           <w:rPr>
             <w:rFonts w:ascii="Garamond" w:hAnsi="Garamond" w:cs="Times New Roman"/>
@@ -4472,7 +4872,7 @@
           <w:t>evenly into equal quartiles</w:t>
         </w:r>
       </w:ins>
-      <w:del w:id="126" w:author="Benjamin J. Makhlouf" w:date="2026-06-19T06:37:00Z" w16du:dateUtc="2026-06-19T13:37:00Z">
+      <w:del w:id="150" w:author="Benjamin J. Makhlouf" w:date="2026-06-19T06:37:00Z" w16du:dateUtc="2026-06-19T13:37:00Z">
         <w:r>
           <w:rPr>
             <w:rFonts w:ascii="Garamond" w:hAnsi="Garamond" w:cs="Times New Roman"/>
@@ -4486,7 +4886,7 @@
         </w:rPr>
         <w:t>while allowing for direct comparison among years.</w:t>
       </w:r>
-      <w:ins w:id="127" w:author="Benjamin J. Makhlouf" w:date="2026-06-19T06:37:00Z" w16du:dateUtc="2026-06-19T13:37:00Z">
+      <w:ins w:id="151" w:author="Benjamin J. Makhlouf" w:date="2026-06-19T06:37:00Z" w16du:dateUtc="2026-06-19T13:37:00Z">
         <w:r>
           <w:rPr>
             <w:rFonts w:ascii="Garamond" w:hAnsi="Garamond" w:cs="Times New Roman"/>
@@ -4494,7 +4894,7 @@
           <w:t xml:space="preserve"> However, because the start and end date of the return migration varied among years, the duration of Q1 and Q4 varied</w:t>
         </w:r>
       </w:ins>
-      <w:ins w:id="128" w:author="Benjamin J. Makhlouf" w:date="2026-06-19T06:38:00Z" w16du:dateUtc="2026-06-19T13:38:00Z">
+      <w:ins w:id="152" w:author="Benjamin J. Makhlouf" w:date="2026-06-19T06:38:00Z" w16du:dateUtc="2026-06-19T13:38:00Z">
         <w:r>
           <w:rPr>
             <w:rFonts w:ascii="Garamond" w:hAnsi="Garamond" w:cs="Times New Roman"/>
@@ -4506,14 +4906,7 @@
         <w:rPr>
           <w:rFonts w:ascii="Garamond" w:hAnsi="Garamond" w:cs="Times New Roman"/>
         </w:rPr>
-        <w:t xml:space="preserve"> The June 11 date was chosen specifically to </w:t>
-      </w:r>
-      <w:r>
-        <w:rPr>
-          <w:rFonts w:ascii="Garamond" w:hAnsi="Garamond" w:cs="Times New Roman"/>
-        </w:rPr>
-        <w:lastRenderedPageBreak/>
-        <w:t xml:space="preserve">match the end of the ‘front end closure’ of the subsistence fishery. Estimates were also produced for the full run in each year. </w:t>
+        <w:t xml:space="preserve"> The June 11 date was chosen specifically to match the end of the ‘front end closure’ of the subsistence fishery. Estimates were also produced for the full run in each year. </w:t>
       </w:r>
     </w:p>
     <w:p>
@@ -4524,7 +4917,7 @@
           <w:rFonts w:ascii="Garamond" w:hAnsi="Garamond" w:cs="Times New Roman"/>
         </w:rPr>
       </w:pPr>
-      <w:ins w:id="129" w:author="Benjamin J. Makhlouf" w:date="2026-06-19T07:16:00Z">
+      <w:ins w:id="153" w:author="Benjamin J. Makhlouf" w:date="2026-06-19T07:16:00Z">
         <w:r>
           <w:rPr>
             <w:rFonts w:ascii="Garamond" w:hAnsi="Garamond" w:cs="Times New Roman"/>
@@ -4532,7 +4925,7 @@
           <w:t>Several major tributaries were identified as focal management areas or important Chinook salmon-producing systems within the Kuskokwim River basin based on expert knowledge and consultation with regional collaborators.</w:t>
         </w:r>
       </w:ins>
-      <w:del w:id="130" w:author="Benjamin J. Makhlouf" w:date="2026-06-19T07:16:00Z" w16du:dateUtc="2026-06-19T14:16:00Z">
+      <w:del w:id="154" w:author="Benjamin J. Makhlouf" w:date="2026-06-19T07:16:00Z" w16du:dateUtc="2026-06-19T14:16:00Z">
         <w:r>
           <w:rPr>
             <w:rFonts w:ascii="Garamond" w:hAnsi="Garamond" w:cs="Times New Roman"/>
@@ -4585,9 +4978,16 @@
         <w:rPr>
           <w:rFonts w:ascii="Garamond" w:hAnsi="Garamond" w:cs="Times New Roman"/>
         </w:rPr>
-        <w:t xml:space="preserve">Sr values found in each. We then evaluated the clustering results for a range of cluster numbers (n = 2-6) using the silhouette score, which measures cluster quality by comparing within-cluster versus between-cluster distances. From this metric we selected n = 6, which maintained a high silhouette score while providing finer isotopic resolution across groups. The resulting regional groupings displayed a general pattern from upstream to downstream regions (Fig. 2b). However, K-means clustering placed the South Fork Kuskokwim in a lower watershed group because of a very small number of enriched tributaries at the headwaters of this group. Based on an evaluation of the overall isotopic composition compared to other nearby tributary groups, we manually added the South Fork Kuskokwim to its nearest watershed group, group </w:t>
-      </w:r>
-      <w:ins w:id="131" w:author="Benjamin J. Makhlouf" w:date="2026-06-22T10:17:00Z" w16du:dateUtc="2026-06-22T17:17:00Z">
+        <w:t xml:space="preserve">Sr values found in each. We then evaluated the clustering results for a range of cluster numbers (n = 2-6) using the silhouette score, which measures cluster quality by comparing within-cluster versus between-cluster distances. From this metric we selected n = 6, which maintained a </w:t>
+      </w:r>
+      <w:r>
+        <w:rPr>
+          <w:rFonts w:ascii="Garamond" w:hAnsi="Garamond" w:cs="Times New Roman"/>
+        </w:rPr>
+        <w:lastRenderedPageBreak/>
+        <w:t xml:space="preserve">high silhouette score while providing finer isotopic resolution across groups. The resulting regional groupings displayed a general pattern from upstream to downstream regions (Fig. 2b). However, K-means clustering placed the South Fork Kuskokwim in a lower watershed group because of a very small number of enriched tributaries at the headwaters of this group. Based on an evaluation of the overall isotopic composition compared to other nearby tributary groups, we manually added the South Fork Kuskokwim to its nearest watershed group, group </w:t>
+      </w:r>
+      <w:ins w:id="155" w:author="Benjamin J. Makhlouf" w:date="2026-06-22T10:17:00Z" w16du:dateUtc="2026-06-22T17:17:00Z">
         <w:r>
           <w:rPr>
             <w:rFonts w:ascii="Garamond" w:hAnsi="Garamond" w:cs="Times New Roman"/>
@@ -4595,7 +4995,7 @@
           <w:t>two</w:t>
         </w:r>
       </w:ins>
-      <w:del w:id="132" w:author="Benjamin J. Makhlouf" w:date="2026-06-22T10:17:00Z" w16du:dateUtc="2026-06-22T17:17:00Z">
+      <w:del w:id="156" w:author="Benjamin J. Makhlouf" w:date="2026-06-22T10:17:00Z" w16du:dateUtc="2026-06-22T17:17:00Z">
         <w:r>
           <w:rPr>
             <w:rFonts w:ascii="Garamond" w:hAnsi="Garamond" w:cs="Times New Roman"/>
@@ -4640,10 +5040,9 @@
         <w:rPr>
           <w:rFonts w:ascii="Garamond" w:hAnsi="Garamond" w:cs="Times New Roman"/>
         </w:rPr>
-        <w:lastRenderedPageBreak/>
         <w:t>For each year and seasonal quartile, tributary-level return estimates were aggregated into the six regional groups and normalized to sum to one across the basin, representing each group’s proportional contribution to that quartile. Summary statistics were then calculated across all years for each group (Fig. 3). Cumulative distribution functions were constructed to examine trends in relative run timing among regional groups independent of abundance and quartile cut-off dates. For each year, the full run was split into three-day intervals and the cumulative number of returners for each group was compared to its full season contribution. To directly compare relative run timing to the temporal distribution of the full run, we used daily CPUE data collected from the BTF to calculate the cumulative proportion of the full run’s CPUE remaining for each day</w:t>
       </w:r>
-      <w:ins w:id="133" w:author="Benjamin J. Makhlouf" w:date="2026-06-22T10:23:00Z" w16du:dateUtc="2026-06-22T17:23:00Z">
+      <w:ins w:id="157" w:author="Benjamin J. Makhlouf" w:date="2026-06-22T10:23:00Z" w16du:dateUtc="2026-06-22T17:23:00Z">
         <w:r>
           <w:rPr>
             <w:rFonts w:ascii="Garamond" w:hAnsi="Garamond" w:cs="Times New Roman"/>
@@ -4670,9 +5069,10 @@
         <w:rPr>
           <w:rFonts w:ascii="Garamond" w:hAnsi="Garamond"/>
         </w:rPr>
+        <w:lastRenderedPageBreak/>
         <w:t xml:space="preserve">To assess the impact of the existing front-end closure, we quantified the </w:t>
       </w:r>
-      <w:ins w:id="134" w:author="Benjamin J. Makhlouf" w:date="2026-06-20T15:18:00Z">
+      <w:ins w:id="158" w:author="Benjamin J. Makhlouf" w:date="2026-06-20T15:18:00Z">
         <w:r>
           <w:rPr>
             <w:rFonts w:ascii="Garamond" w:hAnsi="Garamond"/>
@@ -4680,7 +5080,7 @@
           <w:t>proportion of total abundance occurring within the closure period (corresponding to the first seasonal quartile, Q1, in our dataset) that was assigned to each regional group based on otolith</w:t>
         </w:r>
       </w:ins>
-      <w:ins w:id="135" w:author="Benjamin J. Makhlouf" w:date="2026-06-20T15:20:00Z" w16du:dateUtc="2026-06-20T22:20:00Z">
+      <w:ins w:id="159" w:author="Benjamin J. Makhlouf" w:date="2026-06-20T15:20:00Z" w16du:dateUtc="2026-06-20T22:20:00Z">
         <w:r>
           <w:rPr>
             <w:rFonts w:ascii="Garamond" w:hAnsi="Garamond"/>
@@ -4688,7 +5088,7 @@
           <w:t xml:space="preserve"> isotope</w:t>
         </w:r>
       </w:ins>
-      <w:ins w:id="136" w:author="Benjamin J. Makhlouf" w:date="2026-06-20T15:18:00Z">
+      <w:ins w:id="160" w:author="Benjamin J. Makhlouf" w:date="2026-06-20T15:18:00Z">
         <w:r>
           <w:rPr>
             <w:rFonts w:ascii="Garamond" w:hAnsi="Garamond"/>
@@ -4696,7 +5096,7 @@
           <w:t xml:space="preserve"> assignments. We refer to this metric</w:t>
         </w:r>
       </w:ins>
-      <w:ins w:id="137" w:author="Benjamin J. Makhlouf" w:date="2026-06-20T15:20:00Z" w16du:dateUtc="2026-06-20T22:20:00Z">
+      <w:ins w:id="161" w:author="Benjamin J. Makhlouf" w:date="2026-06-20T15:20:00Z" w16du:dateUtc="2026-06-20T22:20:00Z">
         <w:r>
           <w:rPr>
             <w:rFonts w:ascii="Garamond" w:hAnsi="Garamond"/>
@@ -4704,7 +5104,7 @@
           <w:t xml:space="preserve"> hereafter</w:t>
         </w:r>
       </w:ins>
-      <w:ins w:id="138" w:author="Benjamin J. Makhlouf" w:date="2026-06-20T15:18:00Z">
+      <w:ins w:id="162" w:author="Benjamin J. Makhlouf" w:date="2026-06-20T15:18:00Z">
         <w:r>
           <w:rPr>
             <w:rFonts w:ascii="Garamond" w:hAnsi="Garamond"/>
@@ -4712,7 +5112,7 @@
           <w:t xml:space="preserve"> as </w:t>
         </w:r>
       </w:ins>
-      <w:ins w:id="139" w:author="Benjamin J. Makhlouf" w:date="2026-06-20T15:20:00Z" w16du:dateUtc="2026-06-20T22:20:00Z">
+      <w:ins w:id="163" w:author="Benjamin J. Makhlouf" w:date="2026-06-20T15:20:00Z" w16du:dateUtc="2026-06-20T22:20:00Z">
         <w:r>
           <w:rPr>
             <w:rFonts w:ascii="Garamond" w:hAnsi="Garamond"/>
@@ -4720,11 +5120,11 @@
           <w:t>“</w:t>
         </w:r>
       </w:ins>
-      <w:ins w:id="140" w:author="Benjamin J. Makhlouf" w:date="2026-06-20T15:18:00Z">
+      <w:ins w:id="164" w:author="Benjamin J. Makhlouf" w:date="2026-06-20T15:18:00Z">
         <w:r>
           <w:rPr>
             <w:rFonts w:ascii="Garamond" w:hAnsi="Garamond"/>
-            <w:rPrChange w:id="141" w:author="Benjamin J. Makhlouf" w:date="2026-06-20T15:19:00Z" w16du:dateUtc="2026-06-20T22:19:00Z">
+            <w:rPrChange w:id="165" w:author="Benjamin J. Makhlouf" w:date="2026-06-20T15:19:00Z" w16du:dateUtc="2026-06-20T22:19:00Z">
               <w:rPr>
                 <w:rFonts w:ascii="Garamond" w:hAnsi="Garamond"/>
                 <w:b/>
@@ -4735,7 +5135,7 @@
           <w:t>percent protection</w:t>
         </w:r>
       </w:ins>
-      <w:ins w:id="142" w:author="Benjamin J. Makhlouf" w:date="2026-06-20T15:20:00Z" w16du:dateUtc="2026-06-20T22:20:00Z">
+      <w:ins w:id="166" w:author="Benjamin J. Makhlouf" w:date="2026-06-20T15:20:00Z" w16du:dateUtc="2026-06-20T22:20:00Z">
         <w:r>
           <w:rPr>
             <w:rFonts w:ascii="Garamond" w:hAnsi="Garamond"/>
@@ -4743,7 +5143,7 @@
           <w:t>”</w:t>
         </w:r>
       </w:ins>
-      <w:ins w:id="143" w:author="Benjamin J. Makhlouf" w:date="2026-06-20T15:18:00Z">
+      <w:ins w:id="167" w:author="Benjamin J. Makhlouf" w:date="2026-06-20T15:18:00Z">
         <w:r>
           <w:rPr>
             <w:rFonts w:ascii="Garamond" w:hAnsi="Garamond"/>
@@ -4751,7 +5151,7 @@
           <w:t>.</w:t>
         </w:r>
       </w:ins>
-      <w:del w:id="144" w:author="Benjamin J. Makhlouf" w:date="2026-06-20T15:17:00Z" w16du:dateUtc="2026-06-20T22:17:00Z">
+      <w:del w:id="168" w:author="Benjamin J. Makhlouf" w:date="2026-06-20T15:17:00Z" w16du:dateUtc="2026-06-20T22:17:00Z">
         <w:r>
           <w:rPr>
             <w:rFonts w:ascii="Garamond" w:hAnsi="Garamond"/>
@@ -4795,14 +5195,7 @@
         <w:rPr>
           <w:rFonts w:ascii="Garamond" w:hAnsi="Garamond" w:cs="Times New Roman"/>
         </w:rPr>
-        <w:t xml:space="preserve"> (three days after current closure end </w:t>
-      </w:r>
-      <w:r>
-        <w:rPr>
-          <w:rFonts w:ascii="Garamond" w:hAnsi="Garamond" w:cs="Times New Roman"/>
-        </w:rPr>
-        <w:lastRenderedPageBreak/>
-        <w:t>date), and June 17</w:t>
+        <w:t xml:space="preserve"> (three days after current closure end date), and June 17</w:t>
       </w:r>
       <w:r>
         <w:rPr>
@@ -4914,7 +5307,14 @@
         <w:rPr>
           <w:rFonts w:ascii="Garamond" w:hAnsi="Garamond"/>
         </w:rPr>
-        <w:t>, Fig. 3b.) exhibited a slight decrease in contribution from group two (31.0%), with increasing contribution from groups four and five (25.8% and 19.8%, respectively). This pattern largely held in the 3</w:t>
+        <w:t xml:space="preserve">, Fig. 3b.) exhibited a slight decrease in contribution from group two </w:t>
+      </w:r>
+      <w:r>
+        <w:rPr>
+          <w:rFonts w:ascii="Garamond" w:hAnsi="Garamond"/>
+        </w:rPr>
+        <w:lastRenderedPageBreak/>
+        <w:t>(31.0%), with increasing contribution from groups four and five (25.8% and 19.8%, respectively). This pattern largely held in the 3</w:t>
       </w:r>
       <w:r>
         <w:rPr>
@@ -4971,10 +5371,9 @@
         <w:rPr>
           <w:rFonts w:ascii="Garamond" w:hAnsi="Garamond"/>
         </w:rPr>
-        <w:lastRenderedPageBreak/>
         <w:t>Cumulative distribution plots (Fig. 4) illustrated</w:t>
       </w:r>
-      <w:ins w:id="145" w:author="Benjamin J. Makhlouf" w:date="2026-06-23T09:20:00Z" w16du:dateUtc="2026-06-23T16:20:00Z">
+      <w:ins w:id="169" w:author="Benjamin J. Makhlouf" w:date="2026-06-23T09:20:00Z" w16du:dateUtc="2026-06-23T16:20:00Z">
         <w:r>
           <w:rPr>
             <w:rFonts w:ascii="Garamond" w:hAnsi="Garamond"/>
@@ -5019,7 +5418,80 @@
         <w:rPr>
           <w:rFonts w:ascii="Garamond" w:hAnsi="Garamond"/>
         </w:rPr>
-        <w:t xml:space="preserve">Early returning upper Kuskokwim populations were afforded higher proportional protection through the implementation of a front-end closure management strategy (Fig. 5). On average, group one, comprised of the furthest upstream populations, received 22.6% of its total contribution within the front-end closure window, followed by group two at 13.5%. In contrast, populations in further downstream areas received considerably less protection, with less than 10% protection afforded to groups three through six on average. These downstream groups also displayed a much narrower range of protection values across all years of our dataset: proportional protection ranged from 1.0%–14% for groups four through six and 1.7%–19% for group three. In contrast, upstream groups displayed a much larger range of protection across our dataset, with group two ranging from 2.4%–29.4% and group one ranging from 3%–52% of the overall return protected by the front-end closure. </w:t>
+        <w:t xml:space="preserve">Early returning upper Kuskokwim populations were afforded higher proportional protection through the implementation of a front-end closure management strategy (Fig. 5). On average, group one, comprised of the furthest upstream populations, received 22.6% of its total </w:t>
+      </w:r>
+      <w:ins w:id="170" w:author="Benjamin J. Makhlouf" w:date="2026-07-08T14:57:00Z" w16du:dateUtc="2026-07-08T21:57:00Z">
+        <w:r>
+          <w:rPr>
+            <w:rFonts w:ascii="Garamond" w:hAnsi="Garamond"/>
+          </w:rPr>
+          <w:t xml:space="preserve">relative abundance </w:t>
+        </w:r>
+      </w:ins>
+      <w:del w:id="171" w:author="Benjamin J. Makhlouf" w:date="2026-07-08T14:57:00Z" w16du:dateUtc="2026-07-08T21:57:00Z">
+        <w:r>
+          <w:rPr>
+            <w:rFonts w:ascii="Garamond" w:hAnsi="Garamond"/>
+          </w:rPr>
+          <w:delText>contribution</w:delText>
+        </w:r>
+      </w:del>
+      <w:r>
+        <w:rPr>
+          <w:rFonts w:ascii="Garamond" w:hAnsi="Garamond"/>
+        </w:rPr>
+        <w:t xml:space="preserve"> within the front-end closure window, followed by group two at 13.5%. In contrast, populations in </w:t>
+      </w:r>
+      <w:r>
+        <w:rPr>
+          <w:rFonts w:ascii="Garamond" w:hAnsi="Garamond"/>
+        </w:rPr>
+        <w:lastRenderedPageBreak/>
+        <w:t xml:space="preserve">further downstream areas received considerably less protection, with less than 10% protection afforded to groups three through six on average. These downstream groups also displayed a much narrower range of protection values across all years of our dataset: proportional protection ranged from 1.0%–14% for groups four through six and 1.7%–19% for group three. In contrast, upstream groups displayed a much larger range of </w:t>
+      </w:r>
+      <w:ins w:id="172" w:author="Benjamin J. Makhlouf" w:date="2026-07-08T14:58:00Z" w16du:dateUtc="2026-07-08T21:58:00Z">
+        <w:r>
+          <w:rPr>
+            <w:rFonts w:ascii="Garamond" w:hAnsi="Garamond"/>
+          </w:rPr>
+          <w:t>relative ab</w:t>
+        </w:r>
+      </w:ins>
+      <w:ins w:id="173" w:author="Benjamin J. Makhlouf" w:date="2026-07-08T14:59:00Z" w16du:dateUtc="2026-07-08T21:59:00Z">
+        <w:r>
+          <w:rPr>
+            <w:rFonts w:ascii="Garamond" w:hAnsi="Garamond"/>
+          </w:rPr>
+          <w:t xml:space="preserve">undance </w:t>
+        </w:r>
+      </w:ins>
+      <w:r>
+        <w:rPr>
+          <w:rFonts w:ascii="Garamond" w:hAnsi="Garamond"/>
+        </w:rPr>
+        <w:t>protect</w:t>
+      </w:r>
+      <w:ins w:id="174" w:author="Benjamin J. Makhlouf" w:date="2026-07-08T14:59:00Z" w16du:dateUtc="2026-07-08T21:59:00Z">
+        <w:r>
+          <w:rPr>
+            <w:rFonts w:ascii="Garamond" w:hAnsi="Garamond"/>
+          </w:rPr>
+          <w:t>ed</w:t>
+        </w:r>
+      </w:ins>
+      <w:del w:id="175" w:author="Benjamin J. Makhlouf" w:date="2026-07-08T14:59:00Z" w16du:dateUtc="2026-07-08T21:59:00Z">
+        <w:r>
+          <w:rPr>
+            <w:rFonts w:ascii="Garamond" w:hAnsi="Garamond"/>
+          </w:rPr>
+          <w:delText>ion</w:delText>
+        </w:r>
+      </w:del>
+      <w:r>
+        <w:rPr>
+          <w:rFonts w:ascii="Garamond" w:hAnsi="Garamond"/>
+        </w:rPr>
+        <w:t xml:space="preserve"> across our dataset, with group two ranging from 2.4%–29.4% and group one ranging from 3%–52% of the overall return protected by the front-end closure. </w:t>
       </w:r>
     </w:p>
     <w:p>
@@ -5028,55 +5500,190 @@
         <w:spacing w:line="480" w:lineRule="auto"/>
         <w:ind w:firstLine="720"/>
         <w:rPr>
-          <w:rFonts w:ascii="Garamond" w:hAnsi="Garamond"/>
-        </w:rPr>
-      </w:pPr>
+          <w:ins w:id="176" w:author="Benjamin J. Makhlouf" w:date="2026-07-08T15:12:00Z" w16du:dateUtc="2026-07-08T22:12:00Z"/>
+          <w:rFonts w:ascii="Garamond" w:hAnsi="Garamond"/>
+        </w:rPr>
+      </w:pPr>
+      <w:r>
+        <w:rPr>
+          <w:rFonts w:ascii="Garamond" w:hAnsi="Garamond"/>
+        </w:rPr>
+        <w:t xml:space="preserve">Varying the duration of the front-end closure did not change the overall pattern of higher protection afforded to upstream populations. However, an earlier closure date (June 8th) markedly decreased both the median and range of protection for upstream groups; median protection for groups one and two dropped to 5.4% and 6.7%, respectively. In at least one year of our dataset, ending the front-end closure three days early resulted in &lt;1% protection for all groups, and no group received greater than 20% protection in any year. In contrast, extending the front-end closure later than the current date increased median protection across all groups. Groups one and two saw an increase of </w:t>
+      </w:r>
+      <w:bookmarkStart w:id="177" w:name="_Hlk213834610"/>
+      <w:r>
+        <w:rPr>
+          <w:rFonts w:ascii="Garamond" w:hAnsi="Garamond"/>
+        </w:rPr>
+        <w:t xml:space="preserve">17.4% and 9.1% in median protection, respectively, by extending the front-end closure three days and the same groups saw a 32.3% and 21.3% </w:t>
+      </w:r>
+      <w:bookmarkEnd w:id="177"/>
+      <w:r>
+        <w:rPr>
+          <w:rFonts w:ascii="Garamond" w:hAnsi="Garamond"/>
+        </w:rPr>
+        <w:t xml:space="preserve">increase in protection by extending the front-end closure six days past the current closure date. Importantly, the </w:t>
+      </w:r>
+      <w:ins w:id="178" w:author="Benjamin J. Makhlouf" w:date="2026-06-23T09:53:00Z" w16du:dateUtc="2026-06-23T16:53:00Z">
+        <w:r>
+          <w:rPr>
+            <w:rFonts w:ascii="Garamond" w:hAnsi="Garamond"/>
+          </w:rPr>
+          <w:t xml:space="preserve">lowest proportional protection in the </w:t>
+        </w:r>
+      </w:ins>
+      <w:del w:id="179" w:author="Benjamin J. Makhlouf" w:date="2026-06-23T09:53:00Z" w16du:dateUtc="2026-06-23T16:53:00Z">
+        <w:r>
+          <w:rPr>
+            <w:rFonts w:ascii="Garamond" w:hAnsi="Garamond"/>
+          </w:rPr>
+          <w:delText xml:space="preserve">minimum protection values in the </w:delText>
+        </w:r>
+      </w:del>
+      <w:r>
+        <w:rPr>
+          <w:rFonts w:ascii="Garamond" w:hAnsi="Garamond"/>
+        </w:rPr>
+        <w:t>three-day extension scenario were similar to the results of the currently implemented closure</w:t>
+      </w:r>
+      <w:ins w:id="180" w:author="Benjamin J. Makhlouf" w:date="2026-07-08T15:10:00Z" w16du:dateUtc="2026-07-08T22:10:00Z">
+        <w:r>
+          <w:rPr>
+            <w:rFonts w:ascii="Garamond" w:hAnsi="Garamond"/>
+          </w:rPr>
+          <w:t xml:space="preserve">, indicating that in select years extending the front end closure by three days would not provide additional conservation benefit. </w:t>
+        </w:r>
+      </w:ins>
+      <w:del w:id="181" w:author="Benjamin J. Makhlouf" w:date="2026-07-08T15:10:00Z" w16du:dateUtc="2026-07-08T22:10:00Z">
+        <w:r>
+          <w:rPr>
+            <w:rFonts w:ascii="Garamond" w:hAnsi="Garamond"/>
+          </w:rPr>
+          <w:delText xml:space="preserve">. </w:delText>
+        </w:r>
+      </w:del>
+      <w:r>
+        <w:rPr>
+          <w:rFonts w:ascii="Garamond" w:hAnsi="Garamond"/>
+        </w:rPr>
+        <w:t>For a closure ending on June 14</w:t>
+      </w:r>
+      <w:r>
+        <w:rPr>
+          <w:rFonts w:ascii="Garamond" w:hAnsi="Garamond"/>
+          <w:vertAlign w:val="superscript"/>
+        </w:rPr>
+        <w:t>th</w:t>
+      </w:r>
+      <w:r>
+        <w:rPr>
+          <w:rFonts w:ascii="Garamond" w:hAnsi="Garamond"/>
+        </w:rPr>
+        <w:t>, the lowest protection afforded to groups one and two was 7.8% and 4.4%, respectively, which are only 4.4% and 2.0% increases over the original closure date. By extending the closure by six days (June 17</w:t>
+      </w:r>
+      <w:r>
+        <w:rPr>
+          <w:rFonts w:ascii="Garamond" w:hAnsi="Garamond"/>
+          <w:vertAlign w:val="superscript"/>
+        </w:rPr>
+        <w:t>th</w:t>
+      </w:r>
+      <w:r>
+        <w:rPr>
+          <w:rFonts w:ascii="Garamond" w:hAnsi="Garamond"/>
+        </w:rPr>
+        <w:t xml:space="preserve">), </w:t>
+      </w:r>
       <w:r>
         <w:rPr>
           <w:rFonts w:ascii="Garamond" w:hAnsi="Garamond"/>
         </w:rPr>
         <w:lastRenderedPageBreak/>
-        <w:t xml:space="preserve">Varying the duration of the front-end closure did not change the overall pattern of higher protection afforded to upstream populations. However, an earlier closure date (June 8th) markedly decreased both the median and range of protection for upstream groups; median protection for groups one and two dropped to 5.4% and 6.7%, respectively. In at least one year of our dataset, ending the front-end closure three days early resulted in &lt;1% protection for all groups, and no group received greater than 20% protection in any year. In contrast, extending the front-end closure later than the current date increased median protection across all groups. Groups one and two saw an increase of </w:t>
-      </w:r>
-      <w:bookmarkStart w:id="146" w:name="_Hlk213834610"/>
-      <w:r>
-        <w:rPr>
-          <w:rFonts w:ascii="Garamond" w:hAnsi="Garamond"/>
-        </w:rPr>
-        <w:t xml:space="preserve">17.4% and 9.1% in median protection, respectively, by extending the front-end closure three days and the same groups saw a 32.3% and 21.3% </w:t>
-      </w:r>
-      <w:bookmarkEnd w:id="146"/>
-      <w:r>
-        <w:rPr>
-          <w:rFonts w:ascii="Garamond" w:hAnsi="Garamond"/>
-        </w:rPr>
-        <w:t>increase in protection by extending the front-end closure six days past the current closure date. Importantly, the minimum protection values in the three-day extension scenario were similar to the results of the currently implemented closure. For a closure ending on June 14</w:t>
-      </w:r>
-      <w:r>
-        <w:rPr>
-          <w:rFonts w:ascii="Garamond" w:hAnsi="Garamond"/>
-          <w:vertAlign w:val="superscript"/>
-        </w:rPr>
-        <w:t>th</w:t>
-      </w:r>
-      <w:r>
-        <w:rPr>
-          <w:rFonts w:ascii="Garamond" w:hAnsi="Garamond"/>
-        </w:rPr>
-        <w:t>, the lowest protection afforded to groups one and two was 7.8% and 4.4%, respectively, which are only 4.4% and 2.0% increases over the original closure date. By extending the closure by six days (June 17</w:t>
-      </w:r>
-      <w:r>
-        <w:rPr>
-          <w:rFonts w:ascii="Garamond" w:hAnsi="Garamond"/>
-          <w:vertAlign w:val="superscript"/>
-        </w:rPr>
-        <w:t>th</w:t>
-      </w:r>
-      <w:r>
-        <w:rPr>
-          <w:rFonts w:ascii="Garamond" w:hAnsi="Garamond"/>
-        </w:rPr>
-        <w:t>), minimum protection values increased more prominently to 21.9% and 14.9% for groups one and two. While a longer front-end closure provides greater protection to stocks across the basin, it also increases the share of the total return that cannot be harvested. Under the current closure duration, an average of 12% of the total CPUE fell within the closure period. Shortening the closure reduces this loss to less than 5% but offers very little protection for upstream stocks (Fig. 5). Extending the closure, by contrast, substantially increases protection for several groups; however, an average of 17% and 24% of the total potential harvest fell within the front-end closure with a three or six-day extension to the current end date.</w:t>
+        <w:t xml:space="preserve">minimum protection values increased more prominently to 21.9% and 14.9% for groups one and two. </w:t>
+      </w:r>
+    </w:p>
+    <w:p>
+      <w:pPr>
+        <w:pStyle w:val="whitespace-normal"/>
+        <w:spacing w:line="480" w:lineRule="auto"/>
+        <w:ind w:firstLine="720"/>
+        <w:rPr>
+          <w:rFonts w:ascii="Garamond" w:hAnsi="Garamond"/>
+        </w:rPr>
+      </w:pPr>
+      <w:r>
+        <w:rPr>
+          <w:rFonts w:ascii="Garamond" w:hAnsi="Garamond"/>
+        </w:rPr>
+        <w:t>While a longer front-end closure provides greater protection to stocks across the basin, it also increases the share of the total return that cannot be harvested. Under the current closure duration, an average of 12% of the total CPUE fell within the closure period</w:t>
+      </w:r>
+      <w:ins w:id="182" w:author="Benjamin J. Makhlouf" w:date="2026-07-08T15:16:00Z" w16du:dateUtc="2026-07-08T22:16:00Z">
+        <w:r>
+          <w:rPr>
+            <w:rFonts w:ascii="Garamond" w:hAnsi="Garamond"/>
+          </w:rPr>
+          <w:t xml:space="preserve"> </w:t>
+        </w:r>
+        <w:r>
+          <w:rPr>
+            <w:rFonts w:ascii="Garamond" w:hAnsi="Garamond"/>
+            <w:highlight w:val="yellow"/>
+            <w:rPrChange w:id="183" w:author="Benjamin J. Makhlouf" w:date="2026-07-08T15:17:00Z" w16du:dateUtc="2026-07-08T22:17:00Z">
+              <w:rPr>
+                <w:rFonts w:ascii="Garamond" w:hAnsi="Garamond"/>
+              </w:rPr>
+            </w:rPrChange>
+          </w:rPr>
+          <w:t>(range X to Y)</w:t>
+        </w:r>
+      </w:ins>
+      <w:r>
+        <w:rPr>
+          <w:rFonts w:ascii="Garamond" w:hAnsi="Garamond"/>
+          <w:highlight w:val="yellow"/>
+          <w:rPrChange w:id="184" w:author="Benjamin J. Makhlouf" w:date="2026-07-08T15:17:00Z" w16du:dateUtc="2026-07-08T22:17:00Z">
+            <w:rPr>
+              <w:rFonts w:ascii="Garamond" w:hAnsi="Garamond"/>
+            </w:rPr>
+          </w:rPrChange>
+        </w:rPr>
+        <w:t>.</w:t>
+      </w:r>
+      <w:r>
+        <w:rPr>
+          <w:rFonts w:ascii="Garamond" w:hAnsi="Garamond"/>
+        </w:rPr>
+        <w:t xml:space="preserve"> Shortening the closure reduces this loss to less than 5% but offers very little protection for upstream stocks (Fig. 5). Extending the closure, by contrast, substantially increases protection for </w:t>
+      </w:r>
+      <w:ins w:id="185" w:author="Benjamin J. Makhlouf" w:date="2026-07-08T15:14:00Z" w16du:dateUtc="2026-07-08T22:14:00Z">
+        <w:r>
+          <w:rPr>
+            <w:rFonts w:ascii="Garamond" w:hAnsi="Garamond"/>
+          </w:rPr>
+          <w:t>upriver</w:t>
+        </w:r>
+      </w:ins>
+      <w:del w:id="186" w:author="Benjamin J. Makhlouf" w:date="2026-07-08T15:14:00Z" w16du:dateUtc="2026-07-08T22:14:00Z">
+        <w:r>
+          <w:rPr>
+            <w:rFonts w:ascii="Garamond" w:hAnsi="Garamond"/>
+          </w:rPr>
+          <w:delText>severa</w:delText>
+        </w:r>
+      </w:del>
+      <w:del w:id="187" w:author="Benjamin J. Makhlouf" w:date="2026-07-08T15:13:00Z" w16du:dateUtc="2026-07-08T22:13:00Z">
+        <w:r>
+          <w:rPr>
+            <w:rFonts w:ascii="Garamond" w:hAnsi="Garamond"/>
+          </w:rPr>
+          <w:delText>l</w:delText>
+        </w:r>
+      </w:del>
+      <w:r>
+        <w:rPr>
+          <w:rFonts w:ascii="Garamond" w:hAnsi="Garamond"/>
+        </w:rPr>
+        <w:t xml:space="preserve"> groups; however, an average of 17% and 24% of the total potential harvest fell within the front-end closure with a three or six-day extension to the current end date.</w:t>
       </w:r>
       <w:r>
         <w:t xml:space="preserve"> </w:t>
@@ -5124,8 +5731,65 @@
         <w:rPr>
           <w:rFonts w:ascii="Garamond" w:hAnsi="Garamond"/>
         </w:rPr>
-        <w:lastRenderedPageBreak/>
-        <w:t>The results presented here illustrate the most recent and comprehensive basin-wide quantification of the spatiotemporal patterns of Chinook salmon migrating into the Kuskokwim River. Our data corroborate previously observed relationships between run timing and watershed position of spawning habitat, wherein the earliest returning fish contribute to watersheds in the uppermost portions and the latest returning fish return to the furthest downstream portions of the watershed. This relationship was consistent throughout our multi-year dataset, emphasizing the consistency of this pattern across several generations despite variation in the overall migration timing and abundance.</w:t>
+        <w:t xml:space="preserve">The results presented here illustrate the most recent and comprehensive basin-wide quantification of the spatiotemporal patterns of Chinook salmon migrating into the Kuskokwim River. Our data corroborate previously observed relationships between run timing and watershed position of spawning habitat, wherein the earliest returning fish contribute to </w:t>
+      </w:r>
+      <w:ins w:id="188" w:author="Benjamin J. Makhlouf" w:date="2026-06-23T10:02:00Z" w16du:dateUtc="2026-06-23T17:02:00Z">
+        <w:r>
+          <w:rPr>
+            <w:rFonts w:ascii="Garamond" w:hAnsi="Garamond"/>
+          </w:rPr>
+          <w:t>tributaries</w:t>
+        </w:r>
+      </w:ins>
+      <w:del w:id="189" w:author="Benjamin J. Makhlouf" w:date="2026-06-23T10:02:00Z" w16du:dateUtc="2026-06-23T17:02:00Z">
+        <w:r>
+          <w:rPr>
+            <w:rFonts w:ascii="Garamond" w:hAnsi="Garamond"/>
+          </w:rPr>
+          <w:delText xml:space="preserve">watersheds </w:delText>
+        </w:r>
+      </w:del>
+      <w:r>
+        <w:rPr>
+          <w:rFonts w:ascii="Garamond" w:hAnsi="Garamond"/>
+        </w:rPr>
+        <w:t>in the uppermost portions and the latest returning fish return to the furthest downstream portions of the watershed. This relationship was consistent throughout our multi-year dataset</w:t>
+      </w:r>
+      <w:ins w:id="190" w:author="Benjamin J. Makhlouf" w:date="2026-07-08T15:15:00Z" w16du:dateUtc="2026-07-08T22:15:00Z">
+        <w:r>
+          <w:rPr>
+            <w:rFonts w:ascii="Garamond" w:hAnsi="Garamond"/>
+          </w:rPr>
+          <w:t xml:space="preserve"> (2017-2022)</w:t>
+        </w:r>
+      </w:ins>
+      <w:del w:id="191" w:author="Benjamin J. Makhlouf" w:date="2026-06-23T10:05:00Z" w16du:dateUtc="2026-06-23T17:05:00Z">
+        <w:r>
+          <w:rPr>
+            <w:rFonts w:ascii="Garamond" w:hAnsi="Garamond"/>
+          </w:rPr>
+          <w:delText>, emphasizing the consistency of this pattern</w:delText>
+        </w:r>
+      </w:del>
+      <w:r>
+        <w:rPr>
+          <w:rFonts w:ascii="Garamond" w:hAnsi="Garamond"/>
+        </w:rPr>
+        <w:t xml:space="preserve"> </w:t>
+      </w:r>
+      <w:del w:id="192" w:author="Benjamin J. Makhlouf" w:date="2026-06-23T10:05:00Z" w16du:dateUtc="2026-06-23T17:05:00Z">
+        <w:r>
+          <w:rPr>
+            <w:rFonts w:ascii="Garamond" w:hAnsi="Garamond"/>
+          </w:rPr>
+          <w:delText xml:space="preserve">across several generations </w:delText>
+        </w:r>
+      </w:del>
+      <w:r>
+        <w:rPr>
+          <w:rFonts w:ascii="Garamond" w:hAnsi="Garamond"/>
+        </w:rPr>
+        <w:t>despite variation in the overall migration timing and abundance.</w:t>
       </w:r>
     </w:p>
     <w:p>
@@ -5140,11 +5804,28 @@
           <w:bCs w:val="0"/>
         </w:rPr>
       </w:pPr>
-      <w:r>
-        <w:rPr>
-          <w:rFonts w:ascii="Garamond" w:hAnsi="Garamond"/>
-        </w:rPr>
-        <w:t>A clear pattern of early-returning upriver populations supports the front-end closure’s objective of protecting these fish from downriver harvest and providing more equitable harvest opportunities</w:t>
+      <w:commentRangeStart w:id="193"/>
+      <w:r>
+        <w:rPr>
+          <w:rFonts w:ascii="Garamond" w:hAnsi="Garamond"/>
+        </w:rPr>
+        <w:t>A</w:t>
+      </w:r>
+      <w:commentRangeEnd w:id="193"/>
+      <w:r>
+        <w:rPr>
+          <w:rStyle w:val="CommentReference"/>
+          <w:rFonts w:ascii="Garamond" w:hAnsi="Garamond"/>
+          <w:sz w:val="24"/>
+          <w:szCs w:val="24"/>
+        </w:rPr>
+        <w:commentReference w:id="193"/>
+      </w:r>
+      <w:r>
+        <w:rPr>
+          <w:rFonts w:ascii="Garamond" w:hAnsi="Garamond"/>
+        </w:rPr>
+        <w:t xml:space="preserve"> clear pattern of early-returning upriver populations supports the front-end closure’s objective of protecting these fish from downriver harvest and providing more equitable harvest opportunities</w:t>
       </w:r>
       <w:r>
         <w:rPr>
@@ -5159,7 +5840,14 @@
         <w:rPr>
           <w:rFonts w:ascii="Garamond" w:hAnsi="Garamond"/>
         </w:rPr>
-        <w:t xml:space="preserve">in the upper watershed. Upper Kuskokwim groups contributed substantially to early-season migrants (i.e. group two); however, the furthest upstream populations (group one) consistently represented only a small portion of total basin-wide returns in our dataset. Despite this variation in abundance, individuals in both upper watershed groups returned early in the migration season. As such, the front-end closure strategy as it is currently implemented provides harvest protection to upper watershed populations regardless of their overall abundance. For relatively small stocks such as those found in group one, this strategy may be particularly important for preserving biodiversity by preventing overharvest very early in the season when they may be co-migrating with much more abundant populations such as those in group two. Protecting these populations, despite relatively low returns, </w:t>
+        <w:t xml:space="preserve">in the upper watershed. Upper Kuskokwim groups contributed substantially to early-season migrants (i.e. group two); however, the furthest upstream populations (group one) consistently represented only a small portion of total basin-wide returns in our dataset. Despite this </w:t>
+      </w:r>
+      <w:r>
+        <w:rPr>
+          <w:rFonts w:ascii="Garamond" w:hAnsi="Garamond"/>
+        </w:rPr>
+        <w:lastRenderedPageBreak/>
+        <w:t xml:space="preserve">variation in abundance, individuals in both upper watershed groups returned early in the migration season. As such, the front-end closure strategy as it is currently implemented provides harvest protection to upper watershed populations regardless of their overall abundance. For relatively small stocks such as those found in group one, this strategy may be particularly important for preserving biodiversity by preventing overharvest very early in the season when they may be co-migrating with much more abundant populations such as those in group two. Protecting these populations, despite relatively low returns, </w:t>
       </w:r>
       <w:r>
         <w:rPr>
@@ -5236,8 +5924,81 @@
         <w:rPr>
           <w:rFonts w:ascii="Garamond" w:hAnsi="Garamond"/>
         </w:rPr>
+        <w:t xml:space="preserve">Despite a consistent overall relationship between watershed position and migration timing, we observed substantial interannual variability in both the proportional contributions of regional groups to the total run and the proportional protection afforded by the front-end closure strategy. Variability in spatial patterns of production aligns with well-documented variability in salmon life histories and previously observed shifts in habitat use across annual timescales </w:t>
+      </w:r>
+      <w:r>
+        <w:rPr>
+          <w:rFonts w:ascii="Garamond" w:hAnsi="Garamond"/>
+        </w:rPr>
+        <w:fldChar w:fldCharType="begin"/>
+      </w:r>
+      <w:r>
+        <w:rPr>
+          <w:rFonts w:ascii="Garamond" w:hAnsi="Garamond"/>
+        </w:rPr>
+        <w:instrText xml:space="preserve"> ADDIN ZOTERO_ITEM CSL_CITATION {"citationID":"xeiQXhMP","properties":{"formattedCitation":"(Brennan et al., 2019; Schindler et al., 2010)","plainCitation":"(Brennan et al., 2019; Schindler et al., 2010)","noteIndex":0},"citationItems":[{"id":3844,"uris":["http://zotero.org/users/8421274/items/RXD5IA9D"],"itemData":{"id":3844,"type":"article-journal","abstract":"Watersheds are complex mosaics of habitats whose conditions vary across space and time as landscape features filter overriding climate forcing, yet the extent to which the reliability of ecosystem services depends on these dynamics remains unknown. We quantified how shifting habitat mosaics are expressed across a range of spatial scales within a large, free-flowing river, and how they stabilize the production of Pacific salmon that support valuable fisheries. The strontium isotope records of ear stones (otoliths) show that the relative productivity of locations across the river network, as both natal- and juvenile-rearing habitat, varies widely among years and that this variability is expressed across a broad range of spatial scales, ultimately stabilizing the interannual production of fish at the scale of the entire basin.","container-title":"Science","DOI":"10.1126/science.aav4313","issue":"6442","page":"783-786","publisher":"American Association for the Advancement of Science","source":"science.org (Atypon)","title":"Shifting habitat mosaics and fish production across river basins","volume":"364","author":[{"family":"Brennan","given":"Sean R."},{"family":"Schindler","given":"Daniel E."},{"family":"Cline","given":"Timothy J."},{"family":"Walsworth","given":"Timothy E."},{"family":"Buck","given":"Greg"},{"family":"Fernandez","given":"Diego P."}],"issued":{"date-parts":[["2019"]]}}},{"id":272,"uris":["http://zotero.org/users/8421274/items/24NDGS7V"],"itemData":{"id":272,"type":"article-journal","abstract":"One of the most pervasive themes in ecology is that biological diversity stabilizes ecosystem processes and the services they provide to society, a concept that has become a common argument for biodiversity conservation. Species-rich communities are thought to produce more temporally stable ecosystem services because of the complementary or independent dynamics among species that perform similar ecosystem functions. Such variance dampening within communities is referred to as a portfolio effect and is analogous to the effects of asset diversity on the stability of financial portfolios. In ecology, these arguments have focused on the effects of species diversity on ecosystem stability but have not considered the importance of biologically relevant diversity within individual species. Current rates of population extirpation are probably at least three orders of magnitude higher than species extinction rates, so there is a pressing need to clarify how population and life history diversity affect the performance of individual species in providing important ecosystem services. Here we use five decades of data from Oncorhynchus nerka (sockeye salmon) in Bristol Bay, Alaska, to provide the first quantification of portfolio effects that derive from population and life history diversity in an important and heavily exploited species. Variability in annual Bristol Bay salmon returns is 2.2 times lower than it would be if the system consisted of a single homogenous population rather than the several hundred discrete populations it currently consists of. Furthermore, if it were a single homogeneous population, such increased variability would lead to ten times more frequent fisheries closures. Portfolio effects are also evident in watershed food webs, where they stabilize and extend predator access to salmon resources. Our results demonstrate the critical importance of maintaining population diversity for stabilizing ecosystem services and securing the economies and livelihoods that depend on them. The reliability of ecosystem services will erode faster than indicated by species loss alone. [PUBLICATION ABSTRACT]","container-title":"Nature","DOI":"https://doi-org.prox.lib.ncsu.edu/10.1038/nature09060","ISSN":"00280836","issue":"7298","language":"English","license":"Copyright Nature Publishing Group Jun 3, 2010","note":"number-of-pages: 5\npublisher-place: London, United States","publisher":"Nature Publishing Group","section":"LETTERS","source":"ProQuest","title":"Population diversity and the portfolio effect in an exploited species","URL":"http://www.proquest.com/docview/375318240/abstract/317AC81E34EB4163PQ/1","volume":"465","author":[{"family":"Schindler","given":"Daniel E."},{"family":"Hilborn","given":"Ray"},{"family":"Chasco","given":"Brandon"},{"family":"Boatright","given":"Christopher P."},{"family":"Quinn","given":"Thomas P."},{"family":"Rogers","given":"Lauren A."},{"family":"Webster","given":"Michael S."}],"accessed":{"date-parts":[["2022",5,12]]},"issued":{"date-parts":[["2010",6,3]]}}}],"schema":"https://github.com/citation-style-language/schema/raw/master/csl-citation.json"} </w:instrText>
+      </w:r>
+      <w:r>
+        <w:rPr>
+          <w:rFonts w:ascii="Garamond" w:hAnsi="Garamond"/>
+        </w:rPr>
+        <w:fldChar w:fldCharType="separate"/>
+      </w:r>
+      <w:r>
+        <w:rPr>
+          <w:rFonts w:ascii="Garamond" w:hAnsi="Garamond"/>
+          <w:noProof/>
+        </w:rPr>
+        <w:t>(Brennan et al., 2019; Schindler et al., 2010)</w:t>
+      </w:r>
+      <w:r>
+        <w:rPr>
+          <w:rFonts w:ascii="Garamond" w:hAnsi="Garamond"/>
+        </w:rPr>
+        <w:fldChar w:fldCharType="end"/>
+      </w:r>
+      <w:r>
+        <w:rPr>
+          <w:rFonts w:ascii="Garamond" w:hAnsi="Garamond"/>
+        </w:rPr>
+        <w:t xml:space="preserve">. However, variability in the efficacy of the front-end closure also likely reflects the interaction between run dynamics and management strategies that operate on a fixed calendar date. Because the closure is implemented on a fixed schedule, interannual variation in migration timing means that the proportion of the run occurring within the closure window </w:t>
+      </w:r>
+      <w:commentRangeStart w:id="194"/>
+      <w:r>
+        <w:rPr>
+          <w:rFonts w:ascii="Garamond" w:hAnsi="Garamond"/>
+        </w:rPr>
+        <w:t>depends on both the timing (early vs. late) and duration (compressed vs. protracted) of the overall migration</w:t>
+      </w:r>
+      <w:commentRangeEnd w:id="194"/>
+      <w:r>
+        <w:rPr>
+          <w:rStyle w:val="CommentReference"/>
+          <w:rFonts w:ascii="Garamond" w:hAnsi="Garamond"/>
+          <w:sz w:val="24"/>
+          <w:szCs w:val="24"/>
+        </w:rPr>
+        <w:commentReference w:id="194"/>
+      </w:r>
+      <w:r>
+        <w:rPr>
+          <w:rFonts w:ascii="Garamond" w:hAnsi="Garamond"/>
+        </w:rPr>
+        <w:t xml:space="preserve">. Late return timing or extended run duration may result in less proportional contribution within the closure window as compared to earlier returning and less protracted run timing. As a result, both the amount and distribution of populations afforded protection depend on this interaction. When combined with natural variability in basin-wide production patterns, this may introduce substantial </w:t>
+      </w:r>
+      <w:r>
+        <w:rPr>
+          <w:rFonts w:ascii="Garamond" w:hAnsi="Garamond"/>
+        </w:rPr>
         <w:lastRenderedPageBreak/>
-        <w:t xml:space="preserve">Despite a consistent overall relationship between watershed position and migration timing, we observed substantial interannual variability in both the proportional contributions of regional groups to the total run and the proportional protection afforded by the front-end closure strategy. Variability in spatial patterns of production aligns with well-documented variability in salmon life histories and previously observed shifts in habitat use across annual timescales </w:t>
+        <w:t xml:space="preserve">variability in the population-specific effect of the front-end closure. </w:t>
+      </w:r>
+      <w:commentRangeStart w:id="195"/>
+      <w:r>
+        <w:rPr>
+          <w:rFonts w:ascii="Garamond" w:hAnsi="Garamond"/>
+        </w:rPr>
+        <w:t xml:space="preserve">These results suggest a potential limitation of a fixed date closure and highlight the difficulty of managing for a dynamic ecosystem with fixed-duration management. A more dynamic closure which is responsive to predicted or observed run dynamics may provide more consistent protection to upstream populations. Improvement of run timing forecasts </w:t>
       </w:r>
       <w:r>
         <w:rPr>
@@ -5249,7 +6010,7 @@
         <w:rPr>
           <w:rFonts w:ascii="Garamond" w:hAnsi="Garamond"/>
         </w:rPr>
-        <w:instrText xml:space="preserve"> ADDIN ZOTERO_ITEM CSL_CITATION {"citationID":"xeiQXhMP","properties":{"formattedCitation":"(Brennan et al., 2019; Schindler et al., 2010)","plainCitation":"(Brennan et al., 2019; Schindler et al., 2010)","noteIndex":0},"citationItems":[{"id":3844,"uris":["http://zotero.org/users/8421274/items/RXD5IA9D"],"itemData":{"id":3844,"type":"article-journal","abstract":"Watersheds are complex mosaics of habitats whose conditions vary across space and time as landscape features filter overriding climate forcing, yet the extent to which the reliability of ecosystem services depends on these dynamics remains unknown. We quantified how shifting habitat mosaics are expressed across a range of spatial scales within a large, free-flowing river, and how they stabilize the production of Pacific salmon that support valuable fisheries. The strontium isotope records of ear stones (otoliths) show that the relative productivity of locations across the river network, as both natal- and juvenile-rearing habitat, varies widely among years and that this variability is expressed across a broad range of spatial scales, ultimately stabilizing the interannual production of fish at the scale of the entire basin.","container-title":"Science","DOI":"10.1126/science.aav4313","issue":"6442","page":"783-786","publisher":"American Association for the Advancement of Science","source":"science.org (Atypon)","title":"Shifting habitat mosaics and fish production across river basins","volume":"364","author":[{"family":"Brennan","given":"Sean R."},{"family":"Schindler","given":"Daniel E."},{"family":"Cline","given":"Timothy J."},{"family":"Walsworth","given":"Timothy E."},{"family":"Buck","given":"Greg"},{"family":"Fernandez","given":"Diego P."}],"issued":{"date-parts":[["2019"]]}}},{"id":272,"uris":["http://zotero.org/users/8421274/items/24NDGS7V"],"itemData":{"id":272,"type":"article-journal","abstract":"One of the most pervasive themes in ecology is that biological diversity stabilizes ecosystem processes and the services they provide to society, a concept that has become a common argument for biodiversity conservation. Species-rich communities are thought to produce more temporally stable ecosystem services because of the complementary or independent dynamics among species that perform similar ecosystem functions. Such variance dampening within communities is referred to as a portfolio effect and is analogous to the effects of asset diversity on the stability of financial portfolios. In ecology, these arguments have focused on the effects of species diversity on ecosystem stability but have not considered the importance of biologically relevant diversity within individual species. Current rates of population extirpation are probably at least three orders of magnitude higher than species extinction rates, so there is a pressing need to clarify how population and life history diversity affect the performance of individual species in providing important ecosystem services. Here we use five decades of data from Oncorhynchus nerka (sockeye salmon) in Bristol Bay, Alaska, to provide the first quantification of portfolio effects that derive from population and life history diversity in an important and heavily exploited species. Variability in annual Bristol Bay salmon returns is 2.2 times lower than it would be if the system consisted of a single homogenous population rather than the several hundred discrete populations it currently consists of. Furthermore, if it were a single homogeneous population, such increased variability would lead to ten times more frequent fisheries closures. Portfolio effects are also evident in watershed food webs, where they stabilize and extend predator access to salmon resources. Our results demonstrate the critical importance of maintaining population diversity for stabilizing ecosystem services and securing the economies and livelihoods that depend on them. The reliability of ecosystem services will erode faster than indicated by species loss alone. [PUBLICATION ABSTRACT]","container-title":"Nature","DOI":"https://doi-org.prox.lib.ncsu.edu/10.1038/nature09060","ISSN":"00280836","issue":"7298","language":"English","license":"Copyright Nature Publishing Group Jun 3, 2010","note":"number-of-pages: 5\npublisher-place: London, United States","publisher":"Nature Publishing Group","section":"LETTERS","source":"ProQuest","title":"Population diversity and the portfolio effect in an exploited species","URL":"http://www.proquest.com/docview/375318240/abstract/317AC81E34EB4163PQ/1","volume":"465","author":[{"family":"Schindler","given":"Daniel E."},{"family":"Hilborn","given":"Ray"},{"family":"Chasco","given":"Brandon"},{"family":"Boatright","given":"Christopher P."},{"family":"Quinn","given":"Thomas P."},{"family":"Rogers","given":"Lauren A."},{"family":"Webster","given":"Michael S."}],"accessed":{"date-parts":[["2022",5,12]]},"issued":{"date-parts":[["2010",6,3]]}}}],"schema":"https://github.com/citation-style-language/schema/raw/master/csl-citation.json"} </w:instrText>
+        <w:instrText xml:space="preserve"> ADDIN ZOTERO_ITEM CSL_CITATION {"citationID":"0VgE4Nmv","properties":{"formattedCitation":"(Mundy, 1982; Staton et al., 2017)","plainCitation":"(Mundy, 1982; Staton et al., 2017)","dontUpdate":true,"noteIndex":0},"citationItems":[{"id":5973,"uris":["http://zotero.org/users/8421274/items/T67UPK8M"],"itemData":{"id":5973,"type":"article-journal","abstract":"An objective definition of migratory timing is applied to commercial and test fishing catch data for chinook salmon (Oncorhynchus tshawytscha) from the Yukon delta, 1961-1980. On the average, 91% of all the commercial catch is taken before the end of June, with one-half of the catch being taken by June 21. The middle part of the migration (25-75%) usually is available for harvest only over a span of 11 days. However, the length of the central span has varied from 8 to 13 days, depending on timing. Mean dates of migration based on catch and CPUE data were nearly identical (about June 21), with range limits of June 12-30. Test fishing and commercial catch data for 1963-1978 showed no significant difference (α = 0.05) for the mean date of migration. The spread of the migration (variance) appears to be inversely proportional to the mean date of migration for early and late migrations. Timing of migration may be dependent on factors related to air temperature.","container-title":"North American Journal of Fisheries Management","DOI":"10.1577/1548-8659(1982)2&lt;359:COMTSF&gt;2.0.CO;2","ISSN":"0275-5947","issue":"4","note":"_eprint: https://doi.org/10.1577/1548-8659(1982)2&lt;359:COMTSF&gt;2.0.CO;2","page":"359-370","publisher":"AFS Website","source":"Taylor and Francis+NEJM","title":"Computation of Migratory Timing Statistics for Adult Chinook Salmon in the Yukon River, Alaska, and Their Relevance to Fisheries Management","volume":"2","author":[{"family":"Mundy","given":"P. R."}],"issued":{"date-parts":[["1982",10,1]]}}},{"id":2532,"uris":["http://zotero.org/users/8421274/items/SGCHNLTN"],"itemData":{"id":2532,"type":"article-journal","abstract":"Annual variation in adult salmon migration timing makes the interpretation of in-season assessment data difficult, leading to much in-season uncertainty in run size. We developed and evaluated a run timing forecast model for the Kuskokwim River Chinook salmon stock, located in western Alaska, intended to aid in reducing this source of uncertainty. An objective and adaptive approach (using model-averaging and a sliding window algorithm to select predictive time periods, both calibrated annually) was adopted to deal with multidimensional selection of four climatic variables and was based entirely on predictive performance. Forecast cross-validation was used to evaluate the performance of three forecasting approaches: the null (i.e., intercept only) model, the single model with the lowest mean absolute error, and a model-averaged forecast across 16 nested linear models. As of 2016, the null model had the lowest mean absolute error (2.64days), although the model-averaged forecast performed as well or better than the null model in the majority of retrospective years. The model-averaged forecast had a consistent mean absolute error regardless of the type of year (i.e., average or extreme early/late) the forecast was made for, which was not true of the null model. The availability of the run timing forecast was not found to increase overall accuracy of in-season run assessments in relation to the null model, but was found to substantially increase the precision of these assessments, particularly early in the season.","container-title":"Fisheries Research","DOI":"10.1016/j.fishres.2017.05.003","ISSN":"0165-7836","journalAbbreviation":"Fisheries Research","language":"en","page":"9-21","source":"ScienceDirect","title":"Development and evaluation of a migration timing forecast model for Kuskokwim River Chinook salmon","volume":"194","author":[{"family":"Staton","given":"Benjamin A."},{"family":"Catalano","given":"Matthew J."},{"family":"Farmer","given":"Troy M."},{"family":"Abebe","given":"Asheber"},{"family":"Dobson","given":"F. Stephen"}],"issued":{"date-parts":[["2017",10,1]]}}}],"schema":"https://github.com/citation-style-language/schema/raw/master/csl-citation.json"} </w:instrText>
       </w:r>
       <w:r>
         <w:rPr>
@@ -5262,7 +6023,7 @@
           <w:rFonts w:ascii="Garamond" w:hAnsi="Garamond"/>
           <w:noProof/>
         </w:rPr>
-        <w:t>(Brennan et al., 2019; Schindler et al., 2010)</w:t>
+        <w:t>(e.g. Mundy, 1982; Staton et al., 2017)</w:t>
       </w:r>
       <w:r>
         <w:rPr>
@@ -5274,47 +6035,19 @@
         <w:rPr>
           <w:rFonts w:ascii="Garamond" w:hAnsi="Garamond"/>
         </w:rPr>
-        <w:t xml:space="preserve">. However, variability in the efficacy of the front-end closure also likely reflects the interaction between run dynamics and management strategies that operate on a fixed calendar date. Because the closure is implemented on a fixed schedule, interannual variation in migration timing means that the proportion of the run occurring within the closure window depends on both the timing (early vs. late) and duration (compressed vs. protracted) of the overall migration. Late return timing or extended run duration may result in less proportional contribution within the closure window as compared to earlier returning and less protracted run timing. As a result, both the amount and distribution of populations afforded protection depend on this interaction. When combined with natural variability in basin-wide production patterns, this may introduce substantial variability in the population-specific effect of the front-end closure. These results suggest a potential limitation of a fixed date closure and highlight the difficulty of managing for a dynamic ecosystem with fixed-duration management. A more dynamic closure which is responsive to predicted or observed run dynamics may provide more consistent protection to upstream populations. Improvement of run timing forecasts </w:t>
-      </w:r>
-      <w:r>
-        <w:rPr>
-          <w:rFonts w:ascii="Garamond" w:hAnsi="Garamond"/>
-        </w:rPr>
-        <w:fldChar w:fldCharType="begin"/>
-      </w:r>
-      <w:r>
-        <w:rPr>
-          <w:rFonts w:ascii="Garamond" w:hAnsi="Garamond"/>
-        </w:rPr>
-        <w:instrText xml:space="preserve"> ADDIN ZOTERO_ITEM CSL_CITATION {"citationID":"0VgE4Nmv","properties":{"formattedCitation":"(Mundy, 1982; Staton et al., 2017)","plainCitation":"(Mundy, 1982; Staton et al., 2017)","dontUpdate":true,"noteIndex":0},"citationItems":[{"id":5973,"uris":["http://zotero.org/users/8421274/items/T67UPK8M"],"itemData":{"id":5973,"type":"article-journal","abstract":"An objective definition of migratory timing is applied to commercial and test fishing catch data for chinook salmon (Oncorhynchus tshawytscha) from the Yukon delta, 1961-1980. On the average, 91% of all the commercial catch is taken before the end of June, with one-half of the catch being taken by June 21. The middle part of the migration (25-75%) usually is available for harvest only over a span of 11 days. However, the length of the central span has varied from 8 to 13 days, depending on timing. Mean dates of migration based on catch and CPUE data were nearly identical (about June 21), with range limits of June 12-30. Test fishing and commercial catch data for 1963-1978 showed no significant difference (α = 0.05) for the mean date of migration. The spread of the migration (variance) appears to be inversely proportional to the mean date of migration for early and late migrations. Timing of migration may be dependent on factors related to air temperature.","container-title":"North American Journal of Fisheries Management","DOI":"10.1577/1548-8659(1982)2&lt;359:COMTSF&gt;2.0.CO;2","ISSN":"0275-5947","issue":"4","note":"_eprint: https://doi.org/10.1577/1548-8659(1982)2&lt;359:COMTSF&gt;2.0.CO;2","page":"359-370","publisher":"AFS Website","source":"Taylor and Francis+NEJM","title":"Computation of Migratory Timing Statistics for Adult Chinook Salmon in the Yukon River, Alaska, and Their Relevance to Fisheries Management","volume":"2","author":[{"family":"Mundy","given":"P. R."}],"issued":{"date-parts":[["1982",10,1]]}}},{"id":2532,"uris":["http://zotero.org/users/8421274/items/SGCHNLTN"],"itemData":{"id":2532,"type":"article-journal","abstract":"Annual variation in adult salmon migration timing makes the interpretation of in-season assessment data difficult, leading to much in-season uncertainty in run size. We developed and evaluated a run timing forecast model for the Kuskokwim River Chinook salmon stock, located in western Alaska, intended to aid in reducing this source of uncertainty. An objective and adaptive approach (using model-averaging and a sliding window algorithm to select predictive time periods, both calibrated annually) was adopted to deal with multidimensional selection of four climatic variables and was based entirely on predictive performance. Forecast cross-validation was used to evaluate the performance of three forecasting approaches: the null (i.e., intercept only) model, the single model with the lowest mean absolute error, and a model-averaged forecast across 16 nested linear models. As of 2016, the null model had the lowest mean absolute error (2.64days), although the model-averaged forecast performed as well or better than the null model in the majority of retrospective years. The model-averaged forecast had a consistent mean absolute error regardless of the type of year (i.e., average or extreme early/late) the forecast was made for, which was not true of the null model. The availability of the run timing forecast was not found to increase overall accuracy of in-season run assessments in relation to the null model, but was found to substantially increase the precision of these assessments, particularly early in the season.","container-title":"Fisheries Research","DOI":"10.1016/j.fishres.2017.05.003","ISSN":"0165-7836","journalAbbreviation":"Fisheries Research","language":"en","page":"9-21","source":"ScienceDirect","title":"Development and evaluation of a migration timing forecast model for Kuskokwim River Chinook salmon","volume":"194","author":[{"family":"Staton","given":"Benjamin A."},{"family":"Catalano","given":"Matthew J."},{"family":"Farmer","given":"Troy M."},{"family":"Abebe","given":"Asheber"},{"family":"Dobson","given":"F. Stephen"}],"issued":{"date-parts":[["2017",10,1]]}}}],"schema":"https://github.com/citation-style-language/schema/raw/master/csl-citation.json"} </w:instrText>
-      </w:r>
-      <w:r>
-        <w:rPr>
-          <w:rFonts w:ascii="Garamond" w:hAnsi="Garamond"/>
-        </w:rPr>
-        <w:fldChar w:fldCharType="separate"/>
-      </w:r>
-      <w:r>
-        <w:rPr>
-          <w:rFonts w:ascii="Garamond" w:hAnsi="Garamond"/>
-          <w:noProof/>
-        </w:rPr>
-        <w:t>(e.g. Mundy, 1982; Staton et al., 2017)</w:t>
-      </w:r>
-      <w:r>
-        <w:rPr>
-          <w:rFonts w:ascii="Garamond" w:hAnsi="Garamond"/>
-        </w:rPr>
-        <w:fldChar w:fldCharType="end"/>
-      </w:r>
-      <w:r>
-        <w:rPr>
-          <w:rFonts w:ascii="Garamond" w:hAnsi="Garamond"/>
-        </w:rPr>
         <w:t xml:space="preserve"> might allow for variable front-end closure timing among years; however, until such reliable forecasting methods are developed for the Kuskokwim River, the static approach currently employed here appears to perform relatively well at protecting the upriver stocks that are the primary focus of conservation.</w:t>
       </w:r>
       <w:r>
         <w:t xml:space="preserve"> </w:t>
+      </w:r>
+      <w:commentRangeEnd w:id="195"/>
+      <w:r>
+        <w:rPr>
+          <w:rStyle w:val="CommentReference"/>
+          <w:sz w:val="24"/>
+          <w:szCs w:val="24"/>
+        </w:rPr>
+        <w:commentReference w:id="195"/>
       </w:r>
     </w:p>
     <w:p>
@@ -5330,8 +6063,30 @@
         <w:rPr>
           <w:rFonts w:ascii="Garamond" w:hAnsi="Garamond"/>
         </w:rPr>
-        <w:lastRenderedPageBreak/>
-        <w:t xml:space="preserve">Simulated changes to the front-end closure duration increased the average protection afforded to several regional groups, with a six-day extension from the current end date resulting in increased protection to regional groups one and two by 32.3% and 21.3%. However, increasing the duration of the closure did not result in high protection in all years. In both the three and six-day extension scenarios, several years of data displayed moderately low protection in years where the average run timing was relatively late, reiterating the challenge of estimating the population specific impacts even with a longer duration closure window. In addition, management decisions must consider the dual goals of maintaining both biodiversity and harvest opportunity. As currently implemented, the front-end closure on the Kuskokwim resulted in 12% of the total potential harvest falling within the closure window. Although the three-day and six-day extensions did improve both the minimum and average protection afforded to upper watershed groups, they also resulted in an additional 6% and 14% of the potential harvest falling within the closure window. </w:t>
+        <w:t xml:space="preserve">Simulated changes to the front-end closure duration increased the average protection afforded to several regional groups, with a six-day extension from the current end date resulting in increased protection to regional groups one and two by 32.3% and 21.3%. However, increasing the duration of the closure did not result in high protection in all years. In both the three and six-day extension scenarios, several years of data displayed moderately low protection in years where the average run timing was relatively late, reiterating the challenge of estimating the population specific impacts even with a longer duration closure window. In addition, management decisions must consider the dual goals of maintaining both biodiversity and harvest opportunity. As currently implemented, the front-end closure on the Kuskokwim resulted in 12% of the total potential harvest falling within the closure window. Although the three-day and six-day extensions did improve both the minimum and average protection afforded to upper watershed groups, they also resulted in an additional </w:t>
+      </w:r>
+      <w:commentRangeStart w:id="196"/>
+      <w:r>
+        <w:rPr>
+          <w:rFonts w:ascii="Garamond" w:hAnsi="Garamond"/>
+        </w:rPr>
+        <w:t xml:space="preserve">6% and 14% </w:t>
+      </w:r>
+      <w:commentRangeEnd w:id="196"/>
+      <w:r>
+        <w:rPr>
+          <w:rStyle w:val="CommentReference"/>
+          <w:rFonts w:ascii="Garamond" w:hAnsi="Garamond"/>
+          <w:sz w:val="24"/>
+          <w:szCs w:val="24"/>
+        </w:rPr>
+        <w:commentReference w:id="196"/>
+      </w:r>
+      <w:r>
+        <w:rPr>
+          <w:rFonts w:ascii="Garamond" w:hAnsi="Garamond"/>
+        </w:rPr>
+        <w:t xml:space="preserve">of the potential harvest falling within the closure window. </w:t>
       </w:r>
     </w:p>
     <w:p>
@@ -5347,14 +6102,37 @@
         <w:rPr>
           <w:rFonts w:ascii="Garamond" w:hAnsi="Garamond"/>
         </w:rPr>
-        <w:t xml:space="preserve">Protecting upper Kuskokwim stocks through a front-end closure appears to be an effective strategy for maintaining biodiversity in the upper watershed while supporting basin-wide escapement goals and harvest opportunities. However, the overall effectiveness of this strategy in sustaining stock diversity and balancing conservation with harvest depends not only on the protection provided to upper-watershed stocks during the closure, but also on how the closure affects overall harvest opportunity and harvest behavior once the fishery reopens. For example, a closure which protects a large proportion of upstream stocks by prohibiting harvest on a significant portion of the run may concentrate fishing pressure on later returning stocks. As a result, this shift in the temporal distribution of fishing pressure may impact weak downstream stocks as compared to the same harvest pressure distributed across the full migration window, thereby degrading biodiversity. Further, the timing of the front-end closure coincides with the preferred and traditional timing of </w:t>
+        <w:t xml:space="preserve">Protecting upper Kuskokwim stocks through a front-end closure appears to be an effective strategy for maintaining biodiversity in the upper watershed while supporting basin-wide escapement goals and harvest opportunities. However, the overall effectiveness of this strategy in sustaining </w:t>
       </w:r>
       <w:r>
         <w:rPr>
           <w:rFonts w:ascii="Garamond" w:hAnsi="Garamond"/>
         </w:rPr>
         <w:lastRenderedPageBreak/>
-        <w:t xml:space="preserve">fishing for many communities in the lower Kuskokwim. An extended duration of this closure has the potential to further disrupt traditional fishing opportunities for these communities and cause further hardship to subsistence communities in the basin. The efficacy of management strategies such as front-end closures must therefore be evaluated in the context of ecosystem, fishery, and cultural dynamics to fully understand their role in maintaining basin-wide biodiversity. </w:t>
+        <w:t xml:space="preserve">stock diversity and balancing conservation with harvest depends not only on the protection provided to upper-watershed stocks during the closure, but also on how the closure affects overall harvest opportunity and harvest behavior once the fishery reopens. For example, a closure which protects a large proportion of upstream stocks by prohibiting harvest on a significant portion of the run may concentrate fishing pressure on later returning stocks. As a result, this shift in the temporal distribution of fishing pressure may impact weak downstream stocks as compared to the same harvest pressure distributed across the full migration window, thereby degrading biodiversity. Further, the timing of the front-end closure coincides with the preferred and traditional timing of fishing for many communities in the lower Kuskokwim. An extended duration of this closure has the potential to further disrupt </w:t>
+      </w:r>
+      <w:commentRangeStart w:id="197"/>
+      <w:r>
+        <w:rPr>
+          <w:rFonts w:ascii="Garamond" w:hAnsi="Garamond"/>
+        </w:rPr>
+        <w:t xml:space="preserve">traditional fishing opportunities </w:t>
+      </w:r>
+      <w:commentRangeEnd w:id="197"/>
+      <w:r>
+        <w:rPr>
+          <w:rStyle w:val="CommentReference"/>
+          <w:rFonts w:ascii="Garamond" w:hAnsi="Garamond"/>
+          <w:sz w:val="24"/>
+          <w:szCs w:val="24"/>
+        </w:rPr>
+        <w:commentReference w:id="197"/>
+      </w:r>
+      <w:r>
+        <w:rPr>
+          <w:rFonts w:ascii="Garamond" w:hAnsi="Garamond"/>
+        </w:rPr>
+        <w:t xml:space="preserve">for these communities and cause further hardship to subsistence communities in the basin. The efficacy of management strategies such as front-end closures must therefore be evaluated in the context of ecosystem, fishery, and cultural dynamics to fully understand their role in maintaining basin-wide biodiversity. </w:t>
       </w:r>
     </w:p>
     <w:p>
@@ -5407,7 +6185,30 @@
         <w:rPr>
           <w:rFonts w:ascii="Garamond" w:hAnsi="Garamond"/>
         </w:rPr>
-        <w:t xml:space="preserve">, and our results replicate ecological patterns which have been observed in other contexts in the basin. Although these methods present some limitations for in-season management (i.e. turnaround time), </w:t>
+        <w:t xml:space="preserve">, </w:t>
+      </w:r>
+      <w:commentRangeStart w:id="198"/>
+      <w:r>
+        <w:rPr>
+          <w:rFonts w:ascii="Garamond" w:hAnsi="Garamond"/>
+        </w:rPr>
+        <w:t>and our results replicate ecological patterns which have been observed in other contexts in the basin</w:t>
+      </w:r>
+      <w:commentRangeEnd w:id="198"/>
+      <w:r>
+        <w:rPr>
+          <w:rStyle w:val="CommentReference"/>
+          <w:rFonts w:ascii="Garamond" w:hAnsi="Garamond"/>
+          <w:sz w:val="24"/>
+          <w:szCs w:val="24"/>
+        </w:rPr>
+        <w:commentReference w:id="198"/>
+      </w:r>
+      <w:r>
+        <w:rPr>
+          <w:rFonts w:ascii="Garamond" w:hAnsi="Garamond"/>
+        </w:rPr>
+        <w:t xml:space="preserve">. Although these methods present some limitations for in-season management (i.e. turnaround time), </w:t>
       </w:r>
       <w:r>
         <w:rPr>
@@ -5425,6 +6226,7 @@
         </w:rPr>
         <w:t xml:space="preserve"> </w:t>
       </w:r>
+      <w:commentRangeStart w:id="199"/>
       <w:r>
         <w:rPr>
           <w:rFonts w:ascii="Garamond" w:hAnsi="Garamond"/>
@@ -5447,6 +6249,16 @@
         </w:rPr>
         <w:t xml:space="preserve"> </w:t>
       </w:r>
+      <w:commentRangeEnd w:id="199"/>
+      <w:r>
+        <w:rPr>
+          <w:rStyle w:val="CommentReference"/>
+          <w:rFonts w:ascii="Garamond" w:eastAsiaTheme="majorEastAsia" w:hAnsi="Garamond"/>
+          <w:sz w:val="24"/>
+          <w:szCs w:val="24"/>
+        </w:rPr>
+        <w:commentReference w:id="199"/>
+      </w:r>
       <w:r>
         <w:rPr>
           <w:rStyle w:val="Strong"/>
@@ -5460,7 +6272,14 @@
         <w:rPr>
           <w:rFonts w:ascii="Garamond" w:hAnsi="Garamond"/>
         </w:rPr>
-        <w:t>eveloping methods that explicitly consider this diversity and deploying them to better understand tradeoffs between conservation and exploitation strategies is an important step toward designing management frameworks that provide ecosystem services while safeguarding their reliability and the communities they support.</w:t>
+        <w:t xml:space="preserve">eveloping methods that explicitly consider this </w:t>
+      </w:r>
+      <w:r>
+        <w:rPr>
+          <w:rFonts w:ascii="Garamond" w:hAnsi="Garamond"/>
+        </w:rPr>
+        <w:lastRenderedPageBreak/>
+        <w:t>diversity and deploying them to better understand tradeoffs between conservation and exploitation strategies is an important step toward designing management frameworks that provide ecosystem services while safeguarding their reliability and the communities they support.</w:t>
       </w:r>
     </w:p>
     <w:p>
@@ -5491,14 +6310,7 @@
         <w:rPr>
           <w:rFonts w:ascii="Garamond" w:hAnsi="Garamond" w:cs="Times New Roman"/>
         </w:rPr>
-        <w:t xml:space="preserve">We thank the Alaska Department of Fish &amp; Game, particularly Sean Larson and Zachary Liller for coordinating otolith sampling at the Bethel Test Fishery and for feedback on the study design and manuscript. Funding for this work was provided by the Arctic-Yukon-Kuskokwim Sustainable Salmon Initiative. Joseph Spaeder of the AYK-SSI also provided feedback on the study design. We also thank the local community members who supported otolith removal and collection as well as the ONC fisheries program staff members who helped support data collection and distributed sampled fish to elders, disabled, and widowed community members. This work was </w:t>
-      </w:r>
-      <w:r>
-        <w:rPr>
-          <w:rFonts w:ascii="Garamond" w:hAnsi="Garamond" w:cs="Times New Roman"/>
-        </w:rPr>
-        <w:lastRenderedPageBreak/>
-        <w:t xml:space="preserve">made possible by the efforts of Dr. Sean Brennan, who was instrumental in the collection of these datasets and was motivated to push forward on the boundaries of using isotope-based methods to explore ecological processes in Alaska salmon. </w:t>
+        <w:t xml:space="preserve">We thank the Alaska Department of Fish &amp; Game, particularly Sean Larson and Zachary Liller for coordinating otolith sampling at the Bethel Test Fishery and for feedback on the study design and manuscript. Funding for this work was provided by the Arctic-Yukon-Kuskokwim Sustainable Salmon Initiative. Joseph Spaeder of the AYK-SSI also provided feedback on the study design. We also thank the local community members who supported otolith removal and collection as well as the ONC fisheries program staff members who helped support data collection and distributed sampled fish to elders, disabled, and widowed community members. This work was made possible by the efforts of Dr. Sean Brennan, who was instrumental in the collection of these datasets and was motivated to push forward on the boundaries of using isotope-based methods to explore ecological processes in Alaska salmon. </w:t>
       </w:r>
     </w:p>
     <w:p>
@@ -5648,6 +6460,7 @@
         <w:rPr>
           <w:rFonts w:ascii="Garamond" w:hAnsi="Garamond"/>
         </w:rPr>
+        <w:lastRenderedPageBreak/>
         <w:t xml:space="preserve">Bolnick, D. I., Amarasekare, P., Araújo, M. S., Bürger, R., Levine, J. M., Novak, M., Rudolf, V. H. W., Schreiber, S. J., Urban, M. C., &amp; Vasseur, D. A. (2011). Why intraspecific trait variation matters in community ecology. </w:t>
       </w:r>
       <w:r>
@@ -5732,7 +6545,6 @@
         <w:rPr>
           <w:rFonts w:ascii="Garamond" w:hAnsi="Garamond"/>
         </w:rPr>
-        <w:lastRenderedPageBreak/>
         <w:t xml:space="preserve">Brennan, S. R., Schindler, D. E., Cline, T. J., Walsworth, T. E., Buck, G., &amp; Fernandez, D. P. (2019). Shifting habitat mosaics and fish production across river basins. </w:t>
       </w:r>
       <w:r>
@@ -5922,14 +6734,66 @@
       <w:pPr>
         <w:pStyle w:val="Bibliography"/>
         <w:rPr>
-          <w:rFonts w:ascii="Garamond" w:hAnsi="Garamond"/>
-        </w:rPr>
-      </w:pPr>
-      <w:r>
-        <w:rPr>
-          <w:rFonts w:ascii="Garamond" w:hAnsi="Garamond"/>
-        </w:rPr>
-        <w:t xml:space="preserve">Capo, R. C., Stewart, B. W., &amp; Chadwick, O. A. (1998). Strontium isotopes as tracers of ecosystem processes: Theory and methods. </w:t>
+          <w:del w:id="200" w:author="Benjamin J. Makhlouf" w:date="2026-07-08T12:10:00Z" w16du:dateUtc="2026-07-08T19:10:00Z"/>
+          <w:rFonts w:ascii="Garamond" w:hAnsi="Garamond"/>
+        </w:rPr>
+      </w:pPr>
+      <w:del w:id="201" w:author="Benjamin J. Makhlouf" w:date="2026-07-08T12:10:00Z" w16du:dateUtc="2026-07-08T19:10:00Z">
+        <w:r>
+          <w:rPr>
+            <w:rFonts w:ascii="Garamond" w:hAnsi="Garamond"/>
+          </w:rPr>
+          <w:delText xml:space="preserve">Capo, R. C., Stewart, B. W., &amp; Chadwick, O. A. (1998). Strontium isotopes as tracers of ecosystem processes: Theory and methods. </w:delText>
+        </w:r>
+        <w:r>
+          <w:rPr>
+            <w:rFonts w:ascii="Garamond" w:hAnsi="Garamond"/>
+            <w:i/>
+            <w:iCs/>
+          </w:rPr>
+          <w:delText>Geoderma</w:delText>
+        </w:r>
+        <w:r>
+          <w:rPr>
+            <w:rFonts w:ascii="Garamond" w:hAnsi="Garamond"/>
+          </w:rPr>
+          <w:delText xml:space="preserve">, </w:delText>
+        </w:r>
+        <w:r>
+          <w:rPr>
+            <w:rFonts w:ascii="Garamond" w:hAnsi="Garamond"/>
+            <w:i/>
+            <w:iCs/>
+          </w:rPr>
+          <w:delText>82</w:delText>
+        </w:r>
+        <w:r>
+          <w:rPr>
+            <w:rFonts w:ascii="Garamond" w:hAnsi="Garamond"/>
+          </w:rPr>
+          <w:delText>(1), 197–225. https://doi.org/10.1016/S0016-7061(97)00102-X</w:delText>
+        </w:r>
+      </w:del>
+    </w:p>
+    <w:p>
+      <w:pPr>
+        <w:pStyle w:val="Bibliography"/>
+        <w:rPr>
+          <w:rFonts w:ascii="Garamond" w:hAnsi="Garamond"/>
+        </w:rPr>
+      </w:pPr>
+      <w:r>
+        <w:rPr>
+          <w:rFonts w:ascii="Garamond" w:hAnsi="Garamond"/>
+        </w:rPr>
+        <w:t xml:space="preserve">Chittaro, P., Hegg, J., Fuhrman, A., Robichaux, D., Doung, R., Beckman, B., Fisher, C., Vervoort, J., &amp; Kennedy, B. (2023). The incorporation of environmentally derived 87Sr/86Sr and Sr/Ca </w:t>
+      </w:r>
+      <w:r>
+        <w:rPr>
+          <w:rFonts w:ascii="Garamond" w:hAnsi="Garamond"/>
+        </w:rPr>
+        <w:lastRenderedPageBreak/>
+        <w:t xml:space="preserve">in early otolith formation of Chinook salmon. </w:t>
       </w:r>
       <w:r>
         <w:rPr>
@@ -5937,7 +6801,7 @@
           <w:i/>
           <w:iCs/>
         </w:rPr>
-        <w:t>Geoderma</w:t>
+        <w:t>Ecology of Freshwater Fish</w:t>
       </w:r>
       <w:r>
         <w:rPr>
@@ -5951,13 +6815,13 @@
           <w:i/>
           <w:iCs/>
         </w:rPr>
-        <w:t>82</w:t>
-      </w:r>
-      <w:r>
-        <w:rPr>
-          <w:rFonts w:ascii="Garamond" w:hAnsi="Garamond"/>
-        </w:rPr>
-        <w:t>(1), 197–225. https://doi.org/10.1016/S0016-7061(97)00102-X</w:t>
+        <w:t>32</w:t>
+      </w:r>
+      <w:r>
+        <w:rPr>
+          <w:rFonts w:ascii="Garamond" w:hAnsi="Garamond"/>
+        </w:rPr>
+        <w:t>(1), 107–119. https://doi.org/10.1111/eff.12673</w:t>
       </w:r>
     </w:p>
     <w:p>
@@ -5971,7 +6835,7 @@
         <w:rPr>
           <w:rFonts w:ascii="Garamond" w:hAnsi="Garamond"/>
         </w:rPr>
-        <w:t xml:space="preserve">Chittaro, P., Hegg, J., Fuhrman, A., Robichaux, D., Doung, R., Beckman, B., Fisher, C., Vervoort, J., &amp; Kennedy, B. (2023). The incorporation of environmentally derived 87Sr/86Sr and Sr/Ca in early otolith formation of Chinook salmon. </w:t>
+        <w:t xml:space="preserve">Clark, J. N., &amp; Smith, N. J. (2019). </w:t>
       </w:r>
       <w:r>
         <w:rPr>
@@ -5979,13 +6843,13 @@
           <w:i/>
           <w:iCs/>
         </w:rPr>
-        <w:t>Ecology of Freshwater Fish</w:t>
-      </w:r>
-      <w:r>
-        <w:rPr>
-          <w:rFonts w:ascii="Garamond" w:hAnsi="Garamond"/>
-        </w:rPr>
-        <w:t xml:space="preserve">, </w:t>
+        <w:t>Inriver Abundance of Kuskokwim River Chinook Salmon, 2017</w:t>
+      </w:r>
+      <w:r>
+        <w:rPr>
+          <w:rFonts w:ascii="Garamond" w:hAnsi="Garamond"/>
+        </w:rPr>
+        <w:t xml:space="preserve">. </w:t>
       </w:r>
       <w:r>
         <w:rPr>
@@ -5993,13 +6857,7 @@
           <w:i/>
           <w:iCs/>
         </w:rPr>
-        <w:t>32</w:t>
-      </w:r>
-      <w:r>
-        <w:rPr>
-          <w:rFonts w:ascii="Garamond" w:hAnsi="Garamond"/>
-        </w:rPr>
-        <w:t>(1), 107–119. https://doi.org/10.1111/eff.12673</w:t>
+        <w:t>Alaska Department of Fish and Game, Fishery Data Series No. 19-21, Anchorage.</w:t>
       </w:r>
     </w:p>
     <w:p>
@@ -6013,7 +6871,7 @@
         <w:rPr>
           <w:rFonts w:ascii="Garamond" w:hAnsi="Garamond"/>
         </w:rPr>
-        <w:t xml:space="preserve">Clark, J. N., &amp; Smith, N. J. (2019). </w:t>
+        <w:t xml:space="preserve">Clark, S. C., Tanner, T. L., Sethi, S. A., Bentley, K. T., &amp; Schindler, D. E. (2015). Migration Timing of Adult Chinook Salmon into the Togiak River, Alaska, Watershed: Is There Evidence for Stock Structure? </w:t>
       </w:r>
       <w:r>
         <w:rPr>
@@ -6021,13 +6879,13 @@
           <w:i/>
           <w:iCs/>
         </w:rPr>
-        <w:t>Inriver Abundance of Kuskokwim River Chinook Salmon, 2017</w:t>
-      </w:r>
-      <w:r>
-        <w:rPr>
-          <w:rFonts w:ascii="Garamond" w:hAnsi="Garamond"/>
-        </w:rPr>
-        <w:t xml:space="preserve">. </w:t>
+        <w:t>Transactions of the American Fisheries Society</w:t>
+      </w:r>
+      <w:r>
+        <w:rPr>
+          <w:rFonts w:ascii="Garamond" w:hAnsi="Garamond"/>
+        </w:rPr>
+        <w:t xml:space="preserve">, </w:t>
       </w:r>
       <w:r>
         <w:rPr>
@@ -6035,7 +6893,13 @@
           <w:i/>
           <w:iCs/>
         </w:rPr>
-        <w:t>Alaska Department of Fish and Game, Fishery Data Series No. 19-21, Anchorage.</w:t>
+        <w:t>144</w:t>
+      </w:r>
+      <w:r>
+        <w:rPr>
+          <w:rFonts w:ascii="Garamond" w:hAnsi="Garamond"/>
+        </w:rPr>
+        <w:t>(4), 829–836. https://doi.org/10.1080/00028487.2015.1031281</w:t>
       </w:r>
     </w:p>
     <w:p>
@@ -6049,8 +6913,7 @@
         <w:rPr>
           <w:rFonts w:ascii="Garamond" w:hAnsi="Garamond"/>
         </w:rPr>
-        <w:lastRenderedPageBreak/>
-        <w:t xml:space="preserve">Clark, S. C., Tanner, T. L., Sethi, S. A., Bentley, K. T., &amp; Schindler, D. E. (2015). Migration Timing of Adult Chinook Salmon into the Togiak River, Alaska, Watershed: Is There Evidence for Stock Structure? </w:t>
+        <w:t xml:space="preserve">Cline, T. J., Schindler, D. E., &amp; Hilborn, R. (2017). Fisheries portfolio diversification and turnover buffer Alaskan fishing communities from abrupt resource and market changes. </w:t>
       </w:r>
       <w:r>
         <w:rPr>
@@ -6058,7 +6921,7 @@
           <w:i/>
           <w:iCs/>
         </w:rPr>
-        <w:t>Transactions of the American Fisheries Society</w:t>
+        <w:t>Nature Communications</w:t>
       </w:r>
       <w:r>
         <w:rPr>
@@ -6072,13 +6935,13 @@
           <w:i/>
           <w:iCs/>
         </w:rPr>
-        <w:t>144</w:t>
-      </w:r>
-      <w:r>
-        <w:rPr>
-          <w:rFonts w:ascii="Garamond" w:hAnsi="Garamond"/>
-        </w:rPr>
-        <w:t>(4), 829–836. https://doi.org/10.1080/00028487.2015.1031281</w:t>
+        <w:t>8</w:t>
+      </w:r>
+      <w:r>
+        <w:rPr>
+          <w:rFonts w:ascii="Garamond" w:hAnsi="Garamond"/>
+        </w:rPr>
+        <w:t>(1), Article 1. https://doi.org/10.1038/ncomms14042</w:t>
       </w:r>
     </w:p>
     <w:p>
@@ -6092,7 +6955,7 @@
         <w:rPr>
           <w:rFonts w:ascii="Garamond" w:hAnsi="Garamond"/>
         </w:rPr>
-        <w:t xml:space="preserve">Cline, T. J., Schindler, D. E., &amp; Hilborn, R. (2017). Fisheries portfolio diversification and turnover buffer Alaskan fishing communities from abrupt resource and market changes. </w:t>
+        <w:t xml:space="preserve">Connors, B. M., Staton, B., Coggins, L., Walters, C., Jones, M., Gwinn, D., Catalano, M., &amp; Fleischman, S. (2020). Incorporating harvest–population diversity trade-offs into harvest policy analyses of salmon management in large river basins. </w:t>
       </w:r>
       <w:r>
         <w:rPr>
@@ -6100,7 +6963,7 @@
           <w:i/>
           <w:iCs/>
         </w:rPr>
-        <w:t>Nature Communications</w:t>
+        <w:t>Canadian Journal of Fisheries and Aquatic Sciences</w:t>
       </w:r>
       <w:r>
         <w:rPr>
@@ -6114,13 +6977,13 @@
           <w:i/>
           <w:iCs/>
         </w:rPr>
-        <w:t>8</w:t>
-      </w:r>
-      <w:r>
-        <w:rPr>
-          <w:rFonts w:ascii="Garamond" w:hAnsi="Garamond"/>
-        </w:rPr>
-        <w:t>(1), Article 1. https://doi.org/10.1038/ncomms14042</w:t>
+        <w:t>77</w:t>
+      </w:r>
+      <w:r>
+        <w:rPr>
+          <w:rFonts w:ascii="Garamond" w:hAnsi="Garamond"/>
+        </w:rPr>
+        <w:t>(6), 1076–1089. https://doi.org/10.1139/cjfas-2019-0282</w:t>
       </w:r>
     </w:p>
     <w:p>
@@ -6134,7 +6997,7 @@
         <w:rPr>
           <w:rFonts w:ascii="Garamond" w:hAnsi="Garamond"/>
         </w:rPr>
-        <w:t xml:space="preserve">Connors, B. M., Staton, B., Coggins, L., Walters, C., Jones, M., Gwinn, D., Catalano, M., &amp; Fleischman, S. (2020). Incorporating harvest–population diversity trade-offs into harvest policy analyses of salmon management in large river basins. </w:t>
+        <w:t xml:space="preserve">Donohoe, C. J., &amp; Zimmerman, C. E. (2010). A method of mounting multiple otoliths for beam-based microchemical analyses. </w:t>
       </w:r>
       <w:r>
         <w:rPr>
@@ -6142,7 +7005,7 @@
           <w:i/>
           <w:iCs/>
         </w:rPr>
-        <w:t>Canadian Journal of Fisheries and Aquatic Sciences</w:t>
+        <w:t>Environmental Biology of Fishes</w:t>
       </w:r>
       <w:r>
         <w:rPr>
@@ -6156,13 +7019,13 @@
           <w:i/>
           <w:iCs/>
         </w:rPr>
-        <w:t>77</w:t>
-      </w:r>
-      <w:r>
-        <w:rPr>
-          <w:rFonts w:ascii="Garamond" w:hAnsi="Garamond"/>
-        </w:rPr>
-        <w:t>(6), 1076–1089. https://doi.org/10.1139/cjfas-2019-0282</w:t>
+        <w:t>89</w:t>
+      </w:r>
+      <w:r>
+        <w:rPr>
+          <w:rFonts w:ascii="Garamond" w:hAnsi="Garamond"/>
+        </w:rPr>
+        <w:t>(3), 473–477. https://doi.org/10.1007/s10641-010-9680-3</w:t>
       </w:r>
     </w:p>
     <w:p>
@@ -6176,7 +7039,7 @@
         <w:rPr>
           <w:rFonts w:ascii="Garamond" w:hAnsi="Garamond"/>
         </w:rPr>
-        <w:t xml:space="preserve">Donohoe, C. J., &amp; Zimmerman, C. E. (2010). A method of mounting multiple otoliths for beam-based microchemical analyses. </w:t>
+        <w:t xml:space="preserve">Falke, &amp; Paul. (2025). </w:t>
       </w:r>
       <w:r>
         <w:rPr>
@@ -6184,13 +7047,27 @@
           <w:i/>
           <w:iCs/>
         </w:rPr>
-        <w:t>Environmental Biology of Fishes</w:t>
-      </w:r>
-      <w:r>
-        <w:rPr>
-          <w:rFonts w:ascii="Garamond" w:hAnsi="Garamond"/>
-        </w:rPr>
-        <w:t xml:space="preserve">, </w:t>
+        <w:t>Stream Attributes and Habitat Intrinsic Potential Model Results to examine Freshwater Habitat Potential for Chinook Salmon in the Yukon and Kuskokwim River Basins, Alaska</w:t>
+      </w:r>
+      <w:r>
+        <w:rPr>
+          <w:rFonts w:ascii="Garamond" w:hAnsi="Garamond"/>
+        </w:rPr>
+        <w:t xml:space="preserve"> [Csv,xml,shp]. U.S. Geological Survey. https://doi.org/10.5066/P95AV4JO</w:t>
+      </w:r>
+    </w:p>
+    <w:p>
+      <w:pPr>
+        <w:pStyle w:val="Bibliography"/>
+        <w:rPr>
+          <w:rFonts w:ascii="Garamond" w:hAnsi="Garamond"/>
+        </w:rPr>
+      </w:pPr>
+      <w:r>
+        <w:rPr>
+          <w:rFonts w:ascii="Garamond" w:hAnsi="Garamond"/>
+        </w:rPr>
+        <w:t xml:space="preserve">French, D. W., Schindler, D. E., Brennan, S. R., &amp; Whited, D. (2020). Headwater Catchments Govern Biogeochemistry in America’s Largest Free-Flowing River Network. </w:t>
       </w:r>
       <w:r>
         <w:rPr>
@@ -6198,27 +7075,7 @@
           <w:i/>
           <w:iCs/>
         </w:rPr>
-        <w:t>89</w:t>
-      </w:r>
-      <w:r>
-        <w:rPr>
-          <w:rFonts w:ascii="Garamond" w:hAnsi="Garamond"/>
-        </w:rPr>
-        <w:t>(3), 473–477. https://doi.org/10.1007/s10641-010-9680-3</w:t>
-      </w:r>
-    </w:p>
-    <w:p>
-      <w:pPr>
-        <w:pStyle w:val="Bibliography"/>
-        <w:rPr>
-          <w:rFonts w:ascii="Garamond" w:hAnsi="Garamond"/>
-        </w:rPr>
-      </w:pPr>
-      <w:r>
-        <w:rPr>
-          <w:rFonts w:ascii="Garamond" w:hAnsi="Garamond"/>
-        </w:rPr>
-        <w:t xml:space="preserve">Falke, &amp; Paul. (2025). </w:t>
+        <w:t xml:space="preserve">Journal of </w:t>
       </w:r>
       <w:r>
         <w:rPr>
@@ -6226,27 +7083,14 @@
           <w:i/>
           <w:iCs/>
         </w:rPr>
-        <w:t>Stream Attributes and Habitat Intrinsic Potential Model Results to examine Freshwater Habitat Potential for Chinook Salmon in the Yukon and Kuskokwim River Basins, Alaska</w:t>
-      </w:r>
-      <w:r>
-        <w:rPr>
-          <w:rFonts w:ascii="Garamond" w:hAnsi="Garamond"/>
-        </w:rPr>
-        <w:t xml:space="preserve"> [Csv,xml,shp]. U.S. Geological Survey. https://doi.org/10.5066/P95AV4JO</w:t>
-      </w:r>
-    </w:p>
-    <w:p>
-      <w:pPr>
-        <w:pStyle w:val="Bibliography"/>
-        <w:rPr>
-          <w:rFonts w:ascii="Garamond" w:hAnsi="Garamond"/>
-        </w:rPr>
-      </w:pPr>
-      <w:r>
-        <w:rPr>
-          <w:rFonts w:ascii="Garamond" w:hAnsi="Garamond"/>
-        </w:rPr>
-        <w:t xml:space="preserve">French, D. W., Schindler, D. E., Brennan, S. R., &amp; Whited, D. (2020). Headwater Catchments Govern Biogeochemistry in America’s Largest Free-Flowing River Network. </w:t>
+        <w:lastRenderedPageBreak/>
+        <w:t>Geophysical Research: Biogeosciences</w:t>
+      </w:r>
+      <w:r>
+        <w:rPr>
+          <w:rFonts w:ascii="Garamond" w:hAnsi="Garamond"/>
+        </w:rPr>
+        <w:t xml:space="preserve">, </w:t>
       </w:r>
       <w:r>
         <w:rPr>
@@ -6254,13 +7098,27 @@
           <w:i/>
           <w:iCs/>
         </w:rPr>
-        <w:t>Journal of Geophysical Research: Biogeosciences</w:t>
-      </w:r>
-      <w:r>
-        <w:rPr>
-          <w:rFonts w:ascii="Garamond" w:hAnsi="Garamond"/>
-        </w:rPr>
-        <w:t xml:space="preserve">, </w:t>
+        <w:t>125</w:t>
+      </w:r>
+      <w:r>
+        <w:rPr>
+          <w:rFonts w:ascii="Garamond" w:hAnsi="Garamond"/>
+        </w:rPr>
+        <w:t>(12), e2020JG005851. https://doi.org/10.1029/2020JG005851</w:t>
+      </w:r>
+    </w:p>
+    <w:p>
+      <w:pPr>
+        <w:pStyle w:val="Bibliography"/>
+        <w:rPr>
+          <w:rFonts w:ascii="Garamond" w:hAnsi="Garamond"/>
+        </w:rPr>
+      </w:pPr>
+      <w:r>
+        <w:rPr>
+          <w:rFonts w:ascii="Garamond" w:hAnsi="Garamond"/>
+        </w:rPr>
+        <w:t xml:space="preserve">Griffiths, J. R., Schindler, D. E., Armstrong, J. B., Scheuerell, M. D., Whited, D. C., Clark, R. A., Hilborn, R., Holt, C. A., Lindley, S. T., Stanford, J. A., &amp; Volk, E. C. (2014). Performance of salmon fishery portfolios across western North America. </w:t>
       </w:r>
       <w:r>
         <w:rPr>
@@ -6268,34 +7126,13 @@
           <w:i/>
           <w:iCs/>
         </w:rPr>
-        <w:t>125</w:t>
-      </w:r>
-      <w:r>
-        <w:rPr>
-          <w:rFonts w:ascii="Garamond" w:hAnsi="Garamond"/>
-        </w:rPr>
-        <w:t>(12), e2020JG005851. https://doi.org/10.1029/2020JG005851</w:t>
-      </w:r>
-    </w:p>
-    <w:p>
-      <w:pPr>
-        <w:pStyle w:val="Bibliography"/>
-        <w:rPr>
-          <w:rFonts w:ascii="Garamond" w:hAnsi="Garamond"/>
-        </w:rPr>
-      </w:pPr>
-      <w:r>
-        <w:rPr>
-          <w:rFonts w:ascii="Garamond" w:hAnsi="Garamond"/>
-        </w:rPr>
-        <w:t xml:space="preserve">Griffiths, J. R., Schindler, D. E., Armstrong, J. B., Scheuerell, M. D., Whited, D. C., Clark, R. A., Hilborn, R., Holt, C. A., Lindley, S. T., Stanford, J. A., &amp; Volk, E. C. (2014). Performance of </w:t>
-      </w:r>
-      <w:r>
-        <w:rPr>
-          <w:rFonts w:ascii="Garamond" w:hAnsi="Garamond"/>
-        </w:rPr>
-        <w:lastRenderedPageBreak/>
-        <w:t xml:space="preserve">salmon fishery portfolios across western North America. </w:t>
+        <w:t>Biological Conservation</w:t>
+      </w:r>
+      <w:r>
+        <w:rPr>
+          <w:rFonts w:ascii="Garamond" w:hAnsi="Garamond"/>
+        </w:rPr>
+        <w:t xml:space="preserve">, </w:t>
       </w:r>
       <w:r>
         <w:rPr>
@@ -6303,13 +7140,27 @@
           <w:i/>
           <w:iCs/>
         </w:rPr>
-        <w:t>Biological Conservation</w:t>
-      </w:r>
-      <w:r>
-        <w:rPr>
-          <w:rFonts w:ascii="Garamond" w:hAnsi="Garamond"/>
-        </w:rPr>
-        <w:t xml:space="preserve">, </w:t>
+        <w:t>51</w:t>
+      </w:r>
+      <w:r>
+        <w:rPr>
+          <w:rFonts w:ascii="Garamond" w:hAnsi="Garamond"/>
+        </w:rPr>
+        <w:t>(6), 1554–1563. https://doi.org/10.1111/1365-2664.12341</w:t>
+      </w:r>
+    </w:p>
+    <w:p>
+      <w:pPr>
+        <w:pStyle w:val="Bibliography"/>
+        <w:rPr>
+          <w:rFonts w:ascii="Garamond" w:hAnsi="Garamond"/>
+        </w:rPr>
+      </w:pPr>
+      <w:r>
+        <w:rPr>
+          <w:rFonts w:ascii="Garamond" w:hAnsi="Garamond"/>
+        </w:rPr>
+        <w:t xml:space="preserve">Hamazaki, T. (2008). “When people argue about fish, the fish disappear.” </w:t>
       </w:r>
       <w:r>
         <w:rPr>
@@ -6317,27 +7168,13 @@
           <w:i/>
           <w:iCs/>
         </w:rPr>
-        <w:t>51</w:t>
-      </w:r>
-      <w:r>
-        <w:rPr>
-          <w:rFonts w:ascii="Garamond" w:hAnsi="Garamond"/>
-        </w:rPr>
-        <w:t>(6), 1554–1563. https://doi.org/10.1111/1365-2664.12341</w:t>
-      </w:r>
-    </w:p>
-    <w:p>
-      <w:pPr>
-        <w:pStyle w:val="Bibliography"/>
-        <w:rPr>
-          <w:rFonts w:ascii="Garamond" w:hAnsi="Garamond"/>
-        </w:rPr>
-      </w:pPr>
-      <w:r>
-        <w:rPr>
-          <w:rFonts w:ascii="Garamond" w:hAnsi="Garamond"/>
-        </w:rPr>
-        <w:t xml:space="preserve">Hamazaki, T. (2008). “When people argue about fish, the fish disappear.” </w:t>
+        <w:t>Fisheries</w:t>
+      </w:r>
+      <w:r>
+        <w:rPr>
+          <w:rFonts w:ascii="Garamond" w:hAnsi="Garamond"/>
+        </w:rPr>
+        <w:t xml:space="preserve">, </w:t>
       </w:r>
       <w:r>
         <w:rPr>
@@ -6345,13 +7182,27 @@
           <w:i/>
           <w:iCs/>
         </w:rPr>
-        <w:t>Fisheries</w:t>
-      </w:r>
-      <w:r>
-        <w:rPr>
-          <w:rFonts w:ascii="Garamond" w:hAnsi="Garamond"/>
-        </w:rPr>
-        <w:t xml:space="preserve">, </w:t>
+        <w:t>33</w:t>
+      </w:r>
+      <w:r>
+        <w:rPr>
+          <w:rFonts w:ascii="Garamond" w:hAnsi="Garamond"/>
+        </w:rPr>
+        <w:t>(10), 495–501. https://doi.org/10.1577/1548-8446-33.10.495</w:t>
+      </w:r>
+    </w:p>
+    <w:p>
+      <w:pPr>
+        <w:pStyle w:val="Bibliography"/>
+        <w:rPr>
+          <w:rFonts w:ascii="Garamond" w:hAnsi="Garamond"/>
+        </w:rPr>
+      </w:pPr>
+      <w:r>
+        <w:rPr>
+          <w:rFonts w:ascii="Garamond" w:hAnsi="Garamond"/>
+        </w:rPr>
+        <w:t xml:space="preserve">Head, J. M., Smith, N. J., &amp; Liller, Z. W. (2017). </w:t>
       </w:r>
       <w:r>
         <w:rPr>
@@ -6359,13 +7210,13 @@
           <w:i/>
           <w:iCs/>
         </w:rPr>
-        <w:t>33</w:t>
-      </w:r>
-      <w:r>
-        <w:rPr>
-          <w:rFonts w:ascii="Garamond" w:hAnsi="Garamond"/>
-        </w:rPr>
-        <w:t>(10), 495–501. https://doi.org/10.1577/1548-8446-33.10.495</w:t>
+        <w:t>Inriver abundance of Kuskokwim River Chinook salmon, 2014.</w:t>
+      </w:r>
+      <w:r>
+        <w:rPr>
+          <w:rFonts w:ascii="Garamond" w:hAnsi="Garamond"/>
+        </w:rPr>
+        <w:t xml:space="preserve"> (Alaska Department of Fish and Game, Fishery Data Series No. 17-23, Anchorage.).</w:t>
       </w:r>
     </w:p>
     <w:p>
@@ -6379,7 +7230,7 @@
         <w:rPr>
           <w:rFonts w:ascii="Garamond" w:hAnsi="Garamond"/>
         </w:rPr>
-        <w:t xml:space="preserve">Head, J. M., Smith, N. J., &amp; Liller, Z. W. (2017). </w:t>
+        <w:t xml:space="preserve">Hilborn, R., Quinn, T. P., Schindler, D. E., &amp; Rogers, D. E. (2003). Biocomplexity and fisheries sustainability. </w:t>
       </w:r>
       <w:r>
         <w:rPr>
@@ -6387,27 +7238,13 @@
           <w:i/>
           <w:iCs/>
         </w:rPr>
-        <w:t>Inriver abundance of Kuskokwim River Chinook salmon, 2014.</w:t>
-      </w:r>
-      <w:r>
-        <w:rPr>
-          <w:rFonts w:ascii="Garamond" w:hAnsi="Garamond"/>
-        </w:rPr>
-        <w:t xml:space="preserve"> (Alaska Department of Fish and Game, Fishery Data Series No. 17-23, Anchorage.).</w:t>
-      </w:r>
-    </w:p>
-    <w:p>
-      <w:pPr>
-        <w:pStyle w:val="Bibliography"/>
-        <w:rPr>
-          <w:rFonts w:ascii="Garamond" w:hAnsi="Garamond"/>
-        </w:rPr>
-      </w:pPr>
-      <w:r>
-        <w:rPr>
-          <w:rFonts w:ascii="Garamond" w:hAnsi="Garamond"/>
-        </w:rPr>
-        <w:t xml:space="preserve">Hilborn, R., Quinn, T. P., Schindler, D. E., &amp; Rogers, D. E. (2003). Biocomplexity and fisheries sustainability. </w:t>
+        <w:t>Proceedings of the National Academy of Sciences</w:t>
+      </w:r>
+      <w:r>
+        <w:rPr>
+          <w:rFonts w:ascii="Garamond" w:hAnsi="Garamond"/>
+        </w:rPr>
+        <w:t xml:space="preserve">, </w:t>
       </w:r>
       <w:r>
         <w:rPr>
@@ -6415,13 +7252,27 @@
           <w:i/>
           <w:iCs/>
         </w:rPr>
-        <w:t>Proceedings of the National Academy of Sciences</w:t>
-      </w:r>
-      <w:r>
-        <w:rPr>
-          <w:rFonts w:ascii="Garamond" w:hAnsi="Garamond"/>
-        </w:rPr>
-        <w:t xml:space="preserve">, </w:t>
+        <w:t>100</w:t>
+      </w:r>
+      <w:r>
+        <w:rPr>
+          <w:rFonts w:ascii="Garamond" w:hAnsi="Garamond"/>
+        </w:rPr>
+        <w:t>(11), 6564–6568. https://doi.org/10.1073/pnas.1037274100</w:t>
+      </w:r>
+    </w:p>
+    <w:p>
+      <w:pPr>
+        <w:pStyle w:val="Bibliography"/>
+        <w:rPr>
+          <w:rFonts w:ascii="Garamond" w:hAnsi="Garamond"/>
+        </w:rPr>
+      </w:pPr>
+      <w:r>
+        <w:rPr>
+          <w:rFonts w:ascii="Garamond" w:hAnsi="Garamond"/>
+        </w:rPr>
+        <w:t xml:space="preserve">KRITFC. (2024). </w:t>
       </w:r>
       <w:r>
         <w:rPr>
@@ -6429,13 +7280,13 @@
           <w:i/>
           <w:iCs/>
         </w:rPr>
-        <w:t>100</w:t>
-      </w:r>
-      <w:r>
-        <w:rPr>
-          <w:rFonts w:ascii="Garamond" w:hAnsi="Garamond"/>
-        </w:rPr>
-        <w:t>(11), 6564–6568. https://doi.org/10.1073/pnas.1037274100</w:t>
+        <w:t>Kuskokwim River Salmon Situation Report</w:t>
+      </w:r>
+      <w:r>
+        <w:rPr>
+          <w:rFonts w:ascii="Garamond" w:hAnsi="Garamond"/>
+        </w:rPr>
+        <w:t>. https://static1.squarespace.com/static/5afdc3d5e74940913f78773d/t/66e4bb2dfcc5d24880434ff7/1726266166559/2023+Kusko+Situation+Report_4.19.24+final.pdf</w:t>
       </w:r>
     </w:p>
     <w:p>
@@ -6449,7 +7300,7 @@
         <w:rPr>
           <w:rFonts w:ascii="Garamond" w:hAnsi="Garamond"/>
         </w:rPr>
-        <w:t xml:space="preserve">KRITFC. (2024). </w:t>
+        <w:t xml:space="preserve">Lamborn, C. C., Ohlberger, J., Walsworth, T. E., Westley, P. A. H., Cunningham, C. J., Wynsma, S., &amp; Smith, J. W. (2025a). A Synthesis of Factors Related to Trends in Abundance and Demography of Alaska Chinook Salmon (Oncorhynchus tshawytscha, Salmonidae): Implications for Research, Management, and Policy. </w:t>
       </w:r>
       <w:r>
         <w:rPr>
@@ -6457,27 +7308,13 @@
           <w:i/>
           <w:iCs/>
         </w:rPr>
-        <w:t>Kuskokwim River Salmon Situation Report</w:t>
-      </w:r>
-      <w:r>
-        <w:rPr>
-          <w:rFonts w:ascii="Garamond" w:hAnsi="Garamond"/>
-        </w:rPr>
-        <w:t>. https://static1.squarespace.com/static/5afdc3d5e74940913f78773d/t/66e4bb2dfcc5d24880434ff7/1726266166559/2023+Kusko+Situation+Report_4.19.24+final.pdf</w:t>
-      </w:r>
-    </w:p>
-    <w:p>
-      <w:pPr>
-        <w:pStyle w:val="Bibliography"/>
-        <w:rPr>
-          <w:rFonts w:ascii="Garamond" w:hAnsi="Garamond"/>
-        </w:rPr>
-      </w:pPr>
-      <w:r>
-        <w:rPr>
-          <w:rFonts w:ascii="Garamond" w:hAnsi="Garamond"/>
-        </w:rPr>
-        <w:t xml:space="preserve">Lamborn, C. C., Ohlberger, J., Walsworth, T. E., Westley, P. A. H., Cunningham, C. J., Wynsma, S., &amp; Smith, J. W. (2025a). A Synthesis of Factors Related to Trends in Abundance and Demography of Alaska Chinook Salmon (Oncorhynchus tshawytscha, Salmonidae): Implications for Research, Management, and Policy. </w:t>
+        <w:t>Fish and Fisheries</w:t>
+      </w:r>
+      <w:r>
+        <w:rPr>
+          <w:rFonts w:ascii="Garamond" w:hAnsi="Garamond"/>
+        </w:rPr>
+        <w:t xml:space="preserve">, </w:t>
       </w:r>
       <w:r>
         <w:rPr>
@@ -6485,13 +7322,27 @@
           <w:i/>
           <w:iCs/>
         </w:rPr>
-        <w:t>Fish and Fisheries</w:t>
-      </w:r>
-      <w:r>
-        <w:rPr>
-          <w:rFonts w:ascii="Garamond" w:hAnsi="Garamond"/>
-        </w:rPr>
-        <w:t xml:space="preserve">, </w:t>
+        <w:t>26</w:t>
+      </w:r>
+      <w:r>
+        <w:rPr>
+          <w:rFonts w:ascii="Garamond" w:hAnsi="Garamond"/>
+        </w:rPr>
+        <w:t>(4), 520–532. https://doi.org/10.1111/faf.12895</w:t>
+      </w:r>
+    </w:p>
+    <w:p>
+      <w:pPr>
+        <w:pStyle w:val="Bibliography"/>
+        <w:rPr>
+          <w:rFonts w:ascii="Garamond" w:hAnsi="Garamond"/>
+        </w:rPr>
+      </w:pPr>
+      <w:r>
+        <w:rPr>
+          <w:rFonts w:ascii="Garamond" w:hAnsi="Garamond"/>
+        </w:rPr>
+        <w:t xml:space="preserve">Lipka, C., &amp; Elison, T. (2015). </w:t>
       </w:r>
       <w:r>
         <w:rPr>
@@ -6499,13 +7350,13 @@
           <w:i/>
           <w:iCs/>
         </w:rPr>
-        <w:t>26</w:t>
-      </w:r>
-      <w:r>
-        <w:rPr>
-          <w:rFonts w:ascii="Garamond" w:hAnsi="Garamond"/>
-        </w:rPr>
-        <w:t>(4), 520–532. https://doi.org/10.1111/faf.12895</w:t>
+        <w:t>Characterization of the 2012 and 2013 salmon runs in the Kuskokwim River based on the test fishery at Bethel.</w:t>
+      </w:r>
+      <w:r>
+        <w:rPr>
+          <w:rFonts w:ascii="Garamond" w:hAnsi="Garamond"/>
+        </w:rPr>
+        <w:t xml:space="preserve"> (Fishery Data Series No. 16-06 Anchorage). Alaska Department of Fish and Game.</w:t>
       </w:r>
     </w:p>
     <w:p>
@@ -6519,7 +7370,8 @@
         <w:rPr>
           <w:rFonts w:ascii="Garamond" w:hAnsi="Garamond"/>
         </w:rPr>
-        <w:t xml:space="preserve">Lipka, C., &amp; Elison, T. (2015). </w:t>
+        <w:lastRenderedPageBreak/>
+        <w:t xml:space="preserve">Luck, G., Daily, G., &amp; Ehrlich, P. (2003). Population diversity and ecosystem services. </w:t>
       </w:r>
       <w:r>
         <w:rPr>
@@ -6527,27 +7379,13 @@
           <w:i/>
           <w:iCs/>
         </w:rPr>
-        <w:t>Characterization of the 2012 and 2013 salmon runs in the Kuskokwim River based on the test fishery at Bethel.</w:t>
-      </w:r>
-      <w:r>
-        <w:rPr>
-          <w:rFonts w:ascii="Garamond" w:hAnsi="Garamond"/>
-        </w:rPr>
-        <w:t xml:space="preserve"> (Fishery Data Series No. 16-06 Anchorage). Alaska Department of Fish and Game.</w:t>
-      </w:r>
-    </w:p>
-    <w:p>
-      <w:pPr>
-        <w:pStyle w:val="Bibliography"/>
-        <w:rPr>
-          <w:rFonts w:ascii="Garamond" w:hAnsi="Garamond"/>
-        </w:rPr>
-      </w:pPr>
-      <w:r>
-        <w:rPr>
-          <w:rFonts w:ascii="Garamond" w:hAnsi="Garamond"/>
-        </w:rPr>
-        <w:t xml:space="preserve">Luck, G., Daily, G., &amp; Ehrlich, P. (2003). Population diversity and ecosystem services. </w:t>
+        <w:t>Trends in Ecology &amp; Evolution</w:t>
+      </w:r>
+      <w:r>
+        <w:rPr>
+          <w:rFonts w:ascii="Garamond" w:hAnsi="Garamond"/>
+        </w:rPr>
+        <w:t xml:space="preserve">, </w:t>
       </w:r>
       <w:r>
         <w:rPr>
@@ -6555,13 +7393,27 @@
           <w:i/>
           <w:iCs/>
         </w:rPr>
-        <w:t>Trends in Ecology &amp; Evolution</w:t>
-      </w:r>
-      <w:r>
-        <w:rPr>
-          <w:rFonts w:ascii="Garamond" w:hAnsi="Garamond"/>
-        </w:rPr>
-        <w:t xml:space="preserve">, </w:t>
+        <w:t>18</w:t>
+      </w:r>
+      <w:r>
+        <w:rPr>
+          <w:rFonts w:ascii="Garamond" w:hAnsi="Garamond"/>
+        </w:rPr>
+        <w:t>, 331–336. https://doi.org/10.1016/S0169-5347(03)00100-9</w:t>
+      </w:r>
+    </w:p>
+    <w:p>
+      <w:pPr>
+        <w:pStyle w:val="Bibliography"/>
+        <w:rPr>
+          <w:rFonts w:ascii="Garamond" w:hAnsi="Garamond"/>
+        </w:rPr>
+      </w:pPr>
+      <w:r>
+        <w:rPr>
+          <w:rFonts w:ascii="Garamond" w:hAnsi="Garamond"/>
+        </w:rPr>
+        <w:t xml:space="preserve">Makhlouf, B., Cline, T. J., Fernandez, D., Seeb, L., Lee, E., Gilk-Baumer, S., Whited, D., Zimmerman, C. E., &amp; Schindler, D. E. (2025). Combining genetic and isotope frameworks improves reconstruction of fish provenance across riverscapes. </w:t>
       </w:r>
       <w:r>
         <w:rPr>
@@ -6569,34 +7421,13 @@
           <w:i/>
           <w:iCs/>
         </w:rPr>
-        <w:t>18</w:t>
-      </w:r>
-      <w:r>
-        <w:rPr>
-          <w:rFonts w:ascii="Garamond" w:hAnsi="Garamond"/>
-        </w:rPr>
-        <w:t>, 331–336. https://doi.org/10.1016/S0169-5347(03)00100-9</w:t>
-      </w:r>
-    </w:p>
-    <w:p>
-      <w:pPr>
-        <w:pStyle w:val="Bibliography"/>
-        <w:rPr>
-          <w:rFonts w:ascii="Garamond" w:hAnsi="Garamond"/>
-        </w:rPr>
-      </w:pPr>
-      <w:r>
-        <w:rPr>
-          <w:rFonts w:ascii="Garamond" w:hAnsi="Garamond"/>
-        </w:rPr>
-        <w:t xml:space="preserve">Makhlouf, B., Cline, T. J., Fernandez, D., Seeb, L., Lee, E., Gilk-Baumer, S., Whited, D., Zimmerman, C. E., &amp; Schindler, D. E. (2025). Combining genetic and isotope frameworks </w:t>
-      </w:r>
-      <w:r>
-        <w:rPr>
-          <w:rFonts w:ascii="Garamond" w:hAnsi="Garamond"/>
-        </w:rPr>
-        <w:lastRenderedPageBreak/>
-        <w:t xml:space="preserve">improves reconstruction of fish provenance across riverscapes. </w:t>
+        <w:t>Limnology and Oceanography Letters</w:t>
+      </w:r>
+      <w:r>
+        <w:rPr>
+          <w:rFonts w:ascii="Garamond" w:hAnsi="Garamond"/>
+        </w:rPr>
+        <w:t xml:space="preserve">, </w:t>
       </w:r>
       <w:r>
         <w:rPr>
@@ -6604,13 +7435,27 @@
           <w:i/>
           <w:iCs/>
         </w:rPr>
-        <w:t>Limnology and Oceanography Letters</w:t>
-      </w:r>
-      <w:r>
-        <w:rPr>
-          <w:rFonts w:ascii="Garamond" w:hAnsi="Garamond"/>
-        </w:rPr>
-        <w:t xml:space="preserve">, </w:t>
+        <w:t>n/a</w:t>
+      </w:r>
+      <w:r>
+        <w:rPr>
+          <w:rFonts w:ascii="Garamond" w:hAnsi="Garamond"/>
+        </w:rPr>
+        <w:t>(n/a). https://doi.org/10.1002/lol2.70025</w:t>
+      </w:r>
+    </w:p>
+    <w:p>
+      <w:pPr>
+        <w:pStyle w:val="Bibliography"/>
+        <w:rPr>
+          <w:rFonts w:ascii="Garamond" w:hAnsi="Garamond"/>
+        </w:rPr>
+      </w:pPr>
+      <w:r>
+        <w:rPr>
+          <w:rFonts w:ascii="Garamond" w:hAnsi="Garamond"/>
+        </w:rPr>
+        <w:t xml:space="preserve">Moore, J. W., Connors, B. M., &amp; Hodgson, E. E. (2021). Conservation risks and portfolio effects in mixed-stock fisheries. </w:t>
       </w:r>
       <w:r>
         <w:rPr>
@@ -6618,27 +7463,13 @@
           <w:i/>
           <w:iCs/>
         </w:rPr>
-        <w:t>n/a</w:t>
-      </w:r>
-      <w:r>
-        <w:rPr>
-          <w:rFonts w:ascii="Garamond" w:hAnsi="Garamond"/>
-        </w:rPr>
-        <w:t>(n/a). https://doi.org/10.1002/lol2.70025</w:t>
-      </w:r>
-    </w:p>
-    <w:p>
-      <w:pPr>
-        <w:pStyle w:val="Bibliography"/>
-        <w:rPr>
-          <w:rFonts w:ascii="Garamond" w:hAnsi="Garamond"/>
-        </w:rPr>
-      </w:pPr>
-      <w:r>
-        <w:rPr>
-          <w:rFonts w:ascii="Garamond" w:hAnsi="Garamond"/>
-        </w:rPr>
-        <w:t xml:space="preserve">Moore, J. W., Connors, B. M., &amp; Hodgson, E. E. (2021). Conservation risks and portfolio effects in mixed-stock fisheries. </w:t>
+        <w:t>Fish and Fisheries</w:t>
+      </w:r>
+      <w:r>
+        <w:rPr>
+          <w:rFonts w:ascii="Garamond" w:hAnsi="Garamond"/>
+        </w:rPr>
+        <w:t xml:space="preserve">, </w:t>
       </w:r>
       <w:r>
         <w:rPr>
@@ -6646,13 +7477,27 @@
           <w:i/>
           <w:iCs/>
         </w:rPr>
-        <w:t>Fish and Fisheries</w:t>
-      </w:r>
-      <w:r>
-        <w:rPr>
-          <w:rFonts w:ascii="Garamond" w:hAnsi="Garamond"/>
-        </w:rPr>
-        <w:t xml:space="preserve">, </w:t>
+        <w:t>22</w:t>
+      </w:r>
+      <w:r>
+        <w:rPr>
+          <w:rFonts w:ascii="Garamond" w:hAnsi="Garamond"/>
+        </w:rPr>
+        <w:t>(5), 1024–1040. https://doi.org/10.1111/faf.12567</w:t>
+      </w:r>
+    </w:p>
+    <w:p>
+      <w:pPr>
+        <w:pStyle w:val="Bibliography"/>
+        <w:rPr>
+          <w:rFonts w:ascii="Garamond" w:hAnsi="Garamond"/>
+        </w:rPr>
+      </w:pPr>
+      <w:r>
+        <w:rPr>
+          <w:rFonts w:ascii="Garamond" w:hAnsi="Garamond"/>
+        </w:rPr>
+        <w:t xml:space="preserve">Mundy, P. R. (1982). Computation of Migratory Timing Statistics for Adult Chinook Salmon in the Yukon River, Alaska, and Their Relevance to Fisheries Management. </w:t>
       </w:r>
       <w:r>
         <w:rPr>
@@ -6660,27 +7505,13 @@
           <w:i/>
           <w:iCs/>
         </w:rPr>
-        <w:t>22</w:t>
-      </w:r>
-      <w:r>
-        <w:rPr>
-          <w:rFonts w:ascii="Garamond" w:hAnsi="Garamond"/>
-        </w:rPr>
-        <w:t>(5), 1024–1040. https://doi.org/10.1111/faf.12567</w:t>
-      </w:r>
-    </w:p>
-    <w:p>
-      <w:pPr>
-        <w:pStyle w:val="Bibliography"/>
-        <w:rPr>
-          <w:rFonts w:ascii="Garamond" w:hAnsi="Garamond"/>
-        </w:rPr>
-      </w:pPr>
-      <w:r>
-        <w:rPr>
-          <w:rFonts w:ascii="Garamond" w:hAnsi="Garamond"/>
-        </w:rPr>
-        <w:t xml:space="preserve">Mundy, P. R. (1982). Computation of Migratory Timing Statistics for Adult Chinook Salmon in the Yukon River, Alaska, and Their Relevance to Fisheries Management. </w:t>
+        <w:t>North American Journal of Fisheries Management</w:t>
+      </w:r>
+      <w:r>
+        <w:rPr>
+          <w:rFonts w:ascii="Garamond" w:hAnsi="Garamond"/>
+        </w:rPr>
+        <w:t xml:space="preserve">, </w:t>
       </w:r>
       <w:r>
         <w:rPr>
@@ -6688,13 +7519,27 @@
           <w:i/>
           <w:iCs/>
         </w:rPr>
-        <w:t>North American Journal of Fisheries Management</w:t>
-      </w:r>
-      <w:r>
-        <w:rPr>
-          <w:rFonts w:ascii="Garamond" w:hAnsi="Garamond"/>
-        </w:rPr>
-        <w:t xml:space="preserve">, </w:t>
+        <w:t>2</w:t>
+      </w:r>
+      <w:r>
+        <w:rPr>
+          <w:rFonts w:ascii="Garamond" w:hAnsi="Garamond"/>
+        </w:rPr>
+        <w:t>(4), 359–370. https://doi.org/10.1577/1548-8659(1982)2%253C359:COMTSF%253E2.0.CO;2</w:t>
+      </w:r>
+    </w:p>
+    <w:p>
+      <w:pPr>
+        <w:pStyle w:val="Bibliography"/>
+        <w:rPr>
+          <w:rFonts w:ascii="Garamond" w:hAnsi="Garamond"/>
+        </w:rPr>
+      </w:pPr>
+      <w:r>
+        <w:rPr>
+          <w:rFonts w:ascii="Garamond" w:hAnsi="Garamond"/>
+        </w:rPr>
+        <w:t xml:space="preserve">Nesbitt, H. K., &amp; Moore, J. W. (2016). Species and population diversity in Pacific salmon fisheries underpin indigenous food security. </w:t>
       </w:r>
       <w:r>
         <w:rPr>
@@ -6702,27 +7547,13 @@
           <w:i/>
           <w:iCs/>
         </w:rPr>
-        <w:t>2</w:t>
-      </w:r>
-      <w:r>
-        <w:rPr>
-          <w:rFonts w:ascii="Garamond" w:hAnsi="Garamond"/>
-        </w:rPr>
-        <w:t>(4), 359–370. https://doi.org/10.1577/1548-8659(1982)2%253C359:COMTSF%253E2.0.CO;2</w:t>
-      </w:r>
-    </w:p>
-    <w:p>
-      <w:pPr>
-        <w:pStyle w:val="Bibliography"/>
-        <w:rPr>
-          <w:rFonts w:ascii="Garamond" w:hAnsi="Garamond"/>
-        </w:rPr>
-      </w:pPr>
-      <w:r>
-        <w:rPr>
-          <w:rFonts w:ascii="Garamond" w:hAnsi="Garamond"/>
-        </w:rPr>
-        <w:t xml:space="preserve">Nesbitt, H. K., &amp; Moore, J. W. (2016). Species and population diversity in Pacific salmon fisheries underpin indigenous food security. </w:t>
+        <w:t>Journal of Applied Ecology</w:t>
+      </w:r>
+      <w:r>
+        <w:rPr>
+          <w:rFonts w:ascii="Garamond" w:hAnsi="Garamond"/>
+        </w:rPr>
+        <w:t xml:space="preserve">, </w:t>
       </w:r>
       <w:r>
         <w:rPr>
@@ -6730,13 +7561,27 @@
           <w:i/>
           <w:iCs/>
         </w:rPr>
-        <w:t>Journal of Applied Ecology</w:t>
-      </w:r>
-      <w:r>
-        <w:rPr>
-          <w:rFonts w:ascii="Garamond" w:hAnsi="Garamond"/>
-        </w:rPr>
-        <w:t xml:space="preserve">, </w:t>
+        <w:t>53</w:t>
+      </w:r>
+      <w:r>
+        <w:rPr>
+          <w:rFonts w:ascii="Garamond" w:hAnsi="Garamond"/>
+        </w:rPr>
+        <w:t>(5), 1489–1499. https://doi.org/10.1111/1365-2664.12717</w:t>
+      </w:r>
+    </w:p>
+    <w:p>
+      <w:pPr>
+        <w:pStyle w:val="Bibliography"/>
+        <w:rPr>
+          <w:rFonts w:ascii="Garamond" w:hAnsi="Garamond"/>
+        </w:rPr>
+      </w:pPr>
+      <w:r>
+        <w:rPr>
+          <w:rFonts w:ascii="Garamond" w:hAnsi="Garamond"/>
+        </w:rPr>
+        <w:t xml:space="preserve">Ohlberger, J., Ward, E. J., Schindler, D. E., &amp; Lewis, B. (2018). Demographic changes in Chinook salmon across the Northeast Pacific Ocean. </w:t>
       </w:r>
       <w:r>
         <w:rPr>
@@ -6744,27 +7589,13 @@
           <w:i/>
           <w:iCs/>
         </w:rPr>
-        <w:t>53</w:t>
-      </w:r>
-      <w:r>
-        <w:rPr>
-          <w:rFonts w:ascii="Garamond" w:hAnsi="Garamond"/>
-        </w:rPr>
-        <w:t>(5), 1489–1499. https://doi.org/10.1111/1365-2664.12717</w:t>
-      </w:r>
-    </w:p>
-    <w:p>
-      <w:pPr>
-        <w:pStyle w:val="Bibliography"/>
-        <w:rPr>
-          <w:rFonts w:ascii="Garamond" w:hAnsi="Garamond"/>
-        </w:rPr>
-      </w:pPr>
-      <w:r>
-        <w:rPr>
-          <w:rFonts w:ascii="Garamond" w:hAnsi="Garamond"/>
-        </w:rPr>
-        <w:t xml:space="preserve">Ohlberger, J., Ward, E. J., Schindler, D. E., &amp; Lewis, B. (2018). Demographic changes in Chinook salmon across the Northeast Pacific Ocean. </w:t>
+        <w:t>Fish and Fisheries</w:t>
+      </w:r>
+      <w:r>
+        <w:rPr>
+          <w:rFonts w:ascii="Garamond" w:hAnsi="Garamond"/>
+        </w:rPr>
+        <w:t xml:space="preserve">, </w:t>
       </w:r>
       <w:r>
         <w:rPr>
@@ -6772,13 +7603,27 @@
           <w:i/>
           <w:iCs/>
         </w:rPr>
-        <w:t>Fish and Fisheries</w:t>
-      </w:r>
-      <w:r>
-        <w:rPr>
-          <w:rFonts w:ascii="Garamond" w:hAnsi="Garamond"/>
-        </w:rPr>
-        <w:t xml:space="preserve">, </w:t>
+        <w:t>19</w:t>
+      </w:r>
+      <w:r>
+        <w:rPr>
+          <w:rFonts w:ascii="Garamond" w:hAnsi="Garamond"/>
+        </w:rPr>
+        <w:t>(3), 533–546. https://doi.org/10.1111/faf.12272</w:t>
+      </w:r>
+    </w:p>
+    <w:p>
+      <w:pPr>
+        <w:pStyle w:val="Bibliography"/>
+        <w:rPr>
+          <w:rFonts w:ascii="Garamond" w:hAnsi="Garamond"/>
+        </w:rPr>
+      </w:pPr>
+      <w:r>
+        <w:rPr>
+          <w:rFonts w:ascii="Garamond" w:hAnsi="Garamond"/>
+        </w:rPr>
+        <w:t xml:space="preserve">Quinn, T. P. (2018). </w:t>
       </w:r>
       <w:r>
         <w:rPr>
@@ -6786,13 +7631,13 @@
           <w:i/>
           <w:iCs/>
         </w:rPr>
-        <w:t>19</w:t>
-      </w:r>
-      <w:r>
-        <w:rPr>
-          <w:rFonts w:ascii="Garamond" w:hAnsi="Garamond"/>
-        </w:rPr>
-        <w:t>(3), 533–546. https://doi.org/10.1111/faf.12272</w:t>
+        <w:t>The Behavior and Ecology of Pacific Salmon and Trout</w:t>
+      </w:r>
+      <w:r>
+        <w:rPr>
+          <w:rFonts w:ascii="Garamond" w:hAnsi="Garamond"/>
+        </w:rPr>
+        <w:t>. American Fisheries Society, University of Washington Press.</w:t>
       </w:r>
     </w:p>
     <w:p>
@@ -6806,7 +7651,7 @@
         <w:rPr>
           <w:rFonts w:ascii="Garamond" w:hAnsi="Garamond"/>
         </w:rPr>
-        <w:t xml:space="preserve">Quinn, T. P. (2018). </w:t>
+        <w:t xml:space="preserve">Schindler, D. E., Armstrong, J. B., &amp; Reed, T. E. (2015). The portfolio concept in ecology and evolution. </w:t>
       </w:r>
       <w:r>
         <w:rPr>
@@ -6814,27 +7659,13 @@
           <w:i/>
           <w:iCs/>
         </w:rPr>
-        <w:t>The Behavior and Ecology of Pacific Salmon and Trout</w:t>
-      </w:r>
-      <w:r>
-        <w:rPr>
-          <w:rFonts w:ascii="Garamond" w:hAnsi="Garamond"/>
-        </w:rPr>
-        <w:t>. American Fisheries Society, University of Washington Press.</w:t>
-      </w:r>
-    </w:p>
-    <w:p>
-      <w:pPr>
-        <w:pStyle w:val="Bibliography"/>
-        <w:rPr>
-          <w:rFonts w:ascii="Garamond" w:hAnsi="Garamond"/>
-        </w:rPr>
-      </w:pPr>
-      <w:r>
-        <w:rPr>
-          <w:rFonts w:ascii="Garamond" w:hAnsi="Garamond"/>
-        </w:rPr>
-        <w:t xml:space="preserve">Schindler, D. E., Armstrong, J. B., &amp; Reed, T. E. (2015). The portfolio concept in ecology and evolution. </w:t>
+        <w:t>Frontiers in Ecology and the Environment</w:t>
+      </w:r>
+      <w:r>
+        <w:rPr>
+          <w:rFonts w:ascii="Garamond" w:hAnsi="Garamond"/>
+        </w:rPr>
+        <w:t xml:space="preserve">, </w:t>
       </w:r>
       <w:r>
         <w:rPr>
@@ -6842,20 +7673,6 @@
           <w:i/>
           <w:iCs/>
         </w:rPr>
-        <w:t>Frontiers in Ecology and the Environment</w:t>
-      </w:r>
-      <w:r>
-        <w:rPr>
-          <w:rFonts w:ascii="Garamond" w:hAnsi="Garamond"/>
-        </w:rPr>
-        <w:t xml:space="preserve">, </w:t>
-      </w:r>
-      <w:r>
-        <w:rPr>
-          <w:rFonts w:ascii="Garamond" w:hAnsi="Garamond"/>
-          <w:i/>
-          <w:iCs/>
-        </w:rPr>
         <w:t>13</w:t>
       </w:r>
       <w:r>
@@ -6877,6 +7694,7 @@
         <w:rPr>
           <w:rFonts w:ascii="Garamond" w:hAnsi="Garamond"/>
         </w:rPr>
+        <w:lastRenderedPageBreak/>
         <w:t xml:space="preserve">Schindler, D. E., Hilborn, R., Chasco, B., Boatright, C. P., Quinn, T. P., Rogers, L. A., &amp; Webster, M. S. (2010). Population diversity and the portfolio effect in an exploited species. </w:t>
       </w:r>
       <w:r>
@@ -6924,7 +7742,6 @@
           <w:rFonts w:ascii="Garamond" w:hAnsi="Garamond"/>
           <w:lang w:val="fr-FR"/>
         </w:rPr>
-        <w:lastRenderedPageBreak/>
         <w:t xml:space="preserve">Smith, N. J., &amp; Liller, Z. W. (2017a). </w:t>
       </w:r>
       <w:r>
@@ -7164,6 +7981,7 @@
         <w:rPr>
           <w:rFonts w:ascii="Garamond" w:hAnsi="Garamond"/>
         </w:rPr>
+        <w:lastRenderedPageBreak/>
         <w:t xml:space="preserve">Wunder, M. B. (2010). Using Isoscapes to Model Probability Surfaces for Determining Geographic Origins. In J. B. West, G. J. Bowen, T. E. Dawson, &amp; K. P. Tu (Eds.), </w:t>
       </w:r>
       <w:r>
@@ -7192,7 +8010,6 @@
         <w:rPr>
           <w:rFonts w:ascii="Garamond" w:hAnsi="Garamond"/>
         </w:rPr>
-        <w:lastRenderedPageBreak/>
         <w:t xml:space="preserve">Zimmerman, C. E., &amp; Reeves, G. H. (2002). Identification of Steelhead and Resident Rainbow Trout Progeny in the Deschutes River, Oregon, Revealed with Otolith Microchemistry. </w:t>
       </w:r>
       <w:r>
@@ -7271,24 +8088,157 @@
       </w:r>
     </w:p>
   </w:comment>
+  <w:comment w:id="193" w:author="Benjamin J. Makhlouf" w:date="2026-06-23T10:24:00Z" w:initials="BM">
+    <w:p>
+      <w:pPr>
+        <w:pStyle w:val="CommentText"/>
+      </w:pPr>
+      <w:r>
+        <w:rPr>
+          <w:rStyle w:val="CommentReference"/>
+        </w:rPr>
+        <w:annotationRef/>
+      </w:r>
+      <w:r>
+        <w:t>Suggestion to add comments about regional stock grou</w:t>
+      </w:r>
+    </w:p>
+  </w:comment>
+  <w:comment w:id="194" w:author="Benjamin J. Makhlouf" w:date="2026-07-08T11:58:00Z" w:initials="BM">
+    <w:p>
+      <w:pPr>
+        <w:pStyle w:val="CommentText"/>
+      </w:pPr>
+      <w:r>
+        <w:rPr>
+          <w:rStyle w:val="CommentReference"/>
+        </w:rPr>
+        <w:annotationRef/>
+      </w:r>
+      <w:r>
+        <w:t xml:space="preserve">Add here a discussion of the among group variation </w:t>
+      </w:r>
+    </w:p>
+  </w:comment>
+  <w:comment w:id="195" w:author="Benjamin J. Makhlouf" w:date="2026-07-08T12:46:00Z" w:initials="BM">
+    <w:p>
+      <w:pPr>
+        <w:pStyle w:val="CommentText"/>
+      </w:pPr>
+      <w:r>
+        <w:rPr>
+          <w:rStyle w:val="CommentReference"/>
+        </w:rPr>
+        <w:annotationRef/>
+      </w:r>
+      <w:r>
+        <w:t>Add some additional language about why the front end closure is implemented in the first place and limitations on a dynamic management method</w:t>
+      </w:r>
+    </w:p>
+  </w:comment>
+  <w:comment w:id="196" w:author="Benjamin J. Makhlouf" w:date="2026-07-08T15:18:00Z" w:initials="BM">
+    <w:p>
+      <w:pPr>
+        <w:pStyle w:val="CommentText"/>
+      </w:pPr>
+      <w:r>
+        <w:rPr>
+          <w:rStyle w:val="CommentReference"/>
+        </w:rPr>
+        <w:annotationRef/>
+      </w:r>
+      <w:r>
+        <w:t>Add Range</w:t>
+      </w:r>
+    </w:p>
+  </w:comment>
+  <w:comment w:id="197" w:author="Benjamin J. Makhlouf" w:date="2026-07-08T15:19:00Z" w:initials="BM">
+    <w:p>
+      <w:pPr>
+        <w:pStyle w:val="CommentText"/>
+      </w:pPr>
+      <w:r>
+        <w:rPr>
+          <w:rStyle w:val="CommentReference"/>
+        </w:rPr>
+        <w:annotationRef/>
+      </w:r>
+      <w:r>
+        <w:t xml:space="preserve">Add more info about changing species composition as well as drying and preserving fish </w:t>
+      </w:r>
+    </w:p>
+  </w:comment>
+  <w:comment w:id="198" w:author="Benjamin J. Makhlouf" w:date="2026-07-08T12:00:00Z" w:initials="BM">
+    <w:p>
+      <w:pPr>
+        <w:pStyle w:val="CommentText"/>
+      </w:pPr>
+      <w:r>
+        <w:rPr>
+          <w:rStyle w:val="CommentReference"/>
+        </w:rPr>
+        <w:annotationRef/>
+      </w:r>
+      <w:r>
+        <w:t>Add here more detail and context from other reports/knowledge on the basin</w:t>
+      </w:r>
+    </w:p>
+  </w:comment>
+  <w:comment w:id="199" w:author="Benjamin J. Makhlouf" w:date="2026-07-08T12:39:00Z" w:initials="BM">
+    <w:p>
+      <w:pPr>
+        <w:pStyle w:val="CommentText"/>
+      </w:pPr>
+      <w:r>
+        <w:rPr>
+          <w:rStyle w:val="CommentReference"/>
+        </w:rPr>
+        <w:annotationRef/>
+      </w:r>
+      <w:r>
+        <w:t>Add mention of other systems (SAC)</w:t>
+      </w:r>
+    </w:p>
+  </w:comment>
 </w:comments>
 </file>
 
 <file path=word/commentsExtended.xml><?xml version="1.0" encoding="utf-8"?>
 <w15:commentsEx xmlns:wpc="http://schemas.microsoft.com/office/word/2010/wordprocessingCanvas" xmlns:cx="http://schemas.microsoft.com/office/drawing/2014/chartex" xmlns:cx1="http://schemas.microsoft.com/office/drawing/2015/9/8/chartex" xmlns:cx2="http://schemas.microsoft.com/office/drawing/2015/10/21/chartex" xmlns:cx3="http://schemas.microsoft.com/office/drawing/2016/5/9/chartex" xmlns:cx4="http://schemas.microsoft.com/office/drawing/2016/5/10/chartex" xmlns:cx5="http://schemas.microsoft.com/office/drawing/2016/5/11/chartex" xmlns:cx6="http://schemas.microsoft.com/office/drawing/2016/5/12/chartex" xmlns:cx7="http://schemas.microsoft.com/office/drawing/2016/5/13/chartex" xmlns:cx8="http://schemas.microsoft.com/office/drawing/2016/5/14/chartex" xmlns:mc="http://schemas.openxmlformats.org/markup-compatibility/2006" xmlns:aink="http://schemas.microsoft.com/office/drawing/2016/ink" xmlns:am3d="http://schemas.microsoft.com/office/drawing/2017/model3d" xmlns:o="urn:schemas-microsoft-com:office:office" xmlns:oel="http://schemas.microsoft.com/office/2019/extlst" xmlns:r="http://schemas.openxmlformats.org/officeDocument/2006/relationships" xmlns:m="http://schemas.openxmlformats.org/officeDocument/2006/math" xmlns:v="urn:schemas-microsoft-com:vml" xmlns:wp14="http://schemas.microsoft.com/office/word/2010/wordprocessingDrawing" xmlns:wp="http://schemas.openxmlformats.org/drawingml/2006/wordprocessingDrawing" xmlns:w10="urn:schemas-microsoft-com:office:word" xmlns:w="http://schemas.openxmlformats.org/wordprocessingml/2006/main" xmlns:w14="http://schemas.microsoft.com/office/word/2010/wordml" xmlns:w15="http://schemas.microsoft.com/office/word/2012/wordml" xmlns:w16cex="http://schemas.microsoft.com/office/word/2018/wordml/cex" xmlns:w16cid="http://schemas.microsoft.com/office/word/2016/wordml/cid" xmlns:w16="http://schemas.microsoft.com/office/word/2018/wordml" xmlns:w16du="http://schemas.microsoft.com/office/word/2023/wordml/word16du" xmlns:w16sdtdh="http://schemas.microsoft.com/office/word/2020/wordml/sdtdatahash" xmlns:w16sdtfl="http://schemas.microsoft.com/office/word/2024/wordml/sdtformatlock" xmlns:w16se="http://schemas.microsoft.com/office/word/2015/wordml/symex" xmlns:wpg="http://schemas.microsoft.com/office/word/2010/wordprocessingGroup" xmlns:wpi="http://schemas.microsoft.com/office/word/2010/wordprocessingInk" xmlns:wne="http://schemas.microsoft.com/office/word/2006/wordml" xmlns:wps="http://schemas.microsoft.com/office/word/2010/wordprocessingShape" mc:Ignorable="w14 w15 w16se w16cid w16 w16cex w16sdtdh w16sdtfl w16du wp14">
   <w15:commentEx w15:paraId="5E58D307" w15:done="0"/>
+  <w15:commentEx w15:paraId="4B8310F4" w15:done="0"/>
+  <w15:commentEx w15:paraId="436C5F82" w15:done="0"/>
+  <w15:commentEx w15:paraId="5218EA46" w15:done="0"/>
+  <w15:commentEx w15:paraId="6CA529B2" w15:done="0"/>
+  <w15:commentEx w15:paraId="4AA07CE7" w15:done="0"/>
+  <w15:commentEx w15:paraId="72554D13" w15:done="0"/>
+  <w15:commentEx w15:paraId="682934CA" w15:done="0"/>
 </w15:commentsEx>
 </file>
 
 <file path=word/commentsExtensible.xml><?xml version="1.0" encoding="utf-8"?>
 <w16cex:commentsExtensible xmlns:wpc="http://schemas.microsoft.com/office/word/2010/wordprocessingCanvas" xmlns:cx="http://schemas.microsoft.com/office/drawing/2014/chartex" xmlns:cx1="http://schemas.microsoft.com/office/drawing/2015/9/8/chartex" xmlns:cx2="http://schemas.microsoft.com/office/drawing/2015/10/21/chartex" xmlns:cx3="http://schemas.microsoft.com/office/drawing/2016/5/9/chartex" xmlns:cx4="http://schemas.microsoft.com/office/drawing/2016/5/10/chartex" xmlns:cx5="http://schemas.microsoft.com/office/drawing/2016/5/11/chartex" xmlns:cx6="http://schemas.microsoft.com/office/drawing/2016/5/12/chartex" xmlns:cx7="http://schemas.microsoft.com/office/drawing/2016/5/13/chartex" xmlns:cx8="http://schemas.microsoft.com/office/drawing/2016/5/14/chartex" xmlns:cr="http://schemas.microsoft.com/office/comments/2020/reactions" xmlns:mc="http://schemas.openxmlformats.org/markup-compatibility/2006" xmlns:aink="http://schemas.microsoft.com/office/drawing/2016/ink" xmlns:am3d="http://schemas.microsoft.com/office/drawing/2017/model3d" xmlns:o="urn:schemas-microsoft-com:office:office" xmlns:oel="http://schemas.microsoft.com/office/2019/extlst" xmlns:r="http://schemas.openxmlformats.org/officeDocument/2006/relationships" xmlns:m="http://schemas.openxmlformats.org/officeDocument/2006/math" xmlns:v="urn:schemas-microsoft-com:vml" xmlns:wp14="http://schemas.microsoft.com/office/word/2010/wordprocessingDrawing" xmlns:wp="http://schemas.openxmlformats.org/drawingml/2006/wordprocessingDrawing" xmlns:w10="urn:schemas-microsoft-com:office:word" xmlns:w="http://schemas.openxmlformats.org/wordprocessingml/2006/main" xmlns:w14="http://schemas.microsoft.com/office/word/2010/wordml" xmlns:w15="http://schemas.microsoft.com/office/word/2012/wordml" xmlns:w16cex="http://schemas.microsoft.com/office/word/2018/wordml/cex" xmlns:w16cid="http://schemas.microsoft.com/office/word/2016/wordml/cid" xmlns:w16="http://schemas.microsoft.com/office/word/2018/wordml" xmlns:w16du="http://schemas.microsoft.com/office/word/2023/wordml/word16du" xmlns:w16sdtdh="http://schemas.microsoft.com/office/word/2020/wordml/sdtdatahash" xmlns:w16sdtfl="http://schemas.microsoft.com/office/word/2024/wordml/sdtformatlock" xmlns:w16se="http://schemas.microsoft.com/office/word/2015/wordml/symex" xmlns:wpg="http://schemas.microsoft.com/office/word/2010/wordprocessingGroup" xmlns:wpi="http://schemas.microsoft.com/office/word/2010/wordprocessingInk" xmlns:wne="http://schemas.microsoft.com/office/word/2006/wordml" xmlns:wps="http://schemas.microsoft.com/office/word/2010/wordprocessingShape" mc:Ignorable="w14 w15 w16se w16cid w16 w16cex w16sdtdh w16sdtfl cr w16du wp14">
   <w16cex:commentExtensible w16cex:durableId="404396B8" w16cex:dateUtc="2026-06-18T21:12:00Z"/>
+  <w16cex:commentExtensible w16cex:durableId="08FE87E1" w16cex:dateUtc="2026-06-23T17:24:00Z"/>
+  <w16cex:commentExtensible w16cex:durableId="36AF82A6" w16cex:dateUtc="2026-07-08T18:58:00Z"/>
+  <w16cex:commentExtensible w16cex:durableId="1A4B2E34" w16cex:dateUtc="2026-07-08T19:46:00Z"/>
+  <w16cex:commentExtensible w16cex:durableId="250ECC21" w16cex:dateUtc="2026-07-08T22:18:00Z"/>
+  <w16cex:commentExtensible w16cex:durableId="277D6AAB" w16cex:dateUtc="2026-07-08T22:19:00Z"/>
+  <w16cex:commentExtensible w16cex:durableId="387E2BD2" w16cex:dateUtc="2026-07-08T19:00:00Z"/>
+  <w16cex:commentExtensible w16cex:durableId="137B3CB7" w16cex:dateUtc="2026-07-08T19:39:00Z"/>
 </w16cex:commentsExtensible>
 </file>
 
 <file path=word/commentsIds.xml><?xml version="1.0" encoding="utf-8"?>
 <w16cid:commentsIds xmlns:wpc="http://schemas.microsoft.com/office/word/2010/wordprocessingCanvas" xmlns:cx="http://schemas.microsoft.com/office/drawing/2014/chartex" xmlns:cx1="http://schemas.microsoft.com/office/drawing/2015/9/8/chartex" xmlns:cx2="http://schemas.microsoft.com/office/drawing/2015/10/21/chartex" xmlns:cx3="http://schemas.microsoft.com/office/drawing/2016/5/9/chartex" xmlns:cx4="http://schemas.microsoft.com/office/drawing/2016/5/10/chartex" xmlns:cx5="http://schemas.microsoft.com/office/drawing/2016/5/11/chartex" xmlns:cx6="http://schemas.microsoft.com/office/drawing/2016/5/12/chartex" xmlns:cx7="http://schemas.microsoft.com/office/drawing/2016/5/13/chartex" xmlns:cx8="http://schemas.microsoft.com/office/drawing/2016/5/14/chartex" xmlns:mc="http://schemas.openxmlformats.org/markup-compatibility/2006" xmlns:aink="http://schemas.microsoft.com/office/drawing/2016/ink" xmlns:am3d="http://schemas.microsoft.com/office/drawing/2017/model3d" xmlns:o="urn:schemas-microsoft-com:office:office" xmlns:oel="http://schemas.microsoft.com/office/2019/extlst" xmlns:r="http://schemas.openxmlformats.org/officeDocument/2006/relationships" xmlns:m="http://schemas.openxmlformats.org/officeDocument/2006/math" xmlns:v="urn:schemas-microsoft-com:vml" xmlns:wp14="http://schemas.microsoft.com/office/word/2010/wordprocessingDrawing" xmlns:wp="http://schemas.openxmlformats.org/drawingml/2006/wordprocessingDrawing" xmlns:w10="urn:schemas-microsoft-com:office:word" xmlns:w="http://schemas.openxmlformats.org/wordprocessingml/2006/main" xmlns:w14="http://schemas.microsoft.com/office/word/2010/wordml" xmlns:w15="http://schemas.microsoft.com/office/word/2012/wordml" xmlns:w16cex="http://schemas.microsoft.com/office/word/2018/wordml/cex" xmlns:w16cid="http://schemas.microsoft.com/office/word/2016/wordml/cid" xmlns:w16="http://schemas.microsoft.com/office/word/2018/wordml" xmlns:w16du="http://schemas.microsoft.com/office/word/2023/wordml/word16du" xmlns:w16sdtdh="http://schemas.microsoft.com/office/word/2020/wordml/sdtdatahash" xmlns:w16sdtfl="http://schemas.microsoft.com/office/word/2024/wordml/sdtformatlock" xmlns:w16se="http://schemas.microsoft.com/office/word/2015/wordml/symex" xmlns:wpg="http://schemas.microsoft.com/office/word/2010/wordprocessingGroup" xmlns:wpi="http://schemas.microsoft.com/office/word/2010/wordprocessingInk" xmlns:wne="http://schemas.microsoft.com/office/word/2006/wordml" xmlns:wps="http://schemas.microsoft.com/office/word/2010/wordprocessingShape" mc:Ignorable="w14 w15 w16se w16cid w16 w16cex w16sdtdh w16sdtfl w16du wp14">
   <w16cid:commentId w16cid:paraId="5E58D307" w16cid:durableId="404396B8"/>
+  <w16cid:commentId w16cid:paraId="4B8310F4" w16cid:durableId="08FE87E1"/>
+  <w16cid:commentId w16cid:paraId="436C5F82" w16cid:durableId="36AF82A6"/>
+  <w16cid:commentId w16cid:paraId="5218EA46" w16cid:durableId="1A4B2E34"/>
+  <w16cid:commentId w16cid:paraId="6CA529B2" w16cid:durableId="250ECC21"/>
+  <w16cid:commentId w16cid:paraId="4AA07CE7" w16cid:durableId="277D6AAB"/>
+  <w16cid:commentId w16cid:paraId="72554D13" w16cid:durableId="387E2BD2"/>
+  <w16cid:commentId w16cid:paraId="682934CA" w16cid:durableId="137B3CB7"/>
 </w16cid:commentsIds>
 </file>
 

</xml_diff>

<commit_message>
working through main document left off on 162
</commit_message>
<xml_diff>
--- a/Docs/00_CanJFS/R1_18062026/00_R1_CanJFS_MainDocument.docx
+++ b/Docs/00_CanJFS/R1_18062026/00_R1_CanJFS_MainDocument.docx
@@ -1130,7 +1130,14 @@
         <w:rPr>
           <w:rFonts w:ascii="Garamond" w:hAnsi="Garamond" w:cs="Times New Roman"/>
         </w:rPr>
-        <w:t xml:space="preserve">. Populations of adult salmon migrating upstream within large river basins are often comprised of multiple distinct sub-stocks (or populations) which vary in their relative abundance and life-history, but which co-migrate within overlapping temporal windows. Downstream fisheries that harvest migrating individuals therefore risk overexploitation of vulnerable populations which commingle with more robust ones </w:t>
+        <w:t xml:space="preserve">. Populations of adult salmon migrating upstream within large river basins are often comprised of multiple distinct sub-stocks (or populations) which vary in their relative abundance and life-history, but which co-migrate within overlapping temporal windows. Downstream fisheries that harvest migrating individuals therefore </w:t>
+      </w:r>
+      <w:r>
+        <w:rPr>
+          <w:rFonts w:ascii="Garamond" w:hAnsi="Garamond" w:cs="Times New Roman"/>
+        </w:rPr>
+        <w:lastRenderedPageBreak/>
+        <w:t xml:space="preserve">risk overexploitation of vulnerable populations which commingle with more robust ones </w:t>
       </w:r>
       <w:r>
         <w:rPr>
@@ -1169,77 +1176,76 @@
         </w:rPr>
         <w:t>. Populations returning to the furthest upstream portions of the watershed face particular risk of overharvest given their extended migration</w:t>
       </w:r>
-      <w:ins w:id="31" w:author="Benjamin J. Makhlouf" w:date="2026-06-22T09:50:00Z" w16du:dateUtc="2026-06-22T16:50:00Z">
+      <w:ins w:id="31" w:author="Benjamin J. Makhlouf" w:date="2026-06-22T09:53:00Z" w16du:dateUtc="2026-06-22T16:53:00Z">
+        <w:r>
+          <w:rPr>
+            <w:rFonts w:ascii="Garamond" w:hAnsi="Garamond" w:cs="Times New Roman"/>
+          </w:rPr>
+          <w:t xml:space="preserve">, </w:t>
+        </w:r>
+      </w:ins>
+      <w:ins w:id="32" w:author="Benjamin J. Makhlouf" w:date="2026-06-22T09:50:00Z" w16du:dateUtc="2026-06-22T16:50:00Z">
+        <w:r>
+          <w:rPr>
+            <w:rFonts w:ascii="Garamond" w:hAnsi="Garamond" w:cs="Times New Roman"/>
+          </w:rPr>
+          <w:t xml:space="preserve">which exposes them to </w:t>
+        </w:r>
+      </w:ins>
+      <w:ins w:id="33" w:author="Benjamin J. Makhlouf" w:date="2026-06-22T09:51:00Z" w16du:dateUtc="2026-06-22T16:51:00Z">
+        <w:r>
+          <w:rPr>
+            <w:rFonts w:ascii="Garamond" w:hAnsi="Garamond" w:cs="Times New Roman"/>
+          </w:rPr>
+          <w:t>extended fishing pressure</w:t>
+        </w:r>
+      </w:ins>
+      <w:ins w:id="34" w:author="Benjamin J. Makhlouf" w:date="2026-06-22T09:53:00Z" w16du:dateUtc="2026-06-22T16:53:00Z">
+        <w:r>
+          <w:rPr>
+            <w:rFonts w:ascii="Garamond" w:hAnsi="Garamond" w:cs="Times New Roman"/>
+          </w:rPr>
+          <w:t xml:space="preserve"> and environmental stressors throughout their return migration</w:t>
+        </w:r>
+      </w:ins>
+      <w:ins w:id="35" w:author="Benjamin J. Makhlouf" w:date="2026-07-08T15:39:00Z" w16du:dateUtc="2026-07-08T22:39:00Z">
+        <w:r>
+          <w:rPr>
+            <w:rFonts w:ascii="Garamond" w:hAnsi="Garamond" w:cs="Times New Roman"/>
+          </w:rPr>
+          <w:t xml:space="preserve">. As such, </w:t>
+        </w:r>
+      </w:ins>
+      <w:ins w:id="36" w:author="Benjamin J. Makhlouf" w:date="2026-07-08T15:40:00Z" w16du:dateUtc="2026-07-08T22:40:00Z">
+        <w:r>
+          <w:rPr>
+            <w:rFonts w:ascii="Garamond" w:hAnsi="Garamond" w:cs="Times New Roman"/>
+          </w:rPr>
+          <w:t xml:space="preserve">salmon </w:t>
+        </w:r>
+      </w:ins>
+      <w:ins w:id="37" w:author="Benjamin J. Makhlouf" w:date="2026-07-08T15:39:00Z" w16du:dateUtc="2026-07-08T22:39:00Z">
+        <w:r>
+          <w:rPr>
+            <w:rFonts w:ascii="Garamond" w:hAnsi="Garamond" w:cs="Times New Roman"/>
+          </w:rPr>
+          <w:t>populations with extended migr</w:t>
+        </w:r>
+      </w:ins>
+      <w:ins w:id="38" w:author="Benjamin J. Makhlouf" w:date="2026-07-08T15:40:00Z" w16du:dateUtc="2026-07-08T22:40:00Z">
+        <w:r>
+          <w:rPr>
+            <w:rFonts w:ascii="Garamond" w:hAnsi="Garamond" w:cs="Times New Roman"/>
+          </w:rPr>
+          <w:t>ation durations have been associated with heightened conservation risk in several large river systems</w:t>
+        </w:r>
+      </w:ins>
+      <w:ins w:id="39" w:author="Benjamin J. Makhlouf" w:date="2026-06-22T09:54:00Z" w16du:dateUtc="2026-06-22T16:54:00Z">
         <w:r>
           <w:rPr>
             <w:rFonts w:ascii="Garamond" w:hAnsi="Garamond" w:cs="Times New Roman"/>
           </w:rPr>
           <w:t xml:space="preserve"> </w:t>
-        </w:r>
-      </w:ins>
-      <w:ins w:id="32" w:author="Benjamin J. Makhlouf" w:date="2026-06-22T09:53:00Z" w16du:dateUtc="2026-06-22T16:53:00Z">
-        <w:r>
-          <w:rPr>
-            <w:rFonts w:ascii="Garamond" w:hAnsi="Garamond" w:cs="Times New Roman"/>
-          </w:rPr>
-          <w:t xml:space="preserve">, </w:t>
-        </w:r>
-      </w:ins>
-      <w:ins w:id="33" w:author="Benjamin J. Makhlouf" w:date="2026-06-22T09:50:00Z" w16du:dateUtc="2026-06-22T16:50:00Z">
-        <w:r>
-          <w:rPr>
-            <w:rFonts w:ascii="Garamond" w:hAnsi="Garamond" w:cs="Times New Roman"/>
-          </w:rPr>
-          <w:t xml:space="preserve">which exposes them to </w:t>
-        </w:r>
-      </w:ins>
-      <w:ins w:id="34" w:author="Benjamin J. Makhlouf" w:date="2026-06-22T09:51:00Z" w16du:dateUtc="2026-06-22T16:51:00Z">
-        <w:r>
-          <w:rPr>
-            <w:rFonts w:ascii="Garamond" w:hAnsi="Garamond" w:cs="Times New Roman"/>
-          </w:rPr>
-          <w:lastRenderedPageBreak/>
-          <w:t>extended fishing pressure</w:t>
-        </w:r>
-      </w:ins>
-      <w:ins w:id="35" w:author="Benjamin J. Makhlouf" w:date="2026-06-22T09:53:00Z" w16du:dateUtc="2026-06-22T16:53:00Z">
-        <w:r>
-          <w:rPr>
-            <w:rFonts w:ascii="Garamond" w:hAnsi="Garamond" w:cs="Times New Roman"/>
-          </w:rPr>
-          <w:t xml:space="preserve"> and environmental stressors throughout their return migration. </w:t>
-        </w:r>
-      </w:ins>
-      <w:ins w:id="36" w:author="Benjamin J. Makhlouf" w:date="2026-06-22T09:56:00Z" w16du:dateUtc="2026-06-22T16:56:00Z">
-        <w:r>
-          <w:rPr>
-            <w:rFonts w:ascii="Garamond" w:hAnsi="Garamond" w:cs="Times New Roman"/>
-          </w:rPr>
-          <w:t>E</w:t>
-        </w:r>
-      </w:ins>
-      <w:ins w:id="37" w:author="Benjamin J. Makhlouf" w:date="2026-06-22T09:54:00Z" w16du:dateUtc="2026-06-22T16:54:00Z">
-        <w:r>
-          <w:rPr>
-            <w:rFonts w:ascii="Garamond" w:hAnsi="Garamond" w:cs="Times New Roman"/>
-          </w:rPr>
-          <w:t>arly migrating populations with extended migration durations</w:t>
-        </w:r>
-      </w:ins>
-      <w:ins w:id="38" w:author="Benjamin J. Makhlouf" w:date="2026-06-22T09:56:00Z" w16du:dateUtc="2026-06-22T16:56:00Z">
-        <w:r>
-          <w:rPr>
-            <w:rFonts w:ascii="Garamond" w:hAnsi="Garamond" w:cs="Times New Roman"/>
-          </w:rPr>
-          <w:t xml:space="preserve"> in other systems</w:t>
-        </w:r>
-      </w:ins>
-      <w:ins w:id="39" w:author="Benjamin J. Makhlouf" w:date="2026-06-22T09:54:00Z" w16du:dateUtc="2026-06-22T16:54:00Z">
-        <w:r>
-          <w:rPr>
-            <w:rFonts w:ascii="Garamond" w:hAnsi="Garamond" w:cs="Times New Roman"/>
-          </w:rPr>
-          <w:t xml:space="preserve"> have been associated with a heightened risk of declining abundance, suggesting that upper Kuskokwim populations may face higher conservation risk </w:t>
         </w:r>
         <w:r>
           <w:rPr>
@@ -1393,7 +1399,7 @@
           <w:rPr>
             <w:rFonts w:ascii="Garamond" w:hAnsi="Garamond" w:cs="Times New Roman"/>
           </w:rPr>
-          <w:t>populations that contribute fish to those fisheries</w:t>
+          <w:t>populations that contribute to those fisheries</w:t>
         </w:r>
       </w:ins>
       <w:ins w:id="54" w:author="Benjamin J. Makhlouf" w:date="2026-06-19T15:17:00Z" w16du:dateUtc="2026-06-19T22:17:00Z">
@@ -1462,15 +1468,27 @@
           <w:rPr>
             <w:rFonts w:ascii="Garamond" w:hAnsi="Garamond" w:cs="Times New Roman"/>
           </w:rPr>
-          <w:t xml:space="preserve">For example, diversity in return timing among upstream populations may extend the duration of downstream fishing opportunities relative to a more homogenized stock complex in which fish return </w:t>
-        </w:r>
-      </w:ins>
-      <w:ins w:id="58" w:author="Benjamin J. Makhlouf" w:date="2026-06-19T15:18:00Z" w16du:dateUtc="2026-06-19T22:18:00Z">
-        <w:r>
-          <w:rPr>
-            <w:rFonts w:ascii="Garamond" w:hAnsi="Garamond" w:cs="Times New Roman"/>
-          </w:rPr>
-          <w:t>simultaneously.</w:t>
+          <w:t>For example, diversity in return timing among upstream populations may extend the duration of downstream fishing opportunities</w:t>
+        </w:r>
+      </w:ins>
+      <w:ins w:id="58" w:author="Benjamin J. Makhlouf" w:date="2026-07-08T15:42:00Z" w16du:dateUtc="2026-07-08T22:42:00Z">
+        <w:r>
+          <w:rPr>
+            <w:rFonts w:ascii="Garamond" w:hAnsi="Garamond" w:cs="Times New Roman"/>
+          </w:rPr>
+          <w:t xml:space="preserve"> by distributing the return migration across a broader temporal window </w:t>
+        </w:r>
+        <w:r>
+          <w:rPr>
+            <w:rFonts w:ascii="Garamond" w:hAnsi="Garamond" w:cs="Times New Roman"/>
+            <w:highlight w:val="yellow"/>
+            <w:rPrChange w:id="59" w:author="Benjamin J. Makhlouf" w:date="2026-07-08T15:42:00Z" w16du:dateUtc="2026-07-08T22:42:00Z">
+              <w:rPr>
+                <w:rFonts w:ascii="Garamond" w:hAnsi="Garamond" w:cs="Times New Roman"/>
+              </w:rPr>
+            </w:rPrChange>
+          </w:rPr>
+          <w:t>(Nesbitt and Moore, 2016).</w:t>
         </w:r>
         <w:r>
           <w:rPr>
@@ -1479,39 +1497,39 @@
           <w:t xml:space="preserve"> </w:t>
         </w:r>
       </w:ins>
-      <w:ins w:id="59" w:author="Benjamin J. Makhlouf" w:date="2026-06-19T15:21:00Z">
-        <w:r>
-          <w:rPr>
-            <w:rFonts w:ascii="Garamond" w:hAnsi="Garamond" w:cs="Times New Roman"/>
-          </w:rPr>
-          <w:t>Further, maintaining life-history diversity across the full stock complex enhances ecosystem resilience by spreading risk across space and time. This</w:t>
-        </w:r>
-      </w:ins>
-      <w:ins w:id="60" w:author="Benjamin J. Makhlouf" w:date="2026-06-19T15:21:00Z" w16du:dateUtc="2026-06-19T22:21:00Z">
-        <w:r>
-          <w:rPr>
-            <w:rFonts w:ascii="Garamond" w:hAnsi="Garamond" w:cs="Times New Roman"/>
-          </w:rPr>
-          <w:t>, in turn,</w:t>
-        </w:r>
-      </w:ins>
-      <w:ins w:id="61" w:author="Benjamin J. Makhlouf" w:date="2026-06-19T15:21:00Z">
-        <w:r>
-          <w:rPr>
-            <w:rFonts w:ascii="Garamond" w:hAnsi="Garamond" w:cs="Times New Roman"/>
-          </w:rPr>
-          <w:t xml:space="preserve"> result</w:t>
-        </w:r>
-      </w:ins>
-      <w:ins w:id="62" w:author="Benjamin J. Makhlouf" w:date="2026-06-19T15:21:00Z" w16du:dateUtc="2026-06-19T22:21:00Z">
-        <w:r>
-          <w:rPr>
-            <w:rFonts w:ascii="Garamond" w:hAnsi="Garamond" w:cs="Times New Roman"/>
-          </w:rPr>
-          <w:t>s</w:t>
-        </w:r>
-      </w:ins>
-      <w:ins w:id="63" w:author="Benjamin J. Makhlouf" w:date="2026-06-19T15:21:00Z">
+      <w:ins w:id="60" w:author="Benjamin J. Makhlouf" w:date="2026-06-19T15:21:00Z">
+        <w:r>
+          <w:rPr>
+            <w:rFonts w:ascii="Garamond" w:hAnsi="Garamond" w:cs="Times New Roman"/>
+          </w:rPr>
+          <w:t>Further, maintaining life-history diversity across the full stock complex enhances ecosystem resilience by spreading risk across space and time</w:t>
+        </w:r>
+      </w:ins>
+      <w:ins w:id="61" w:author="Benjamin J. Makhlouf" w:date="2026-07-08T15:43:00Z" w16du:dateUtc="2026-07-08T22:43:00Z">
+        <w:r>
+          <w:rPr>
+            <w:rFonts w:ascii="Garamond" w:hAnsi="Garamond" w:cs="Times New Roman"/>
+          </w:rPr>
+          <w:t xml:space="preserve">, </w:t>
+        </w:r>
+      </w:ins>
+      <w:ins w:id="62" w:author="Benjamin J. Makhlouf" w:date="2026-06-19T15:21:00Z">
+        <w:r>
+          <w:rPr>
+            <w:rFonts w:ascii="Garamond" w:hAnsi="Garamond" w:cs="Times New Roman"/>
+          </w:rPr>
+          <w:t>result</w:t>
+        </w:r>
+      </w:ins>
+      <w:ins w:id="63" w:author="Benjamin J. Makhlouf" w:date="2026-07-08T15:43:00Z" w16du:dateUtc="2026-07-08T22:43:00Z">
+        <w:r>
+          <w:rPr>
+            <w:rFonts w:ascii="Garamond" w:hAnsi="Garamond" w:cs="Times New Roman"/>
+          </w:rPr>
+          <w:t>ing</w:t>
+        </w:r>
+      </w:ins>
+      <w:ins w:id="64" w:author="Benjamin J. Makhlouf" w:date="2026-06-19T15:21:00Z">
         <w:r>
           <w:rPr>
             <w:rFonts w:ascii="Garamond" w:hAnsi="Garamond" w:cs="Times New Roman"/>
@@ -1519,7 +1537,7 @@
           <w:t xml:space="preserve"> in more reliable delivery of ecosystem services by reducing interannual variability in the abundance of returning fish at the watershed scale</w:t>
         </w:r>
       </w:ins>
-      <w:ins w:id="64" w:author="Benjamin J. Makhlouf" w:date="2026-06-19T15:21:00Z" w16du:dateUtc="2026-06-19T22:21:00Z">
+      <w:ins w:id="65" w:author="Benjamin J. Makhlouf" w:date="2026-06-19T15:21:00Z" w16du:dateUtc="2026-06-19T22:21:00Z">
         <w:r>
           <w:rPr>
             <w:rFonts w:ascii="Garamond" w:hAnsi="Garamond" w:cs="Times New Roman"/>
@@ -1564,7 +1582,7 @@
         </w:rPr>
         <w:t>. Designing strategies which explicitly consider and protect this biodiversity, including vulnerable upstream populations, therefore contributes to stabilizing downstream fishery resources</w:t>
       </w:r>
-      <w:ins w:id="65" w:author="Benjamin J. Makhlouf" w:date="2026-06-19T15:31:00Z" w16du:dateUtc="2026-06-19T22:31:00Z">
+      <w:ins w:id="66" w:author="Benjamin J. Makhlouf" w:date="2026-06-19T15:31:00Z" w16du:dateUtc="2026-06-19T22:31:00Z">
         <w:r>
           <w:rPr>
             <w:rFonts w:ascii="Garamond" w:hAnsi="Garamond" w:cs="Times New Roman"/>
@@ -1587,7 +1605,7 @@
           <w:rFonts w:ascii="Garamond" w:hAnsi="Garamond" w:cs="Times New Roman"/>
         </w:rPr>
       </w:pPr>
-      <w:ins w:id="66" w:author="Benjamin J. Makhlouf" w:date="2026-06-18T14:25:00Z" w16du:dateUtc="2026-06-18T21:25:00Z">
+      <w:ins w:id="67" w:author="Benjamin J. Makhlouf" w:date="2026-06-18T14:25:00Z" w16du:dateUtc="2026-06-18T21:25:00Z">
         <w:r>
           <w:rPr>
             <w:rFonts w:ascii="Garamond" w:hAnsi="Garamond" w:cs="Times New Roman"/>
@@ -1595,7 +1613,7 @@
           <w:t>W</w:t>
         </w:r>
       </w:ins>
-      <w:del w:id="67" w:author="Benjamin J. Makhlouf" w:date="2026-06-18T14:25:00Z" w16du:dateUtc="2026-06-18T21:25:00Z">
+      <w:del w:id="68" w:author="Benjamin J. Makhlouf" w:date="2026-06-18T14:25:00Z" w16du:dateUtc="2026-06-18T21:25:00Z">
         <w:r>
           <w:rPr>
             <w:rFonts w:ascii="Garamond" w:hAnsi="Garamond" w:cs="Times New Roman"/>
@@ -1647,6 +1665,7 @@
         <w:rPr>
           <w:rFonts w:ascii="Garamond" w:hAnsi="Garamond" w:cs="Times New Roman"/>
         </w:rPr>
+        <w:lastRenderedPageBreak/>
         <w:fldChar w:fldCharType="begin"/>
       </w:r>
       <w:r>
@@ -1728,14 +1747,7 @@
         <w:rPr>
           <w:rFonts w:ascii="Garamond" w:hAnsi="Garamond" w:cs="Times New Roman"/>
         </w:rPr>
-        <w:t xml:space="preserve">) free-flowing watershed in western Alaska, Chinook salmon populations support subsistence fishing opportunities </w:t>
-      </w:r>
-      <w:r>
-        <w:rPr>
-          <w:rFonts w:ascii="Garamond" w:hAnsi="Garamond" w:cs="Times New Roman"/>
-        </w:rPr>
-        <w:lastRenderedPageBreak/>
-        <w:t xml:space="preserve">for dozens of rural communities, comprised by a majority of Alaska Natives </w:t>
+        <w:t xml:space="preserve">) free-flowing watershed in western Alaska, Chinook salmon populations support subsistence fishing opportunities for dozens of rural communities, comprised by a majority of Alaska Natives </w:t>
       </w:r>
       <w:r>
         <w:rPr>
@@ -1774,14 +1786,14 @@
         </w:rPr>
         <w:t xml:space="preserve">. </w:t>
       </w:r>
-      <w:commentRangeStart w:id="68"/>
+      <w:commentRangeStart w:id="69"/>
       <w:r>
         <w:rPr>
           <w:rFonts w:ascii="Garamond" w:hAnsi="Garamond" w:cs="Times New Roman"/>
         </w:rPr>
         <w:t>Subsistence</w:t>
       </w:r>
-      <w:commentRangeEnd w:id="68"/>
+      <w:commentRangeEnd w:id="69"/>
       <w:r>
         <w:rPr>
           <w:rStyle w:val="CommentReference"/>
@@ -1789,7 +1801,7 @@
           <w:sz w:val="24"/>
           <w:szCs w:val="24"/>
         </w:rPr>
-        <w:commentReference w:id="68"/>
+        <w:commentReference w:id="69"/>
       </w:r>
       <w:r>
         <w:rPr>
@@ -1840,6 +1852,7 @@
         <w:spacing w:line="480" w:lineRule="auto"/>
         <w:ind w:firstLine="720"/>
         <w:rPr>
+          <w:ins w:id="70" w:author="Benjamin J. Makhlouf" w:date="2026-07-08T16:30:00Z" w16du:dateUtc="2026-07-08T23:30:00Z"/>
           <w:rFonts w:ascii="Garamond" w:hAnsi="Garamond" w:cs="Times New Roman"/>
         </w:rPr>
       </w:pPr>
@@ -1894,27 +1907,348 @@
         <w:rPr>
           <w:rFonts w:ascii="Garamond" w:hAnsi="Garamond" w:cs="Times New Roman"/>
         </w:rPr>
-        <w:t xml:space="preserve">This strategy is designed to protect early migrating fish which are assumed to be returning to spawn in the furthest upstream regions of the Kuskokwim River. </w:t>
-      </w:r>
-      <w:ins w:id="69" w:author="Benjamin J. Makhlouf" w:date="2026-06-19T15:33:00Z" w16du:dateUtc="2026-06-19T22:33:00Z">
-        <w:r>
-          <w:rPr>
-            <w:rFonts w:ascii="Garamond" w:hAnsi="Garamond" w:cs="Times New Roman"/>
-          </w:rPr>
-          <w:t>In doing so</w:t>
-        </w:r>
-      </w:ins>
-      <w:ins w:id="70" w:author="Benjamin J. Makhlouf" w:date="2026-06-19T15:34:00Z" w16du:dateUtc="2026-06-19T22:34:00Z">
-        <w:r>
-          <w:rPr>
-            <w:rFonts w:ascii="Garamond" w:hAnsi="Garamond" w:cs="Times New Roman"/>
-          </w:rPr>
-          <w:t xml:space="preserve">, managers aim to </w:t>
-        </w:r>
-      </w:ins>
-      <w:moveToRangeStart w:id="71" w:author="Benjamin J. Makhlouf" w:date="2026-06-19T15:33:00Z" w:name="move232775618"/>
-      <w:moveTo w:id="72" w:author="Benjamin J. Makhlouf" w:date="2026-06-19T15:33:00Z" w16du:dateUtc="2026-06-19T22:33:00Z">
-        <w:del w:id="73" w:author="Benjamin J. Makhlouf" w:date="2026-06-19T15:34:00Z" w16du:dateUtc="2026-06-19T22:34:00Z">
+        <w:t>This strategy is designed to protect early migrating fish which are assumed to be returning to spawn in the furthest upstream regions of the Kuskokwim River</w:t>
+      </w:r>
+      <w:ins w:id="71" w:author="Benjamin J. Makhlouf" w:date="2026-07-08T16:13:00Z" w16du:dateUtc="2026-07-08T23:13:00Z">
+        <w:r>
+          <w:rPr>
+            <w:rFonts w:ascii="Garamond" w:hAnsi="Garamond" w:cs="Times New Roman"/>
+          </w:rPr>
+          <w:t xml:space="preserve"> </w:t>
+        </w:r>
+      </w:ins>
+      <w:del w:id="72" w:author="Benjamin J. Makhlouf" w:date="2026-07-08T16:13:00Z" w16du:dateUtc="2026-07-08T23:13:00Z">
+        <w:r>
+          <w:rPr>
+            <w:rFonts w:ascii="Garamond" w:hAnsi="Garamond" w:cs="Times New Roman"/>
+          </w:rPr>
+          <w:delText>.</w:delText>
+        </w:r>
+      </w:del>
+      <w:ins w:id="73" w:author="Benjamin J. Makhlouf" w:date="2026-07-08T15:59:00Z" w16du:dateUtc="2026-07-08T22:59:00Z">
+        <w:r>
+          <w:rPr>
+            <w:rFonts w:ascii="Garamond" w:hAnsi="Garamond" w:cs="Times New Roman"/>
+          </w:rPr>
+          <w:t xml:space="preserve">based on  patterns observed in other systems </w:t>
+        </w:r>
+        <w:r>
+          <w:rPr>
+            <w:rFonts w:ascii="Garamond" w:hAnsi="Garamond" w:cs="Times New Roman"/>
+          </w:rPr>
+          <w:fldChar w:fldCharType="begin"/>
+        </w:r>
+        <w:r>
+          <w:rPr>
+            <w:rFonts w:ascii="Garamond" w:hAnsi="Garamond" w:cs="Times New Roman"/>
+          </w:rPr>
+          <w:instrText xml:space="preserve"> ADDIN ZOTERO_ITEM CSL_CITATION {"citationID":"DfGnnmMb","properties":{"formattedCitation":"(S. C. Clark et al., 2015)","plainCitation":"(S. C. Clark et al., 2015)","noteIndex":0},"citationItems":[{"id":5370,"uris":["http://zotero.org/users/8421274/items/CSEI4Y28"],"itemData":{"id":5370,"type":"article-journal","abstract":"Variation in the timing of migration to freshwaters to spawn is one important dimension of the life history variation within individual salmon stocks. That variable has important implications for developing sustainable fisheries that simultaneously exploit multiple populations within the same geographic area. We examined the variation in migration timing of adult Chinook Salmon Oncorhynchus tshawytscha within the Togiak River system of southwest Alaska to determine whether fish that spawned in different habitats migrated into freshwater from the ocean at different times. In particular, we evaluated whether there were watershed</w:instrText>
+        </w:r>
+        <w:r>
+          <w:rPr>
+            <w:rFonts w:ascii="Cambria Math" w:hAnsi="Cambria Math" w:cs="Cambria Math"/>
+          </w:rPr>
+          <w:instrText>‐</w:instrText>
+        </w:r>
+        <w:r>
+          <w:rPr>
+            <w:rFonts w:ascii="Garamond" w:hAnsi="Garamond" w:cs="Times New Roman"/>
+          </w:rPr>
+          <w:instrText>wide effects of body size, sex, spawning location, and year on the timing of spawning</w:instrText>
+        </w:r>
+        <w:r>
+          <w:rPr>
+            <w:rFonts w:ascii="Cambria Math" w:hAnsi="Cambria Math" w:cs="Cambria Math"/>
+          </w:rPr>
+          <w:instrText>‐</w:instrText>
+        </w:r>
+        <w:r>
+          <w:rPr>
+            <w:rFonts w:ascii="Garamond" w:hAnsi="Garamond" w:cs="Times New Roman"/>
+          </w:rPr>
+          <w:instrText>run migration into the Togiak River. Migration data and spawning fate were collected using radiotelemetry and analyzed with mixed effects models to account for among</w:instrText>
+        </w:r>
+        <w:r>
+          <w:rPr>
+            <w:rFonts w:ascii="Cambria Math" w:hAnsi="Cambria Math" w:cs="Cambria Math"/>
+          </w:rPr>
+          <w:instrText>‐</w:instrText>
+        </w:r>
+        <w:r>
+          <w:rPr>
+            <w:rFonts w:ascii="Garamond" w:hAnsi="Garamond" w:cs="Times New Roman"/>
+          </w:rPr>
+          <w:instrText xml:space="preserve">year variation in migration timing across the 4 years of the study. We found that migration timing of Chinook Salmon in the Togiak watershed is segregated by spawning location and sex and is consistent across body sizes and years. Fish that spawned higher in the watershed had a tendency to enter freshwater earlier than fish that spawned lower in the watershed and in the main stem of the river. Our results indicate clear stock structure in the migration of spawning Chinook Salmon to the Togiak River watershed, suggesting that it is important to distribute harvest over the entire distribution of Chinook Salmon run timing to minimize the risk of overexploiting certain components of the stock complex.","container-title":"Transactions of the American Fisheries Society","DOI":"10.1080/00028487.2015.1031281","ISSN":"0002-8487","issue":"4","journalAbbreviation":"Transactions of the American Fisheries Society","page":"829-836","source":"Silverchair","title":"Migration Timing of Adult Chinook Salmon into the Togiak River, Alaska, Watershed: Is There Evidence for Stock Structure?","title-short":"Migration Timing of Adult Chinook Salmon into the Togiak River, Alaska, Watershed","volume":"144","author":[{"family":"Clark","given":"Sydney C."},{"family":"Tanner","given":"Theresa L."},{"family":"Sethi","given":"Suresh A."},{"family":"Bentley","given":"Kale T."},{"family":"Schindler","given":"Daniel E."}],"issued":{"date-parts":[["2015",7,1]]}}}],"schema":"https://github.com/citation-style-language/schema/raw/master/csl-citation.json"} </w:instrText>
+        </w:r>
+        <w:r>
+          <w:rPr>
+            <w:rFonts w:ascii="Garamond" w:hAnsi="Garamond" w:cs="Times New Roman"/>
+          </w:rPr>
+          <w:fldChar w:fldCharType="separate"/>
+        </w:r>
+        <w:r>
+          <w:rPr>
+            <w:rFonts w:ascii="Garamond" w:hAnsi="Garamond" w:cs="Times New Roman"/>
+            <w:noProof/>
+          </w:rPr>
+          <w:t>(S. C. Clark et al., 2015)</w:t>
+        </w:r>
+        <w:r>
+          <w:rPr>
+            <w:rFonts w:ascii="Garamond" w:hAnsi="Garamond" w:cs="Times New Roman"/>
+          </w:rPr>
+          <w:fldChar w:fldCharType="end"/>
+        </w:r>
+        <w:r>
+          <w:rPr>
+            <w:rFonts w:ascii="Garamond" w:hAnsi="Garamond" w:cs="Times New Roman"/>
+          </w:rPr>
+          <w:t xml:space="preserve">, telemetry data in the Kuskokwim </w:t>
+        </w:r>
+        <w:r>
+          <w:rPr>
+            <w:rFonts w:ascii="Garamond" w:hAnsi="Garamond" w:cs="Times New Roman"/>
+          </w:rPr>
+          <w:fldChar w:fldCharType="begin"/>
+        </w:r>
+        <w:r>
+          <w:rPr>
+            <w:rFonts w:ascii="Garamond" w:hAnsi="Garamond" w:cs="Times New Roman"/>
+          </w:rPr>
+          <w:instrText xml:space="preserve"> ADDIN ZOTERO_ITEM CSL_CITATION {"citationID":"63CDq9nT","properties":{"formattedCitation":"(J. N. Clark &amp; Smith, 2019; Head et al., 2017; Smith &amp; Liller, 2017a, 2017b)","plainCitation":"(J. N. Clark &amp; Smith, 2019; Head et al., 2017; Smith &amp; Liller, 2017a, 2017b)","noteIndex":0},"citationItems":[{"id":5951,"uris":["http://zotero.org/users/8421274/items/CIAC53WC"],"itemData":{"id":5951,"type":"article-journal","collection-title":"Alaska Department of Fish and Game, Fishery Data Series No. 19-21, Anchorage.","language":"en","source":"Zotero","title":"Inriver Abundance of Kuskokwim River Chinook Salmon, 2017","author":[{"family":"Clark","given":"Joshua N"},{"family":"Smith","given":"Nicholas J"}],"issued":{"date-parts":[["2019"]]}}},{"id":5945,"uris":["http://zotero.org/users/8421274/items/SEG4LZ34"],"itemData":{"id":5945,"type":"report","collection-title":"Alaska Department of Fish and Game, Fishery Data Series No. 17-23, Anchorage.","language":"en","source":"Zotero","title":"Inriver abundance of Kuskokwim River Chinook salmon, 2014.","author":[{"family":"Head","given":"Jordan M"},{"family":"Smith","given":"Nicholas J"},{"family":"Liller","given":"Zachary W"}],"issued":{"date-parts":[["2017"]]}}},{"id":5947,"uris":["http://zotero.org/users/8421274/items/Q33MW6W6"],"itemData":{"id":5947,"type":"report","collection-title":"Alaska Department of Fish and Game, Fishery Data Series No. 17-22, Anchorage.","language":"en","source":"Zotero","title":"Inriver abundance and migration characteristics of Kuskokwim River Chinook salmon, 2015.","author":[{"family":"Smith","given":"Nicholas J."},{"family":"Liller","given":"Zachary W."}],"issued":{"date-parts":[["2017"]]}}},{"id":5949,"uris":["http://zotero.org/users/8421274/items/LBRV3BM5"],"itemData":{"id":5949,"type":"article-journal","collection-title":"Alaska Department of Fish and Game, Fishery Data Series No. 17-47, Anchorage.","language":"en","source":"Zotero","title":"Inriver abundance and migration characteristics of Kuskokwim River Chinook salmon, 2016.","author":[{"family":"Smith","given":"Nicholas J."},{"family":"Liller","given":"Zachary W."}],"issued":{"date-parts":[["2017"]]}}}],"schema":"https://github.com/citation-style-language/schema/raw/master/csl-citation.json"} </w:instrText>
+        </w:r>
+        <w:r>
+          <w:rPr>
+            <w:rFonts w:ascii="Garamond" w:hAnsi="Garamond" w:cs="Times New Roman"/>
+          </w:rPr>
+          <w:fldChar w:fldCharType="separate"/>
+        </w:r>
+        <w:r>
+          <w:rPr>
+            <w:rFonts w:ascii="Garamond" w:hAnsi="Garamond" w:cs="Times New Roman"/>
+            <w:noProof/>
+          </w:rPr>
+          <w:t>(J. N. Clark &amp; Smith, 2019; Head et al., 2017; Smith &amp; Liller, 2017a, 2017b)</w:t>
+        </w:r>
+        <w:r>
+          <w:rPr>
+            <w:rFonts w:ascii="Garamond" w:hAnsi="Garamond" w:cs="Times New Roman"/>
+          </w:rPr>
+          <w:fldChar w:fldCharType="end"/>
+        </w:r>
+        <w:r>
+          <w:rPr>
+            <w:rFonts w:ascii="Garamond" w:hAnsi="Garamond" w:cs="Times New Roman"/>
+          </w:rPr>
+          <w:t xml:space="preserve">, and traditional and local knowledge held by Tribal citizens and </w:t>
+        </w:r>
+        <w:r>
+          <w:rPr>
+            <w:rFonts w:ascii="Garamond" w:hAnsi="Garamond" w:cs="Times New Roman"/>
+            <w:highlight w:val="yellow"/>
+            <w:rPrChange w:id="74" w:author="Benjamin J. Makhlouf" w:date="2026-07-08T16:21:00Z" w16du:dateUtc="2026-07-08T23:21:00Z">
+              <w:rPr>
+                <w:rFonts w:ascii="Garamond" w:hAnsi="Garamond" w:cs="Times New Roman"/>
+              </w:rPr>
+            </w:rPrChange>
+          </w:rPr>
+          <w:t>stakeholders</w:t>
+        </w:r>
+      </w:ins>
+      <w:ins w:id="75" w:author="Benjamin J. Makhlouf" w:date="2026-07-08T16:20:00Z" w16du:dateUtc="2026-07-08T23:20:00Z">
+        <w:r>
+          <w:rPr>
+            <w:rFonts w:ascii="Garamond" w:hAnsi="Garamond" w:cs="Times New Roman"/>
+            <w:highlight w:val="yellow"/>
+            <w:rPrChange w:id="76" w:author="Benjamin J. Makhlouf" w:date="2026-07-08T16:21:00Z" w16du:dateUtc="2026-07-08T23:21:00Z">
+              <w:rPr>
+                <w:rFonts w:ascii="Garamond" w:hAnsi="Garamond" w:cs="Times New Roman"/>
+              </w:rPr>
+            </w:rPrChange>
+          </w:rPr>
+          <w:t xml:space="preserve"> (Mikow et al., 2019)</w:t>
+        </w:r>
+      </w:ins>
+      <w:ins w:id="77" w:author="Benjamin J. Makhlouf" w:date="2026-07-08T15:59:00Z" w16du:dateUtc="2026-07-08T22:59:00Z">
+        <w:r>
+          <w:rPr>
+            <w:rFonts w:ascii="Garamond" w:hAnsi="Garamond" w:cs="Times New Roman"/>
+            <w:highlight w:val="yellow"/>
+            <w:rPrChange w:id="78" w:author="Benjamin J. Makhlouf" w:date="2026-07-08T16:21:00Z" w16du:dateUtc="2026-07-08T23:21:00Z">
+              <w:rPr>
+                <w:rFonts w:ascii="Garamond" w:hAnsi="Garamond" w:cs="Times New Roman"/>
+              </w:rPr>
+            </w:rPrChange>
+          </w:rPr>
+          <w:t>.</w:t>
+        </w:r>
+      </w:ins>
+      <w:ins w:id="79" w:author="Benjamin J. Makhlouf" w:date="2026-07-08T16:00:00Z" w16du:dateUtc="2026-07-08T23:00:00Z">
+        <w:r>
+          <w:rPr>
+            <w:rFonts w:ascii="Garamond" w:hAnsi="Garamond" w:cs="Times New Roman"/>
+          </w:rPr>
+          <w:t xml:space="preserve"> </w:t>
+        </w:r>
+      </w:ins>
+      <w:ins w:id="80" w:author="Benjamin J. Makhlouf" w:date="2026-07-08T16:12:00Z">
+        <w:r>
+          <w:rPr>
+            <w:rFonts w:ascii="Garamond" w:hAnsi="Garamond" w:cs="Times New Roman"/>
+          </w:rPr>
+          <w:t xml:space="preserve">Telemetry studies conducted over several years have provided variable estimates of the relative contribution of upper watershed Chinook salmon to the total run, ranging from &lt;10% to more recent estimates closer to 25% (Stuby 2007; Schaberg et al. 2012; Head et al. 2017; Smith and Liller 2017a). </w:t>
+        </w:r>
+      </w:ins>
+      <w:ins w:id="81" w:author="Benjamin J. Makhlouf" w:date="2026-07-08T16:14:00Z" w16du:dateUtc="2026-07-08T23:14:00Z">
+        <w:r>
+          <w:rPr>
+            <w:rFonts w:ascii="Garamond" w:hAnsi="Garamond" w:cs="Times New Roman"/>
+          </w:rPr>
+          <w:t>Upper watershed subpopulations</w:t>
+        </w:r>
+      </w:ins>
+      <w:ins w:id="82" w:author="Benjamin J. Makhlouf" w:date="2026-07-08T16:12:00Z">
+        <w:r>
+          <w:rPr>
+            <w:rFonts w:ascii="Garamond" w:hAnsi="Garamond" w:cs="Times New Roman"/>
+          </w:rPr>
+          <w:t xml:space="preserve"> are an important subsistence resource for upstream communities, including McGrath, Alaska</w:t>
+        </w:r>
+      </w:ins>
+      <w:ins w:id="83" w:author="Benjamin J. Makhlouf" w:date="2026-07-08T16:12:00Z" w16du:dateUtc="2026-07-08T23:12:00Z">
+        <w:r>
+          <w:rPr>
+            <w:rFonts w:ascii="Garamond" w:hAnsi="Garamond" w:cs="Times New Roman"/>
+          </w:rPr>
+          <w:t xml:space="preserve">, however, the vast majority (&gt;85%) of the total harvest occurs early in </w:t>
+        </w:r>
+      </w:ins>
+      <w:ins w:id="84" w:author="Benjamin J. Makhlouf" w:date="2026-07-08T16:13:00Z" w16du:dateUtc="2026-07-08T23:13:00Z">
+        <w:r>
+          <w:rPr>
+            <w:rFonts w:ascii="Garamond" w:hAnsi="Garamond" w:cs="Times New Roman"/>
+          </w:rPr>
+          <w:t xml:space="preserve">the return migration and </w:t>
+        </w:r>
+      </w:ins>
+      <w:ins w:id="85" w:author="Benjamin J. Makhlouf" w:date="2026-07-08T16:12:00Z" w16du:dateUtc="2026-07-08T23:12:00Z">
+        <w:r>
+          <w:rPr>
+            <w:rFonts w:ascii="Garamond" w:hAnsi="Garamond" w:cs="Times New Roman"/>
+          </w:rPr>
+          <w:t xml:space="preserve">in the lower portions of the river </w:t>
+        </w:r>
+      </w:ins>
+      <w:ins w:id="86" w:author="Benjamin J. Makhlouf" w:date="2026-07-08T15:55:00Z" w16du:dateUtc="2026-07-08T22:55:00Z">
+        <w:r>
+          <w:rPr>
+            <w:rFonts w:ascii="Garamond" w:hAnsi="Garamond" w:cs="Times New Roman"/>
+          </w:rPr>
+          <w:t xml:space="preserve"> </w:t>
+        </w:r>
+        <w:r>
+          <w:rPr>
+            <w:rFonts w:ascii="Garamond" w:hAnsi="Garamond" w:cs="Times New Roman"/>
+            <w:highlight w:val="yellow"/>
+            <w:rPrChange w:id="87" w:author="Benjamin J. Makhlouf" w:date="2026-07-08T16:13:00Z" w16du:dateUtc="2026-07-08T23:13:00Z">
+              <w:rPr>
+                <w:rFonts w:ascii="Garamond" w:hAnsi="Garamond" w:cs="Times New Roman"/>
+              </w:rPr>
+            </w:rPrChange>
+          </w:rPr>
+          <w:t>(</w:t>
+        </w:r>
+      </w:ins>
+      <w:ins w:id="88" w:author="Benjamin J. Makhlouf" w:date="2026-07-08T16:13:00Z" w16du:dateUtc="2026-07-08T23:13:00Z">
+        <w:r>
+          <w:rPr>
+            <w:rFonts w:ascii="Garamond" w:hAnsi="Garamond" w:cs="Times New Roman"/>
+            <w:highlight w:val="yellow"/>
+            <w:rPrChange w:id="89" w:author="Benjamin J. Makhlouf" w:date="2026-07-08T16:13:00Z" w16du:dateUtc="2026-07-08T23:13:00Z">
+              <w:rPr>
+                <w:rFonts w:ascii="Garamond" w:hAnsi="Garamond" w:cs="Times New Roman"/>
+              </w:rPr>
+            </w:rPrChange>
+          </w:rPr>
+          <w:t>Hamazaki 2008</w:t>
+        </w:r>
+        <w:r>
+          <w:rPr>
+            <w:rFonts w:ascii="Garamond" w:hAnsi="Garamond" w:cs="Times New Roman"/>
+            <w:highlight w:val="yellow"/>
+            <w:rPrChange w:id="90" w:author="Benjamin J. Makhlouf" w:date="2026-07-08T16:13:00Z" w16du:dateUtc="2026-07-08T23:13:00Z">
+              <w:rPr>
+                <w:rFonts w:ascii="Garamond" w:hAnsi="Garamond" w:cs="Times New Roman"/>
+              </w:rPr>
+            </w:rPrChange>
+          </w:rPr>
+          <w:t xml:space="preserve">, </w:t>
+        </w:r>
+      </w:ins>
+      <w:ins w:id="91" w:author="Benjamin J. Makhlouf" w:date="2026-07-08T15:55:00Z" w16du:dateUtc="2026-07-08T22:55:00Z">
+        <w:r>
+          <w:rPr>
+            <w:rFonts w:ascii="Garamond" w:hAnsi="Garamond" w:cs="Times New Roman"/>
+            <w:highlight w:val="yellow"/>
+            <w:rPrChange w:id="92" w:author="Benjamin J. Makhlouf" w:date="2026-07-08T16:13:00Z" w16du:dateUtc="2026-07-08T23:13:00Z">
+              <w:rPr>
+                <w:rFonts w:ascii="Garamond" w:hAnsi="Garamond" w:cs="Times New Roman"/>
+              </w:rPr>
+            </w:rPrChange>
+          </w:rPr>
+          <w:t>Tiernan and Poetter 2015).</w:t>
+        </w:r>
+      </w:ins>
+      <w:ins w:id="93" w:author="Benjamin J. Makhlouf" w:date="2026-07-08T16:16:00Z" w16du:dateUtc="2026-07-08T23:16:00Z">
+        <w:r>
+          <w:rPr>
+            <w:rFonts w:ascii="Garamond" w:hAnsi="Garamond" w:cs="Times New Roman"/>
+          </w:rPr>
+          <w:t xml:space="preserve"> As suc</w:t>
+        </w:r>
+      </w:ins>
+      <w:ins w:id="94" w:author="Benjamin J. Makhlouf" w:date="2026-07-08T16:17:00Z" w16du:dateUtc="2026-07-08T23:17:00Z">
+        <w:r>
+          <w:rPr>
+            <w:rFonts w:ascii="Garamond" w:hAnsi="Garamond" w:cs="Times New Roman"/>
+          </w:rPr>
+          <w:t xml:space="preserve">h, there is concern that upper </w:t>
+        </w:r>
+        <w:r>
+          <w:rPr>
+            <w:rFonts w:ascii="Garamond" w:hAnsi="Garamond" w:cs="Times New Roman"/>
+          </w:rPr>
+          <w:lastRenderedPageBreak/>
+          <w:t xml:space="preserve">watershed stocks may be </w:t>
+        </w:r>
+      </w:ins>
+      <w:del w:id="95" w:author="Benjamin J. Makhlouf" w:date="2026-07-08T15:52:00Z" w16du:dateUtc="2026-07-08T22:52:00Z">
+        <w:r>
+          <w:rPr>
+            <w:rFonts w:ascii="Garamond" w:hAnsi="Garamond" w:cs="Times New Roman"/>
+          </w:rPr>
+          <w:delText xml:space="preserve"> </w:delText>
+        </w:r>
+      </w:del>
+      <w:ins w:id="96" w:author="Benjamin J. Makhlouf" w:date="2026-07-08T16:17:00Z" w16du:dateUtc="2026-07-08T23:17:00Z">
+        <w:r>
+          <w:rPr>
+            <w:rFonts w:ascii="Garamond" w:hAnsi="Garamond" w:cs="Times New Roman"/>
+          </w:rPr>
+          <w:t>overexploited by downstream fisheries</w:t>
+        </w:r>
+      </w:ins>
+      <w:ins w:id="97" w:author="Benjamin J. Makhlouf" w:date="2026-07-08T16:18:00Z" w16du:dateUtc="2026-07-08T23:18:00Z">
+        <w:r>
+          <w:rPr>
+            <w:rFonts w:ascii="Garamond" w:hAnsi="Garamond" w:cs="Times New Roman"/>
+          </w:rPr>
+          <w:t xml:space="preserve">. By implementing a front-end fishery closure, managers aim to </w:t>
+        </w:r>
+      </w:ins>
+      <w:moveToRangeStart w:id="98" w:author="Benjamin J. Makhlouf" w:date="2026-06-19T15:33:00Z" w:name="move232775618"/>
+      <w:moveTo w:id="99" w:author="Benjamin J. Makhlouf" w:date="2026-06-19T15:33:00Z" w16du:dateUtc="2026-06-19T22:33:00Z">
+        <w:del w:id="100" w:author="Benjamin J. Makhlouf" w:date="2026-06-19T15:34:00Z" w16du:dateUtc="2026-06-19T22:34:00Z">
           <w:r>
             <w:rPr>
               <w:rFonts w:ascii="Garamond" w:hAnsi="Garamond" w:cs="Times New Roman"/>
@@ -1926,19 +2260,43 @@
           <w:rPr>
             <w:rFonts w:ascii="Garamond" w:hAnsi="Garamond" w:cs="Times New Roman"/>
           </w:rPr>
-          <w:t>support basin-wide escapement goals, provide more equitable harvest opportunities to upstream communities, and protect upper river stocks which are at heightened risk of overharvest but contribute disproportionately to stabilizing downstream fishery dynamics.</w:t>
+          <w:t xml:space="preserve">support basin-wide escapement goals, provide more equitable harvest opportunities to upstream communities, and protect upper river stocks </w:t>
+        </w:r>
+        <w:del w:id="101" w:author="Benjamin J. Makhlouf" w:date="2026-07-08T16:18:00Z" w16du:dateUtc="2026-07-08T23:18:00Z">
+          <w:r>
+            <w:rPr>
+              <w:rFonts w:ascii="Garamond" w:hAnsi="Garamond" w:cs="Times New Roman"/>
+            </w:rPr>
+            <w:delText xml:space="preserve">which are </w:delText>
+          </w:r>
+        </w:del>
+        <w:r>
+          <w:rPr>
+            <w:rFonts w:ascii="Garamond" w:hAnsi="Garamond" w:cs="Times New Roman"/>
+          </w:rPr>
+          <w:t>at heightened risk of overharvest</w:t>
         </w:r>
       </w:moveTo>
-      <w:moveToRangeEnd w:id="71"/>
-      <w:ins w:id="74" w:author="Benjamin J. Makhlouf" w:date="2026-06-19T15:35:00Z" w16du:dateUtc="2026-06-19T22:35:00Z">
-        <w:r>
-          <w:rPr>
-            <w:rFonts w:ascii="Garamond" w:hAnsi="Garamond" w:cs="Times New Roman"/>
-          </w:rPr>
-          <w:t xml:space="preserve"> The relationship between return timing and watershed position underpinning this strategy  </w:t>
-        </w:r>
-      </w:ins>
-      <w:del w:id="75" w:author="Benjamin J. Makhlouf" w:date="2026-06-19T15:35:00Z" w16du:dateUtc="2026-06-19T22:35:00Z">
+      <w:ins w:id="102" w:author="Benjamin J. Makhlouf" w:date="2026-07-08T16:19:00Z" w16du:dateUtc="2026-07-08T23:19:00Z">
+        <w:r>
+          <w:rPr>
+            <w:rFonts w:ascii="Garamond" w:hAnsi="Garamond" w:cs="Times New Roman"/>
+          </w:rPr>
+          <w:t>.</w:t>
+        </w:r>
+      </w:ins>
+      <w:moveTo w:id="103" w:author="Benjamin J. Makhlouf" w:date="2026-06-19T15:33:00Z" w16du:dateUtc="2026-06-19T22:33:00Z">
+        <w:del w:id="104" w:author="Benjamin J. Makhlouf" w:date="2026-07-08T16:19:00Z" w16du:dateUtc="2026-07-08T23:19:00Z">
+          <w:r>
+            <w:rPr>
+              <w:rFonts w:ascii="Garamond" w:hAnsi="Garamond" w:cs="Times New Roman"/>
+            </w:rPr>
+            <w:delText xml:space="preserve"> but contribute disproportionately to stabilizing downstream fishery dynamics.</w:delText>
+          </w:r>
+        </w:del>
+      </w:moveTo>
+      <w:moveToRangeEnd w:id="98"/>
+      <w:del w:id="105" w:author="Benjamin J. Makhlouf" w:date="2026-06-19T15:35:00Z" w16du:dateUtc="2026-06-19T22:35:00Z">
         <w:r>
           <w:rPr>
             <w:rFonts w:ascii="Garamond" w:hAnsi="Garamond" w:cs="Times New Roman"/>
@@ -1946,21 +2304,15 @@
           <w:delText xml:space="preserve">This assumption </w:delText>
         </w:r>
       </w:del>
-      <w:r>
-        <w:rPr>
-          <w:rFonts w:ascii="Garamond" w:hAnsi="Garamond" w:cs="Times New Roman"/>
-        </w:rPr>
-        <w:t xml:space="preserve">is </w:t>
-      </w:r>
-      <w:ins w:id="76" w:author="Benjamin J. Makhlouf" w:date="2026-06-19T15:35:00Z" w16du:dateUtc="2026-06-19T22:35:00Z">
-        <w:r>
-          <w:rPr>
-            <w:rFonts w:ascii="Garamond" w:hAnsi="Garamond" w:cs="Times New Roman"/>
-          </w:rPr>
-          <w:t xml:space="preserve">based on </w:t>
-        </w:r>
-      </w:ins>
-      <w:del w:id="77" w:author="Benjamin J. Makhlouf" w:date="2026-06-19T15:35:00Z" w16du:dateUtc="2026-06-19T22:35:00Z">
+      <w:del w:id="106" w:author="Benjamin J. Makhlouf" w:date="2026-07-08T15:59:00Z" w16du:dateUtc="2026-07-08T22:59:00Z">
+        <w:r>
+          <w:rPr>
+            <w:rFonts w:ascii="Garamond" w:hAnsi="Garamond" w:cs="Times New Roman"/>
+          </w:rPr>
+          <w:delText xml:space="preserve">is </w:delText>
+        </w:r>
+      </w:del>
+      <w:del w:id="107" w:author="Benjamin J. Makhlouf" w:date="2026-06-19T15:35:00Z" w16du:dateUtc="2026-06-19T22:35:00Z">
         <w:r>
           <w:rPr>
             <w:rFonts w:ascii="Garamond" w:hAnsi="Garamond" w:cs="Times New Roman"/>
@@ -1968,86 +2320,88 @@
           <w:delText>bolstered by</w:delText>
         </w:r>
       </w:del>
-      <w:r>
-        <w:rPr>
-          <w:rFonts w:ascii="Garamond" w:hAnsi="Garamond" w:cs="Times New Roman"/>
-        </w:rPr>
-        <w:t xml:space="preserve"> patterns observed in other systems </w:t>
-      </w:r>
-      <w:r>
-        <w:rPr>
-          <w:rFonts w:ascii="Garamond" w:hAnsi="Garamond" w:cs="Times New Roman"/>
-        </w:rPr>
-        <w:fldChar w:fldCharType="begin"/>
-      </w:r>
-      <w:r>
-        <w:rPr>
-          <w:rFonts w:ascii="Garamond" w:hAnsi="Garamond" w:cs="Times New Roman"/>
-        </w:rPr>
-        <w:instrText xml:space="preserve"> ADDIN ZOTERO_ITEM CSL_CITATION {"citationID":"DfGnnmMb","properties":{"formattedCitation":"(S. C. Clark et al., 2015)","plainCitation":"(S. C. Clark et al., 2015)","noteIndex":0},"citationItems":[{"id":5370,"uris":["http://zotero.org/users/8421274/items/CSEI4Y28"],"itemData":{"id":5370,"type":"article-journal","abstract":"Variation in the timing of migration to freshwaters to spawn is one important dimension of the life history variation within individual salmon stocks. That variable has important implications for developing sustainable fisheries that simultaneously exploit multiple populations within the same geographic area. We examined the variation in migration timing of adult Chinook Salmon Oncorhynchus tshawytscha within the Togiak River system of southwest Alaska to determine whether fish that spawned in different habitats migrated into freshwater from the ocean at different times. In particular, we evaluated whether there were watershed</w:instrText>
-      </w:r>
-      <w:r>
-        <w:rPr>
-          <w:rFonts w:ascii="Cambria Math" w:hAnsi="Cambria Math" w:cs="Cambria Math"/>
-        </w:rPr>
-        <w:instrText>‐</w:instrText>
-      </w:r>
-      <w:r>
-        <w:rPr>
-          <w:rFonts w:ascii="Garamond" w:hAnsi="Garamond" w:cs="Times New Roman"/>
-        </w:rPr>
-        <w:instrText>wide effects of body size, sex, spawning location, and year on the timing of spawning</w:instrText>
-      </w:r>
-      <w:r>
-        <w:rPr>
-          <w:rFonts w:ascii="Cambria Math" w:hAnsi="Cambria Math" w:cs="Cambria Math"/>
-        </w:rPr>
-        <w:instrText>‐</w:instrText>
-      </w:r>
-      <w:r>
-        <w:rPr>
-          <w:rFonts w:ascii="Garamond" w:hAnsi="Garamond" w:cs="Times New Roman"/>
-        </w:rPr>
-        <w:instrText>run migration into the Togiak River. Migration data and spawning fate were collected using radiotelemetry and analyzed with mixed effects models to account for among</w:instrText>
-      </w:r>
-      <w:r>
-        <w:rPr>
-          <w:rFonts w:ascii="Cambria Math" w:hAnsi="Cambria Math" w:cs="Cambria Math"/>
-        </w:rPr>
-        <w:instrText>‐</w:instrText>
-      </w:r>
-      <w:r>
-        <w:rPr>
-          <w:rFonts w:ascii="Garamond" w:hAnsi="Garamond" w:cs="Times New Roman"/>
-        </w:rPr>
-        <w:instrText xml:space="preserve">year variation in migration timing across the 4 years of the study. We found that migration timing of Chinook Salmon in the Togiak watershed is segregated by spawning location and sex and is consistent across body sizes and years. Fish that spawned higher in the watershed had a tendency to enter freshwater earlier than fish that spawned lower in the watershed and in the main stem of the river. Our results indicate clear stock structure in the migration of spawning Chinook Salmon to the Togiak River watershed, suggesting that it is important to distribute harvest over the entire distribution of Chinook Salmon run timing to minimize the risk of overexploiting certain components of the stock complex.","container-title":"Transactions of the American Fisheries Society","DOI":"10.1080/00028487.2015.1031281","ISSN":"0002-8487","issue":"4","journalAbbreviation":"Transactions of the American Fisheries Society","page":"829-836","source":"Silverchair","title":"Migration Timing of Adult Chinook Salmon into the Togiak River, Alaska, Watershed: Is There Evidence for Stock Structure?","title-short":"Migration Timing of Adult Chinook Salmon into the Togiak River, Alaska, Watershed","volume":"144","author":[{"family":"Clark","given":"Sydney C."},{"family":"Tanner","given":"Theresa L."},{"family":"Sethi","given":"Suresh A."},{"family":"Bentley","given":"Kale T."},{"family":"Schindler","given":"Daniel E."}],"issued":{"date-parts":[["2015",7,1]]}}}],"schema":"https://github.com/citation-style-language/schema/raw/master/csl-citation.json"} </w:instrText>
-      </w:r>
-      <w:r>
-        <w:rPr>
-          <w:rFonts w:ascii="Garamond" w:hAnsi="Garamond" w:cs="Times New Roman"/>
-        </w:rPr>
-        <w:fldChar w:fldCharType="separate"/>
-      </w:r>
-      <w:r>
-        <w:rPr>
-          <w:rFonts w:ascii="Garamond" w:hAnsi="Garamond" w:cs="Times New Roman"/>
-          <w:noProof/>
-        </w:rPr>
-        <w:t>(S. C. Clark et al., 2015)</w:t>
-      </w:r>
-      <w:r>
-        <w:rPr>
-          <w:rFonts w:ascii="Garamond" w:hAnsi="Garamond" w:cs="Times New Roman"/>
-        </w:rPr>
-        <w:fldChar w:fldCharType="end"/>
-      </w:r>
-      <w:r>
-        <w:rPr>
-          <w:rFonts w:ascii="Garamond" w:hAnsi="Garamond" w:cs="Times New Roman"/>
-        </w:rPr>
-        <w:t xml:space="preserve">, </w:t>
-      </w:r>
-      <w:del w:id="78" w:author="Benjamin J. Makhlouf" w:date="2026-06-19T15:36:00Z" w16du:dateUtc="2026-06-19T22:36:00Z">
+      <w:del w:id="108" w:author="Benjamin J. Makhlouf" w:date="2026-07-08T15:59:00Z" w16du:dateUtc="2026-07-08T22:59:00Z">
+        <w:r>
+          <w:rPr>
+            <w:rFonts w:ascii="Garamond" w:hAnsi="Garamond" w:cs="Times New Roman"/>
+          </w:rPr>
+          <w:delText xml:space="preserve"> patterns observed in other systems </w:delText>
+        </w:r>
+        <w:r>
+          <w:rPr>
+            <w:rFonts w:ascii="Garamond" w:hAnsi="Garamond" w:cs="Times New Roman"/>
+          </w:rPr>
+          <w:fldChar w:fldCharType="begin"/>
+        </w:r>
+        <w:r>
+          <w:rPr>
+            <w:rFonts w:ascii="Garamond" w:hAnsi="Garamond" w:cs="Times New Roman"/>
+          </w:rPr>
+          <w:delInstrText xml:space="preserve"> ADDIN ZOTERO_ITEM CSL_CITATION {"citationID":"DfGnnmMb","properties":{"formattedCitation":"(S. C. Clark et al., 2015)","plainCitation":"(S. C. Clark et al., 2015)","noteIndex":0},"citationItems":[{"id":5370,"uris":["http://zotero.org/users/8421274/items/CSEI4Y28"],"itemData":{"id":5370,"type":"article-journal","abstract":"Variation in the timing of migration to freshwaters to spawn is one important dimension of the life history variation within individual salmon stocks. That variable has important implications for developing sustainable fisheries that simultaneously exploit multiple populations within the same geographic area. We examined the variation in migration timing of adult Chinook Salmon Oncorhynchus tshawytscha within the Togiak River system of southwest Alaska to determine whether fish that spawned in different habitats migrated into freshwater from the ocean at different times. In particular, we evaluated whether there were watershed</w:delInstrText>
+        </w:r>
+        <w:r>
+          <w:rPr>
+            <w:rFonts w:ascii="Cambria Math" w:hAnsi="Cambria Math" w:cs="Cambria Math"/>
+          </w:rPr>
+          <w:delInstrText>‐</w:delInstrText>
+        </w:r>
+        <w:r>
+          <w:rPr>
+            <w:rFonts w:ascii="Garamond" w:hAnsi="Garamond" w:cs="Times New Roman"/>
+          </w:rPr>
+          <w:delInstrText>wide effects of body size, sex, spawning location, and year on the timing of spawning</w:delInstrText>
+        </w:r>
+        <w:r>
+          <w:rPr>
+            <w:rFonts w:ascii="Cambria Math" w:hAnsi="Cambria Math" w:cs="Cambria Math"/>
+          </w:rPr>
+          <w:delInstrText>‐</w:delInstrText>
+        </w:r>
+        <w:r>
+          <w:rPr>
+            <w:rFonts w:ascii="Garamond" w:hAnsi="Garamond" w:cs="Times New Roman"/>
+          </w:rPr>
+          <w:delInstrText>run migration into the Togiak River. Migration data and spawning fate were collected using radiotelemetry and analyzed with mixed effects models to account for among</w:delInstrText>
+        </w:r>
+        <w:r>
+          <w:rPr>
+            <w:rFonts w:ascii="Cambria Math" w:hAnsi="Cambria Math" w:cs="Cambria Math"/>
+          </w:rPr>
+          <w:delInstrText>‐</w:delInstrText>
+        </w:r>
+        <w:r>
+          <w:rPr>
+            <w:rFonts w:ascii="Garamond" w:hAnsi="Garamond" w:cs="Times New Roman"/>
+          </w:rPr>
+          <w:delInstrText xml:space="preserve">year variation in migration timing across the 4 years of the study. We found that migration timing of Chinook Salmon in the Togiak watershed is segregated by spawning location and sex and is consistent across body sizes and years. Fish that spawned higher in the watershed had a tendency to enter freshwater earlier than fish that spawned lower in the watershed and in the main stem of the river. Our results indicate clear stock structure in the migration of spawning Chinook Salmon to the Togiak River watershed, suggesting that it is important to distribute harvest over the entire distribution of Chinook Salmon run timing to minimize the risk of overexploiting certain components of the stock complex.","container-title":"Transactions of the American Fisheries Society","DOI":"10.1080/00028487.2015.1031281","ISSN":"0002-8487","issue":"4","journalAbbreviation":"Transactions of the American Fisheries Society","page":"829-836","source":"Silverchair","title":"Migration Timing of Adult Chinook Salmon into the Togiak River, Alaska, Watershed: Is There Evidence for Stock Structure?","title-short":"Migration Timing of Adult Chinook Salmon into the Togiak River, Alaska, Watershed","volume":"144","author":[{"family":"Clark","given":"Sydney C."},{"family":"Tanner","given":"Theresa L."},{"family":"Sethi","given":"Suresh A."},{"family":"Bentley","given":"Kale T."},{"family":"Schindler","given":"Daniel E."}],"issued":{"date-parts":[["2015",7,1]]}}}],"schema":"https://github.com/citation-style-language/schema/raw/master/csl-citation.json"} </w:delInstrText>
+        </w:r>
+        <w:r>
+          <w:rPr>
+            <w:rFonts w:ascii="Garamond" w:hAnsi="Garamond" w:cs="Times New Roman"/>
+          </w:rPr>
+          <w:fldChar w:fldCharType="separate"/>
+        </w:r>
+        <w:r>
+          <w:rPr>
+            <w:rFonts w:ascii="Garamond" w:hAnsi="Garamond" w:cs="Times New Roman"/>
+            <w:noProof/>
+          </w:rPr>
+          <w:delText>(S. C. Clark et al., 2015)</w:delText>
+        </w:r>
+        <w:r>
+          <w:rPr>
+            <w:rFonts w:ascii="Garamond" w:hAnsi="Garamond" w:cs="Times New Roman"/>
+          </w:rPr>
+          <w:fldChar w:fldCharType="end"/>
+        </w:r>
+        <w:r>
+          <w:rPr>
+            <w:rFonts w:ascii="Garamond" w:hAnsi="Garamond" w:cs="Times New Roman"/>
+          </w:rPr>
+          <w:delText xml:space="preserve">, </w:delText>
+        </w:r>
+      </w:del>
+      <w:del w:id="109" w:author="Benjamin J. Makhlouf" w:date="2026-06-19T15:36:00Z" w16du:dateUtc="2026-06-19T22:36:00Z">
         <w:r>
           <w:rPr>
             <w:rFonts w:ascii="Garamond" w:hAnsi="Garamond" w:cs="Times New Roman"/>
@@ -2055,51 +2409,53 @@
           <w:delText xml:space="preserve">supported by </w:delText>
         </w:r>
       </w:del>
-      <w:r>
-        <w:rPr>
-          <w:rFonts w:ascii="Garamond" w:hAnsi="Garamond" w:cs="Times New Roman"/>
-        </w:rPr>
-        <w:t xml:space="preserve">telemetry data in the Kuskokwim </w:t>
-      </w:r>
-      <w:r>
-        <w:rPr>
-          <w:rFonts w:ascii="Garamond" w:hAnsi="Garamond" w:cs="Times New Roman"/>
-        </w:rPr>
-        <w:fldChar w:fldCharType="begin"/>
-      </w:r>
-      <w:r>
-        <w:rPr>
-          <w:rFonts w:ascii="Garamond" w:hAnsi="Garamond" w:cs="Times New Roman"/>
-        </w:rPr>
-        <w:instrText xml:space="preserve"> ADDIN ZOTERO_ITEM CSL_CITATION {"citationID":"63CDq9nT","properties":{"formattedCitation":"(J. N. Clark &amp; Smith, 2019; Head et al., 2017; Smith &amp; Liller, 2017a, 2017b)","plainCitation":"(J. N. Clark &amp; Smith, 2019; Head et al., 2017; Smith &amp; Liller, 2017a, 2017b)","noteIndex":0},"citationItems":[{"id":5951,"uris":["http://zotero.org/users/8421274/items/CIAC53WC"],"itemData":{"id":5951,"type":"article-journal","collection-title":"Alaska Department of Fish and Game, Fishery Data Series No. 19-21, Anchorage.","language":"en","source":"Zotero","title":"Inriver Abundance of Kuskokwim River Chinook Salmon, 2017","author":[{"family":"Clark","given":"Joshua N"},{"family":"Smith","given":"Nicholas J"}],"issued":{"date-parts":[["2019"]]}}},{"id":5945,"uris":["http://zotero.org/users/8421274/items/SEG4LZ34"],"itemData":{"id":5945,"type":"report","collection-title":"Alaska Department of Fish and Game, Fishery Data Series No. 17-23, Anchorage.","language":"en","source":"Zotero","title":"Inriver abundance of Kuskokwim River Chinook salmon, 2014.","author":[{"family":"Head","given":"Jordan M"},{"family":"Smith","given":"Nicholas J"},{"family":"Liller","given":"Zachary W"}],"issued":{"date-parts":[["2017"]]}}},{"id":5947,"uris":["http://zotero.org/users/8421274/items/Q33MW6W6"],"itemData":{"id":5947,"type":"report","collection-title":"Alaska Department of Fish and Game, Fishery Data Series No. 17-22, Anchorage.","language":"en","source":"Zotero","title":"Inriver abundance and migration characteristics of Kuskokwim River Chinook salmon, 2015.","author":[{"family":"Smith","given":"Nicholas J."},{"family":"Liller","given":"Zachary W."}],"issued":{"date-parts":[["2017"]]}}},{"id":5949,"uris":["http://zotero.org/users/8421274/items/LBRV3BM5"],"itemData":{"id":5949,"type":"article-journal","collection-title":"Alaska Department of Fish and Game, Fishery Data Series No. 17-47, Anchorage.","language":"en","source":"Zotero","title":"Inriver abundance and migration characteristics of Kuskokwim River Chinook salmon, 2016.","author":[{"family":"Smith","given":"Nicholas J."},{"family":"Liller","given":"Zachary W."}],"issued":{"date-parts":[["2017"]]}}}],"schema":"https://github.com/citation-style-language/schema/raw/master/csl-citation.json"} </w:instrText>
-      </w:r>
-      <w:r>
-        <w:rPr>
-          <w:rFonts w:ascii="Garamond" w:hAnsi="Garamond" w:cs="Times New Roman"/>
-        </w:rPr>
-        <w:fldChar w:fldCharType="separate"/>
-      </w:r>
-      <w:r>
-        <w:rPr>
-          <w:rFonts w:ascii="Garamond" w:hAnsi="Garamond" w:cs="Times New Roman"/>
-          <w:noProof/>
-        </w:rPr>
-        <w:t>(J. N. Clark &amp; Smith, 2019; Head et al., 2017; Smith &amp; Liller, 2017a, 2017b)</w:t>
-      </w:r>
-      <w:r>
-        <w:rPr>
-          <w:rFonts w:ascii="Garamond" w:hAnsi="Garamond" w:cs="Times New Roman"/>
-        </w:rPr>
-        <w:fldChar w:fldCharType="end"/>
-      </w:r>
-      <w:r>
-        <w:rPr>
-          <w:rFonts w:ascii="Garamond" w:hAnsi="Garamond" w:cs="Times New Roman"/>
-        </w:rPr>
-        <w:t xml:space="preserve">, and further motivated by traditional and local knowledge held by Tribal citizens and stakeholders. </w:t>
-      </w:r>
-      <w:moveFromRangeStart w:id="79" w:author="Benjamin J. Makhlouf" w:date="2026-06-19T15:33:00Z" w:name="move232775618"/>
-      <w:moveFrom w:id="80" w:author="Benjamin J. Makhlouf" w:date="2026-06-19T15:33:00Z" w16du:dateUtc="2026-06-19T22:33:00Z">
+      <w:del w:id="110" w:author="Benjamin J. Makhlouf" w:date="2026-07-08T15:59:00Z" w16du:dateUtc="2026-07-08T22:59:00Z">
+        <w:r>
+          <w:rPr>
+            <w:rFonts w:ascii="Garamond" w:hAnsi="Garamond" w:cs="Times New Roman"/>
+          </w:rPr>
+          <w:delText xml:space="preserve">telemetry data in the Kuskokwim </w:delText>
+        </w:r>
+        <w:r>
+          <w:rPr>
+            <w:rFonts w:ascii="Garamond" w:hAnsi="Garamond" w:cs="Times New Roman"/>
+          </w:rPr>
+          <w:fldChar w:fldCharType="begin"/>
+        </w:r>
+        <w:r>
+          <w:rPr>
+            <w:rFonts w:ascii="Garamond" w:hAnsi="Garamond" w:cs="Times New Roman"/>
+          </w:rPr>
+          <w:delInstrText xml:space="preserve"> ADDIN ZOTERO_ITEM CSL_CITATION {"citationID":"63CDq9nT","properties":{"formattedCitation":"(J. N. Clark &amp; Smith, 2019; Head et al., 2017; Smith &amp; Liller, 2017a, 2017b)","plainCitation":"(J. N. Clark &amp; Smith, 2019; Head et al., 2017; Smith &amp; Liller, 2017a, 2017b)","noteIndex":0},"citationItems":[{"id":5951,"uris":["http://zotero.org/users/8421274/items/CIAC53WC"],"itemData":{"id":5951,"type":"article-journal","collection-title":"Alaska Department of Fish and Game, Fishery Data Series No. 19-21, Anchorage.","language":"en","source":"Zotero","title":"Inriver Abundance of Kuskokwim River Chinook Salmon, 2017","author":[{"family":"Clark","given":"Joshua N"},{"family":"Smith","given":"Nicholas J"}],"issued":{"date-parts":[["2019"]]}}},{"id":5945,"uris":["http://zotero.org/users/8421274/items/SEG4LZ34"],"itemData":{"id":5945,"type":"report","collection-title":"Alaska Department of Fish and Game, Fishery Data Series No. 17-23, Anchorage.","language":"en","source":"Zotero","title":"Inriver abundance of Kuskokwim River Chinook salmon, 2014.","author":[{"family":"Head","given":"Jordan M"},{"family":"Smith","given":"Nicholas J"},{"family":"Liller","given":"Zachary W"}],"issued":{"date-parts":[["2017"]]}}},{"id":5947,"uris":["http://zotero.org/users/8421274/items/Q33MW6W6"],"itemData":{"id":5947,"type":"report","collection-title":"Alaska Department of Fish and Game, Fishery Data Series No. 17-22, Anchorage.","language":"en","source":"Zotero","title":"Inriver abundance and migration characteristics of Kuskokwim River Chinook salmon, 2015.","author":[{"family":"Smith","given":"Nicholas J."},{"family":"Liller","given":"Zachary W."}],"issued":{"date-parts":[["2017"]]}}},{"id":5949,"uris":["http://zotero.org/users/8421274/items/LBRV3BM5"],"itemData":{"id":5949,"type":"article-journal","collection-title":"Alaska Department of Fish and Game, Fishery Data Series No. 17-47, Anchorage.","language":"en","source":"Zotero","title":"Inriver abundance and migration characteristics of Kuskokwim River Chinook salmon, 2016.","author":[{"family":"Smith","given":"Nicholas J."},{"family":"Liller","given":"Zachary W."}],"issued":{"date-parts":[["2017"]]}}}],"schema":"https://github.com/citation-style-language/schema/raw/master/csl-citation.json"} </w:delInstrText>
+        </w:r>
+        <w:r>
+          <w:rPr>
+            <w:rFonts w:ascii="Garamond" w:hAnsi="Garamond" w:cs="Times New Roman"/>
+          </w:rPr>
+          <w:fldChar w:fldCharType="separate"/>
+        </w:r>
+        <w:r>
+          <w:rPr>
+            <w:rFonts w:ascii="Garamond" w:hAnsi="Garamond" w:cs="Times New Roman"/>
+            <w:noProof/>
+          </w:rPr>
+          <w:delText>(J. N. Clark &amp; Smith, 2019; Head et al., 2017; Smith &amp; Liller, 2017a, 2017b)</w:delText>
+        </w:r>
+        <w:r>
+          <w:rPr>
+            <w:rFonts w:ascii="Garamond" w:hAnsi="Garamond" w:cs="Times New Roman"/>
+          </w:rPr>
+          <w:fldChar w:fldCharType="end"/>
+        </w:r>
+        <w:r>
+          <w:rPr>
+            <w:rFonts w:ascii="Garamond" w:hAnsi="Garamond" w:cs="Times New Roman"/>
+          </w:rPr>
+          <w:delText xml:space="preserve">, and further motivated by traditional and local knowledge held by Tribal citizens and stakeholders. </w:delText>
+        </w:r>
+      </w:del>
+      <w:moveFromRangeStart w:id="111" w:author="Benjamin J. Makhlouf" w:date="2026-06-19T15:33:00Z" w:name="move232775618"/>
+      <w:moveFrom w:id="112" w:author="Benjamin J. Makhlouf" w:date="2026-06-19T15:33:00Z" w16du:dateUtc="2026-06-19T22:33:00Z">
         <w:r>
           <w:rPr>
             <w:rFonts w:ascii="Garamond" w:hAnsi="Garamond" w:cs="Times New Roman"/>
@@ -2107,172 +2463,125 @@
           <w:t xml:space="preserve">By protecting upriver stocks, managers aim to support basin-wide escapement goals, provide more equitable harvest opportunities to upstream communities, and protect upper river stocks which are at heightened risk of overharvest but contribute disproportionately to stabilizing downstream fishery dynamics. </w:t>
         </w:r>
       </w:moveFrom>
-      <w:moveFromRangeEnd w:id="79"/>
-      <w:ins w:id="81" w:author="Benjamin J. Makhlouf" w:date="2026-06-19T15:36:00Z" w16du:dateUtc="2026-06-19T22:36:00Z">
-        <w:r>
-          <w:rPr>
-            <w:rFonts w:ascii="Garamond" w:hAnsi="Garamond" w:cs="Times New Roman"/>
-          </w:rPr>
-          <w:t xml:space="preserve">However, </w:t>
-        </w:r>
-      </w:ins>
-      <w:ins w:id="82" w:author="Benjamin J. Makhlouf" w:date="2026-06-18T18:33:00Z">
-        <w:r>
-          <w:rPr>
-            <w:rFonts w:ascii="Garamond" w:hAnsi="Garamond" w:cs="Times New Roman"/>
-          </w:rPr>
-          <w:t>the spatial ecology of Chinook salmon in the Kuskokwim River basin remains poorly understood at the watershed scale</w:t>
-        </w:r>
-      </w:ins>
-      <w:ins w:id="83" w:author="Benjamin J. Makhlouf" w:date="2026-06-19T15:36:00Z" w16du:dateUtc="2026-06-19T22:36:00Z">
-        <w:r>
-          <w:rPr>
-            <w:rFonts w:ascii="Garamond" w:hAnsi="Garamond" w:cs="Times New Roman"/>
-          </w:rPr>
-          <w:t>. As a result,</w:t>
-        </w:r>
-      </w:ins>
-      <w:ins w:id="84" w:author="Benjamin J. Makhlouf" w:date="2026-06-18T18:33:00Z">
-        <w:r>
-          <w:rPr>
-            <w:rFonts w:ascii="Garamond" w:hAnsi="Garamond" w:cs="Times New Roman"/>
-          </w:rPr>
-          <w:t xml:space="preserve"> it remains unclear whether the front-end fishery closure effectively protects upstream stocks as intended. </w:t>
-        </w:r>
-      </w:ins>
-      <w:ins w:id="85" w:author="Benjamin J. Makhlouf" w:date="2026-06-18T18:35:00Z">
-        <w:r>
-          <w:rPr>
-            <w:rFonts w:ascii="Garamond" w:hAnsi="Garamond" w:cs="Times New Roman"/>
-          </w:rPr>
-          <w:t xml:space="preserve">Genetic approaches, which have been widely used to investigate population structure and provenance in other Pacific salmon species, cannot be used to estimate provenance in the Kuskokwim because Chinook salmon exhibit low genetic differentiation across the basin, while ongoing telemetry studies are logistically constrained in their ability to characterize migration </w:t>
-        </w:r>
-        <w:r>
-          <w:rPr>
-            <w:rFonts w:ascii="Garamond" w:hAnsi="Garamond" w:cs="Times New Roman"/>
-          </w:rPr>
-          <w:lastRenderedPageBreak/>
-          <w:t>dynamics across such a large and remote watershed.</w:t>
-        </w:r>
-      </w:ins>
-      <w:ins w:id="86" w:author="Benjamin J. Makhlouf" w:date="2026-06-18T18:35:00Z" w16du:dateUtc="2026-06-19T01:35:00Z">
-        <w:r>
-          <w:rPr>
-            <w:rFonts w:ascii="Garamond" w:hAnsi="Garamond" w:cs="Times New Roman"/>
-          </w:rPr>
-          <w:t xml:space="preserve"> </w:t>
-        </w:r>
-      </w:ins>
-      <w:ins w:id="87" w:author="Benjamin J. Makhlouf" w:date="2026-06-18T18:37:00Z">
-        <w:r>
-          <w:rPr>
-            <w:rFonts w:ascii="Garamond" w:hAnsi="Garamond" w:cs="Times New Roman"/>
-          </w:rPr>
-          <w:t xml:space="preserve">Otolith microchemical approaches have emerged as an alternative tool capable of estimating sub-watershed provenance without the need for extensive field-based monitoring. </w:t>
-        </w:r>
-      </w:ins>
-      <w:ins w:id="88" w:author="Benjamin J. Makhlouf" w:date="2026-06-18T18:42:00Z">
-        <w:r>
-          <w:rPr>
-            <w:rFonts w:ascii="Garamond" w:hAnsi="Garamond"/>
-          </w:rPr>
-          <w:t>Otolith microchemical approaches have emerged as an alternative tool for reconstructing spatial patterns of salmon movement and provenance.</w:t>
-        </w:r>
-      </w:ins>
-      <w:ins w:id="89" w:author="Benjamin J. Makhlouf" w:date="2026-06-18T18:42:00Z" w16du:dateUtc="2026-06-19T01:42:00Z">
-        <w:r>
-          <w:rPr>
-            <w:rFonts w:ascii="Garamond" w:hAnsi="Garamond"/>
-          </w:rPr>
-          <w:t xml:space="preserve"> </w:t>
-        </w:r>
-      </w:ins>
-      <w:ins w:id="90" w:author="Benjamin J. Makhlouf" w:date="2026-06-18T18:39:00Z">
-        <w:r>
-          <w:rPr>
-            <w:rFonts w:ascii="Garamond" w:hAnsi="Garamond"/>
-          </w:rPr>
-          <w:t>By leveraging predictable relationships between chemical signatures recorded in</w:t>
-        </w:r>
-      </w:ins>
-      <w:ins w:id="91" w:author="Benjamin J. Makhlouf" w:date="2026-06-18T18:43:00Z" w16du:dateUtc="2026-06-19T01:43:00Z">
-        <w:r>
-          <w:rPr>
-            <w:rFonts w:ascii="Garamond" w:hAnsi="Garamond"/>
-          </w:rPr>
-          <w:t xml:space="preserve"> the</w:t>
-        </w:r>
-      </w:ins>
-      <w:ins w:id="92" w:author="Benjamin J. Makhlouf" w:date="2026-06-18T18:39:00Z">
-        <w:r>
-          <w:rPr>
-            <w:rFonts w:ascii="Garamond" w:hAnsi="Garamond"/>
-          </w:rPr>
-          <w:t xml:space="preserve"> otolith and those measured or modeled across the landscape, </w:t>
-        </w:r>
-      </w:ins>
-      <w:ins w:id="93" w:author="Benjamin J. Makhlouf" w:date="2026-06-18T18:43:00Z" w16du:dateUtc="2026-06-19T01:43:00Z">
-        <w:r>
-          <w:rPr>
-            <w:rFonts w:ascii="Garamond" w:hAnsi="Garamond"/>
-          </w:rPr>
-          <w:t>otolith-based</w:t>
-        </w:r>
-      </w:ins>
-      <w:ins w:id="94" w:author="Benjamin J. Makhlouf" w:date="2026-06-18T18:39:00Z">
-        <w:r>
-          <w:rPr>
-            <w:rFonts w:ascii="Garamond" w:hAnsi="Garamond"/>
-          </w:rPr>
-          <w:t xml:space="preserve"> approaches enable </w:t>
-        </w:r>
-      </w:ins>
-      <w:ins w:id="95" w:author="Benjamin J. Makhlouf" w:date="2026-06-18T18:43:00Z" w16du:dateUtc="2026-06-19T01:43:00Z">
-        <w:r>
-          <w:rPr>
-            <w:rFonts w:ascii="Garamond" w:hAnsi="Garamond"/>
-          </w:rPr>
-          <w:t xml:space="preserve">the </w:t>
-        </w:r>
-      </w:ins>
-      <w:ins w:id="96" w:author="Benjamin J. Makhlouf" w:date="2026-06-18T18:39:00Z">
-        <w:r>
-          <w:rPr>
-            <w:rFonts w:ascii="Garamond" w:hAnsi="Garamond"/>
-          </w:rPr>
-          <w:t xml:space="preserve">reconstruction of </w:t>
-        </w:r>
-      </w:ins>
-      <w:ins w:id="97" w:author="Benjamin J. Makhlouf" w:date="2026-06-18T18:44:00Z" w16du:dateUtc="2026-06-19T01:44:00Z">
-        <w:r>
-          <w:rPr>
-            <w:rFonts w:ascii="Garamond" w:hAnsi="Garamond"/>
-          </w:rPr>
-          <w:t xml:space="preserve">life history characteristics </w:t>
-        </w:r>
-      </w:ins>
-      <w:ins w:id="98" w:author="Benjamin J. Makhlouf" w:date="2026-06-18T18:45:00Z" w16du:dateUtc="2026-06-19T01:45:00Z">
-        <w:r>
-          <w:rPr>
-            <w:rFonts w:ascii="Garamond" w:hAnsi="Garamond"/>
-          </w:rPr>
-          <w:t xml:space="preserve">throughout the lifetime of the individual inferred from samples easily collected from adult fish. </w:t>
-        </w:r>
-      </w:ins>
-      <w:ins w:id="99" w:author="Benjamin J. Makhlouf" w:date="2026-06-18T18:48:00Z">
-        <w:r>
-          <w:rPr>
-            <w:rFonts w:ascii="Garamond" w:hAnsi="Garamond"/>
-          </w:rPr>
-          <w:t>As such, these methods provide an approach for estimating fine-scale patterns in salmon spatial ecology across entire watersheds without requiring extensive manual monitoring.</w:t>
-        </w:r>
-      </w:ins>
+      <w:moveFromRangeEnd w:id="111"/>
     </w:p>
     <w:p>
       <w:pPr>
         <w:spacing w:line="480" w:lineRule="auto"/>
         <w:ind w:firstLine="720"/>
         <w:rPr>
+          <w:rFonts w:ascii="Garamond" w:hAnsi="Garamond"/>
+        </w:rPr>
+      </w:pPr>
+      <w:ins w:id="113" w:author="Benjamin J. Makhlouf" w:date="2026-07-08T16:35:00Z">
+        <w:r>
+          <w:rPr>
+            <w:rFonts w:ascii="Garamond" w:hAnsi="Garamond" w:cs="Times New Roman"/>
+          </w:rPr>
+          <w:t xml:space="preserve">At the watershed scale and over multi-year timescales, the spatial ecology of Chinook salmon in the Kuskokwim River basin remains poorly understood, limiting </w:t>
+        </w:r>
+      </w:ins>
+      <w:ins w:id="114" w:author="Benjamin J. Makhlouf" w:date="2026-07-08T16:35:00Z" w16du:dateUtc="2026-07-08T23:35:00Z">
+        <w:r>
+          <w:rPr>
+            <w:rFonts w:ascii="Garamond" w:hAnsi="Garamond" w:cs="Times New Roman"/>
+          </w:rPr>
+          <w:t>the</w:t>
+        </w:r>
+      </w:ins>
+      <w:ins w:id="115" w:author="Benjamin J. Makhlouf" w:date="2026-07-08T16:35:00Z">
+        <w:r>
+          <w:rPr>
+            <w:rFonts w:ascii="Garamond" w:hAnsi="Garamond" w:cs="Times New Roman"/>
+          </w:rPr>
+          <w:t xml:space="preserve"> ability to assess whether the front-end fishery closure effectively protects upstream stocks as intended.</w:t>
+        </w:r>
+      </w:ins>
+      <w:ins w:id="116" w:author="Benjamin J. Makhlouf" w:date="2026-07-08T16:35:00Z" w16du:dateUtc="2026-07-08T23:35:00Z">
+        <w:r>
+          <w:rPr>
+            <w:rFonts w:ascii="Garamond" w:hAnsi="Garamond" w:cs="Times New Roman"/>
+          </w:rPr>
+          <w:t xml:space="preserve"> </w:t>
+        </w:r>
+      </w:ins>
+      <w:ins w:id="117" w:author="Benjamin J. Makhlouf" w:date="2026-07-08T16:38:00Z">
+        <w:r>
+          <w:rPr>
+            <w:rFonts w:ascii="Garamond" w:hAnsi="Garamond" w:cs="Times New Roman"/>
+          </w:rPr>
+          <w:t xml:space="preserve">Although genetics-based approaches such as Genetic Stock Identification (GSI) have been widely used to investigate population structure and provenance in other Pacific salmon species and watersheds, low genetic structure among Chinook salmon populations in the Kuskokwim River basin limits their ability to distinguish among </w:t>
+        </w:r>
+      </w:ins>
+      <w:ins w:id="118" w:author="Benjamin J. Makhlouf" w:date="2026-07-08T16:38:00Z" w16du:dateUtc="2026-07-08T23:38:00Z">
+        <w:r>
+          <w:rPr>
+            <w:rFonts w:ascii="Garamond" w:hAnsi="Garamond" w:cs="Times New Roman"/>
+          </w:rPr>
+          <w:t>subpopulations in the basin [ref].</w:t>
+        </w:r>
+      </w:ins>
+      <w:ins w:id="119" w:author="Benjamin J. Makhlouf" w:date="2026-07-08T16:39:00Z" w16du:dateUtc="2026-07-08T23:39:00Z">
+        <w:r>
+          <w:rPr>
+            <w:rFonts w:ascii="Garamond" w:hAnsi="Garamond" w:cs="Times New Roman"/>
+          </w:rPr>
+          <w:t xml:space="preserve"> </w:t>
+        </w:r>
+      </w:ins>
+      <w:ins w:id="120" w:author="Benjamin J. Makhlouf" w:date="2026-07-08T16:41:00Z">
+        <w:r>
+          <w:rPr>
+            <w:rFonts w:ascii="Garamond" w:hAnsi="Garamond" w:cs="Times New Roman"/>
+          </w:rPr>
+          <w:t>Telemetry-based approaches have provided valuable insights into movement patterns within the basin; however, their spatial coverage is limited, and they have not been consistently applied across multiple years, restricting their ability to characterize watershed-scale patterns in Chinook salmon ecology</w:t>
+        </w:r>
+      </w:ins>
+      <w:ins w:id="121" w:author="Benjamin J. Makhlouf" w:date="2026-07-08T16:42:00Z" w16du:dateUtc="2026-07-08T23:42:00Z">
+        <w:r>
+          <w:rPr>
+            <w:rFonts w:ascii="Garamond" w:hAnsi="Garamond" w:cs="Times New Roman"/>
+          </w:rPr>
+          <w:t xml:space="preserve"> [ref,ref,ref]. </w:t>
+        </w:r>
+      </w:ins>
+      <w:ins w:id="122" w:author="Benjamin J. Makhlouf" w:date="2026-07-08T16:50:00Z">
+        <w:r>
+          <w:rPr>
+            <w:rFonts w:ascii="Garamond" w:hAnsi="Garamond" w:cs="Times New Roman"/>
+          </w:rPr>
+          <w:t xml:space="preserve">Otolith microchemical approaches have emerged as an alternative tool for estimating sub-watershed provenance without extensive field-based monitoring [ref, ref]. By leveraging predictable relationships between chemical </w:t>
+        </w:r>
+        <w:r>
+          <w:rPr>
+            <w:rFonts w:ascii="Garamond" w:hAnsi="Garamond" w:cs="Times New Roman"/>
+          </w:rPr>
+          <w:lastRenderedPageBreak/>
+          <w:t>signatures recorded in the otolith and those measured or modeled across the landscape, these approaches enable retrospective reconstruction of individual life histories, including provenance</w:t>
+        </w:r>
+      </w:ins>
+      <w:ins w:id="123" w:author="Benjamin J. Makhlouf" w:date="2026-07-08T16:50:00Z" w16du:dateUtc="2026-07-08T23:50:00Z">
+        <w:r>
+          <w:rPr>
+            <w:rFonts w:ascii="Garamond" w:hAnsi="Garamond" w:cs="Times New Roman"/>
+          </w:rPr>
+          <w:t xml:space="preserve">. </w:t>
+        </w:r>
+      </w:ins>
+      <w:ins w:id="124" w:author="Benjamin J. Makhlouf" w:date="2026-07-08T16:50:00Z">
+        <w:r>
+          <w:rPr>
+            <w:rFonts w:ascii="Garamond" w:hAnsi="Garamond" w:cs="Times New Roman"/>
+          </w:rPr>
+          <w:t>These methods therefore provide a means to estimate Chinook salmon provenance from adult fish sampled during their return migration, allowing for the investigation of fine-scale patterns in salmon spatial ecology at watershed scales.</w:t>
+        </w:r>
+      </w:ins>
+    </w:p>
+    <w:p>
+      <w:pPr>
+        <w:spacing w:line="480" w:lineRule="auto"/>
+        <w:ind w:firstLine="720"/>
+        <w:rPr>
           <w:rFonts w:ascii="Garamond" w:hAnsi="Garamond" w:cs="Times New Roman"/>
           <w:b/>
           <w:bCs/>
@@ -2284,7 +2593,7 @@
         </w:rPr>
         <w:t xml:space="preserve">Here, we use otolith chemistry from fish caught during a test fishery throughout the seasonal migration period over six years in the Kuskokwim River to reconstruct spatiotemporal patterns of Chinook salmon returns. </w:t>
       </w:r>
-      <w:del w:id="100" w:author="Benjamin J. Makhlouf" w:date="2026-06-18T18:48:00Z" w16du:dateUtc="2026-06-19T01:48:00Z">
+      <w:del w:id="125" w:author="Benjamin J. Makhlouf" w:date="2026-06-18T18:48:00Z" w16du:dateUtc="2026-06-19T01:48:00Z">
         <w:r>
           <w:rPr>
             <w:rFonts w:ascii="Garamond" w:hAnsi="Garamond" w:cs="Times New Roman"/>
@@ -2292,11 +2601,63 @@
           <w:delText xml:space="preserve">The limited genetic structure of Chinook salmon in this region precludes using genetic approaches to quantify migration timing of different populations throughout the watershed. </w:delText>
         </w:r>
       </w:del>
-      <w:r>
-        <w:rPr>
-          <w:rFonts w:ascii="Garamond" w:hAnsi="Garamond" w:cs="Times New Roman"/>
-        </w:rPr>
-        <w:t>Otolith-based methods for estimating provenance therefore offer a novel approach to: (1) identify the spatiotemporal structure of returning populations in the Kuskokwim River basin, and (2) evaluate potential impacts of front-end closures on conserving population diversity within salmon stock complexes returning to large, remote, watersheds.</w:t>
+      <w:ins w:id="126" w:author="Benjamin J. Makhlouf" w:date="2026-07-08T16:52:00Z" w16du:dateUtc="2026-07-08T23:52:00Z">
+        <w:r>
+          <w:rPr>
+            <w:rFonts w:ascii="Garamond" w:hAnsi="Garamond" w:cs="Times New Roman"/>
+          </w:rPr>
+          <w:t>In doing so, we use o</w:t>
+        </w:r>
+      </w:ins>
+      <w:del w:id="127" w:author="Benjamin J. Makhlouf" w:date="2026-07-08T16:52:00Z" w16du:dateUtc="2026-07-08T23:52:00Z">
+        <w:r>
+          <w:rPr>
+            <w:rFonts w:ascii="Garamond" w:hAnsi="Garamond" w:cs="Times New Roman"/>
+          </w:rPr>
+          <w:delText>O</w:delText>
+        </w:r>
+      </w:del>
+      <w:r>
+        <w:rPr>
+          <w:rFonts w:ascii="Garamond" w:hAnsi="Garamond" w:cs="Times New Roman"/>
+        </w:rPr>
+        <w:t xml:space="preserve">tolith-based methods for estimating provenance </w:t>
+      </w:r>
+      <w:del w:id="128" w:author="Benjamin J. Makhlouf" w:date="2026-07-08T16:51:00Z" w16du:dateUtc="2026-07-08T23:51:00Z">
+        <w:r>
+          <w:rPr>
+            <w:rFonts w:ascii="Garamond" w:hAnsi="Garamond" w:cs="Times New Roman"/>
+          </w:rPr>
+          <w:delText xml:space="preserve">therefore </w:delText>
+        </w:r>
+      </w:del>
+      <w:del w:id="129" w:author="Benjamin J. Makhlouf" w:date="2026-07-08T16:52:00Z" w16du:dateUtc="2026-07-08T23:52:00Z">
+        <w:r>
+          <w:rPr>
+            <w:rFonts w:ascii="Garamond" w:hAnsi="Garamond" w:cs="Times New Roman"/>
+          </w:rPr>
+          <w:delText>offer a</w:delText>
+        </w:r>
+      </w:del>
+      <w:r>
+        <w:rPr>
+          <w:rFonts w:ascii="Garamond" w:hAnsi="Garamond" w:cs="Times New Roman"/>
+        </w:rPr>
+        <w:t xml:space="preserve"> </w:t>
+      </w:r>
+      <w:ins w:id="130" w:author="Benjamin J. Makhlouf" w:date="2026-07-08T16:52:00Z" w16du:dateUtc="2026-07-08T23:52:00Z">
+        <w:r>
+          <w:rPr>
+            <w:rFonts w:ascii="Garamond" w:hAnsi="Garamond" w:cs="Times New Roman"/>
+          </w:rPr>
+          <w:t xml:space="preserve">as a </w:t>
+        </w:r>
+      </w:ins>
+      <w:r>
+        <w:rPr>
+          <w:rFonts w:ascii="Garamond" w:hAnsi="Garamond" w:cs="Times New Roman"/>
+        </w:rPr>
+        <w:t>novel approach to: (1) identify the spatiotemporal structure of returning populations in the Kuskokwim River basin, and (2) evaluate potential impacts of front-end closures on conserving population diversity within salmon stock complexes returning to large, remote, watersheds.</w:t>
       </w:r>
     </w:p>
     <w:p>
@@ -2393,52 +2754,112 @@
         <w:rPr>
           <w:rFonts w:ascii="Garamond" w:hAnsi="Garamond" w:cs="Times New Roman"/>
         </w:rPr>
-        <w:t xml:space="preserve"> to inform management decisions for </w:t>
-      </w:r>
+        <w:t xml:space="preserve"> to inform management decisions for fisheries throughout the river. Fish </w:t>
+      </w:r>
+      <w:ins w:id="131" w:author="Benjamin J. Makhlouf" w:date="2026-06-19T15:58:00Z" w16du:dateUtc="2026-06-19T22:58:00Z">
+        <w:r>
+          <w:rPr>
+            <w:rFonts w:ascii="Garamond" w:hAnsi="Garamond" w:cs="Times New Roman"/>
+          </w:rPr>
+          <w:t xml:space="preserve">are sampled throughout the full return migration window, and are assumed to  </w:t>
+        </w:r>
+      </w:ins>
+      <w:del w:id="132" w:author="Benjamin J. Makhlouf" w:date="2026-06-19T15:59:00Z" w16du:dateUtc="2026-06-19T22:59:00Z">
+        <w:r>
+          <w:rPr>
+            <w:rFonts w:ascii="Garamond" w:hAnsi="Garamond" w:cs="Times New Roman"/>
+          </w:rPr>
+          <w:delText xml:space="preserve">caught in this fishery are a </w:delText>
+        </w:r>
+      </w:del>
+      <w:r>
+        <w:rPr>
+          <w:rFonts w:ascii="Garamond" w:hAnsi="Garamond" w:cs="Times New Roman"/>
+        </w:rPr>
+        <w:t>represent</w:t>
+      </w:r>
+      <w:ins w:id="133" w:author="Benjamin J. Makhlouf" w:date="2026-07-08T16:54:00Z" w16du:dateUtc="2026-07-08T23:54:00Z">
+        <w:r>
+          <w:rPr>
+            <w:rFonts w:ascii="Garamond" w:hAnsi="Garamond" w:cs="Times New Roman"/>
+          </w:rPr>
+          <w:t xml:space="preserve"> the distribution of </w:t>
+        </w:r>
+      </w:ins>
+      <w:del w:id="134" w:author="Benjamin J. Makhlouf" w:date="2026-07-08T16:53:00Z" w16du:dateUtc="2026-07-08T23:53:00Z">
+        <w:r>
+          <w:rPr>
+            <w:rFonts w:ascii="Garamond" w:hAnsi="Garamond" w:cs="Times New Roman"/>
+          </w:rPr>
+          <w:delText>ative</w:delText>
+        </w:r>
+      </w:del>
+      <w:r>
+        <w:rPr>
+          <w:rFonts w:ascii="Garamond" w:hAnsi="Garamond" w:cs="Times New Roman"/>
+        </w:rPr>
+        <w:t xml:space="preserve"> </w:t>
+      </w:r>
+      <w:del w:id="135" w:author="Benjamin J. Makhlouf" w:date="2026-07-08T16:53:00Z" w16du:dateUtc="2026-07-08T23:53:00Z">
+        <w:r>
+          <w:rPr>
+            <w:rFonts w:ascii="Garamond" w:hAnsi="Garamond" w:cs="Times New Roman"/>
+          </w:rPr>
+          <w:delText>sample of</w:delText>
+        </w:r>
+      </w:del>
+      <w:ins w:id="136" w:author="Benjamin J. Makhlouf" w:date="2026-07-08T16:53:00Z" w16du:dateUtc="2026-07-08T23:53:00Z">
+        <w:r>
+          <w:rPr>
+            <w:rFonts w:ascii="Garamond" w:hAnsi="Garamond" w:cs="Times New Roman"/>
+          </w:rPr>
+          <w:t xml:space="preserve"> </w:t>
+        </w:r>
+      </w:ins>
+      <w:del w:id="137" w:author="Benjamin J. Makhlouf" w:date="2026-07-08T16:53:00Z" w16du:dateUtc="2026-07-08T23:53:00Z">
+        <w:r>
+          <w:rPr>
+            <w:rFonts w:ascii="Garamond" w:hAnsi="Garamond" w:cs="Times New Roman"/>
+          </w:rPr>
+          <w:delText xml:space="preserve"> </w:delText>
+        </w:r>
+      </w:del>
+      <w:del w:id="138" w:author="Benjamin J. Makhlouf" w:date="2026-07-08T16:54:00Z" w16du:dateUtc="2026-07-08T23:54:00Z">
+        <w:r>
+          <w:rPr>
+            <w:rFonts w:ascii="Garamond" w:hAnsi="Garamond" w:cs="Times New Roman"/>
+          </w:rPr>
+          <w:delText xml:space="preserve">returning </w:delText>
+        </w:r>
+      </w:del>
       <w:r>
         <w:rPr>
           <w:rFonts w:ascii="Garamond" w:hAnsi="Garamond" w:cs="Times New Roman"/>
         </w:rPr>
         <w:lastRenderedPageBreak/>
-        <w:t xml:space="preserve">fisheries throughout the river. Fish </w:t>
-      </w:r>
-      <w:ins w:id="101" w:author="Benjamin J. Makhlouf" w:date="2026-06-19T15:58:00Z" w16du:dateUtc="2026-06-19T22:58:00Z">
-        <w:r>
-          <w:rPr>
-            <w:rFonts w:ascii="Garamond" w:hAnsi="Garamond" w:cs="Times New Roman"/>
-          </w:rPr>
-          <w:t xml:space="preserve">are sampled throughout the full return migration window, and are assumed to </w:t>
-        </w:r>
-      </w:ins>
-      <w:ins w:id="102" w:author="Benjamin J. Makhlouf" w:date="2026-06-19T15:59:00Z" w16du:dateUtc="2026-06-19T22:59:00Z">
-        <w:r>
-          <w:rPr>
-            <w:rFonts w:ascii="Garamond" w:hAnsi="Garamond" w:cs="Times New Roman"/>
-          </w:rPr>
-          <w:t>be</w:t>
-        </w:r>
-      </w:ins>
-      <w:ins w:id="103" w:author="Benjamin J. Makhlouf" w:date="2026-06-19T15:58:00Z" w16du:dateUtc="2026-06-19T22:58:00Z">
-        <w:r>
-          <w:rPr>
-            <w:rFonts w:ascii="Garamond" w:hAnsi="Garamond" w:cs="Times New Roman"/>
-          </w:rPr>
-          <w:t xml:space="preserve"> a </w:t>
-        </w:r>
-      </w:ins>
-      <w:del w:id="104" w:author="Benjamin J. Makhlouf" w:date="2026-06-19T15:59:00Z" w16du:dateUtc="2026-06-19T22:59:00Z">
-        <w:r>
-          <w:rPr>
-            <w:rFonts w:ascii="Garamond" w:hAnsi="Garamond" w:cs="Times New Roman"/>
-          </w:rPr>
-          <w:delText xml:space="preserve">caught in this fishery are a </w:delText>
+        <w:t xml:space="preserve">stocks throughout the basin </w:t>
+      </w:r>
+      <w:del w:id="139" w:author="Benjamin J. Makhlouf" w:date="2026-07-08T16:54:00Z" w16du:dateUtc="2026-07-08T23:54:00Z">
+        <w:r>
+          <w:rPr>
+            <w:rFonts w:ascii="Garamond" w:hAnsi="Garamond" w:cs="Times New Roman"/>
+          </w:rPr>
+          <w:delText>above the test fishery location</w:delText>
         </w:r>
       </w:del>
-      <w:r>
-        <w:rPr>
-          <w:rFonts w:ascii="Garamond" w:hAnsi="Garamond" w:cs="Times New Roman"/>
-        </w:rPr>
-        <w:t xml:space="preserve">representative sample of returning stocks throughout the basin above the test fishery location </w:t>
+      <w:ins w:id="140" w:author="Benjamin J. Makhlouf" w:date="2026-07-08T16:55:00Z" w16du:dateUtc="2026-07-08T23:55:00Z">
+        <w:r>
+          <w:rPr>
+            <w:rFonts w:ascii="Garamond" w:hAnsi="Garamond" w:cs="Times New Roman"/>
+          </w:rPr>
+          <w:t xml:space="preserve"> that comprise the run at any given time</w:t>
+        </w:r>
+      </w:ins>
+      <w:r>
+        <w:rPr>
+          <w:rFonts w:ascii="Garamond" w:hAnsi="Garamond" w:cs="Times New Roman"/>
+        </w:rPr>
+        <w:t xml:space="preserve"> </w:t>
       </w:r>
       <w:r>
         <w:rPr>
@@ -2489,7 +2910,7 @@
         </w:rPr>
         <w:t>. Although this sample set does not capture fish which spawn below Bethel, nearly all Chinook salmon returning to the Kuskokwim River spawn above this location. Contributing partners collected approximately 500 otoliths annually from 2017-2022, ensuring sampling efforts over the full course of the run. From these, approximately 250 otoliths</w:t>
       </w:r>
-      <w:ins w:id="105" w:author="Benjamin J. Makhlouf" w:date="2026-06-19T16:10:00Z" w16du:dateUtc="2026-06-19T23:10:00Z">
+      <w:ins w:id="141" w:author="Benjamin J. Makhlouf" w:date="2026-06-19T16:10:00Z" w16du:dateUtc="2026-06-19T23:10:00Z">
         <w:r>
           <w:rPr>
             <w:rFonts w:ascii="Garamond" w:eastAsia="Times New Roman" w:hAnsi="Garamond" w:cs="Times New Roman"/>
@@ -2512,6 +2933,115 @@
       <w:pPr>
         <w:spacing w:line="480" w:lineRule="auto"/>
         <w:ind w:firstLine="720"/>
+        <w:rPr>
+          <w:ins w:id="142" w:author="Benjamin J. Makhlouf" w:date="2026-07-08T16:57:00Z" w16du:dateUtc="2026-07-08T23:57:00Z"/>
+          <w:rFonts w:ascii="Garamond" w:eastAsia="Times New Roman" w:hAnsi="Garamond" w:cs="Times New Roman"/>
+          <w:kern w:val="0"/>
+          <w14:ligatures w14:val="none"/>
+        </w:rPr>
+      </w:pPr>
+      <w:r>
+        <w:rPr>
+          <w:rFonts w:ascii="Garamond" w:hAnsi="Garamond" w:cs="Times New Roman"/>
+        </w:rPr>
+        <w:t xml:space="preserve">Otoliths were </w:t>
+      </w:r>
+      <w:r>
+        <w:rPr>
+          <w:rFonts w:ascii="Garamond" w:eastAsia="Times New Roman" w:hAnsi="Garamond" w:cs="Times New Roman"/>
+          <w:kern w:val="0"/>
+          <w14:ligatures w14:val="none"/>
+        </w:rPr>
+        <w:t xml:space="preserve">sectioned with a low-speed diamond-blade Isomet saw along the transverse plane, mounted on microscope slides, and polished to expose internal growth structures </w:t>
+      </w:r>
+      <w:r>
+        <w:rPr>
+          <w:rFonts w:ascii="Garamond" w:eastAsia="Times New Roman" w:hAnsi="Garamond" w:cs="Times New Roman"/>
+          <w:kern w:val="0"/>
+          <w14:ligatures w14:val="none"/>
+        </w:rPr>
+        <w:fldChar w:fldCharType="begin"/>
+      </w:r>
+      <w:r>
+        <w:rPr>
+          <w:rFonts w:ascii="Garamond" w:eastAsia="Times New Roman" w:hAnsi="Garamond" w:cs="Times New Roman"/>
+          <w:kern w:val="0"/>
+          <w14:ligatures w14:val="none"/>
+        </w:rPr>
+        <w:instrText xml:space="preserve"> ADDIN ZOTERO_ITEM CSL_CITATION {"citationID":"4icvZ6KO","properties":{"formattedCitation":"(Donohoe &amp; Zimmerman, 2010; Zimmerman &amp; Reeves, 2002)","plainCitation":"(Donohoe &amp; Zimmerman, 2010; Zimmerman &amp; Reeves, 2002)","noteIndex":0},"citationItems":[{"id":4778,"uris":["http://zotero.org/users/8421274/items/QJZIBTQC"],"itemData":{"id":4778,"type":"article-journal","abstract":"Beam-based analytical methods are widely used to measure the concentrations of elements and isotopes in otoliths. These methods usually require that otoliths be individually mounted and prepared to properly expose the desired growth region to the analytical beam. Most analytical instruments, such as LA-ICPMS and ion and electron microprobes, have sample holders that will accept only one to six slides or mounts at a time. We describe a method of mounting otoliths that allows for easy transfer of many otoliths to a single mount after they have been prepared. Such an approach increases the number of otoliths that can be analyzed in a single session by reducing the need open the sample chamber to exchange slides—a particularly time consuming step on instruments that operate under vacuum. For ion and electron microprobes, the method also greatly reduces the number of slides that must be coated with an electrical conductor prior to analysis. In this method, a narrow strip of cover glass is first glued at one end to a standard microscope slide. The otolith is then mounted in thermoplastic resin on the opposite, free end of the strip. The otolith can then be ground and flipped, if needed, by reheating the mounting medium. After otolith preparation is complete, the cover glass is cut with a scribe to free the otolith and up to 20 small otoliths can be arranged on a single petrographic slide.","container-title":"Environmental Biology of Fishes","DOI":"10.1007/s10641-010-9680-3","ISSN":"1573-5133","issue":"3","journalAbbreviation":"Environ Biol Fish","language":"en","page":"473-477","source":"Springer Link","title":"A method of mounting multiple otoliths for beam-based microchemical analyses","volume":"89","author":[{"family":"Donohoe","given":"Christopher J."},{"family":"Zimmerman","given":"Christian E."}],"issued":{"date-parts":[["2010",11,1]]}}},{"id":4132,"uris":["http://zotero.org/users/8421274/items/5YINANGC"],"itemData":{"id":4132,"type":"article-journal","abstract":"Comparisons of strontium:calcium (Sr: Ca) ratios in otolith primordia and freshwater growth regions were used to identify the progeny of steelhead Oncorhynchus mykiss (anadromous rainbow trout) and resident rainbow trout in the Deschutes River, Oregon. We cultured progeny of known adult steelhead and resident rainbow trout to confirm the relationship between Sr:Ca ratios in otolith primordia and the life history of the maternal parent. The mean (±SD) Sr:Ca ratio was significantly higher in the otolith primordia of the progeny of steelhead (0.001461 ± 0.00029; n = 100) than in those of the progeny of resident rainbow trout (0.000829 ± 0.000012; n = 100). We used comparisons of Sr:Ca ratios in the primordia and first-summer growth regions of otoliths to determine the maternal origin of unknown O. mykiss juveniles (n = 272) collected from rearing habitats within the main-stem Deschutes River and tributary rearing habitats and thus to ascertain the relative proportion of each life history morph in each rearing habitat. Resident rainbow trout fry dominated the bimonthly samples collected from main-stem rearing habitats between May and November 1995. Steelhead fry dominated samples collected from below waterfalls on two tributaries in 1996 and 1998.","container-title":"Transactions of the American Fisheries Society","DOI":"10.1577/1548-8659(2002)131&lt;0986:IOSARR&gt;2.0.CO;2","ISSN":"0002-8487","issue":"5","note":"_eprint: https://doi.org/10.1577/1548-8659(2002)131&lt;0986:IOSARR&gt;2.0.CO;2","page":"986-993","publisher":"Taylor &amp; Francis","source":"Taylor and Francis+NEJM","title":"Identification of Steelhead and Resident Rainbow Trout Progeny in the Deschutes River, Oregon, Revealed with Otolith Microchemistry","volume":"131","author":[{"family":"Zimmerman","given":"Christian E."},{"family":"Reeves","given":"Gordon H."}],"issued":{"date-parts":[["2002",9,1]]}}}],"schema":"https://github.com/citation-style-language/schema/raw/master/csl-citation.json"} </w:instrText>
+      </w:r>
+      <w:r>
+        <w:rPr>
+          <w:rFonts w:ascii="Garamond" w:eastAsia="Times New Roman" w:hAnsi="Garamond" w:cs="Times New Roman"/>
+          <w:kern w:val="0"/>
+          <w14:ligatures w14:val="none"/>
+        </w:rPr>
+        <w:fldChar w:fldCharType="separate"/>
+      </w:r>
+      <w:r>
+        <w:rPr>
+          <w:rFonts w:ascii="Garamond" w:eastAsia="Times New Roman" w:hAnsi="Garamond" w:cs="Times New Roman"/>
+          <w:noProof/>
+          <w:kern w:val="0"/>
+          <w14:ligatures w14:val="none"/>
+        </w:rPr>
+        <w:t>(Donohoe &amp; Zimmerman, 2010; Zimmerman &amp; Reeves, 2002)</w:t>
+      </w:r>
+      <w:r>
+        <w:rPr>
+          <w:rFonts w:ascii="Garamond" w:eastAsia="Times New Roman" w:hAnsi="Garamond" w:cs="Times New Roman"/>
+          <w:kern w:val="0"/>
+          <w14:ligatures w14:val="none"/>
+        </w:rPr>
+        <w:fldChar w:fldCharType="end"/>
+      </w:r>
+      <w:r>
+        <w:rPr>
+          <w:rFonts w:ascii="Garamond" w:eastAsia="Times New Roman" w:hAnsi="Garamond" w:cs="Times New Roman"/>
+          <w:kern w:val="0"/>
+          <w14:ligatures w14:val="none"/>
+        </w:rPr>
+        <w:t xml:space="preserve">. Prepared samples were analyzed at the University of Utah Strontium Isotope Laboratory using laser ablation inductively coupled plasma mass spectrometry (LA-ICP-MS). Laser ablation was conducted along a transect from the otolith core to just beyond the onset of marine growth (identified by the dark annuli check indicative of marine entry) </w:t>
+      </w:r>
+      <w:r>
+        <w:rPr>
+          <w:rFonts w:ascii="Garamond" w:hAnsi="Garamond" w:cs="Times New Roman"/>
+        </w:rPr>
+        <w:t xml:space="preserve">using a 53 </w:t>
+      </w:r>
+      <w:r>
+        <w:rPr>
+          <w:rFonts w:ascii="Garamond" w:hAnsi="Garamond" w:cs="Times New Roman"/>
+        </w:rPr>
+        <w:sym w:font="Symbol" w:char="F06D"/>
+      </w:r>
+      <w:r>
+        <w:rPr>
+          <w:rFonts w:ascii="Garamond" w:hAnsi="Garamond" w:cs="Times New Roman"/>
+        </w:rPr>
+        <w:t xml:space="preserve">m diameter beam and scanning at 2 </w:t>
+      </w:r>
+      <w:r>
+        <w:rPr>
+          <w:rFonts w:ascii="Garamond" w:hAnsi="Garamond" w:cs="Times New Roman"/>
+        </w:rPr>
+        <w:sym w:font="Symbol" w:char="F06D"/>
+      </w:r>
+      <w:r>
+        <w:rPr>
+          <w:rFonts w:ascii="Garamond" w:hAnsi="Garamond" w:cs="Times New Roman"/>
+        </w:rPr>
+        <w:t>m/second</w:t>
+      </w:r>
+      <w:r>
+        <w:rPr>
+          <w:rFonts w:ascii="Garamond" w:eastAsia="Times New Roman" w:hAnsi="Garamond" w:cs="Times New Roman"/>
+          <w:kern w:val="0"/>
+          <w14:ligatures w14:val="none"/>
+        </w:rPr>
+        <w:t>.</w:t>
+      </w:r>
+      <w:r>
         <w:rPr>
           <w:rFonts w:ascii="Garamond" w:eastAsia="Times New Roman" w:hAnsi="Garamond" w:cs="Times New Roman"/>
           <w:kern w:val="0"/>
@@ -2519,12 +3049,7 @@
           <w:szCs w:val="22"/>
           <w14:ligatures w14:val="none"/>
         </w:rPr>
-      </w:pPr>
-      <w:r>
-        <w:rPr>
-          <w:rFonts w:ascii="Garamond" w:hAnsi="Garamond" w:cs="Times New Roman"/>
-        </w:rPr>
-        <w:t xml:space="preserve">Otoliths were </w:t>
+        <w:t xml:space="preserve"> </w:t>
       </w:r>
       <w:r>
         <w:rPr>
@@ -2532,15 +3057,95 @@
           <w:kern w:val="0"/>
           <w14:ligatures w14:val="none"/>
         </w:rPr>
-        <w:t xml:space="preserve">sectioned with a low-speed diamond-blade Isomet saw along the transverse plane, mounted on microscope slides, and polished to expose internal growth structures </w:t>
-      </w:r>
+        <w:t xml:space="preserve">The resulting data represent a continuously integrated measurement of </w:t>
+      </w:r>
+      <w:ins w:id="143" w:author="Benjamin J. Makhlouf" w:date="2026-07-08T12:03:00Z" w16du:dateUtc="2026-07-08T19:03:00Z">
+        <w:r>
+          <w:rPr>
+            <w:rFonts w:ascii="Garamond" w:eastAsia="Times New Roman" w:hAnsi="Garamond" w:cs="Times New Roman"/>
+            <w:kern w:val="0"/>
+            <w:vertAlign w:val="superscript"/>
+            <w14:ligatures w14:val="none"/>
+          </w:rPr>
+          <w:t>87</w:t>
+        </w:r>
+        <w:r>
+          <w:rPr>
+            <w:rFonts w:ascii="Garamond" w:eastAsia="Times New Roman" w:hAnsi="Garamond" w:cs="Times New Roman"/>
+            <w:kern w:val="0"/>
+            <w14:ligatures w14:val="none"/>
+          </w:rPr>
+          <w:t>Sr/</w:t>
+        </w:r>
+        <w:r>
+          <w:rPr>
+            <w:rFonts w:ascii="Garamond" w:eastAsia="Times New Roman" w:hAnsi="Garamond" w:cs="Times New Roman"/>
+            <w:kern w:val="0"/>
+            <w:vertAlign w:val="superscript"/>
+            <w14:ligatures w14:val="none"/>
+          </w:rPr>
+          <w:t>86</w:t>
+        </w:r>
+        <w:r>
+          <w:rPr>
+            <w:rFonts w:ascii="Garamond" w:eastAsia="Times New Roman" w:hAnsi="Garamond" w:cs="Times New Roman"/>
+            <w:kern w:val="0"/>
+            <w14:ligatures w14:val="none"/>
+          </w:rPr>
+          <w:t xml:space="preserve">Sr </w:t>
+        </w:r>
+      </w:ins>
+      <w:del w:id="144" w:author="Benjamin J. Makhlouf" w:date="2026-07-08T12:03:00Z" w16du:dateUtc="2026-07-08T19:03:00Z">
+        <w:r>
+          <w:rPr>
+            <w:rFonts w:ascii="Garamond" w:eastAsia="Times New Roman" w:hAnsi="Garamond" w:cs="Times New Roman"/>
+            <w:kern w:val="0"/>
+            <w14:ligatures w14:val="none"/>
+          </w:rPr>
+          <w:delText>Sr</w:delText>
+        </w:r>
+        <w:r>
+          <w:rPr>
+            <w:rFonts w:ascii="Garamond" w:eastAsia="Times New Roman" w:hAnsi="Garamond" w:cs="Times New Roman"/>
+            <w:kern w:val="0"/>
+            <w:vertAlign w:val="superscript"/>
+            <w14:ligatures w14:val="none"/>
+          </w:rPr>
+          <w:delText>87</w:delText>
+        </w:r>
+        <w:r>
+          <w:rPr>
+            <w:rFonts w:ascii="Garamond" w:eastAsia="Times New Roman" w:hAnsi="Garamond" w:cs="Times New Roman"/>
+            <w:kern w:val="0"/>
+            <w14:ligatures w14:val="none"/>
+          </w:rPr>
+          <w:delText>/Sr</w:delText>
+        </w:r>
+        <w:r>
+          <w:rPr>
+            <w:rFonts w:ascii="Garamond" w:eastAsia="Times New Roman" w:hAnsi="Garamond" w:cs="Times New Roman"/>
+            <w:kern w:val="0"/>
+            <w:vertAlign w:val="superscript"/>
+            <w14:ligatures w14:val="none"/>
+          </w:rPr>
+          <w:delText>86</w:delText>
+        </w:r>
+        <w:r>
+          <w:rPr>
+            <w:rFonts w:ascii="Garamond" w:eastAsia="Times New Roman" w:hAnsi="Garamond" w:cs="Times New Roman"/>
+            <w:kern w:val="0"/>
+            <w14:ligatures w14:val="none"/>
+          </w:rPr>
+          <w:delText xml:space="preserve"> </w:delText>
+        </w:r>
+      </w:del>
       <w:r>
         <w:rPr>
           <w:rFonts w:ascii="Garamond" w:eastAsia="Times New Roman" w:hAnsi="Garamond" w:cs="Times New Roman"/>
           <w:kern w:val="0"/>
           <w14:ligatures w14:val="none"/>
         </w:rPr>
-        <w:fldChar w:fldCharType="begin"/>
+        <w:t xml:space="preserve">from early development until marine entry </w:t>
       </w:r>
       <w:r>
         <w:rPr>
@@ -2548,7 +3153,15 @@
           <w:kern w:val="0"/>
           <w14:ligatures w14:val="none"/>
         </w:rPr>
-        <w:instrText xml:space="preserve"> ADDIN ZOTERO_ITEM CSL_CITATION {"citationID":"4icvZ6KO","properties":{"formattedCitation":"(Donohoe &amp; Zimmerman, 2010; Zimmerman &amp; Reeves, 2002)","plainCitation":"(Donohoe &amp; Zimmerman, 2010; Zimmerman &amp; Reeves, 2002)","noteIndex":0},"citationItems":[{"id":4778,"uris":["http://zotero.org/users/8421274/items/QJZIBTQC"],"itemData":{"id":4778,"type":"article-journal","abstract":"Beam-based analytical methods are widely used to measure the concentrations of elements and isotopes in otoliths. These methods usually require that otoliths be individually mounted and prepared to properly expose the desired growth region to the analytical beam. Most analytical instruments, such as LA-ICPMS and ion and electron microprobes, have sample holders that will accept only one to six slides or mounts at a time. We describe a method of mounting otoliths that allows for easy transfer of many otoliths to a single mount after they have been prepared. Such an approach increases the number of otoliths that can be analyzed in a single session by reducing the need open the sample chamber to exchange slides—a particularly time consuming step on instruments that operate under vacuum. For ion and electron microprobes, the method also greatly reduces the number of slides that must be coated with an electrical conductor prior to analysis. In this method, a narrow strip of cover glass is first glued at one end to a standard microscope slide. The otolith is then mounted in thermoplastic resin on the opposite, free end of the strip. The otolith can then be ground and flipped, if needed, by reheating the mounting medium. After otolith preparation is complete, the cover glass is cut with a scribe to free the otolith and up to 20 small otoliths can be arranged on a single petrographic slide.","container-title":"Environmental Biology of Fishes","DOI":"10.1007/s10641-010-9680-3","ISSN":"1573-5133","issue":"3","journalAbbreviation":"Environ Biol Fish","language":"en","page":"473-477","source":"Springer Link","title":"A method of mounting multiple otoliths for beam-based microchemical analyses","volume":"89","author":[{"family":"Donohoe","given":"Christopher J."},{"family":"Zimmerman","given":"Christian E."}],"issued":{"date-parts":[["2010",11,1]]}}},{"id":4132,"uris":["http://zotero.org/users/8421274/items/5YINANGC"],"itemData":{"id":4132,"type":"article-journal","abstract":"Comparisons of strontium:calcium (Sr: Ca) ratios in otolith primordia and freshwater growth regions were used to identify the progeny of steelhead Oncorhynchus mykiss (anadromous rainbow trout) and resident rainbow trout in the Deschutes River, Oregon. We cultured progeny of known adult steelhead and resident rainbow trout to confirm the relationship between Sr:Ca ratios in otolith primordia and the life history of the maternal parent. The mean (±SD) Sr:Ca ratio was significantly higher in the otolith primordia of the progeny of steelhead (0.001461 ± 0.00029; n = 100) than in those of the progeny of resident rainbow trout (0.000829 ± 0.000012; n = 100). We used comparisons of Sr:Ca ratios in the primordia and first-summer growth regions of otoliths to determine the maternal origin of unknown O. mykiss juveniles (n = 272) collected from rearing habitats within the main-stem Deschutes River and tributary rearing habitats and thus to ascertain the relative proportion of each life history morph in each rearing habitat. Resident rainbow trout fry dominated the bimonthly samples collected from main-stem rearing habitats between May and November 1995. Steelhead fry dominated samples collected from below waterfalls on two tributaries in 1996 and 1998.","container-title":"Transactions of the American Fisheries Society","DOI":"10.1577/1548-8659(2002)131&lt;0986:IOSARR&gt;2.0.CO;2","ISSN":"0002-8487","issue":"5","note":"_eprint: https://doi.org/10.1577/1548-8659(2002)131&lt;0986:IOSARR&gt;2.0.CO;2","page":"986-993","publisher":"Taylor &amp; Francis","source":"Taylor and Francis+NEJM","title":"Identification of Steelhead and Resident Rainbow Trout Progeny in the Deschutes River, Oregon, Revealed with Otolith Microchemistry","volume":"131","author":[{"family":"Zimmerman","given":"Christian E."},{"family":"Reeves","given":"Gordon H."}],"issued":{"date-parts":[["2002",9,1]]}}}],"schema":"https://github.com/citation-style-language/schema/raw/master/csl-citation.json"} </w:instrText>
+        <w:fldChar w:fldCharType="begin"/>
+      </w:r>
+      <w:r>
+        <w:rPr>
+          <w:rFonts w:ascii="Garamond" w:eastAsia="Times New Roman" w:hAnsi="Garamond" w:cs="Times New Roman"/>
+          <w:kern w:val="0"/>
+          <w14:ligatures w14:val="none"/>
+        </w:rPr>
+        <w:instrText xml:space="preserve"> ADDIN ZOTERO_ITEM CSL_CITATION {"citationID":"drNJXJRw","properties":{"formattedCitation":"(Brennan et al., 2015; Campana, 1999; Capo et al., 1998)","plainCitation":"(Brennan et al., 2015; Campana, 1999; Capo et al., 1998)","noteIndex":0},"citationItems":[{"id":"25Y35S3t/lIyU3UG4","uris":["http://zotero.org/users/8421274/items/IY3FLHLM"],"itemData":{"id":"dI01jIsp/qEdWN4pU","type":"article-journal","abstract":"Strontium isotopes simultaneously delineate fine-scale natal habitats and migrations of Pacific salmon harvested during a coastal commercial fishery., Highly migratory organisms present major challenges to conservation efforts. This is especially true for exploited anadromous fish species, which exhibit long-range dispersals from natal sites, complex population structures, and extensive mixing of distinct populations during exploitation. By tracing the migratory histories of individual Chinook salmon caught in fisheries using strontium isotopes, we determined the relative production of natal habitats at fine spatial scales and different life histories. Although strontium isotopes have been widely used in provenance research, we present a new robust framework to simultaneously assess natal sources and migrations of individuals within fishery harvests through time. Our results pave the way for investigating how fine-scale habitat production and life histories of salmon respond to perturbations—providing crucial insights for conservation.","container-title":"Science Advances","DOI":"10.1126/sciadv.1400124","ISSN":"2375-2548","issue":"4","journalAbbreviation":"Sci Adv","note":"PMID: 26601173\nPMCID: PMC4640640","page":"e1400124","source":"PubMed Central","title":"Strontium isotopes delineate fine-scale natal origins and migration histories of Pacific salmon","volume":"1","author":[{"family":"Brennan","given":"Sean R."},{"family":"Zimmerman","given":"Christian E."},{"family":"Fernandez","given":"Diego P."},{"family":"Cerling","given":"Thure E."},{"family":"McPhee","given":"Megan V."},{"family":"Wooller","given":"Matthew J."}],"issued":{"date-parts":[["2015",5,15]]}}},{"id":1441,"uris":["http://zotero.org/users/8421274/items/PHNAKZ8D"],"itemData":{"id":1441,"type":"article-journal","abstract":"The fish otolith (earstone) has long been known as a timekeeper, but interest in its use as a metabolically inert environmental recorder has accelerated in recent years. In part due to technological advances, applications such as stock identification, determination of rnigralon pathways, reconstruction of temperature and salinity history, age validation, detection of anadromy, use as a natural tag and chemical mass marking have been developed, some of which are difficult or impossible to implement using alternative techniques. Microsamphg and the latest advances in beam-based probes allow many elemental assays to be coupled with daily or annual growth increments, thus providing a detailed chronologcal record of the environment. However, few workers have critically assessed the assumptions upon which the environmental reconstructions are based, or considered the possibility that elemental incorporation into the otolith may proceed differently than that into other calcified structures. This paper reviews current applications and their assumptions and suggests future directions. Particular attention is given to the premises that the elemental and isotopic composition of the otolith reflects that of the environment, and the effect of physiological filters on the resulting composition. The roles of temperature, elemental uptake into the fish and the process of otolith crystahzation are also assessed. Drawing upon recent advances in geochemistry and paleoclirnate research as points of contrast, it appears that not all applications of otolith chemistry are firmly based, although others are destined to become powerful and perhaps routine tools for the mainstream fish biologst.","container-title":"Marine Ecology Progress Series","DOI":"10.3354/meps188263","ISSN":"0171-8630, 1616-1599","journalAbbreviation":"Mar. Ecol. Prog. Ser.","language":"en","page":"263-297","source":"DOI.org (Crossref)","title":"Chemistry and composition of fish otoliths:pathways, mechanisms and applications","title-short":"Chemistry and composition of fish otoliths","volume":"188","author":[{"family":"Campana","given":"Se"}],"issued":{"date-parts":[["1999"]]}}},{"id":1457,"uris":["http://zotero.org/users/8421274/items/TDIQBP7K"],"itemData":{"id":1457,"type":"article-journal","abstract":"The strontium (Sr) isotope method can be a powerful tool in studies of chemical weathering and soil genesis, cation provenance and mobility, and the chronostratigraphic correlation of marine sediments. It is a sensitive geochemical tracer, applicable to large-scale ecosystem studies as well as to centimeter-scaled examination of cation mobility within a soil profile. The 87Sr/86Sr ratios of natural materials reflect the sources of strontium available during their formation. Isotopically distinct inputs from precipitation, dryfall, soil parent material, and surface or groundwater allow determination of the relative proportions of those materials entering or leaving an ecosystem. The isotopic compositions of labile (soil exchange complex and soil solution) strontium and Sr in vegetation reflect the sources of cations available to plants. Strontium isotopes can be used to track the biogeochemical cycling of nutrient cations such as calcium. The extent of cation contributions from in situ weathering and external additions to soil from dust and rain can also be resolved with this method. In this paper, we review the geochemistry and isotopic systematics of strontium, and discuss the use of this method as a tracer of earth surface processes.","container-title":"Geoderma","DOI":"10.1016/S0016-7061(97)00102-X","ISSN":"0016-7061","issue":"1","journalAbbreviation":"Geoderma","language":"en","page":"197-225","source":"ScienceDirect","title":"Strontium isotopes as tracers of ecosystem processes: theory and methods","title-short":"Strontium isotopes as tracers of ecosystem processes","volume":"82","author":[{"family":"Capo","given":"Rosemary C."},{"family":"Stewart","given":"Brian W."},{"family":"Chadwick","given":"Oliver A."}],"issued":{"date-parts":[["1998",2,1]]}}}],"schema":"https://github.com/citation-style-language/schema/raw/master/csl-citation.json"} </w:instrText>
       </w:r>
       <w:r>
         <w:rPr>
@@ -2565,7 +3178,27 @@
           <w:kern w:val="0"/>
           <w14:ligatures w14:val="none"/>
         </w:rPr>
-        <w:t>(Donohoe &amp; Zimmerman, 2010; Zimmerman &amp; Reeves, 2002)</w:t>
+        <w:t>(Brennan et al., 2015; Campana, 1999</w:t>
+      </w:r>
+      <w:del w:id="145" w:author="Benjamin J. Makhlouf" w:date="2026-07-08T12:10:00Z" w16du:dateUtc="2026-07-08T19:10:00Z">
+        <w:r>
+          <w:rPr>
+            <w:rFonts w:ascii="Garamond" w:eastAsia="Times New Roman" w:hAnsi="Garamond" w:cs="Times New Roman"/>
+            <w:noProof/>
+            <w:kern w:val="0"/>
+            <w14:ligatures w14:val="none"/>
+          </w:rPr>
+          <w:delText>; Capo et al., 1998</w:delText>
+        </w:r>
+      </w:del>
+      <w:r>
+        <w:rPr>
+          <w:rFonts w:ascii="Garamond" w:eastAsia="Times New Roman" w:hAnsi="Garamond" w:cs="Times New Roman"/>
+          <w:noProof/>
+          <w:kern w:val="0"/>
+          <w14:ligatures w14:val="none"/>
+        </w:rPr>
+        <w:t>)</w:t>
       </w:r>
       <w:r>
         <w:rPr>
@@ -2581,65 +3214,9 @@
           <w:kern w:val="0"/>
           <w14:ligatures w14:val="none"/>
         </w:rPr>
-        <w:t xml:space="preserve">. Prepared samples were analyzed at the University of Utah Strontium Isotope Laboratory using laser ablation inductively coupled plasma mass spectrometry (LA-ICP-MS). Laser ablation was conducted along a transect from the otolith core to just beyond the onset of marine growth (identified by the dark annuli check indicative of marine entry) </w:t>
-      </w:r>
-      <w:r>
-        <w:rPr>
-          <w:rFonts w:ascii="Garamond" w:hAnsi="Garamond" w:cs="Times New Roman"/>
-        </w:rPr>
-        <w:t xml:space="preserve">using a 53 </w:t>
-      </w:r>
-      <w:r>
-        <w:rPr>
-          <w:rFonts w:ascii="Garamond" w:hAnsi="Garamond" w:cs="Times New Roman"/>
-        </w:rPr>
-        <w:sym w:font="Symbol" w:char="F06D"/>
-      </w:r>
-      <w:r>
-        <w:rPr>
-          <w:rFonts w:ascii="Garamond" w:hAnsi="Garamond" w:cs="Times New Roman"/>
-        </w:rPr>
-        <w:t xml:space="preserve">m diameter beam and scanning at 2 </w:t>
-      </w:r>
-      <w:r>
-        <w:rPr>
-          <w:rFonts w:ascii="Garamond" w:hAnsi="Garamond" w:cs="Times New Roman"/>
-        </w:rPr>
-        <w:sym w:font="Symbol" w:char="F06D"/>
-      </w:r>
-      <w:r>
-        <w:rPr>
-          <w:rFonts w:ascii="Garamond" w:hAnsi="Garamond" w:cs="Times New Roman"/>
-        </w:rPr>
-        <w:t>m/second</w:t>
-      </w:r>
-      <w:r>
-        <w:rPr>
-          <w:rFonts w:ascii="Garamond" w:eastAsia="Times New Roman" w:hAnsi="Garamond" w:cs="Times New Roman"/>
-          <w:kern w:val="0"/>
-          <w14:ligatures w14:val="none"/>
-        </w:rPr>
-        <w:t>.</w:t>
-      </w:r>
-      <w:r>
-        <w:rPr>
-          <w:rFonts w:ascii="Garamond" w:eastAsia="Times New Roman" w:hAnsi="Garamond" w:cs="Times New Roman"/>
-          <w:kern w:val="0"/>
-          <w:sz w:val="22"/>
-          <w:szCs w:val="22"/>
-          <w14:ligatures w14:val="none"/>
-        </w:rPr>
-        <w:t xml:space="preserve"> </w:t>
-      </w:r>
-      <w:r>
-        <w:rPr>
-          <w:rFonts w:ascii="Garamond" w:eastAsia="Times New Roman" w:hAnsi="Garamond" w:cs="Times New Roman"/>
-          <w:kern w:val="0"/>
-          <w14:ligatures w14:val="none"/>
-        </w:rPr>
-        <w:t xml:space="preserve">The resulting data represent a continuously integrated measurement of </w:t>
-      </w:r>
-      <w:ins w:id="106" w:author="Benjamin J. Makhlouf" w:date="2026-07-08T12:03:00Z" w16du:dateUtc="2026-07-08T19:03:00Z">
+        <w:t xml:space="preserve">. From these data, the </w:t>
+      </w:r>
+      <w:ins w:id="146" w:author="Benjamin J. Makhlouf" w:date="2026-07-08T12:03:00Z" w16du:dateUtc="2026-07-08T19:03:00Z">
         <w:r>
           <w:rPr>
             <w:rFonts w:ascii="Garamond" w:eastAsia="Times New Roman" w:hAnsi="Garamond" w:cs="Times New Roman"/>
@@ -2649,14 +3226,16 @@
           </w:rPr>
           <w:t>87</w:t>
         </w:r>
-        <w:r>
-          <w:rPr>
-            <w:rFonts w:ascii="Garamond" w:eastAsia="Times New Roman" w:hAnsi="Garamond" w:cs="Times New Roman"/>
-            <w:kern w:val="0"/>
-            <w14:ligatures w14:val="none"/>
-          </w:rPr>
-          <w:t>Sr/</w:t>
-        </w:r>
+      </w:ins>
+      <w:r>
+        <w:rPr>
+          <w:rFonts w:ascii="Garamond" w:eastAsia="Times New Roman" w:hAnsi="Garamond" w:cs="Times New Roman"/>
+          <w:kern w:val="0"/>
+          <w14:ligatures w14:val="none"/>
+        </w:rPr>
+        <w:t>Sr</w:t>
+      </w:r>
+      <w:del w:id="147" w:author="Benjamin J. Makhlouf" w:date="2026-07-08T12:03:00Z" w16du:dateUtc="2026-07-08T19:03:00Z">
         <w:r>
           <w:rPr>
             <w:rFonts w:ascii="Garamond" w:eastAsia="Times New Roman" w:hAnsi="Garamond" w:cs="Times New Roman"/>
@@ -2664,26 +3243,18 @@
             <w:vertAlign w:val="superscript"/>
             <w14:ligatures w14:val="none"/>
           </w:rPr>
-          <w:t>86</w:t>
-        </w:r>
-        <w:r>
-          <w:rPr>
-            <w:rFonts w:ascii="Garamond" w:eastAsia="Times New Roman" w:hAnsi="Garamond" w:cs="Times New Roman"/>
-            <w:kern w:val="0"/>
-            <w14:ligatures w14:val="none"/>
-          </w:rPr>
-          <w:t xml:space="preserve">Sr </w:t>
-        </w:r>
-      </w:ins>
-      <w:del w:id="107" w:author="Benjamin J. Makhlouf" w:date="2026-07-08T12:03:00Z" w16du:dateUtc="2026-07-08T19:03:00Z">
-        <w:r>
-          <w:rPr>
-            <w:rFonts w:ascii="Garamond" w:eastAsia="Times New Roman" w:hAnsi="Garamond" w:cs="Times New Roman"/>
-            <w:kern w:val="0"/>
-            <w14:ligatures w14:val="none"/>
-          </w:rPr>
-          <w:delText>Sr</w:delText>
-        </w:r>
+          <w:delText>87</w:delText>
+        </w:r>
+      </w:del>
+      <w:r>
+        <w:rPr>
+          <w:rFonts w:ascii="Garamond" w:eastAsia="Times New Roman" w:hAnsi="Garamond" w:cs="Times New Roman"/>
+          <w:kern w:val="0"/>
+          <w14:ligatures w14:val="none"/>
+        </w:rPr>
+        <w:t>/</w:t>
+      </w:r>
+      <w:ins w:id="148" w:author="Benjamin J. Makhlouf" w:date="2026-07-08T12:03:00Z" w16du:dateUtc="2026-07-08T19:03:00Z">
         <w:r>
           <w:rPr>
             <w:rFonts w:ascii="Garamond" w:eastAsia="Times New Roman" w:hAnsi="Garamond" w:cs="Times New Roman"/>
@@ -2691,16 +3262,18 @@
             <w:vertAlign w:val="superscript"/>
             <w14:ligatures w14:val="none"/>
           </w:rPr>
-          <w:delText>87</w:delText>
-        </w:r>
-        <w:r>
-          <w:rPr>
-            <w:rFonts w:ascii="Garamond" w:eastAsia="Times New Roman" w:hAnsi="Garamond" w:cs="Times New Roman"/>
-            <w:kern w:val="0"/>
-            <w14:ligatures w14:val="none"/>
-          </w:rPr>
-          <w:delText>/Sr</w:delText>
-        </w:r>
+          <w:t>86</w:t>
+        </w:r>
+      </w:ins>
+      <w:r>
+        <w:rPr>
+          <w:rFonts w:ascii="Garamond" w:eastAsia="Times New Roman" w:hAnsi="Garamond" w:cs="Times New Roman"/>
+          <w:kern w:val="0"/>
+          <w14:ligatures w14:val="none"/>
+        </w:rPr>
+        <w:t>Sr</w:t>
+      </w:r>
+      <w:del w:id="149" w:author="Benjamin J. Makhlouf" w:date="2026-07-08T12:03:00Z" w16du:dateUtc="2026-07-08T19:03:00Z">
         <w:r>
           <w:rPr>
             <w:rFonts w:ascii="Garamond" w:eastAsia="Times New Roman" w:hAnsi="Garamond" w:cs="Times New Roman"/>
@@ -2710,14 +3283,6 @@
           </w:rPr>
           <w:delText>86</w:delText>
         </w:r>
-        <w:r>
-          <w:rPr>
-            <w:rFonts w:ascii="Garamond" w:eastAsia="Times New Roman" w:hAnsi="Garamond" w:cs="Times New Roman"/>
-            <w:kern w:val="0"/>
-            <w14:ligatures w14:val="none"/>
-          </w:rPr>
-          <w:delText xml:space="preserve"> </w:delText>
-        </w:r>
       </w:del>
       <w:r>
         <w:rPr>
@@ -2725,78 +3290,9 @@
           <w:kern w:val="0"/>
           <w14:ligatures w14:val="none"/>
         </w:rPr>
-        <w:t xml:space="preserve">from early development until marine entry </w:t>
-      </w:r>
-      <w:r>
-        <w:rPr>
-          <w:rFonts w:ascii="Garamond" w:eastAsia="Times New Roman" w:hAnsi="Garamond" w:cs="Times New Roman"/>
-          <w:kern w:val="0"/>
-          <w14:ligatures w14:val="none"/>
-        </w:rPr>
-        <w:fldChar w:fldCharType="begin"/>
-      </w:r>
-      <w:r>
-        <w:rPr>
-          <w:rFonts w:ascii="Garamond" w:eastAsia="Times New Roman" w:hAnsi="Garamond" w:cs="Times New Roman"/>
-          <w:kern w:val="0"/>
-          <w14:ligatures w14:val="none"/>
-        </w:rPr>
-        <w:instrText xml:space="preserve"> ADDIN ZOTERO_ITEM CSL_CITATION {"citationID":"drNJXJRw","properties":{"formattedCitation":"(Brennan et al., 2015; Campana, 1999; Capo et al., 1998)","plainCitation":"(Brennan et al., 2015; Campana, 1999; Capo et al., 1998)","noteIndex":0},"citationItems":[{"id":"25Y35S3t/lIyU3UG4","uris":["http://zotero.org/users/8421274/items/IY3FLHLM"],"itemData":{"id":"dI01jIsp/qEdWN4pU","type":"article-journal","abstract":"Strontium isotopes simultaneously delineate fine-scale natal habitats and migrations of Pacific salmon harvested during a coastal commercial fishery., Highly migratory organisms present major challenges to conservation efforts. This is especially true for exploited anadromous fish species, which exhibit long-range dispersals from natal sites, complex population structures, and extensive mixing of distinct populations during exploitation. By tracing the migratory histories of individual Chinook salmon caught in fisheries using strontium isotopes, we determined the relative production of natal habitats at fine spatial scales and different life histories. Although strontium isotopes have been widely used in provenance research, we present a new robust framework to simultaneously assess natal sources and migrations of individuals within fishery harvests through time. Our results pave the way for investigating how fine-scale habitat production and life histories of salmon respond to perturbations—providing crucial insights for conservation.","container-title":"Science Advances","DOI":"10.1126/sciadv.1400124","ISSN":"2375-2548","issue":"4","journalAbbreviation":"Sci Adv","note":"PMID: 26601173\nPMCID: PMC4640640","page":"e1400124","source":"PubMed Central","title":"Strontium isotopes delineate fine-scale natal origins and migration histories of Pacific salmon","volume":"1","author":[{"family":"Brennan","given":"Sean R."},{"family":"Zimmerman","given":"Christian E."},{"family":"Fernandez","given":"Diego P."},{"family":"Cerling","given":"Thure E."},{"family":"McPhee","given":"Megan V."},{"family":"Wooller","given":"Matthew J."}],"issued":{"date-parts":[["2015",5,15]]}}},{"id":1441,"uris":["http://zotero.org/users/8421274/items/PHNAKZ8D"],"itemData":{"id":1441,"type":"article-journal","abstract":"The fish otolith (earstone) has long been known as a timekeeper, but interest in its use as a metabolically inert environmental recorder has accelerated in recent years. In part due to technological advances, applications such as stock identification, determination of rnigralon pathways, reconstruction of temperature and salinity history, age validation, detection of anadromy, use as a natural tag and chemical mass marking have been developed, some of which are difficult or impossible to implement using alternative techniques. Microsamphg and the latest advances in beam-based probes allow many elemental assays to be coupled with daily or annual growth increments, thus providing a detailed chronologcal record of the environment. However, few workers have critically assessed the assumptions upon which the environmental reconstructions are based, or considered the possibility that elemental incorporation into the otolith may proceed differently than that into other calcified structures. This paper reviews current applications and their assumptions and suggests future directions. Particular attention is given to the premises that the elemental and isotopic composition of the otolith reflects that of the environment, and the effect of physiological filters on the resulting composition. The roles of temperature, elemental uptake into the fish and the process of otolith crystahzation are also assessed. Drawing upon recent advances in geochemistry and paleoclirnate research as points of contrast, it appears that not all applications of otolith chemistry are firmly based, although others are destined to become powerful and perhaps routine tools for the mainstream fish biologst.","container-title":"Marine Ecology Progress Series","DOI":"10.3354/meps188263","ISSN":"0171-8630, 1616-1599","journalAbbreviation":"Mar. Ecol. Prog. Ser.","language":"en","page":"263-297","source":"DOI.org (Crossref)","title":"Chemistry and composition of fish otoliths:pathways, mechanisms and applications","title-short":"Chemistry and composition of fish otoliths","volume":"188","author":[{"family":"Campana","given":"Se"}],"issued":{"date-parts":[["1999"]]}}},{"id":1457,"uris":["http://zotero.org/users/8421274/items/TDIQBP7K"],"itemData":{"id":1457,"type":"article-journal","abstract":"The strontium (Sr) isotope method can be a powerful tool in studies of chemical weathering and soil genesis, cation provenance and mobility, and the chronostratigraphic correlation of marine sediments. It is a sensitive geochemical tracer, applicable to large-scale ecosystem studies as well as to centimeter-scaled examination of cation mobility within a soil profile. The 87Sr/86Sr ratios of natural materials reflect the sources of strontium available during their formation. Isotopically distinct inputs from precipitation, dryfall, soil parent material, and surface or groundwater allow determination of the relative proportions of those materials entering or leaving an ecosystem. The isotopic compositions of labile (soil exchange complex and soil solution) strontium and Sr in vegetation reflect the sources of cations available to plants. Strontium isotopes can be used to track the biogeochemical cycling of nutrient cations such as calcium. The extent of cation contributions from in situ weathering and external additions to soil from dust and rain can also be resolved with this method. In this paper, we review the geochemistry and isotopic systematics of strontium, and discuss the use of this method as a tracer of earth surface processes.","container-title":"Geoderma","DOI":"10.1016/S0016-7061(97)00102-X","ISSN":"0016-7061","issue":"1","journalAbbreviation":"Geoderma","language":"en","page":"197-225","source":"ScienceDirect","title":"Strontium isotopes as tracers of ecosystem processes: theory and methods","title-short":"Strontium isotopes as tracers of ecosystem processes","volume":"82","author":[{"family":"Capo","given":"Rosemary C."},{"family":"Stewart","given":"Brian W."},{"family":"Chadwick","given":"Oliver A."}],"issued":{"date-parts":[["1998",2,1]]}}}],"schema":"https://github.com/citation-style-language/schema/raw/master/csl-citation.json"} </w:instrText>
-      </w:r>
-      <w:r>
-        <w:rPr>
-          <w:rFonts w:ascii="Garamond" w:eastAsia="Times New Roman" w:hAnsi="Garamond" w:cs="Times New Roman"/>
-          <w:kern w:val="0"/>
-          <w14:ligatures w14:val="none"/>
-        </w:rPr>
-        <w:fldChar w:fldCharType="separate"/>
-      </w:r>
-      <w:r>
-        <w:rPr>
-          <w:rFonts w:ascii="Garamond" w:eastAsia="Times New Roman" w:hAnsi="Garamond" w:cs="Times New Roman"/>
-          <w:noProof/>
-          <w:kern w:val="0"/>
-          <w14:ligatures w14:val="none"/>
-        </w:rPr>
-        <w:t>(Brennan et al., 2015; Campana, 1999</w:t>
-      </w:r>
-      <w:del w:id="108" w:author="Benjamin J. Makhlouf" w:date="2026-07-08T12:10:00Z" w16du:dateUtc="2026-07-08T19:10:00Z">
-        <w:r>
-          <w:rPr>
-            <w:rFonts w:ascii="Garamond" w:eastAsia="Times New Roman" w:hAnsi="Garamond" w:cs="Times New Roman"/>
-            <w:noProof/>
-            <w:kern w:val="0"/>
-            <w14:ligatures w14:val="none"/>
-          </w:rPr>
-          <w:delText>; Capo et al., 1998</w:delText>
-        </w:r>
-      </w:del>
-      <w:r>
-        <w:rPr>
-          <w:rFonts w:ascii="Garamond" w:eastAsia="Times New Roman" w:hAnsi="Garamond" w:cs="Times New Roman"/>
-          <w:noProof/>
-          <w:kern w:val="0"/>
-          <w14:ligatures w14:val="none"/>
-        </w:rPr>
-        <w:t>)</w:t>
-      </w:r>
-      <w:r>
-        <w:rPr>
-          <w:rFonts w:ascii="Garamond" w:eastAsia="Times New Roman" w:hAnsi="Garamond" w:cs="Times New Roman"/>
-          <w:kern w:val="0"/>
-          <w14:ligatures w14:val="none"/>
-        </w:rPr>
-        <w:fldChar w:fldCharType="end"/>
-      </w:r>
-      <w:r>
-        <w:rPr>
-          <w:rFonts w:ascii="Garamond" w:eastAsia="Times New Roman" w:hAnsi="Garamond" w:cs="Times New Roman"/>
-          <w:kern w:val="0"/>
-          <w14:ligatures w14:val="none"/>
-        </w:rPr>
-        <w:t xml:space="preserve">. From these data, the </w:t>
-      </w:r>
-      <w:ins w:id="109" w:author="Benjamin J. Makhlouf" w:date="2026-07-08T12:03:00Z" w16du:dateUtc="2026-07-08T19:03:00Z">
+        <w:t xml:space="preserve"> value associated with the natal freshwater rearing period was extracted by examining patterns of change in </w:t>
+      </w:r>
+      <w:ins w:id="150" w:author="Benjamin J. Makhlouf" w:date="2026-07-08T12:04:00Z" w16du:dateUtc="2026-07-08T19:04:00Z">
         <w:r>
           <w:rPr>
             <w:rFonts w:ascii="Garamond" w:eastAsia="Times New Roman" w:hAnsi="Garamond" w:cs="Times New Roman"/>
@@ -2806,16 +3302,14 @@
           </w:rPr>
           <w:t>87</w:t>
         </w:r>
-      </w:ins>
-      <w:r>
-        <w:rPr>
-          <w:rFonts w:ascii="Garamond" w:eastAsia="Times New Roman" w:hAnsi="Garamond" w:cs="Times New Roman"/>
-          <w:kern w:val="0"/>
-          <w14:ligatures w14:val="none"/>
-        </w:rPr>
-        <w:t>Sr</w:t>
-      </w:r>
-      <w:del w:id="110" w:author="Benjamin J. Makhlouf" w:date="2026-07-08T12:03:00Z" w16du:dateUtc="2026-07-08T19:03:00Z">
+        <w:r>
+          <w:rPr>
+            <w:rFonts w:ascii="Garamond" w:eastAsia="Times New Roman" w:hAnsi="Garamond" w:cs="Times New Roman"/>
+            <w:kern w:val="0"/>
+            <w14:ligatures w14:val="none"/>
+          </w:rPr>
+          <w:t>Sr/</w:t>
+        </w:r>
         <w:r>
           <w:rPr>
             <w:rFonts w:ascii="Garamond" w:eastAsia="Times New Roman" w:hAnsi="Garamond" w:cs="Times New Roman"/>
@@ -2823,18 +3317,26 @@
             <w:vertAlign w:val="superscript"/>
             <w14:ligatures w14:val="none"/>
           </w:rPr>
-          <w:delText>87</w:delText>
-        </w:r>
-      </w:del>
-      <w:r>
-        <w:rPr>
-          <w:rFonts w:ascii="Garamond" w:eastAsia="Times New Roman" w:hAnsi="Garamond" w:cs="Times New Roman"/>
-          <w:kern w:val="0"/>
-          <w14:ligatures w14:val="none"/>
-        </w:rPr>
-        <w:t>/</w:t>
-      </w:r>
-      <w:ins w:id="111" w:author="Benjamin J. Makhlouf" w:date="2026-07-08T12:03:00Z" w16du:dateUtc="2026-07-08T19:03:00Z">
+          <w:t>86</w:t>
+        </w:r>
+        <w:r>
+          <w:rPr>
+            <w:rFonts w:ascii="Garamond" w:eastAsia="Times New Roman" w:hAnsi="Garamond" w:cs="Times New Roman"/>
+            <w:kern w:val="0"/>
+            <w14:ligatures w14:val="none"/>
+          </w:rPr>
+          <w:t xml:space="preserve">Sr </w:t>
+        </w:r>
+      </w:ins>
+      <w:del w:id="151" w:author="Benjamin J. Makhlouf" w:date="2026-07-08T12:04:00Z" w16du:dateUtc="2026-07-08T19:04:00Z">
+        <w:r>
+          <w:rPr>
+            <w:rFonts w:ascii="Garamond" w:eastAsia="Times New Roman" w:hAnsi="Garamond" w:cs="Times New Roman"/>
+            <w:kern w:val="0"/>
+            <w14:ligatures w14:val="none"/>
+          </w:rPr>
+          <w:delText>Sr</w:delText>
+        </w:r>
         <w:r>
           <w:rPr>
             <w:rFonts w:ascii="Garamond" w:eastAsia="Times New Roman" w:hAnsi="Garamond" w:cs="Times New Roman"/>
@@ -2842,18 +3344,16 @@
             <w:vertAlign w:val="superscript"/>
             <w14:ligatures w14:val="none"/>
           </w:rPr>
-          <w:t>86</w:t>
-        </w:r>
-      </w:ins>
-      <w:r>
-        <w:rPr>
-          <w:rFonts w:ascii="Garamond" w:eastAsia="Times New Roman" w:hAnsi="Garamond" w:cs="Times New Roman"/>
-          <w:kern w:val="0"/>
-          <w14:ligatures w14:val="none"/>
-        </w:rPr>
-        <w:t>Sr</w:t>
-      </w:r>
-      <w:del w:id="112" w:author="Benjamin J. Makhlouf" w:date="2026-07-08T12:03:00Z" w16du:dateUtc="2026-07-08T19:03:00Z">
+          <w:delText>87</w:delText>
+        </w:r>
+        <w:r>
+          <w:rPr>
+            <w:rFonts w:ascii="Garamond" w:eastAsia="Times New Roman" w:hAnsi="Garamond" w:cs="Times New Roman"/>
+            <w:kern w:val="0"/>
+            <w14:ligatures w14:val="none"/>
+          </w:rPr>
+          <w:delText>/Sr</w:delText>
+        </w:r>
         <w:r>
           <w:rPr>
             <w:rFonts w:ascii="Garamond" w:eastAsia="Times New Roman" w:hAnsi="Garamond" w:cs="Times New Roman"/>
@@ -2863,86 +3363,6 @@
           </w:rPr>
           <w:delText>86</w:delText>
         </w:r>
-      </w:del>
-      <w:r>
-        <w:rPr>
-          <w:rFonts w:ascii="Garamond" w:eastAsia="Times New Roman" w:hAnsi="Garamond" w:cs="Times New Roman"/>
-          <w:kern w:val="0"/>
-          <w14:ligatures w14:val="none"/>
-        </w:rPr>
-        <w:t xml:space="preserve"> value associated with the natal freshwater rearing period was extracted by examining patterns of change in </w:t>
-      </w:r>
-      <w:ins w:id="113" w:author="Benjamin J. Makhlouf" w:date="2026-07-08T12:04:00Z" w16du:dateUtc="2026-07-08T19:04:00Z">
-        <w:r>
-          <w:rPr>
-            <w:rFonts w:ascii="Garamond" w:eastAsia="Times New Roman" w:hAnsi="Garamond" w:cs="Times New Roman"/>
-            <w:kern w:val="0"/>
-            <w:vertAlign w:val="superscript"/>
-            <w14:ligatures w14:val="none"/>
-          </w:rPr>
-          <w:t>87</w:t>
-        </w:r>
-        <w:r>
-          <w:rPr>
-            <w:rFonts w:ascii="Garamond" w:eastAsia="Times New Roman" w:hAnsi="Garamond" w:cs="Times New Roman"/>
-            <w:kern w:val="0"/>
-            <w14:ligatures w14:val="none"/>
-          </w:rPr>
-          <w:t>Sr/</w:t>
-        </w:r>
-        <w:r>
-          <w:rPr>
-            <w:rFonts w:ascii="Garamond" w:eastAsia="Times New Roman" w:hAnsi="Garamond" w:cs="Times New Roman"/>
-            <w:kern w:val="0"/>
-            <w:vertAlign w:val="superscript"/>
-            <w14:ligatures w14:val="none"/>
-          </w:rPr>
-          <w:t>86</w:t>
-        </w:r>
-        <w:r>
-          <w:rPr>
-            <w:rFonts w:ascii="Garamond" w:eastAsia="Times New Roman" w:hAnsi="Garamond" w:cs="Times New Roman"/>
-            <w:kern w:val="0"/>
-            <w14:ligatures w14:val="none"/>
-          </w:rPr>
-          <w:t xml:space="preserve">Sr </w:t>
-        </w:r>
-      </w:ins>
-      <w:del w:id="114" w:author="Benjamin J. Makhlouf" w:date="2026-07-08T12:04:00Z" w16du:dateUtc="2026-07-08T19:04:00Z">
-        <w:r>
-          <w:rPr>
-            <w:rFonts w:ascii="Garamond" w:eastAsia="Times New Roman" w:hAnsi="Garamond" w:cs="Times New Roman"/>
-            <w:kern w:val="0"/>
-            <w14:ligatures w14:val="none"/>
-          </w:rPr>
-          <w:delText>Sr</w:delText>
-        </w:r>
-        <w:r>
-          <w:rPr>
-            <w:rFonts w:ascii="Garamond" w:eastAsia="Times New Roman" w:hAnsi="Garamond" w:cs="Times New Roman"/>
-            <w:kern w:val="0"/>
-            <w:vertAlign w:val="superscript"/>
-            <w14:ligatures w14:val="none"/>
-          </w:rPr>
-          <w:delText>87</w:delText>
-        </w:r>
-        <w:r>
-          <w:rPr>
-            <w:rFonts w:ascii="Garamond" w:eastAsia="Times New Roman" w:hAnsi="Garamond" w:cs="Times New Roman"/>
-            <w:kern w:val="0"/>
-            <w14:ligatures w14:val="none"/>
-          </w:rPr>
-          <w:delText>/Sr</w:delText>
-        </w:r>
-        <w:r>
-          <w:rPr>
-            <w:rFonts w:ascii="Garamond" w:eastAsia="Times New Roman" w:hAnsi="Garamond" w:cs="Times New Roman"/>
-            <w:kern w:val="0"/>
-            <w:vertAlign w:val="superscript"/>
-            <w14:ligatures w14:val="none"/>
-          </w:rPr>
-          <w:delText>86</w:delText>
-        </w:r>
         <w:r>
           <w:rPr>
             <w:rFonts w:ascii="Garamond" w:eastAsia="Times New Roman" w:hAnsi="Garamond" w:cs="Times New Roman"/>
@@ -2977,7 +3397,7 @@
         </w:rPr>
         <w:t xml:space="preserve"> between the core and freshwater region, morphological features of the otolith visible along the ablation path, and known distances from the core</w:t>
       </w:r>
-      <w:ins w:id="115" w:author="Benjamin J. Makhlouf" w:date="2026-06-18T19:47:00Z" w16du:dateUtc="2026-06-19T02:47:00Z">
+      <w:ins w:id="152" w:author="Benjamin J. Makhlouf" w:date="2026-06-18T19:47:00Z" w16du:dateUtc="2026-06-19T02:47:00Z">
         <w:r>
           <w:rPr>
             <w:rFonts w:ascii="Garamond" w:eastAsia="Times New Roman" w:hAnsi="Garamond" w:cs="Times New Roman"/>
@@ -2992,7 +3412,7 @@
             <w:kern w:val="0"/>
             <w:highlight w:val="yellow"/>
             <w14:ligatures w14:val="none"/>
-            <w:rPrChange w:id="116" w:author="Benjamin J. Makhlouf" w:date="2026-06-18T19:47:00Z" w16du:dateUtc="2026-06-19T02:47:00Z">
+            <w:rPrChange w:id="153" w:author="Benjamin J. Makhlouf" w:date="2026-06-18T19:47:00Z" w16du:dateUtc="2026-06-19T02:47:00Z">
               <w:rPr>
                 <w:rFonts w:ascii="Garamond" w:eastAsia="Times New Roman" w:hAnsi="Garamond" w:cs="Times New Roman"/>
                 <w:kern w:val="0"/>
@@ -3003,7 +3423,7 @@
           <w:t>(</w:t>
         </w:r>
       </w:ins>
-      <w:ins w:id="117" w:author="Benjamin J. Makhlouf" w:date="2026-07-08T12:13:00Z" w16du:dateUtc="2026-07-08T19:13:00Z">
+      <w:ins w:id="154" w:author="Benjamin J. Makhlouf" w:date="2026-07-08T12:13:00Z" w16du:dateUtc="2026-07-08T19:13:00Z">
         <w:r>
           <w:rPr>
             <w:rFonts w:ascii="Garamond" w:eastAsia="Times New Roman" w:hAnsi="Garamond" w:cs="Times New Roman"/>
@@ -3014,14 +3434,14 @@
           <w:t>~120-150 µm</w:t>
         </w:r>
       </w:ins>
-      <w:ins w:id="118" w:author="Benjamin J. Makhlouf" w:date="2026-06-18T19:47:00Z" w16du:dateUtc="2026-06-19T02:47:00Z">
+      <w:ins w:id="155" w:author="Benjamin J. Makhlouf" w:date="2026-06-18T19:47:00Z" w16du:dateUtc="2026-06-19T02:47:00Z">
         <w:r>
           <w:rPr>
             <w:rFonts w:ascii="Garamond" w:eastAsia="Times New Roman" w:hAnsi="Garamond" w:cs="Times New Roman"/>
             <w:kern w:val="0"/>
             <w:highlight w:val="yellow"/>
             <w14:ligatures w14:val="none"/>
-            <w:rPrChange w:id="119" w:author="Benjamin J. Makhlouf" w:date="2026-06-18T19:47:00Z" w16du:dateUtc="2026-06-19T02:47:00Z">
+            <w:rPrChange w:id="156" w:author="Benjamin J. Makhlouf" w:date="2026-06-18T19:47:00Z" w16du:dateUtc="2026-06-19T02:47:00Z">
               <w:rPr>
                 <w:rFonts w:ascii="Garamond" w:eastAsia="Times New Roman" w:hAnsi="Garamond" w:cs="Times New Roman"/>
                 <w:kern w:val="0"/>
@@ -3089,17 +3509,27 @@
         </w:rPr>
         <w:t>.</w:t>
       </w:r>
-      <w:ins w:id="120" w:author="Benjamin J. Makhlouf" w:date="2026-06-18T19:45:00Z" w16du:dateUtc="2026-06-19T02:45:00Z">
+      <w:ins w:id="157" w:author="Benjamin J. Makhlouf" w:date="2026-07-08T16:56:00Z" w16du:dateUtc="2026-07-08T23:56:00Z">
         <w:r>
           <w:rPr>
             <w:rFonts w:ascii="Garamond" w:eastAsia="Times New Roman" w:hAnsi="Garamond" w:cs="Times New Roman"/>
             <w:kern w:val="0"/>
             <w14:ligatures w14:val="none"/>
           </w:rPr>
+          <w:t xml:space="preserve"> We used </w:t>
+        </w:r>
+      </w:ins>
+      <w:ins w:id="158" w:author="Benjamin J. Makhlouf" w:date="2026-06-18T19:45:00Z" w16du:dateUtc="2026-06-19T02:45:00Z">
+        <w:r>
+          <w:rPr>
+            <w:rFonts w:ascii="Garamond" w:eastAsia="Times New Roman" w:hAnsi="Garamond" w:cs="Times New Roman"/>
+            <w:kern w:val="0"/>
+            <w14:ligatures w14:val="none"/>
+          </w:rPr>
           <w:t xml:space="preserve"> </w:t>
         </w:r>
       </w:ins>
-      <w:ins w:id="121" w:author="Benjamin J. Makhlouf" w:date="2026-07-08T12:05:00Z" w16du:dateUtc="2026-07-08T19:05:00Z">
+      <w:ins w:id="159" w:author="Benjamin J. Makhlouf" w:date="2026-07-08T12:05:00Z" w16du:dateUtc="2026-07-08T19:05:00Z">
         <w:r>
           <w:rPr>
             <w:rFonts w:ascii="Garamond" w:eastAsia="Times New Roman" w:hAnsi="Garamond" w:cs="Times New Roman"/>
@@ -3110,7 +3540,7 @@
           <w:t>88</w:t>
         </w:r>
       </w:ins>
-      <w:ins w:id="122" w:author="Benjamin J. Makhlouf" w:date="2026-06-18T19:47:00Z" w16du:dateUtc="2026-06-19T02:47:00Z">
+      <w:ins w:id="160" w:author="Benjamin J. Makhlouf" w:date="2026-06-18T19:47:00Z" w16du:dateUtc="2026-06-19T02:47:00Z">
         <w:r>
           <w:rPr>
             <w:rFonts w:ascii="Garamond" w:eastAsia="Times New Roman" w:hAnsi="Garamond" w:cs="Times New Roman"/>
@@ -3120,27 +3550,151 @@
           <w:t>Sr</w:t>
         </w:r>
       </w:ins>
-      <w:ins w:id="123" w:author="Benjamin J. Makhlouf" w:date="2026-06-18T19:48:00Z" w16du:dateUtc="2026-06-19T02:48:00Z">
+      <w:ins w:id="161" w:author="Benjamin J. Makhlouf" w:date="2026-06-18T19:48:00Z" w16du:dateUtc="2026-06-19T02:48:00Z">
         <w:r>
           <w:rPr>
             <w:rFonts w:ascii="Garamond" w:eastAsia="Times New Roman" w:hAnsi="Garamond" w:cs="Times New Roman"/>
             <w:kern w:val="0"/>
             <w14:ligatures w14:val="none"/>
           </w:rPr>
-          <w:t xml:space="preserve"> can be used as a proxy for Sr concentration, which is expected to be much higher in the marine environment as well as the materna</w:t>
-        </w:r>
-      </w:ins>
-      <w:ins w:id="124" w:author="Benjamin J. Makhlouf" w:date="2026-06-18T19:49:00Z" w16du:dateUtc="2026-06-19T02:49:00Z">
+          <w:t xml:space="preserve"> as a proxy for </w:t>
+        </w:r>
+      </w:ins>
+      <w:ins w:id="162" w:author="Benjamin J. Makhlouf" w:date="2026-07-08T16:56:00Z" w16du:dateUtc="2026-07-08T23:56:00Z">
         <w:r>
           <w:rPr>
             <w:rFonts w:ascii="Garamond" w:eastAsia="Times New Roman" w:hAnsi="Garamond" w:cs="Times New Roman"/>
             <w:kern w:val="0"/>
             <w14:ligatures w14:val="none"/>
           </w:rPr>
-          <w:t xml:space="preserve">lly influenced core. As a result, the </w:t>
-        </w:r>
-      </w:ins>
-      <w:ins w:id="125" w:author="Benjamin J. Makhlouf" w:date="2026-07-08T12:05:00Z" w16du:dateUtc="2026-07-08T19:05:00Z">
+          <w:t xml:space="preserve">total </w:t>
+        </w:r>
+      </w:ins>
+      <w:ins w:id="163" w:author="Benjamin J. Makhlouf" w:date="2026-07-08T16:57:00Z" w16du:dateUtc="2026-07-08T23:57:00Z">
+        <w:r>
+          <w:rPr>
+            <w:rFonts w:ascii="Garamond" w:eastAsia="Times New Roman" w:hAnsi="Garamond" w:cs="Times New Roman"/>
+            <w:kern w:val="0"/>
+            <w14:ligatures w14:val="none"/>
+          </w:rPr>
+          <w:t>s</w:t>
+        </w:r>
+      </w:ins>
+      <w:ins w:id="164" w:author="Benjamin J. Makhlouf" w:date="2026-07-08T16:56:00Z" w16du:dateUtc="2026-07-08T23:56:00Z">
+        <w:r>
+          <w:rPr>
+            <w:rFonts w:ascii="Garamond" w:eastAsia="Times New Roman" w:hAnsi="Garamond" w:cs="Times New Roman"/>
+            <w:kern w:val="0"/>
+            <w14:ligatures w14:val="none"/>
+          </w:rPr>
+          <w:t>trontium</w:t>
+        </w:r>
+      </w:ins>
+      <w:ins w:id="165" w:author="Benjamin J. Makhlouf" w:date="2026-06-18T19:48:00Z" w16du:dateUtc="2026-06-19T02:48:00Z">
+        <w:r>
+          <w:rPr>
+            <w:rFonts w:ascii="Garamond" w:eastAsia="Times New Roman" w:hAnsi="Garamond" w:cs="Times New Roman"/>
+            <w:kern w:val="0"/>
+            <w14:ligatures w14:val="none"/>
+          </w:rPr>
+          <w:t xml:space="preserve"> concentration, which is expected to be much higher in </w:t>
+        </w:r>
+      </w:ins>
+      <w:ins w:id="166" w:author="Benjamin J. Makhlouf" w:date="2026-07-08T16:57:00Z" w16du:dateUtc="2026-07-08T23:57:00Z">
+        <w:r>
+          <w:rPr>
+            <w:rFonts w:ascii="Garamond" w:eastAsia="Times New Roman" w:hAnsi="Garamond" w:cs="Times New Roman"/>
+            <w:kern w:val="0"/>
+            <w14:ligatures w14:val="none"/>
+          </w:rPr>
+          <w:t>both the</w:t>
+        </w:r>
+      </w:ins>
+      <w:ins w:id="167" w:author="Benjamin J. Makhlouf" w:date="2026-06-18T19:48:00Z" w16du:dateUtc="2026-06-19T02:48:00Z">
+        <w:r>
+          <w:rPr>
+            <w:rFonts w:ascii="Garamond" w:eastAsia="Times New Roman" w:hAnsi="Garamond" w:cs="Times New Roman"/>
+            <w:kern w:val="0"/>
+            <w14:ligatures w14:val="none"/>
+          </w:rPr>
+          <w:t xml:space="preserve"> marine environment </w:t>
+        </w:r>
+      </w:ins>
+      <w:ins w:id="168" w:author="Benjamin J. Makhlouf" w:date="2026-07-08T16:57:00Z" w16du:dateUtc="2026-07-08T23:57:00Z">
+        <w:r>
+          <w:rPr>
+            <w:rFonts w:ascii="Garamond" w:eastAsia="Times New Roman" w:hAnsi="Garamond" w:cs="Times New Roman"/>
+            <w:kern w:val="0"/>
+            <w14:ligatures w14:val="none"/>
+          </w:rPr>
+          <w:t xml:space="preserve">and the </w:t>
+        </w:r>
+      </w:ins>
+      <w:ins w:id="169" w:author="Benjamin J. Makhlouf" w:date="2026-06-18T19:48:00Z" w16du:dateUtc="2026-06-19T02:48:00Z">
+        <w:r>
+          <w:rPr>
+            <w:rFonts w:ascii="Garamond" w:eastAsia="Times New Roman" w:hAnsi="Garamond" w:cs="Times New Roman"/>
+            <w:kern w:val="0"/>
+            <w14:ligatures w14:val="none"/>
+          </w:rPr>
+          <w:t>materna</w:t>
+        </w:r>
+      </w:ins>
+      <w:ins w:id="170" w:author="Benjamin J. Makhlouf" w:date="2026-06-18T19:49:00Z" w16du:dateUtc="2026-06-19T02:49:00Z">
+        <w:r>
+          <w:rPr>
+            <w:rFonts w:ascii="Garamond" w:eastAsia="Times New Roman" w:hAnsi="Garamond" w:cs="Times New Roman"/>
+            <w:kern w:val="0"/>
+            <w14:ligatures w14:val="none"/>
+          </w:rPr>
+          <w:t>lly influenced core</w:t>
+        </w:r>
+      </w:ins>
+      <w:ins w:id="171" w:author="Benjamin J. Makhlouf" w:date="2026-07-08T16:57:00Z" w16du:dateUtc="2026-07-08T23:57:00Z">
+        <w:r>
+          <w:rPr>
+            <w:rFonts w:ascii="Garamond" w:eastAsia="Times New Roman" w:hAnsi="Garamond" w:cs="Times New Roman"/>
+            <w:kern w:val="0"/>
+            <w14:ligatures w14:val="none"/>
+          </w:rPr>
+          <w:t xml:space="preserve"> region of the otolith</w:t>
+        </w:r>
+      </w:ins>
+      <w:ins w:id="172" w:author="Benjamin J. Makhlouf" w:date="2026-06-18T19:49:00Z" w16du:dateUtc="2026-06-19T02:49:00Z">
+        <w:r>
+          <w:rPr>
+            <w:rFonts w:ascii="Garamond" w:eastAsia="Times New Roman" w:hAnsi="Garamond" w:cs="Times New Roman"/>
+            <w:kern w:val="0"/>
+            <w14:ligatures w14:val="none"/>
+          </w:rPr>
+          <w:t xml:space="preserve">. </w:t>
+        </w:r>
+      </w:ins>
+    </w:p>
+    <w:p>
+      <w:pPr>
+        <w:spacing w:line="480" w:lineRule="auto"/>
+        <w:ind w:firstLine="720"/>
+        <w:rPr>
+          <w:rFonts w:ascii="Garamond" w:eastAsia="Times New Roman" w:hAnsi="Garamond" w:cs="Times New Roman"/>
+          <w:kern w:val="0"/>
+          <w:sz w:val="22"/>
+          <w:szCs w:val="22"/>
+          <w14:ligatures w14:val="none"/>
+        </w:rPr>
+      </w:pPr>
+      <w:ins w:id="173" w:author="Benjamin J. Makhlouf" w:date="2026-06-18T19:49:00Z" w16du:dateUtc="2026-06-19T02:49:00Z">
+        <w:r>
+          <w:rPr>
+            <w:rFonts w:ascii="Garamond" w:eastAsia="Times New Roman" w:hAnsi="Garamond" w:cs="Times New Roman"/>
+            <w:kern w:val="0"/>
+            <w14:ligatures w14:val="none"/>
+          </w:rPr>
+          <w:lastRenderedPageBreak/>
+          <w:t xml:space="preserve">As a result, the </w:t>
+        </w:r>
+      </w:ins>
+      <w:ins w:id="174" w:author="Benjamin J. Makhlouf" w:date="2026-07-08T12:05:00Z" w16du:dateUtc="2026-07-08T19:05:00Z">
         <w:r>
           <w:rPr>
             <w:rFonts w:ascii="Garamond" w:eastAsia="Times New Roman" w:hAnsi="Garamond" w:cs="Times New Roman"/>
@@ -3151,7 +3705,7 @@
           <w:t>88</w:t>
         </w:r>
       </w:ins>
-      <w:ins w:id="126" w:author="Benjamin J. Makhlouf" w:date="2026-06-18T19:49:00Z" w16du:dateUtc="2026-06-19T02:49:00Z">
+      <w:ins w:id="175" w:author="Benjamin J. Makhlouf" w:date="2026-06-18T19:49:00Z" w16du:dateUtc="2026-06-19T02:49:00Z">
         <w:r>
           <w:rPr>
             <w:rFonts w:ascii="Garamond" w:eastAsia="Times New Roman" w:hAnsi="Garamond" w:cs="Times New Roman"/>
@@ -3161,7 +3715,7 @@
           <w:t xml:space="preserve">Sr signal of the otolith data was used to guide manual selection of the natal origin region following depletion of the maternal signature, indicated by decreased </w:t>
         </w:r>
       </w:ins>
-      <w:ins w:id="127" w:author="Benjamin J. Makhlouf" w:date="2026-07-08T12:05:00Z" w16du:dateUtc="2026-07-08T19:05:00Z">
+      <w:ins w:id="176" w:author="Benjamin J. Makhlouf" w:date="2026-07-08T12:05:00Z" w16du:dateUtc="2026-07-08T19:05:00Z">
         <w:r>
           <w:rPr>
             <w:rFonts w:ascii="Garamond" w:eastAsia="Times New Roman" w:hAnsi="Garamond" w:cs="Times New Roman"/>
@@ -3172,7 +3726,7 @@
           <w:t>88</w:t>
         </w:r>
       </w:ins>
-      <w:ins w:id="128" w:author="Benjamin J. Makhlouf" w:date="2026-06-18T19:49:00Z" w16du:dateUtc="2026-06-19T02:49:00Z">
+      <w:ins w:id="177" w:author="Benjamin J. Makhlouf" w:date="2026-06-18T19:49:00Z" w16du:dateUtc="2026-06-19T02:49:00Z">
         <w:r>
           <w:rPr>
             <w:rFonts w:ascii="Garamond" w:eastAsia="Times New Roman" w:hAnsi="Garamond" w:cs="Times New Roman"/>
@@ -3182,7 +3736,7 @@
           <w:t xml:space="preserve">Sr concentrations. </w:t>
         </w:r>
       </w:ins>
-      <w:del w:id="129" w:author="Benjamin J. Makhlouf" w:date="2026-06-18T19:45:00Z" w16du:dateUtc="2026-06-19T02:45:00Z">
+      <w:del w:id="178" w:author="Benjamin J. Makhlouf" w:date="2026-06-18T19:45:00Z" w16du:dateUtc="2026-06-19T02:45:00Z">
         <w:r>
           <w:rPr>
             <w:rFonts w:ascii="Garamond" w:eastAsia="Times New Roman" w:hAnsi="Garamond" w:cs="Times New Roman"/>
@@ -3243,7 +3797,7 @@
         </w:rPr>
         <w:t xml:space="preserve">A strontium isoscape of the Kuskokwim River basin (Fig. 1) was constructed by French et al. (2020) in which spatial variation in </w:t>
       </w:r>
-      <w:ins w:id="130" w:author="Benjamin J. Makhlouf" w:date="2026-07-08T12:04:00Z" w16du:dateUtc="2026-07-08T19:04:00Z">
+      <w:ins w:id="179" w:author="Benjamin J. Makhlouf" w:date="2026-07-08T12:04:00Z" w16du:dateUtc="2026-07-08T19:04:00Z">
         <w:r>
           <w:rPr>
             <w:rFonts w:ascii="Garamond" w:eastAsia="Times New Roman" w:hAnsi="Garamond" w:cs="Times New Roman"/>
@@ -3279,7 +3833,7 @@
           <w:t xml:space="preserve">Sr </w:t>
         </w:r>
       </w:ins>
-      <w:del w:id="131" w:author="Benjamin J. Makhlouf" w:date="2026-07-08T12:04:00Z" w16du:dateUtc="2026-07-08T19:04:00Z">
+      <w:del w:id="180" w:author="Benjamin J. Makhlouf" w:date="2026-07-08T12:04:00Z" w16du:dateUtc="2026-07-08T19:04:00Z">
         <w:r>
           <w:rPr>
             <w:rFonts w:ascii="Garamond" w:eastAsia="Times New Roman" w:hAnsi="Garamond" w:cs="Times New Roman"/>
@@ -3380,7 +3934,7 @@
         </w:rPr>
         <w:t xml:space="preserve">. The resulting isoscape includes estimates of </w:t>
       </w:r>
-      <w:ins w:id="132" w:author="Benjamin J. Makhlouf" w:date="2026-07-08T12:04:00Z" w16du:dateUtc="2026-07-08T19:04:00Z">
+      <w:ins w:id="181" w:author="Benjamin J. Makhlouf" w:date="2026-07-08T12:04:00Z" w16du:dateUtc="2026-07-08T19:04:00Z">
         <w:r>
           <w:rPr>
             <w:rFonts w:ascii="Garamond" w:eastAsia="Times New Roman" w:hAnsi="Garamond" w:cs="Times New Roman"/>
@@ -3416,7 +3970,7 @@
           <w:t xml:space="preserve">Sr </w:t>
         </w:r>
       </w:ins>
-      <w:del w:id="133" w:author="Benjamin J. Makhlouf" w:date="2026-07-08T12:04:00Z" w16du:dateUtc="2026-07-08T19:04:00Z">
+      <w:del w:id="182" w:author="Benjamin J. Makhlouf" w:date="2026-07-08T12:04:00Z" w16du:dateUtc="2026-07-08T19:04:00Z">
         <w:r>
           <w:rPr>
             <w:rFonts w:ascii="Garamond" w:eastAsia="Times New Roman" w:hAnsi="Garamond" w:cs="Times New Roman"/>
@@ -3593,7 +4147,7 @@
         </w:rPr>
         <w:t xml:space="preserve">. This approach considers the relationship between extracted natal origin otolith </w:t>
       </w:r>
-      <w:ins w:id="134" w:author="Benjamin J. Makhlouf" w:date="2026-07-08T12:04:00Z" w16du:dateUtc="2026-07-08T19:04:00Z">
+      <w:ins w:id="183" w:author="Benjamin J. Makhlouf" w:date="2026-07-08T12:04:00Z" w16du:dateUtc="2026-07-08T19:04:00Z">
         <w:r>
           <w:rPr>
             <w:rFonts w:ascii="Garamond" w:eastAsia="Times New Roman" w:hAnsi="Garamond" w:cs="Times New Roman"/>
@@ -3629,7 +4183,7 @@
           <w:t xml:space="preserve">Sr </w:t>
         </w:r>
       </w:ins>
-      <w:del w:id="135" w:author="Benjamin J. Makhlouf" w:date="2026-07-08T12:04:00Z" w16du:dateUtc="2026-07-08T19:04:00Z">
+      <w:del w:id="184" w:author="Benjamin J. Makhlouf" w:date="2026-07-08T12:04:00Z" w16du:dateUtc="2026-07-08T19:04:00Z">
         <w:r>
           <w:rPr>
             <w:rFonts w:ascii="Garamond" w:eastAsia="Times New Roman" w:hAnsi="Garamond" w:cs="Times New Roman"/>
@@ -3681,7 +4235,7 @@
         </w:rPr>
         <w:t>values as well as several variance generating processes</w:t>
       </w:r>
-      <w:ins w:id="136" w:author="Benjamin J. Makhlouf" w:date="2026-06-22T08:33:00Z" w16du:dateUtc="2026-06-22T15:33:00Z">
+      <w:ins w:id="185" w:author="Benjamin J. Makhlouf" w:date="2026-06-22T08:33:00Z" w16du:dateUtc="2026-06-22T15:33:00Z">
         <w:r>
           <w:rPr>
             <w:rFonts w:ascii="Garamond" w:eastAsia="Times New Roman" w:hAnsi="Garamond" w:cs="Times New Roman"/>
@@ -3691,12 +4245,12 @@
           <w:t>.</w:t>
         </w:r>
       </w:ins>
-      <w:ins w:id="137" w:author="Benjamin J. Makhlouf" w:date="2026-06-22T08:49:00Z" w16du:dateUtc="2026-06-22T15:49:00Z">
+      <w:ins w:id="186" w:author="Benjamin J. Makhlouf" w:date="2026-06-22T08:49:00Z" w16du:dateUtc="2026-06-22T15:49:00Z">
         <w:r>
           <w:t xml:space="preserve"> </w:t>
         </w:r>
       </w:ins>
-      <w:ins w:id="138" w:author="Benjamin J. Makhlouf" w:date="2026-06-22T08:49:00Z">
+      <w:ins w:id="187" w:author="Benjamin J. Makhlouf" w:date="2026-06-22T08:49:00Z">
         <w:r>
           <w:rPr>
             <w:rFonts w:ascii="Garamond" w:eastAsia="Times New Roman" w:hAnsi="Garamond" w:cs="Times New Roman"/>
@@ -3706,7 +4260,7 @@
           <w:t>These sources include analytical error (variation among repeated standard measurements; 0.000055), within-population error (variation among individuals at the same site; 0.00016), and isoscape error (uncertainty in isoscape model predictions; basin-wide mean = 0.00072)</w:t>
         </w:r>
       </w:ins>
-      <w:ins w:id="139" w:author="Benjamin J. Makhlouf" w:date="2026-06-22T10:03:00Z" w16du:dateUtc="2026-06-22T17:03:00Z">
+      <w:ins w:id="188" w:author="Benjamin J. Makhlouf" w:date="2026-06-22T10:03:00Z" w16du:dateUtc="2026-06-22T17:03:00Z">
         <w:r>
           <w:rPr>
             <w:rFonts w:ascii="Garamond" w:eastAsia="Times New Roman" w:hAnsi="Garamond" w:cs="Times New Roman"/>
@@ -3716,7 +4270,7 @@
           <w:t xml:space="preserve"> </w:t>
         </w:r>
       </w:ins>
-      <w:ins w:id="140" w:author="Benjamin J. Makhlouf" w:date="2026-06-22T10:05:00Z" w16du:dateUtc="2026-06-22T17:05:00Z">
+      <w:ins w:id="189" w:author="Benjamin J. Makhlouf" w:date="2026-06-22T10:05:00Z" w16du:dateUtc="2026-06-22T17:05:00Z">
         <w:r>
           <w:rPr>
             <w:rFonts w:ascii="Garamond" w:eastAsia="Times New Roman" w:hAnsi="Garamond" w:cs="Times New Roman"/>
@@ -3726,7 +4280,7 @@
           <w:t xml:space="preserve">(Brennan et al., 2015, French at al., X). </w:t>
         </w:r>
       </w:ins>
-      <w:del w:id="141" w:author="Benjamin J. Makhlouf" w:date="2026-06-22T08:33:00Z" w16du:dateUtc="2026-06-22T15:33:00Z">
+      <w:del w:id="190" w:author="Benjamin J. Makhlouf" w:date="2026-06-22T08:33:00Z" w16du:dateUtc="2026-06-22T15:33:00Z">
         <w:r>
           <w:rPr>
             <w:rFonts w:ascii="Garamond" w:eastAsia="Times New Roman" w:hAnsi="Garamond" w:cs="Times New Roman"/>
@@ -3739,10 +4293,11 @@
           <w:rPr>
             <w:rFonts w:ascii="Garamond" w:hAnsi="Garamond" w:cs="Times New Roman"/>
           </w:rPr>
+          <w:lastRenderedPageBreak/>
           <w:delText>analytical</w:delText>
         </w:r>
       </w:del>
-      <w:del w:id="142" w:author="Benjamin J. Makhlouf" w:date="2026-06-22T10:06:00Z" w16du:dateUtc="2026-06-22T17:06:00Z">
+      <w:del w:id="191" w:author="Benjamin J. Makhlouf" w:date="2026-06-22T10:06:00Z" w16du:dateUtc="2026-06-22T17:06:00Z">
         <w:r>
           <w:rPr>
             <w:rFonts w:ascii="Garamond" w:hAnsi="Garamond" w:cs="Times New Roman"/>
@@ -3959,7 +4514,6 @@
         <w:rPr>
           <w:rFonts w:ascii="Garamond" w:hAnsi="Garamond" w:cs="Times New Roman"/>
         </w:rPr>
-        <w:lastRenderedPageBreak/>
         <w:t xml:space="preserve">Posterior probability values for each tributary (j) were then calculated using Bayes’ theorem </w:t>
       </w:r>
       <w:r>
@@ -4419,7 +4973,7 @@
         </w:rPr>
         <w:t>r</w:t>
       </w:r>
-      <w:del w:id="143" w:author="Benjamin J. Makhlouf" w:date="2026-07-08T14:55:00Z" w16du:dateUtc="2026-07-08T21:55:00Z">
+      <w:del w:id="192" w:author="Benjamin J. Makhlouf" w:date="2026-07-08T14:55:00Z" w16du:dateUtc="2026-07-08T21:55:00Z">
         <w:r>
           <w:rPr>
             <w:rFonts w:ascii="Garamond" w:hAnsi="Garamond" w:cs="Times New Roman"/>
@@ -4735,7 +5289,16 @@
           <w:kern w:val="0"/>
           <w14:ligatures w14:val="none"/>
         </w:rPr>
-        <w:t>. To avoid biasing regions without observations but with low sampling effort this prior was applied only to the two highest stream orders in the dataset (Stream order greater than five). From these tributaries, reaches identified as lacking observed Chinook spawning were assigned a value of zero.</w:t>
+        <w:t xml:space="preserve">. </w:t>
+      </w:r>
+      <w:r>
+        <w:rPr>
+          <w:rFonts w:ascii="Garamond" w:eastAsia="Times New Roman" w:hAnsi="Garamond" w:cs="Times New Roman"/>
+          <w:kern w:val="0"/>
+          <w14:ligatures w14:val="none"/>
+        </w:rPr>
+        <w:lastRenderedPageBreak/>
+        <w:t>To avoid biasing regions without observations but with low sampling effort this prior was applied only to the two highest stream orders in the dataset (Stream order greater than five). From these tributaries, reaches identified as lacking observed Chinook spawning were assigned a value of zero.</w:t>
       </w:r>
       <w:r>
         <w:rPr>
@@ -4760,10 +5323,9 @@
         <w:rPr>
           <w:rFonts w:ascii="Garamond" w:hAnsi="Garamond" w:cs="Times New Roman"/>
         </w:rPr>
-        <w:lastRenderedPageBreak/>
         <w:t xml:space="preserve">To estimate the spatial distribution of returns across a </w:t>
       </w:r>
-      <w:ins w:id="144" w:author="Benjamin J. Makhlouf" w:date="2026-06-22T10:08:00Z" w16du:dateUtc="2026-06-22T17:08:00Z">
+      <w:ins w:id="193" w:author="Benjamin J. Makhlouf" w:date="2026-06-22T10:08:00Z" w16du:dateUtc="2026-06-22T17:08:00Z">
         <w:r>
           <w:rPr>
             <w:rFonts w:ascii="Garamond" w:hAnsi="Garamond" w:cs="Times New Roman"/>
@@ -4777,7 +5339,7 @@
         </w:rPr>
         <w:t>subset of the</w:t>
       </w:r>
-      <w:ins w:id="145" w:author="Benjamin J. Makhlouf" w:date="2026-06-22T10:08:00Z" w16du:dateUtc="2026-06-22T17:08:00Z">
+      <w:ins w:id="194" w:author="Benjamin J. Makhlouf" w:date="2026-06-22T10:08:00Z" w16du:dateUtc="2026-06-22T17:08:00Z">
         <w:r>
           <w:rPr>
             <w:rFonts w:ascii="Garamond" w:hAnsi="Garamond" w:cs="Times New Roman"/>
@@ -4791,7 +5353,7 @@
           <w:t xml:space="preserve"> migration</w:t>
         </w:r>
       </w:ins>
-      <w:del w:id="146" w:author="Benjamin J. Makhlouf" w:date="2026-06-22T10:08:00Z" w16du:dateUtc="2026-06-22T17:08:00Z">
+      <w:del w:id="195" w:author="Benjamin J. Makhlouf" w:date="2026-06-22T10:08:00Z" w16du:dateUtc="2026-06-22T17:08:00Z">
         <w:r>
           <w:rPr>
             <w:rFonts w:ascii="Garamond" w:hAnsi="Garamond" w:cs="Times New Roman"/>
@@ -4842,7 +5404,7 @@
         </w:rPr>
         <w:t xml:space="preserve">. We produced these estimates for four predefined temporal </w:t>
       </w:r>
-      <w:ins w:id="147" w:author="Benjamin J. Makhlouf" w:date="2026-06-19T06:36:00Z" w16du:dateUtc="2026-06-19T13:36:00Z">
+      <w:ins w:id="196" w:author="Benjamin J. Makhlouf" w:date="2026-06-19T06:36:00Z" w16du:dateUtc="2026-06-19T13:36:00Z">
         <w:r>
           <w:rPr>
             <w:rFonts w:ascii="Garamond" w:hAnsi="Garamond" w:cs="Times New Roman"/>
@@ -4850,7 +5412,7 @@
           <w:t xml:space="preserve">ranges that roughly represent quartiles of the </w:t>
         </w:r>
       </w:ins>
-      <w:del w:id="148" w:author="Benjamin J. Makhlouf" w:date="2026-06-19T06:36:00Z" w16du:dateUtc="2026-06-19T13:36:00Z">
+      <w:del w:id="197" w:author="Benjamin J. Makhlouf" w:date="2026-06-19T06:36:00Z" w16du:dateUtc="2026-06-19T13:36:00Z">
         <w:r>
           <w:rPr>
             <w:rFonts w:ascii="Garamond" w:hAnsi="Garamond" w:cs="Times New Roman"/>
@@ -4864,7 +5426,7 @@
         </w:rPr>
         <w:t xml:space="preserve"> of the salmon migration season based on capture date: Q1 (run start through June 11), Q2 (June 12-21), Q3 (June 22-July 1), and Q4 (July 2 onward). These dates were chosen to roughly split the full run </w:t>
       </w:r>
-      <w:ins w:id="149" w:author="Benjamin J. Makhlouf" w:date="2026-06-19T06:37:00Z" w16du:dateUtc="2026-06-19T13:37:00Z">
+      <w:ins w:id="198" w:author="Benjamin J. Makhlouf" w:date="2026-06-19T06:37:00Z" w16du:dateUtc="2026-06-19T13:37:00Z">
         <w:r>
           <w:rPr>
             <w:rFonts w:ascii="Garamond" w:hAnsi="Garamond" w:cs="Times New Roman"/>
@@ -4872,7 +5434,7 @@
           <w:t>evenly into equal quartiles</w:t>
         </w:r>
       </w:ins>
-      <w:del w:id="150" w:author="Benjamin J. Makhlouf" w:date="2026-06-19T06:37:00Z" w16du:dateUtc="2026-06-19T13:37:00Z">
+      <w:del w:id="199" w:author="Benjamin J. Makhlouf" w:date="2026-06-19T06:37:00Z" w16du:dateUtc="2026-06-19T13:37:00Z">
         <w:r>
           <w:rPr>
             <w:rFonts w:ascii="Garamond" w:hAnsi="Garamond" w:cs="Times New Roman"/>
@@ -4886,7 +5448,7 @@
         </w:rPr>
         <w:t>while allowing for direct comparison among years.</w:t>
       </w:r>
-      <w:ins w:id="151" w:author="Benjamin J. Makhlouf" w:date="2026-06-19T06:37:00Z" w16du:dateUtc="2026-06-19T13:37:00Z">
+      <w:ins w:id="200" w:author="Benjamin J. Makhlouf" w:date="2026-06-19T06:37:00Z" w16du:dateUtc="2026-06-19T13:37:00Z">
         <w:r>
           <w:rPr>
             <w:rFonts w:ascii="Garamond" w:hAnsi="Garamond" w:cs="Times New Roman"/>
@@ -4894,7 +5456,7 @@
           <w:t xml:space="preserve"> However, because the start and end date of the return migration varied among years, the duration of Q1 and Q4 varied</w:t>
         </w:r>
       </w:ins>
-      <w:ins w:id="152" w:author="Benjamin J. Makhlouf" w:date="2026-06-19T06:38:00Z" w16du:dateUtc="2026-06-19T13:38:00Z">
+      <w:ins w:id="201" w:author="Benjamin J. Makhlouf" w:date="2026-06-19T06:38:00Z" w16du:dateUtc="2026-06-19T13:38:00Z">
         <w:r>
           <w:rPr>
             <w:rFonts w:ascii="Garamond" w:hAnsi="Garamond" w:cs="Times New Roman"/>
@@ -4917,7 +5479,7 @@
           <w:rFonts w:ascii="Garamond" w:hAnsi="Garamond" w:cs="Times New Roman"/>
         </w:rPr>
       </w:pPr>
-      <w:ins w:id="153" w:author="Benjamin J. Makhlouf" w:date="2026-06-19T07:16:00Z">
+      <w:ins w:id="202" w:author="Benjamin J. Makhlouf" w:date="2026-06-19T07:16:00Z">
         <w:r>
           <w:rPr>
             <w:rFonts w:ascii="Garamond" w:hAnsi="Garamond" w:cs="Times New Roman"/>
@@ -4925,7 +5487,7 @@
           <w:t>Several major tributaries were identified as focal management areas or important Chinook salmon-producing systems within the Kuskokwim River basin based on expert knowledge and consultation with regional collaborators.</w:t>
         </w:r>
       </w:ins>
-      <w:del w:id="154" w:author="Benjamin J. Makhlouf" w:date="2026-06-19T07:16:00Z" w16du:dateUtc="2026-06-19T14:16:00Z">
+      <w:del w:id="203" w:author="Benjamin J. Makhlouf" w:date="2026-06-19T07:16:00Z" w16du:dateUtc="2026-06-19T14:16:00Z">
         <w:r>
           <w:rPr>
             <w:rFonts w:ascii="Garamond" w:hAnsi="Garamond" w:cs="Times New Roman"/>
@@ -4952,7 +5514,14 @@
         <w:rPr>
           <w:rFonts w:ascii="Garamond" w:hAnsi="Garamond" w:cs="Times New Roman"/>
         </w:rPr>
-        <w:t xml:space="preserve">To identify regions of the watershed that can be distinguished based on their isotopic composition, we performed k-means clustering of initial tributary groupings using the full range of </w:t>
+        <w:t xml:space="preserve">To </w:t>
+      </w:r>
+      <w:r>
+        <w:rPr>
+          <w:rFonts w:ascii="Garamond" w:hAnsi="Garamond" w:cs="Times New Roman"/>
+        </w:rPr>
+        <w:lastRenderedPageBreak/>
+        <w:t xml:space="preserve">identify regions of the watershed that can be distinguished based on their isotopic composition, we performed k-means clustering of initial tributary groupings using the full range of </w:t>
       </w:r>
       <w:r>
         <w:rPr>
@@ -4978,16 +5547,9 @@
         <w:rPr>
           <w:rFonts w:ascii="Garamond" w:hAnsi="Garamond" w:cs="Times New Roman"/>
         </w:rPr>
-        <w:t xml:space="preserve">Sr values found in each. We then evaluated the clustering results for a range of cluster numbers (n = 2-6) using the silhouette score, which measures cluster quality by comparing within-cluster versus between-cluster distances. From this metric we selected n = 6, which maintained a </w:t>
-      </w:r>
-      <w:r>
-        <w:rPr>
-          <w:rFonts w:ascii="Garamond" w:hAnsi="Garamond" w:cs="Times New Roman"/>
-        </w:rPr>
-        <w:lastRenderedPageBreak/>
-        <w:t xml:space="preserve">high silhouette score while providing finer isotopic resolution across groups. The resulting regional groupings displayed a general pattern from upstream to downstream regions (Fig. 2b). However, K-means clustering placed the South Fork Kuskokwim in a lower watershed group because of a very small number of enriched tributaries at the headwaters of this group. Based on an evaluation of the overall isotopic composition compared to other nearby tributary groups, we manually added the South Fork Kuskokwim to its nearest watershed group, group </w:t>
-      </w:r>
-      <w:ins w:id="155" w:author="Benjamin J. Makhlouf" w:date="2026-06-22T10:17:00Z" w16du:dateUtc="2026-06-22T17:17:00Z">
+        <w:t xml:space="preserve">Sr values found in each. We then evaluated the clustering results for a range of cluster numbers (n = 2-6) using the silhouette score, which measures cluster quality by comparing within-cluster versus between-cluster distances. From this metric we selected n = 6, which maintained a high silhouette score while providing finer isotopic resolution across groups. The resulting regional groupings displayed a general pattern from upstream to downstream regions (Fig. 2b). However, K-means clustering placed the South Fork Kuskokwim in a lower watershed group because of a very small number of enriched tributaries at the headwaters of this group. Based on an evaluation of the overall isotopic composition compared to other nearby tributary groups, we manually added the South Fork Kuskokwim to its nearest watershed group, group </w:t>
+      </w:r>
+      <w:ins w:id="204" w:author="Benjamin J. Makhlouf" w:date="2026-06-22T10:17:00Z" w16du:dateUtc="2026-06-22T17:17:00Z">
         <w:r>
           <w:rPr>
             <w:rFonts w:ascii="Garamond" w:hAnsi="Garamond" w:cs="Times New Roman"/>
@@ -4995,7 +5557,7 @@
           <w:t>two</w:t>
         </w:r>
       </w:ins>
-      <w:del w:id="156" w:author="Benjamin J. Makhlouf" w:date="2026-06-22T10:17:00Z" w16du:dateUtc="2026-06-22T17:17:00Z">
+      <w:del w:id="205" w:author="Benjamin J. Makhlouf" w:date="2026-06-22T10:17:00Z" w16du:dateUtc="2026-06-22T17:17:00Z">
         <w:r>
           <w:rPr>
             <w:rFonts w:ascii="Garamond" w:hAnsi="Garamond" w:cs="Times New Roman"/>
@@ -5042,7 +5604,7 @@
         </w:rPr>
         <w:t>For each year and seasonal quartile, tributary-level return estimates were aggregated into the six regional groups and normalized to sum to one across the basin, representing each group’s proportional contribution to that quartile. Summary statistics were then calculated across all years for each group (Fig. 3). Cumulative distribution functions were constructed to examine trends in relative run timing among regional groups independent of abundance and quartile cut-off dates. For each year, the full run was split into three-day intervals and the cumulative number of returners for each group was compared to its full season contribution. To directly compare relative run timing to the temporal distribution of the full run, we used daily CPUE data collected from the BTF to calculate the cumulative proportion of the full run’s CPUE remaining for each day</w:t>
       </w:r>
-      <w:ins w:id="157" w:author="Benjamin J. Makhlouf" w:date="2026-06-22T10:23:00Z" w16du:dateUtc="2026-06-22T17:23:00Z">
+      <w:ins w:id="206" w:author="Benjamin J. Makhlouf" w:date="2026-06-22T10:23:00Z" w16du:dateUtc="2026-06-22T17:23:00Z">
         <w:r>
           <w:rPr>
             <w:rFonts w:ascii="Garamond" w:hAnsi="Garamond" w:cs="Times New Roman"/>
@@ -5054,7 +5616,14 @@
         <w:rPr>
           <w:rFonts w:ascii="Garamond" w:hAnsi="Garamond" w:cs="Times New Roman"/>
         </w:rPr>
-        <w:t xml:space="preserve">. This value represents the maximum potential harvest available if harvest rates are proportional to CPUE. However, this value does not account for the preferred harvest timing without the closure implemented, which may not follow this pattern. Resulting data (Fig. 4) illustrate the proportion (from zero to one) of each group’s total cumulative contribution to the overall run at each three-day interval as well as the proportion of the total potential harvest remaining for each day. </w:t>
+        <w:t xml:space="preserve">. This value represents the maximum potential harvest available if harvest rates are proportional to CPUE. However, this value does not account for the preferred harvest timing </w:t>
+      </w:r>
+      <w:r>
+        <w:rPr>
+          <w:rFonts w:ascii="Garamond" w:hAnsi="Garamond" w:cs="Times New Roman"/>
+        </w:rPr>
+        <w:lastRenderedPageBreak/>
+        <w:t xml:space="preserve">without the closure implemented, which may not follow this pattern. Resulting data (Fig. 4) illustrate the proportion (from zero to one) of each group’s total cumulative contribution to the overall run at each three-day interval as well as the proportion of the total potential harvest remaining for each day. </w:t>
       </w:r>
     </w:p>
     <w:p>
@@ -5069,10 +5638,9 @@
         <w:rPr>
           <w:rFonts w:ascii="Garamond" w:hAnsi="Garamond"/>
         </w:rPr>
-        <w:lastRenderedPageBreak/>
         <w:t xml:space="preserve">To assess the impact of the existing front-end closure, we quantified the </w:t>
       </w:r>
-      <w:ins w:id="158" w:author="Benjamin J. Makhlouf" w:date="2026-06-20T15:18:00Z">
+      <w:ins w:id="207" w:author="Benjamin J. Makhlouf" w:date="2026-06-20T15:18:00Z">
         <w:r>
           <w:rPr>
             <w:rFonts w:ascii="Garamond" w:hAnsi="Garamond"/>
@@ -5080,7 +5648,7 @@
           <w:t>proportion of total abundance occurring within the closure period (corresponding to the first seasonal quartile, Q1, in our dataset) that was assigned to each regional group based on otolith</w:t>
         </w:r>
       </w:ins>
-      <w:ins w:id="159" w:author="Benjamin J. Makhlouf" w:date="2026-06-20T15:20:00Z" w16du:dateUtc="2026-06-20T22:20:00Z">
+      <w:ins w:id="208" w:author="Benjamin J. Makhlouf" w:date="2026-06-20T15:20:00Z" w16du:dateUtc="2026-06-20T22:20:00Z">
         <w:r>
           <w:rPr>
             <w:rFonts w:ascii="Garamond" w:hAnsi="Garamond"/>
@@ -5088,7 +5656,7 @@
           <w:t xml:space="preserve"> isotope</w:t>
         </w:r>
       </w:ins>
-      <w:ins w:id="160" w:author="Benjamin J. Makhlouf" w:date="2026-06-20T15:18:00Z">
+      <w:ins w:id="209" w:author="Benjamin J. Makhlouf" w:date="2026-06-20T15:18:00Z">
         <w:r>
           <w:rPr>
             <w:rFonts w:ascii="Garamond" w:hAnsi="Garamond"/>
@@ -5096,7 +5664,7 @@
           <w:t xml:space="preserve"> assignments. We refer to this metric</w:t>
         </w:r>
       </w:ins>
-      <w:ins w:id="161" w:author="Benjamin J. Makhlouf" w:date="2026-06-20T15:20:00Z" w16du:dateUtc="2026-06-20T22:20:00Z">
+      <w:ins w:id="210" w:author="Benjamin J. Makhlouf" w:date="2026-06-20T15:20:00Z" w16du:dateUtc="2026-06-20T22:20:00Z">
         <w:r>
           <w:rPr>
             <w:rFonts w:ascii="Garamond" w:hAnsi="Garamond"/>
@@ -5104,7 +5672,7 @@
           <w:t xml:space="preserve"> hereafter</w:t>
         </w:r>
       </w:ins>
-      <w:ins w:id="162" w:author="Benjamin J. Makhlouf" w:date="2026-06-20T15:18:00Z">
+      <w:ins w:id="211" w:author="Benjamin J. Makhlouf" w:date="2026-06-20T15:18:00Z">
         <w:r>
           <w:rPr>
             <w:rFonts w:ascii="Garamond" w:hAnsi="Garamond"/>
@@ -5112,7 +5680,7 @@
           <w:t xml:space="preserve"> as </w:t>
         </w:r>
       </w:ins>
-      <w:ins w:id="163" w:author="Benjamin J. Makhlouf" w:date="2026-06-20T15:20:00Z" w16du:dateUtc="2026-06-20T22:20:00Z">
+      <w:ins w:id="212" w:author="Benjamin J. Makhlouf" w:date="2026-06-20T15:20:00Z" w16du:dateUtc="2026-06-20T22:20:00Z">
         <w:r>
           <w:rPr>
             <w:rFonts w:ascii="Garamond" w:hAnsi="Garamond"/>
@@ -5120,11 +5688,11 @@
           <w:t>“</w:t>
         </w:r>
       </w:ins>
-      <w:ins w:id="164" w:author="Benjamin J. Makhlouf" w:date="2026-06-20T15:18:00Z">
+      <w:ins w:id="213" w:author="Benjamin J. Makhlouf" w:date="2026-06-20T15:18:00Z">
         <w:r>
           <w:rPr>
             <w:rFonts w:ascii="Garamond" w:hAnsi="Garamond"/>
-            <w:rPrChange w:id="165" w:author="Benjamin J. Makhlouf" w:date="2026-06-20T15:19:00Z" w16du:dateUtc="2026-06-20T22:19:00Z">
+            <w:rPrChange w:id="214" w:author="Benjamin J. Makhlouf" w:date="2026-06-20T15:19:00Z" w16du:dateUtc="2026-06-20T22:19:00Z">
               <w:rPr>
                 <w:rFonts w:ascii="Garamond" w:hAnsi="Garamond"/>
                 <w:b/>
@@ -5135,7 +5703,7 @@
           <w:t>percent protection</w:t>
         </w:r>
       </w:ins>
-      <w:ins w:id="166" w:author="Benjamin J. Makhlouf" w:date="2026-06-20T15:20:00Z" w16du:dateUtc="2026-06-20T22:20:00Z">
+      <w:ins w:id="215" w:author="Benjamin J. Makhlouf" w:date="2026-06-20T15:20:00Z" w16du:dateUtc="2026-06-20T22:20:00Z">
         <w:r>
           <w:rPr>
             <w:rFonts w:ascii="Garamond" w:hAnsi="Garamond"/>
@@ -5143,7 +5711,7 @@
           <w:t>”</w:t>
         </w:r>
       </w:ins>
-      <w:ins w:id="167" w:author="Benjamin J. Makhlouf" w:date="2026-06-20T15:18:00Z">
+      <w:ins w:id="216" w:author="Benjamin J. Makhlouf" w:date="2026-06-20T15:18:00Z">
         <w:r>
           <w:rPr>
             <w:rFonts w:ascii="Garamond" w:hAnsi="Garamond"/>
@@ -5151,7 +5719,7 @@
           <w:t>.</w:t>
         </w:r>
       </w:ins>
-      <w:del w:id="168" w:author="Benjamin J. Makhlouf" w:date="2026-06-20T15:17:00Z" w16du:dateUtc="2026-06-20T22:17:00Z">
+      <w:del w:id="217" w:author="Benjamin J. Makhlouf" w:date="2026-06-20T15:17:00Z" w16du:dateUtc="2026-06-20T22:17:00Z">
         <w:r>
           <w:rPr>
             <w:rFonts w:ascii="Garamond" w:hAnsi="Garamond"/>
@@ -5281,7 +5849,14 @@
         <w:rPr>
           <w:rFonts w:ascii="Garamond" w:hAnsi="Garamond"/>
         </w:rPr>
-        <w:t>Across all years of our dataset (2017-2022), returns to the six regional groups exhibited a general transition from the furthest upstream to the furthest downstream as the season progressed (Fig. 3). Notably, group one, which contains the North Fork and East Fork Kuskokwim River, consistently contributed little to all years and quartiles (max: 2.9%). Early season returns (Q1: start of run through June 11, Fig. 3a.) were represented primarily by high contributions from group two (median: 42.2%), with relatively low median contribution (20% or less) from all other groups. The second quartile (June 12</w:t>
+        <w:t xml:space="preserve">Across all years of our dataset (2017-2022), returns to the six regional groups exhibited a general transition from the furthest upstream to the furthest downstream as the season progressed </w:t>
+      </w:r>
+      <w:r>
+        <w:rPr>
+          <w:rFonts w:ascii="Garamond" w:hAnsi="Garamond"/>
+        </w:rPr>
+        <w:lastRenderedPageBreak/>
+        <w:t>(Fig. 3). Notably, group one, which contains the North Fork and East Fork Kuskokwim River, consistently contributed little to all years and quartiles (max: 2.9%). Early season returns (Q1: start of run through June 11, Fig. 3a.) were represented primarily by high contributions from group two (median: 42.2%), with relatively low median contribution (20% or less) from all other groups. The second quartile (June 12</w:t>
       </w:r>
       <w:r>
         <w:rPr>
@@ -5307,14 +5882,7 @@
         <w:rPr>
           <w:rFonts w:ascii="Garamond" w:hAnsi="Garamond"/>
         </w:rPr>
-        <w:t xml:space="preserve">, Fig. 3b.) exhibited a slight decrease in contribution from group two </w:t>
-      </w:r>
-      <w:r>
-        <w:rPr>
-          <w:rFonts w:ascii="Garamond" w:hAnsi="Garamond"/>
-        </w:rPr>
-        <w:lastRenderedPageBreak/>
-        <w:t>(31.0%), with increasing contribution from groups four and five (25.8% and 19.8%, respectively). This pattern largely held in the 3</w:t>
+        <w:t>, Fig. 3b.) exhibited a slight decrease in contribution from group two (31.0%), with increasing contribution from groups four and five (25.8% and 19.8%, respectively). This pattern largely held in the 3</w:t>
       </w:r>
       <w:r>
         <w:rPr>
@@ -5373,7 +5941,7 @@
         </w:rPr>
         <w:t>Cumulative distribution plots (Fig. 4) illustrated</w:t>
       </w:r>
-      <w:ins w:id="169" w:author="Benjamin J. Makhlouf" w:date="2026-06-23T09:20:00Z" w16du:dateUtc="2026-06-23T16:20:00Z">
+      <w:ins w:id="218" w:author="Benjamin J. Makhlouf" w:date="2026-06-23T09:20:00Z" w16du:dateUtc="2026-06-23T16:20:00Z">
         <w:r>
           <w:rPr>
             <w:rFonts w:ascii="Garamond" w:hAnsi="Garamond"/>
@@ -5418,9 +5986,10 @@
         <w:rPr>
           <w:rFonts w:ascii="Garamond" w:hAnsi="Garamond"/>
         </w:rPr>
+        <w:lastRenderedPageBreak/>
         <w:t xml:space="preserve">Early returning upper Kuskokwim populations were afforded higher proportional protection through the implementation of a front-end closure management strategy (Fig. 5). On average, group one, comprised of the furthest upstream populations, received 22.6% of its total </w:t>
       </w:r>
-      <w:ins w:id="170" w:author="Benjamin J. Makhlouf" w:date="2026-07-08T14:57:00Z" w16du:dateUtc="2026-07-08T21:57:00Z">
+      <w:ins w:id="219" w:author="Benjamin J. Makhlouf" w:date="2026-07-08T14:57:00Z" w16du:dateUtc="2026-07-08T21:57:00Z">
         <w:r>
           <w:rPr>
             <w:rFonts w:ascii="Garamond" w:hAnsi="Garamond"/>
@@ -5428,7 +5997,7 @@
           <w:t xml:space="preserve">relative abundance </w:t>
         </w:r>
       </w:ins>
-      <w:del w:id="171" w:author="Benjamin J. Makhlouf" w:date="2026-07-08T14:57:00Z" w16du:dateUtc="2026-07-08T21:57:00Z">
+      <w:del w:id="220" w:author="Benjamin J. Makhlouf" w:date="2026-07-08T14:57:00Z" w16du:dateUtc="2026-07-08T21:57:00Z">
         <w:r>
           <w:rPr>
             <w:rFonts w:ascii="Garamond" w:hAnsi="Garamond"/>
@@ -5440,16 +6009,9 @@
         <w:rPr>
           <w:rFonts w:ascii="Garamond" w:hAnsi="Garamond"/>
         </w:rPr>
-        <w:t xml:space="preserve"> within the front-end closure window, followed by group two at 13.5%. In contrast, populations in </w:t>
-      </w:r>
-      <w:r>
-        <w:rPr>
-          <w:rFonts w:ascii="Garamond" w:hAnsi="Garamond"/>
-        </w:rPr>
-        <w:lastRenderedPageBreak/>
-        <w:t xml:space="preserve">further downstream areas received considerably less protection, with less than 10% protection afforded to groups three through six on average. These downstream groups also displayed a much narrower range of protection values across all years of our dataset: proportional protection ranged from 1.0%–14% for groups four through six and 1.7%–19% for group three. In contrast, upstream groups displayed a much larger range of </w:t>
-      </w:r>
-      <w:ins w:id="172" w:author="Benjamin J. Makhlouf" w:date="2026-07-08T14:58:00Z" w16du:dateUtc="2026-07-08T21:58:00Z">
+        <w:t xml:space="preserve"> within the front-end closure window, followed by group two at 13.5%. In contrast, populations in further downstream areas received considerably less protection, with less than 10% protection afforded to groups three through six on average. These downstream groups also displayed a much narrower range of protection values across all years of our dataset: proportional protection ranged from 1.0%–14% for groups four through six and 1.7%–19% for group three. In contrast, upstream groups displayed a much larger range of </w:t>
+      </w:r>
+      <w:ins w:id="221" w:author="Benjamin J. Makhlouf" w:date="2026-07-08T14:58:00Z" w16du:dateUtc="2026-07-08T21:58:00Z">
         <w:r>
           <w:rPr>
             <w:rFonts w:ascii="Garamond" w:hAnsi="Garamond"/>
@@ -5457,7 +6019,7 @@
           <w:t>relative ab</w:t>
         </w:r>
       </w:ins>
-      <w:ins w:id="173" w:author="Benjamin J. Makhlouf" w:date="2026-07-08T14:59:00Z" w16du:dateUtc="2026-07-08T21:59:00Z">
+      <w:ins w:id="222" w:author="Benjamin J. Makhlouf" w:date="2026-07-08T14:59:00Z" w16du:dateUtc="2026-07-08T21:59:00Z">
         <w:r>
           <w:rPr>
             <w:rFonts w:ascii="Garamond" w:hAnsi="Garamond"/>
@@ -5471,7 +6033,7 @@
         </w:rPr>
         <w:t>protect</w:t>
       </w:r>
-      <w:ins w:id="174" w:author="Benjamin J. Makhlouf" w:date="2026-07-08T14:59:00Z" w16du:dateUtc="2026-07-08T21:59:00Z">
+      <w:ins w:id="223" w:author="Benjamin J. Makhlouf" w:date="2026-07-08T14:59:00Z" w16du:dateUtc="2026-07-08T21:59:00Z">
         <w:r>
           <w:rPr>
             <w:rFonts w:ascii="Garamond" w:hAnsi="Garamond"/>
@@ -5479,7 +6041,7 @@
           <w:t>ed</w:t>
         </w:r>
       </w:ins>
-      <w:del w:id="175" w:author="Benjamin J. Makhlouf" w:date="2026-07-08T14:59:00Z" w16du:dateUtc="2026-07-08T21:59:00Z">
+      <w:del w:id="224" w:author="Benjamin J. Makhlouf" w:date="2026-07-08T14:59:00Z" w16du:dateUtc="2026-07-08T21:59:00Z">
         <w:r>
           <w:rPr>
             <w:rFonts w:ascii="Garamond" w:hAnsi="Garamond"/>
@@ -5500,7 +6062,7 @@
         <w:spacing w:line="480" w:lineRule="auto"/>
         <w:ind w:firstLine="720"/>
         <w:rPr>
-          <w:ins w:id="176" w:author="Benjamin J. Makhlouf" w:date="2026-07-08T15:12:00Z" w16du:dateUtc="2026-07-08T22:12:00Z"/>
+          <w:ins w:id="225" w:author="Benjamin J. Makhlouf" w:date="2026-07-08T15:12:00Z" w16du:dateUtc="2026-07-08T22:12:00Z"/>
           <w:rFonts w:ascii="Garamond" w:hAnsi="Garamond"/>
         </w:rPr>
       </w:pPr>
@@ -5510,21 +6072,21 @@
         </w:rPr>
         <w:t xml:space="preserve">Varying the duration of the front-end closure did not change the overall pattern of higher protection afforded to upstream populations. However, an earlier closure date (June 8th) markedly decreased both the median and range of protection for upstream groups; median protection for groups one and two dropped to 5.4% and 6.7%, respectively. In at least one year of our dataset, ending the front-end closure three days early resulted in &lt;1% protection for all groups, and no group received greater than 20% protection in any year. In contrast, extending the front-end closure later than the current date increased median protection across all groups. Groups one and two saw an increase of </w:t>
       </w:r>
-      <w:bookmarkStart w:id="177" w:name="_Hlk213834610"/>
+      <w:bookmarkStart w:id="226" w:name="_Hlk213834610"/>
       <w:r>
         <w:rPr>
           <w:rFonts w:ascii="Garamond" w:hAnsi="Garamond"/>
         </w:rPr>
         <w:t xml:space="preserve">17.4% and 9.1% in median protection, respectively, by extending the front-end closure three days and the same groups saw a 32.3% and 21.3% </w:t>
       </w:r>
-      <w:bookmarkEnd w:id="177"/>
+      <w:bookmarkEnd w:id="226"/>
       <w:r>
         <w:rPr>
           <w:rFonts w:ascii="Garamond" w:hAnsi="Garamond"/>
         </w:rPr>
         <w:t xml:space="preserve">increase in protection by extending the front-end closure six days past the current closure date. Importantly, the </w:t>
       </w:r>
-      <w:ins w:id="178" w:author="Benjamin J. Makhlouf" w:date="2026-06-23T09:53:00Z" w16du:dateUtc="2026-06-23T16:53:00Z">
+      <w:ins w:id="227" w:author="Benjamin J. Makhlouf" w:date="2026-06-23T09:53:00Z" w16du:dateUtc="2026-06-23T16:53:00Z">
         <w:r>
           <w:rPr>
             <w:rFonts w:ascii="Garamond" w:hAnsi="Garamond"/>
@@ -5532,7 +6094,7 @@
           <w:t xml:space="preserve">lowest proportional protection in the </w:t>
         </w:r>
       </w:ins>
-      <w:del w:id="179" w:author="Benjamin J. Makhlouf" w:date="2026-06-23T09:53:00Z" w16du:dateUtc="2026-06-23T16:53:00Z">
+      <w:del w:id="228" w:author="Benjamin J. Makhlouf" w:date="2026-06-23T09:53:00Z" w16du:dateUtc="2026-06-23T16:53:00Z">
         <w:r>
           <w:rPr>
             <w:rFonts w:ascii="Garamond" w:hAnsi="Garamond"/>
@@ -5546,19 +6108,26 @@
         </w:rPr>
         <w:t>three-day extension scenario were similar to the results of the currently implemented closure</w:t>
       </w:r>
-      <w:ins w:id="180" w:author="Benjamin J. Makhlouf" w:date="2026-07-08T15:10:00Z" w16du:dateUtc="2026-07-08T22:10:00Z">
+      <w:ins w:id="229" w:author="Benjamin J. Makhlouf" w:date="2026-07-08T15:10:00Z" w16du:dateUtc="2026-07-08T22:10:00Z">
         <w:r>
           <w:rPr>
             <w:rFonts w:ascii="Garamond" w:hAnsi="Garamond"/>
           </w:rPr>
-          <w:t xml:space="preserve">, indicating that in select years extending the front end closure by three days would not provide additional conservation benefit. </w:t>
-        </w:r>
-      </w:ins>
-      <w:del w:id="181" w:author="Benjamin J. Makhlouf" w:date="2026-07-08T15:10:00Z" w16du:dateUtc="2026-07-08T22:10:00Z">
+          <w:t xml:space="preserve">, indicating that in select years extending the front end </w:t>
+        </w:r>
         <w:r>
           <w:rPr>
             <w:rFonts w:ascii="Garamond" w:hAnsi="Garamond"/>
           </w:rPr>
+          <w:lastRenderedPageBreak/>
+          <w:t xml:space="preserve">closure by three days would not provide additional conservation benefit. </w:t>
+        </w:r>
+      </w:ins>
+      <w:del w:id="230" w:author="Benjamin J. Makhlouf" w:date="2026-07-08T15:10:00Z" w16du:dateUtc="2026-07-08T22:10:00Z">
+        <w:r>
+          <w:rPr>
+            <w:rFonts w:ascii="Garamond" w:hAnsi="Garamond"/>
+          </w:rPr>
           <w:delText xml:space="preserve">. </w:delText>
         </w:r>
       </w:del>
@@ -5592,14 +6161,7 @@
         <w:rPr>
           <w:rFonts w:ascii="Garamond" w:hAnsi="Garamond"/>
         </w:rPr>
-        <w:t xml:space="preserve">), </w:t>
-      </w:r>
-      <w:r>
-        <w:rPr>
-          <w:rFonts w:ascii="Garamond" w:hAnsi="Garamond"/>
-        </w:rPr>
-        <w:lastRenderedPageBreak/>
-        <w:t xml:space="preserve">minimum protection values increased more prominently to 21.9% and 14.9% for groups one and two. </w:t>
+        <w:t xml:space="preserve">), minimum protection values increased more prominently to 21.9% and 14.9% for groups one and two. </w:t>
       </w:r>
     </w:p>
     <w:p>
@@ -5617,7 +6179,7 @@
         </w:rPr>
         <w:t>While a longer front-end closure provides greater protection to stocks across the basin, it also increases the share of the total return that cannot be harvested. Under the current closure duration, an average of 12% of the total CPUE fell within the closure period</w:t>
       </w:r>
-      <w:ins w:id="182" w:author="Benjamin J. Makhlouf" w:date="2026-07-08T15:16:00Z" w16du:dateUtc="2026-07-08T22:16:00Z">
+      <w:ins w:id="231" w:author="Benjamin J. Makhlouf" w:date="2026-07-08T15:16:00Z" w16du:dateUtc="2026-07-08T22:16:00Z">
         <w:r>
           <w:rPr>
             <w:rFonts w:ascii="Garamond" w:hAnsi="Garamond"/>
@@ -5628,7 +6190,7 @@
           <w:rPr>
             <w:rFonts w:ascii="Garamond" w:hAnsi="Garamond"/>
             <w:highlight w:val="yellow"/>
-            <w:rPrChange w:id="183" w:author="Benjamin J. Makhlouf" w:date="2026-07-08T15:17:00Z" w16du:dateUtc="2026-07-08T22:17:00Z">
+            <w:rPrChange w:id="232" w:author="Benjamin J. Makhlouf" w:date="2026-07-08T15:17:00Z" w16du:dateUtc="2026-07-08T22:17:00Z">
               <w:rPr>
                 <w:rFonts w:ascii="Garamond" w:hAnsi="Garamond"/>
               </w:rPr>
@@ -5641,7 +6203,7 @@
         <w:rPr>
           <w:rFonts w:ascii="Garamond" w:hAnsi="Garamond"/>
           <w:highlight w:val="yellow"/>
-          <w:rPrChange w:id="184" w:author="Benjamin J. Makhlouf" w:date="2026-07-08T15:17:00Z" w16du:dateUtc="2026-07-08T22:17:00Z">
+          <w:rPrChange w:id="233" w:author="Benjamin J. Makhlouf" w:date="2026-07-08T15:17:00Z" w16du:dateUtc="2026-07-08T22:17:00Z">
             <w:rPr>
               <w:rFonts w:ascii="Garamond" w:hAnsi="Garamond"/>
             </w:rPr>
@@ -5655,7 +6217,7 @@
         </w:rPr>
         <w:t xml:space="preserve"> Shortening the closure reduces this loss to less than 5% but offers very little protection for upstream stocks (Fig. 5). Extending the closure, by contrast, substantially increases protection for </w:t>
       </w:r>
-      <w:ins w:id="185" w:author="Benjamin J. Makhlouf" w:date="2026-07-08T15:14:00Z" w16du:dateUtc="2026-07-08T22:14:00Z">
+      <w:ins w:id="234" w:author="Benjamin J. Makhlouf" w:date="2026-07-08T15:14:00Z" w16du:dateUtc="2026-07-08T22:14:00Z">
         <w:r>
           <w:rPr>
             <w:rFonts w:ascii="Garamond" w:hAnsi="Garamond"/>
@@ -5663,7 +6225,7 @@
           <w:t>upriver</w:t>
         </w:r>
       </w:ins>
-      <w:del w:id="186" w:author="Benjamin J. Makhlouf" w:date="2026-07-08T15:14:00Z" w16du:dateUtc="2026-07-08T22:14:00Z">
+      <w:del w:id="235" w:author="Benjamin J. Makhlouf" w:date="2026-07-08T15:14:00Z" w16du:dateUtc="2026-07-08T22:14:00Z">
         <w:r>
           <w:rPr>
             <w:rFonts w:ascii="Garamond" w:hAnsi="Garamond"/>
@@ -5671,7 +6233,7 @@
           <w:delText>severa</w:delText>
         </w:r>
       </w:del>
-      <w:del w:id="187" w:author="Benjamin J. Makhlouf" w:date="2026-07-08T15:13:00Z" w16du:dateUtc="2026-07-08T22:13:00Z">
+      <w:del w:id="236" w:author="Benjamin J. Makhlouf" w:date="2026-07-08T15:13:00Z" w16du:dateUtc="2026-07-08T22:13:00Z">
         <w:r>
           <w:rPr>
             <w:rFonts w:ascii="Garamond" w:hAnsi="Garamond"/>
@@ -5733,7 +6295,7 @@
         </w:rPr>
         <w:t xml:space="preserve">The results presented here illustrate the most recent and comprehensive basin-wide quantification of the spatiotemporal patterns of Chinook salmon migrating into the Kuskokwim River. Our data corroborate previously observed relationships between run timing and watershed position of spawning habitat, wherein the earliest returning fish contribute to </w:t>
       </w:r>
-      <w:ins w:id="188" w:author="Benjamin J. Makhlouf" w:date="2026-06-23T10:02:00Z" w16du:dateUtc="2026-06-23T17:02:00Z">
+      <w:ins w:id="237" w:author="Benjamin J. Makhlouf" w:date="2026-06-23T10:02:00Z" w16du:dateUtc="2026-06-23T17:02:00Z">
         <w:r>
           <w:rPr>
             <w:rFonts w:ascii="Garamond" w:hAnsi="Garamond"/>
@@ -5741,7 +6303,7 @@
           <w:t>tributaries</w:t>
         </w:r>
       </w:ins>
-      <w:del w:id="189" w:author="Benjamin J. Makhlouf" w:date="2026-06-23T10:02:00Z" w16du:dateUtc="2026-06-23T17:02:00Z">
+      <w:del w:id="238" w:author="Benjamin J. Makhlouf" w:date="2026-06-23T10:02:00Z" w16du:dateUtc="2026-06-23T17:02:00Z">
         <w:r>
           <w:rPr>
             <w:rFonts w:ascii="Garamond" w:hAnsi="Garamond"/>
@@ -5755,7 +6317,7 @@
         </w:rPr>
         <w:t>in the uppermost portions and the latest returning fish return to the furthest downstream portions of the watershed. This relationship was consistent throughout our multi-year dataset</w:t>
       </w:r>
-      <w:ins w:id="190" w:author="Benjamin J. Makhlouf" w:date="2026-07-08T15:15:00Z" w16du:dateUtc="2026-07-08T22:15:00Z">
+      <w:ins w:id="239" w:author="Benjamin J. Makhlouf" w:date="2026-07-08T15:15:00Z" w16du:dateUtc="2026-07-08T22:15:00Z">
         <w:r>
           <w:rPr>
             <w:rFonts w:ascii="Garamond" w:hAnsi="Garamond"/>
@@ -5763,7 +6325,7 @@
           <w:t xml:space="preserve"> (2017-2022)</w:t>
         </w:r>
       </w:ins>
-      <w:del w:id="191" w:author="Benjamin J. Makhlouf" w:date="2026-06-23T10:05:00Z" w16du:dateUtc="2026-06-23T17:05:00Z">
+      <w:del w:id="240" w:author="Benjamin J. Makhlouf" w:date="2026-06-23T10:05:00Z" w16du:dateUtc="2026-06-23T17:05:00Z">
         <w:r>
           <w:rPr>
             <w:rFonts w:ascii="Garamond" w:hAnsi="Garamond"/>
@@ -5777,7 +6339,7 @@
         </w:rPr>
         <w:t xml:space="preserve"> </w:t>
       </w:r>
-      <w:del w:id="192" w:author="Benjamin J. Makhlouf" w:date="2026-06-23T10:05:00Z" w16du:dateUtc="2026-06-23T17:05:00Z">
+      <w:del w:id="241" w:author="Benjamin J. Makhlouf" w:date="2026-06-23T10:05:00Z" w16du:dateUtc="2026-06-23T17:05:00Z">
         <w:r>
           <w:rPr>
             <w:rFonts w:ascii="Garamond" w:hAnsi="Garamond"/>
@@ -5804,14 +6366,15 @@
           <w:bCs w:val="0"/>
         </w:rPr>
       </w:pPr>
-      <w:commentRangeStart w:id="193"/>
-      <w:r>
-        <w:rPr>
-          <w:rFonts w:ascii="Garamond" w:hAnsi="Garamond"/>
-        </w:rPr>
+      <w:commentRangeStart w:id="242"/>
+      <w:r>
+        <w:rPr>
+          <w:rFonts w:ascii="Garamond" w:hAnsi="Garamond"/>
+        </w:rPr>
+        <w:lastRenderedPageBreak/>
         <w:t>A</w:t>
       </w:r>
-      <w:commentRangeEnd w:id="193"/>
+      <w:commentRangeEnd w:id="242"/>
       <w:r>
         <w:rPr>
           <w:rStyle w:val="CommentReference"/>
@@ -5819,7 +6382,7 @@
           <w:sz w:val="24"/>
           <w:szCs w:val="24"/>
         </w:rPr>
-        <w:commentReference w:id="193"/>
+        <w:commentReference w:id="242"/>
       </w:r>
       <w:r>
         <w:rPr>
@@ -5840,14 +6403,7 @@
         <w:rPr>
           <w:rFonts w:ascii="Garamond" w:hAnsi="Garamond"/>
         </w:rPr>
-        <w:t xml:space="preserve">in the upper watershed. Upper Kuskokwim groups contributed substantially to early-season migrants (i.e. group two); however, the furthest upstream populations (group one) consistently represented only a small portion of total basin-wide returns in our dataset. Despite this </w:t>
-      </w:r>
-      <w:r>
-        <w:rPr>
-          <w:rFonts w:ascii="Garamond" w:hAnsi="Garamond"/>
-        </w:rPr>
-        <w:lastRenderedPageBreak/>
-        <w:t xml:space="preserve">variation in abundance, individuals in both upper watershed groups returned early in the migration season. As such, the front-end closure strategy as it is currently implemented provides harvest protection to upper watershed populations regardless of their overall abundance. For relatively small stocks such as those found in group one, this strategy may be particularly important for preserving biodiversity by preventing overharvest very early in the season when they may be co-migrating with much more abundant populations such as those in group two. Protecting these populations, despite relatively low returns, </w:t>
+        <w:t xml:space="preserve">in the upper watershed. Upper Kuskokwim groups contributed substantially to early-season migrants (i.e. group two); however, the furthest upstream populations (group one) consistently represented only a small portion of total basin-wide returns in our dataset. Despite this variation in abundance, individuals in both upper watershed groups returned early in the migration season. As such, the front-end closure strategy as it is currently implemented provides harvest protection to upper watershed populations regardless of their overall abundance. For relatively small stocks such as those found in group one, this strategy may be particularly important for preserving biodiversity by preventing overharvest very early in the season when they may be co-migrating with much more abundant populations such as those in group two. Protecting these populations, despite relatively low returns, </w:t>
       </w:r>
       <w:r>
         <w:rPr>
@@ -5963,14 +6519,21 @@
         </w:rPr>
         <w:t xml:space="preserve">. However, variability in the efficacy of the front-end closure also likely reflects the interaction between run dynamics and management strategies that operate on a fixed calendar date. Because the closure is implemented on a fixed schedule, interannual variation in migration timing means that the proportion of the run occurring within the closure window </w:t>
       </w:r>
-      <w:commentRangeStart w:id="194"/>
-      <w:r>
-        <w:rPr>
-          <w:rFonts w:ascii="Garamond" w:hAnsi="Garamond"/>
-        </w:rPr>
-        <w:t>depends on both the timing (early vs. late) and duration (compressed vs. protracted) of the overall migration</w:t>
-      </w:r>
-      <w:commentRangeEnd w:id="194"/>
+      <w:commentRangeStart w:id="243"/>
+      <w:r>
+        <w:rPr>
+          <w:rFonts w:ascii="Garamond" w:hAnsi="Garamond"/>
+        </w:rPr>
+        <w:t xml:space="preserve">depends on both </w:t>
+      </w:r>
+      <w:r>
+        <w:rPr>
+          <w:rFonts w:ascii="Garamond" w:hAnsi="Garamond"/>
+        </w:rPr>
+        <w:lastRenderedPageBreak/>
+        <w:t>the timing (early vs. late) and duration (compressed vs. protracted) of the overall migration</w:t>
+      </w:r>
+      <w:commentRangeEnd w:id="243"/>
       <w:r>
         <w:rPr>
           <w:rStyle w:val="CommentReference"/>
@@ -5978,22 +6541,15 @@
           <w:sz w:val="24"/>
           <w:szCs w:val="24"/>
         </w:rPr>
-        <w:commentReference w:id="194"/>
-      </w:r>
-      <w:r>
-        <w:rPr>
-          <w:rFonts w:ascii="Garamond" w:hAnsi="Garamond"/>
-        </w:rPr>
-        <w:t xml:space="preserve">. Late return timing or extended run duration may result in less proportional contribution within the closure window as compared to earlier returning and less protracted run timing. As a result, both the amount and distribution of populations afforded protection depend on this interaction. When combined with natural variability in basin-wide production patterns, this may introduce substantial </w:t>
-      </w:r>
-      <w:r>
-        <w:rPr>
-          <w:rFonts w:ascii="Garamond" w:hAnsi="Garamond"/>
-        </w:rPr>
-        <w:lastRenderedPageBreak/>
-        <w:t xml:space="preserve">variability in the population-specific effect of the front-end closure. </w:t>
-      </w:r>
-      <w:commentRangeStart w:id="195"/>
+        <w:commentReference w:id="243"/>
+      </w:r>
+      <w:r>
+        <w:rPr>
+          <w:rFonts w:ascii="Garamond" w:hAnsi="Garamond"/>
+        </w:rPr>
+        <w:t xml:space="preserve">. Late return timing or extended run duration may result in less proportional contribution within the closure window as compared to earlier returning and less protracted run timing. As a result, both the amount and distribution of populations afforded protection depend on this interaction. When combined with natural variability in basin-wide production patterns, this may introduce substantial variability in the population-specific effect of the front-end closure. </w:t>
+      </w:r>
+      <w:commentRangeStart w:id="244"/>
       <w:r>
         <w:rPr>
           <w:rFonts w:ascii="Garamond" w:hAnsi="Garamond"/>
@@ -6040,14 +6596,14 @@
       <w:r>
         <w:t xml:space="preserve"> </w:t>
       </w:r>
-      <w:commentRangeEnd w:id="195"/>
+      <w:commentRangeEnd w:id="244"/>
       <w:r>
         <w:rPr>
           <w:rStyle w:val="CommentReference"/>
           <w:sz w:val="24"/>
           <w:szCs w:val="24"/>
         </w:rPr>
-        <w:commentReference w:id="195"/>
+        <w:commentReference w:id="244"/>
       </w:r>
     </w:p>
     <w:p>
@@ -6063,16 +6619,23 @@
         <w:rPr>
           <w:rFonts w:ascii="Garamond" w:hAnsi="Garamond"/>
         </w:rPr>
-        <w:t xml:space="preserve">Simulated changes to the front-end closure duration increased the average protection afforded to several regional groups, with a six-day extension from the current end date resulting in increased protection to regional groups one and two by 32.3% and 21.3%. However, increasing the duration of the closure did not result in high protection in all years. In both the three and six-day extension scenarios, several years of data displayed moderately low protection in years where the average run timing was relatively late, reiterating the challenge of estimating the population specific impacts even with a longer duration closure window. In addition, management decisions must consider the dual goals of maintaining both biodiversity and harvest opportunity. As currently implemented, the front-end closure on the Kuskokwim resulted in 12% of the total potential harvest falling within the closure window. Although the three-day and six-day extensions did improve both the minimum and average protection afforded to upper watershed groups, they also resulted in an additional </w:t>
-      </w:r>
-      <w:commentRangeStart w:id="196"/>
+        <w:t xml:space="preserve">Simulated changes to the front-end closure duration increased the average protection afforded to several regional groups, with a six-day extension from the current end date resulting in increased protection to regional groups one and two by 32.3% and 21.3%. However, increasing the duration of the closure did not result in high protection in all years. In both the three and six-day extension scenarios, several years of data displayed moderately low protection in years where the average run timing was relatively late, reiterating the challenge of estimating the population specific impacts even with a longer duration closure window. In addition, management decisions must consider the dual goals of maintaining both biodiversity and harvest opportunity. As currently implemented, the front-end closure on the Kuskokwim resulted in 12% of the total potential harvest falling within the closure window. Although the three-day and six-day extensions did improve both </w:t>
+      </w:r>
+      <w:r>
+        <w:rPr>
+          <w:rFonts w:ascii="Garamond" w:hAnsi="Garamond"/>
+        </w:rPr>
+        <w:lastRenderedPageBreak/>
+        <w:t xml:space="preserve">the minimum and average protection afforded to upper watershed groups, they also resulted in an additional </w:t>
+      </w:r>
+      <w:commentRangeStart w:id="245"/>
       <w:r>
         <w:rPr>
           <w:rFonts w:ascii="Garamond" w:hAnsi="Garamond"/>
         </w:rPr>
         <w:t xml:space="preserve">6% and 14% </w:t>
       </w:r>
-      <w:commentRangeEnd w:id="196"/>
+      <w:commentRangeEnd w:id="245"/>
       <w:r>
         <w:rPr>
           <w:rStyle w:val="CommentReference"/>
@@ -6080,7 +6643,7 @@
           <w:sz w:val="24"/>
           <w:szCs w:val="24"/>
         </w:rPr>
-        <w:commentReference w:id="196"/>
+        <w:commentReference w:id="245"/>
       </w:r>
       <w:r>
         <w:rPr>
@@ -6102,23 +6665,16 @@
         <w:rPr>
           <w:rFonts w:ascii="Garamond" w:hAnsi="Garamond"/>
         </w:rPr>
-        <w:t xml:space="preserve">Protecting upper Kuskokwim stocks through a front-end closure appears to be an effective strategy for maintaining biodiversity in the upper watershed while supporting basin-wide escapement goals and harvest opportunities. However, the overall effectiveness of this strategy in sustaining </w:t>
-      </w:r>
-      <w:r>
-        <w:rPr>
-          <w:rFonts w:ascii="Garamond" w:hAnsi="Garamond"/>
-        </w:rPr>
-        <w:lastRenderedPageBreak/>
-        <w:t xml:space="preserve">stock diversity and balancing conservation with harvest depends not only on the protection provided to upper-watershed stocks during the closure, but also on how the closure affects overall harvest opportunity and harvest behavior once the fishery reopens. For example, a closure which protects a large proportion of upstream stocks by prohibiting harvest on a significant portion of the run may concentrate fishing pressure on later returning stocks. As a result, this shift in the temporal distribution of fishing pressure may impact weak downstream stocks as compared to the same harvest pressure distributed across the full migration window, thereby degrading biodiversity. Further, the timing of the front-end closure coincides with the preferred and traditional timing of fishing for many communities in the lower Kuskokwim. An extended duration of this closure has the potential to further disrupt </w:t>
-      </w:r>
-      <w:commentRangeStart w:id="197"/>
+        <w:t xml:space="preserve">Protecting upper Kuskokwim stocks through a front-end closure appears to be an effective strategy for maintaining biodiversity in the upper watershed while supporting basin-wide escapement goals and harvest opportunities. However, the overall effectiveness of this strategy in sustaining stock diversity and balancing conservation with harvest depends not only on the protection provided to upper-watershed stocks during the closure, but also on how the closure affects overall harvest opportunity and harvest behavior once the fishery reopens. For example, a closure which protects a large proportion of upstream stocks by prohibiting harvest on a significant portion of the run may concentrate fishing pressure on later returning stocks. As a result, this shift in the temporal distribution of fishing pressure may impact weak downstream stocks as compared to the same harvest pressure distributed across the full migration window, thereby degrading biodiversity. Further, the timing of the front-end closure coincides with the preferred and traditional timing of fishing for many communities in the lower Kuskokwim. An extended duration of this closure has the potential to further disrupt </w:t>
+      </w:r>
+      <w:commentRangeStart w:id="246"/>
       <w:r>
         <w:rPr>
           <w:rFonts w:ascii="Garamond" w:hAnsi="Garamond"/>
         </w:rPr>
         <w:t xml:space="preserve">traditional fishing opportunities </w:t>
       </w:r>
-      <w:commentRangeEnd w:id="197"/>
+      <w:commentRangeEnd w:id="246"/>
       <w:r>
         <w:rPr>
           <w:rStyle w:val="CommentReference"/>
@@ -6126,7 +6682,7 @@
           <w:sz w:val="24"/>
           <w:szCs w:val="24"/>
         </w:rPr>
-        <w:commentReference w:id="197"/>
+        <w:commentReference w:id="246"/>
       </w:r>
       <w:r>
         <w:rPr>
@@ -6187,14 +6743,14 @@
         </w:rPr>
         <w:t xml:space="preserve">, </w:t>
       </w:r>
-      <w:commentRangeStart w:id="198"/>
+      <w:commentRangeStart w:id="247"/>
       <w:r>
         <w:rPr>
           <w:rFonts w:ascii="Garamond" w:hAnsi="Garamond"/>
         </w:rPr>
         <w:t>and our results replicate ecological patterns which have been observed in other contexts in the basin</w:t>
       </w:r>
-      <w:commentRangeEnd w:id="198"/>
+      <w:commentRangeEnd w:id="247"/>
       <w:r>
         <w:rPr>
           <w:rStyle w:val="CommentReference"/>
@@ -6202,7 +6758,7 @@
           <w:sz w:val="24"/>
           <w:szCs w:val="24"/>
         </w:rPr>
-        <w:commentReference w:id="198"/>
+        <w:commentReference w:id="247"/>
       </w:r>
       <w:r>
         <w:rPr>
@@ -6217,21 +6773,7 @@
           <w:b w:val="0"/>
           <w:bCs w:val="0"/>
         </w:rPr>
-        <w:t xml:space="preserve">tools that enable reconstruction of population specific spatiotemporal patterns in remote ecosystems allow for an explicit consideration of existing intrapopulation variability into management and conservation. </w:t>
-      </w:r>
-      <w:r>
-        <w:rPr>
-          <w:rStyle w:val="Strong"/>
-          <w:rFonts w:ascii="Garamond" w:eastAsiaTheme="majorEastAsia" w:hAnsi="Garamond"/>
-        </w:rPr>
-        <w:t xml:space="preserve"> </w:t>
-      </w:r>
-      <w:commentRangeStart w:id="199"/>
-      <w:r>
-        <w:rPr>
-          <w:rFonts w:ascii="Garamond" w:hAnsi="Garamond"/>
-        </w:rPr>
-        <w:t xml:space="preserve">The data presented here demonstrate this application for population-specific run timing of salmon in the Kuskokwim River basin; however, this principle can be applied to </w:t>
+        <w:t xml:space="preserve">tools that enable reconstruction of population </w:t>
       </w:r>
       <w:r>
         <w:rPr>
@@ -6240,7 +6782,8 @@
           <w:b w:val="0"/>
           <w:bCs w:val="0"/>
         </w:rPr>
-        <w:t>multiple dimensions of inter- and intra-species variation which contribute to system-wide biodiversity.</w:t>
+        <w:lastRenderedPageBreak/>
+        <w:t xml:space="preserve">specific spatiotemporal patterns in remote ecosystems allow for an explicit consideration of existing intrapopulation variability into management and conservation. </w:t>
       </w:r>
       <w:r>
         <w:rPr>
@@ -6249,7 +6792,30 @@
         </w:rPr>
         <w:t xml:space="preserve"> </w:t>
       </w:r>
-      <w:commentRangeEnd w:id="199"/>
+      <w:commentRangeStart w:id="248"/>
+      <w:r>
+        <w:rPr>
+          <w:rFonts w:ascii="Garamond" w:hAnsi="Garamond"/>
+        </w:rPr>
+        <w:t xml:space="preserve">The data presented here demonstrate this application for population-specific run timing of salmon in the Kuskokwim River basin; however, this principle can be applied to </w:t>
+      </w:r>
+      <w:r>
+        <w:rPr>
+          <w:rStyle w:val="Strong"/>
+          <w:rFonts w:ascii="Garamond" w:eastAsiaTheme="majorEastAsia" w:hAnsi="Garamond"/>
+          <w:b w:val="0"/>
+          <w:bCs w:val="0"/>
+        </w:rPr>
+        <w:t>multiple dimensions of inter- and intra-species variation which contribute to system-wide biodiversity.</w:t>
+      </w:r>
+      <w:r>
+        <w:rPr>
+          <w:rStyle w:val="Strong"/>
+          <w:rFonts w:ascii="Garamond" w:eastAsiaTheme="majorEastAsia" w:hAnsi="Garamond"/>
+        </w:rPr>
+        <w:t xml:space="preserve"> </w:t>
+      </w:r>
+      <w:commentRangeEnd w:id="248"/>
       <w:r>
         <w:rPr>
           <w:rStyle w:val="CommentReference"/>
@@ -6257,7 +6823,7 @@
           <w:sz w:val="24"/>
           <w:szCs w:val="24"/>
         </w:rPr>
-        <w:commentReference w:id="199"/>
+        <w:commentReference w:id="248"/>
       </w:r>
       <w:r>
         <w:rPr>
@@ -6272,14 +6838,7 @@
         <w:rPr>
           <w:rFonts w:ascii="Garamond" w:hAnsi="Garamond"/>
         </w:rPr>
-        <w:t xml:space="preserve">eveloping methods that explicitly consider this </w:t>
-      </w:r>
-      <w:r>
-        <w:rPr>
-          <w:rFonts w:ascii="Garamond" w:hAnsi="Garamond"/>
-        </w:rPr>
-        <w:lastRenderedPageBreak/>
-        <w:t>diversity and deploying them to better understand tradeoffs between conservation and exploitation strategies is an important step toward designing management frameworks that provide ecosystem services while safeguarding their reliability and the communities they support.</w:t>
+        <w:t>eveloping methods that explicitly consider this diversity and deploying them to better understand tradeoffs between conservation and exploitation strategies is an important step toward designing management frameworks that provide ecosystem services while safeguarding their reliability and the communities they support.</w:t>
       </w:r>
     </w:p>
     <w:p>
@@ -6400,6 +6959,7 @@
           <w:b/>
           <w:bCs/>
         </w:rPr>
+        <w:lastRenderedPageBreak/>
         <w:t xml:space="preserve">References </w:t>
       </w:r>
     </w:p>
@@ -6460,7 +7020,6 @@
         <w:rPr>
           <w:rFonts w:ascii="Garamond" w:hAnsi="Garamond"/>
         </w:rPr>
-        <w:lastRenderedPageBreak/>
         <w:t xml:space="preserve">Bolnick, D. I., Amarasekare, P., Araújo, M. S., Bürger, R., Levine, J. M., Novak, M., Rudolf, V. H. W., Schreiber, S. J., Urban, M. C., &amp; Vasseur, D. A. (2011). Why intraspecific trait variation matters in community ecology. </w:t>
       </w:r>
       <w:r>
@@ -6699,6 +7258,7 @@
         <w:rPr>
           <w:rFonts w:ascii="Garamond" w:hAnsi="Garamond"/>
         </w:rPr>
+        <w:lastRenderedPageBreak/>
         <w:t xml:space="preserve">Campana, S. (1999). Chemistry and composition of fish otoliths:pathways, mechanisms and applications. </w:t>
       </w:r>
       <w:r>
@@ -6734,11 +7294,11 @@
       <w:pPr>
         <w:pStyle w:val="Bibliography"/>
         <w:rPr>
-          <w:del w:id="200" w:author="Benjamin J. Makhlouf" w:date="2026-07-08T12:10:00Z" w16du:dateUtc="2026-07-08T19:10:00Z"/>
-          <w:rFonts w:ascii="Garamond" w:hAnsi="Garamond"/>
-        </w:rPr>
-      </w:pPr>
-      <w:del w:id="201" w:author="Benjamin J. Makhlouf" w:date="2026-07-08T12:10:00Z" w16du:dateUtc="2026-07-08T19:10:00Z">
+          <w:del w:id="249" w:author="Benjamin J. Makhlouf" w:date="2026-07-08T12:10:00Z" w16du:dateUtc="2026-07-08T19:10:00Z"/>
+          <w:rFonts w:ascii="Garamond" w:hAnsi="Garamond"/>
+        </w:rPr>
+      </w:pPr>
+      <w:del w:id="250" w:author="Benjamin J. Makhlouf" w:date="2026-07-08T12:10:00Z" w16du:dateUtc="2026-07-08T19:10:00Z">
         <w:r>
           <w:rPr>
             <w:rFonts w:ascii="Garamond" w:hAnsi="Garamond"/>
@@ -6786,14 +7346,7 @@
         <w:rPr>
           <w:rFonts w:ascii="Garamond" w:hAnsi="Garamond"/>
         </w:rPr>
-        <w:t xml:space="preserve">Chittaro, P., Hegg, J., Fuhrman, A., Robichaux, D., Doung, R., Beckman, B., Fisher, C., Vervoort, J., &amp; Kennedy, B. (2023). The incorporation of environmentally derived 87Sr/86Sr and Sr/Ca </w:t>
-      </w:r>
-      <w:r>
-        <w:rPr>
-          <w:rFonts w:ascii="Garamond" w:hAnsi="Garamond"/>
-        </w:rPr>
-        <w:lastRenderedPageBreak/>
-        <w:t xml:space="preserve">in early otolith formation of Chinook salmon. </w:t>
+        <w:t xml:space="preserve">Chittaro, P., Hegg, J., Fuhrman, A., Robichaux, D., Doung, R., Beckman, B., Fisher, C., Vervoort, J., &amp; Kennedy, B. (2023). The incorporation of environmentally derived 87Sr/86Sr and Sr/Ca in early otolith formation of Chinook salmon. </w:t>
       </w:r>
       <w:r>
         <w:rPr>
@@ -6997,6 +7550,7 @@
         <w:rPr>
           <w:rFonts w:ascii="Garamond" w:hAnsi="Garamond"/>
         </w:rPr>
+        <w:lastRenderedPageBreak/>
         <w:t xml:space="preserve">Donohoe, C. J., &amp; Zimmerman, C. E. (2010). A method of mounting multiple otoliths for beam-based microchemical analyses. </w:t>
       </w:r>
       <w:r>
@@ -7075,7 +7629,13 @@
           <w:i/>
           <w:iCs/>
         </w:rPr>
-        <w:t xml:space="preserve">Journal of </w:t>
+        <w:t>Journal of Geophysical Research: Biogeosciences</w:t>
+      </w:r>
+      <w:r>
+        <w:rPr>
+          <w:rFonts w:ascii="Garamond" w:hAnsi="Garamond"/>
+        </w:rPr>
+        <w:t xml:space="preserve">, </w:t>
       </w:r>
       <w:r>
         <w:rPr>
@@ -7083,14 +7643,27 @@
           <w:i/>
           <w:iCs/>
         </w:rPr>
-        <w:lastRenderedPageBreak/>
-        <w:t>Geophysical Research: Biogeosciences</w:t>
-      </w:r>
-      <w:r>
-        <w:rPr>
-          <w:rFonts w:ascii="Garamond" w:hAnsi="Garamond"/>
-        </w:rPr>
-        <w:t xml:space="preserve">, </w:t>
+        <w:t>125</w:t>
+      </w:r>
+      <w:r>
+        <w:rPr>
+          <w:rFonts w:ascii="Garamond" w:hAnsi="Garamond"/>
+        </w:rPr>
+        <w:t>(12), e2020JG005851. https://doi.org/10.1029/2020JG005851</w:t>
+      </w:r>
+    </w:p>
+    <w:p>
+      <w:pPr>
+        <w:pStyle w:val="Bibliography"/>
+        <w:rPr>
+          <w:rFonts w:ascii="Garamond" w:hAnsi="Garamond"/>
+        </w:rPr>
+      </w:pPr>
+      <w:r>
+        <w:rPr>
+          <w:rFonts w:ascii="Garamond" w:hAnsi="Garamond"/>
+        </w:rPr>
+        <w:t xml:space="preserve">Griffiths, J. R., Schindler, D. E., Armstrong, J. B., Scheuerell, M. D., Whited, D. C., Clark, R. A., Hilborn, R., Holt, C. A., Lindley, S. T., Stanford, J. A., &amp; Volk, E. C. (2014). Performance of salmon fishery portfolios across western North America. </w:t>
       </w:r>
       <w:r>
         <w:rPr>
@@ -7098,27 +7671,13 @@
           <w:i/>
           <w:iCs/>
         </w:rPr>
-        <w:t>125</w:t>
-      </w:r>
-      <w:r>
-        <w:rPr>
-          <w:rFonts w:ascii="Garamond" w:hAnsi="Garamond"/>
-        </w:rPr>
-        <w:t>(12), e2020JG005851. https://doi.org/10.1029/2020JG005851</w:t>
-      </w:r>
-    </w:p>
-    <w:p>
-      <w:pPr>
-        <w:pStyle w:val="Bibliography"/>
-        <w:rPr>
-          <w:rFonts w:ascii="Garamond" w:hAnsi="Garamond"/>
-        </w:rPr>
-      </w:pPr>
-      <w:r>
-        <w:rPr>
-          <w:rFonts w:ascii="Garamond" w:hAnsi="Garamond"/>
-        </w:rPr>
-        <w:t xml:space="preserve">Griffiths, J. R., Schindler, D. E., Armstrong, J. B., Scheuerell, M. D., Whited, D. C., Clark, R. A., Hilborn, R., Holt, C. A., Lindley, S. T., Stanford, J. A., &amp; Volk, E. C. (2014). Performance of salmon fishery portfolios across western North America. </w:t>
+        <w:t>Biological Conservation</w:t>
+      </w:r>
+      <w:r>
+        <w:rPr>
+          <w:rFonts w:ascii="Garamond" w:hAnsi="Garamond"/>
+        </w:rPr>
+        <w:t xml:space="preserve">, </w:t>
       </w:r>
       <w:r>
         <w:rPr>
@@ -7126,13 +7685,27 @@
           <w:i/>
           <w:iCs/>
         </w:rPr>
-        <w:t>Biological Conservation</w:t>
-      </w:r>
-      <w:r>
-        <w:rPr>
-          <w:rFonts w:ascii="Garamond" w:hAnsi="Garamond"/>
-        </w:rPr>
-        <w:t xml:space="preserve">, </w:t>
+        <w:t>51</w:t>
+      </w:r>
+      <w:r>
+        <w:rPr>
+          <w:rFonts w:ascii="Garamond" w:hAnsi="Garamond"/>
+        </w:rPr>
+        <w:t>(6), 1554–1563. https://doi.org/10.1111/1365-2664.12341</w:t>
+      </w:r>
+    </w:p>
+    <w:p>
+      <w:pPr>
+        <w:pStyle w:val="Bibliography"/>
+        <w:rPr>
+          <w:rFonts w:ascii="Garamond" w:hAnsi="Garamond"/>
+        </w:rPr>
+      </w:pPr>
+      <w:r>
+        <w:rPr>
+          <w:rFonts w:ascii="Garamond" w:hAnsi="Garamond"/>
+        </w:rPr>
+        <w:t xml:space="preserve">Hamazaki, T. (2008). “When people argue about fish, the fish disappear.” </w:t>
       </w:r>
       <w:r>
         <w:rPr>
@@ -7140,27 +7713,13 @@
           <w:i/>
           <w:iCs/>
         </w:rPr>
-        <w:t>51</w:t>
-      </w:r>
-      <w:r>
-        <w:rPr>
-          <w:rFonts w:ascii="Garamond" w:hAnsi="Garamond"/>
-        </w:rPr>
-        <w:t>(6), 1554–1563. https://doi.org/10.1111/1365-2664.12341</w:t>
-      </w:r>
-    </w:p>
-    <w:p>
-      <w:pPr>
-        <w:pStyle w:val="Bibliography"/>
-        <w:rPr>
-          <w:rFonts w:ascii="Garamond" w:hAnsi="Garamond"/>
-        </w:rPr>
-      </w:pPr>
-      <w:r>
-        <w:rPr>
-          <w:rFonts w:ascii="Garamond" w:hAnsi="Garamond"/>
-        </w:rPr>
-        <w:t xml:space="preserve">Hamazaki, T. (2008). “When people argue about fish, the fish disappear.” </w:t>
+        <w:t>Fisheries</w:t>
+      </w:r>
+      <w:r>
+        <w:rPr>
+          <w:rFonts w:ascii="Garamond" w:hAnsi="Garamond"/>
+        </w:rPr>
+        <w:t xml:space="preserve">, </w:t>
       </w:r>
       <w:r>
         <w:rPr>
@@ -7168,13 +7727,27 @@
           <w:i/>
           <w:iCs/>
         </w:rPr>
-        <w:t>Fisheries</w:t>
-      </w:r>
-      <w:r>
-        <w:rPr>
-          <w:rFonts w:ascii="Garamond" w:hAnsi="Garamond"/>
-        </w:rPr>
-        <w:t xml:space="preserve">, </w:t>
+        <w:t>33</w:t>
+      </w:r>
+      <w:r>
+        <w:rPr>
+          <w:rFonts w:ascii="Garamond" w:hAnsi="Garamond"/>
+        </w:rPr>
+        <w:t>(10), 495–501. https://doi.org/10.1577/1548-8446-33.10.495</w:t>
+      </w:r>
+    </w:p>
+    <w:p>
+      <w:pPr>
+        <w:pStyle w:val="Bibliography"/>
+        <w:rPr>
+          <w:rFonts w:ascii="Garamond" w:hAnsi="Garamond"/>
+        </w:rPr>
+      </w:pPr>
+      <w:r>
+        <w:rPr>
+          <w:rFonts w:ascii="Garamond" w:hAnsi="Garamond"/>
+        </w:rPr>
+        <w:t xml:space="preserve">Head, J. M., Smith, N. J., &amp; Liller, Z. W. (2017). </w:t>
       </w:r>
       <w:r>
         <w:rPr>
@@ -7182,13 +7755,13 @@
           <w:i/>
           <w:iCs/>
         </w:rPr>
-        <w:t>33</w:t>
-      </w:r>
-      <w:r>
-        <w:rPr>
-          <w:rFonts w:ascii="Garamond" w:hAnsi="Garamond"/>
-        </w:rPr>
-        <w:t>(10), 495–501. https://doi.org/10.1577/1548-8446-33.10.495</w:t>
+        <w:t>Inriver abundance of Kuskokwim River Chinook salmon, 2014.</w:t>
+      </w:r>
+      <w:r>
+        <w:rPr>
+          <w:rFonts w:ascii="Garamond" w:hAnsi="Garamond"/>
+        </w:rPr>
+        <w:t xml:space="preserve"> (Alaska Department of Fish and Game, Fishery Data Series No. 17-23, Anchorage.).</w:t>
       </w:r>
     </w:p>
     <w:p>
@@ -7202,7 +7775,7 @@
         <w:rPr>
           <w:rFonts w:ascii="Garamond" w:hAnsi="Garamond"/>
         </w:rPr>
-        <w:t xml:space="preserve">Head, J. M., Smith, N. J., &amp; Liller, Z. W. (2017). </w:t>
+        <w:t xml:space="preserve">Hilborn, R., Quinn, T. P., Schindler, D. E., &amp; Rogers, D. E. (2003). Biocomplexity and fisheries sustainability. </w:t>
       </w:r>
       <w:r>
         <w:rPr>
@@ -7210,27 +7783,13 @@
           <w:i/>
           <w:iCs/>
         </w:rPr>
-        <w:t>Inriver abundance of Kuskokwim River Chinook salmon, 2014.</w:t>
-      </w:r>
-      <w:r>
-        <w:rPr>
-          <w:rFonts w:ascii="Garamond" w:hAnsi="Garamond"/>
-        </w:rPr>
-        <w:t xml:space="preserve"> (Alaska Department of Fish and Game, Fishery Data Series No. 17-23, Anchorage.).</w:t>
-      </w:r>
-    </w:p>
-    <w:p>
-      <w:pPr>
-        <w:pStyle w:val="Bibliography"/>
-        <w:rPr>
-          <w:rFonts w:ascii="Garamond" w:hAnsi="Garamond"/>
-        </w:rPr>
-      </w:pPr>
-      <w:r>
-        <w:rPr>
-          <w:rFonts w:ascii="Garamond" w:hAnsi="Garamond"/>
-        </w:rPr>
-        <w:t xml:space="preserve">Hilborn, R., Quinn, T. P., Schindler, D. E., &amp; Rogers, D. E. (2003). Biocomplexity and fisheries sustainability. </w:t>
+        <w:t>Proceedings of the National Academy of Sciences</w:t>
+      </w:r>
+      <w:r>
+        <w:rPr>
+          <w:rFonts w:ascii="Garamond" w:hAnsi="Garamond"/>
+        </w:rPr>
+        <w:t xml:space="preserve">, </w:t>
       </w:r>
       <w:r>
         <w:rPr>
@@ -7238,13 +7797,27 @@
           <w:i/>
           <w:iCs/>
         </w:rPr>
-        <w:t>Proceedings of the National Academy of Sciences</w:t>
-      </w:r>
-      <w:r>
-        <w:rPr>
-          <w:rFonts w:ascii="Garamond" w:hAnsi="Garamond"/>
-        </w:rPr>
-        <w:t xml:space="preserve">, </w:t>
+        <w:t>100</w:t>
+      </w:r>
+      <w:r>
+        <w:rPr>
+          <w:rFonts w:ascii="Garamond" w:hAnsi="Garamond"/>
+        </w:rPr>
+        <w:t>(11), 6564–6568. https://doi.org/10.1073/pnas.1037274100</w:t>
+      </w:r>
+    </w:p>
+    <w:p>
+      <w:pPr>
+        <w:pStyle w:val="Bibliography"/>
+        <w:rPr>
+          <w:rFonts w:ascii="Garamond" w:hAnsi="Garamond"/>
+        </w:rPr>
+      </w:pPr>
+      <w:r>
+        <w:rPr>
+          <w:rFonts w:ascii="Garamond" w:hAnsi="Garamond"/>
+        </w:rPr>
+        <w:t xml:space="preserve">KRITFC. (2024). </w:t>
       </w:r>
       <w:r>
         <w:rPr>
@@ -7252,13 +7825,13 @@
           <w:i/>
           <w:iCs/>
         </w:rPr>
-        <w:t>100</w:t>
-      </w:r>
-      <w:r>
-        <w:rPr>
-          <w:rFonts w:ascii="Garamond" w:hAnsi="Garamond"/>
-        </w:rPr>
-        <w:t>(11), 6564–6568. https://doi.org/10.1073/pnas.1037274100</w:t>
+        <w:t>Kuskokwim River Salmon Situation Report</w:t>
+      </w:r>
+      <w:r>
+        <w:rPr>
+          <w:rFonts w:ascii="Garamond" w:hAnsi="Garamond"/>
+        </w:rPr>
+        <w:t>. https://static1.squarespace.com/static/5afdc3d5e74940913f78773d/t/66e4bb2dfcc5d24880434ff7/1726266166559/2023+Kusko+Situation+Report_4.19.24+final.pdf</w:t>
       </w:r>
     </w:p>
     <w:p>
@@ -7272,7 +7845,8 @@
         <w:rPr>
           <w:rFonts w:ascii="Garamond" w:hAnsi="Garamond"/>
         </w:rPr>
-        <w:t xml:space="preserve">KRITFC. (2024). </w:t>
+        <w:lastRenderedPageBreak/>
+        <w:t xml:space="preserve">Lamborn, C. C., Ohlberger, J., Walsworth, T. E., Westley, P. A. H., Cunningham, C. J., Wynsma, S., &amp; Smith, J. W. (2025a). A Synthesis of Factors Related to Trends in Abundance and Demography of Alaska Chinook Salmon (Oncorhynchus tshawytscha, Salmonidae): Implications for Research, Management, and Policy. </w:t>
       </w:r>
       <w:r>
         <w:rPr>
@@ -7280,27 +7854,13 @@
           <w:i/>
           <w:iCs/>
         </w:rPr>
-        <w:t>Kuskokwim River Salmon Situation Report</w:t>
-      </w:r>
-      <w:r>
-        <w:rPr>
-          <w:rFonts w:ascii="Garamond" w:hAnsi="Garamond"/>
-        </w:rPr>
-        <w:t>. https://static1.squarespace.com/static/5afdc3d5e74940913f78773d/t/66e4bb2dfcc5d24880434ff7/1726266166559/2023+Kusko+Situation+Report_4.19.24+final.pdf</w:t>
-      </w:r>
-    </w:p>
-    <w:p>
-      <w:pPr>
-        <w:pStyle w:val="Bibliography"/>
-        <w:rPr>
-          <w:rFonts w:ascii="Garamond" w:hAnsi="Garamond"/>
-        </w:rPr>
-      </w:pPr>
-      <w:r>
-        <w:rPr>
-          <w:rFonts w:ascii="Garamond" w:hAnsi="Garamond"/>
-        </w:rPr>
-        <w:t xml:space="preserve">Lamborn, C. C., Ohlberger, J., Walsworth, T. E., Westley, P. A. H., Cunningham, C. J., Wynsma, S., &amp; Smith, J. W. (2025a). A Synthesis of Factors Related to Trends in Abundance and Demography of Alaska Chinook Salmon (Oncorhynchus tshawytscha, Salmonidae): Implications for Research, Management, and Policy. </w:t>
+        <w:t>Fish and Fisheries</w:t>
+      </w:r>
+      <w:r>
+        <w:rPr>
+          <w:rFonts w:ascii="Garamond" w:hAnsi="Garamond"/>
+        </w:rPr>
+        <w:t xml:space="preserve">, </w:t>
       </w:r>
       <w:r>
         <w:rPr>
@@ -7308,13 +7868,27 @@
           <w:i/>
           <w:iCs/>
         </w:rPr>
-        <w:t>Fish and Fisheries</w:t>
-      </w:r>
-      <w:r>
-        <w:rPr>
-          <w:rFonts w:ascii="Garamond" w:hAnsi="Garamond"/>
-        </w:rPr>
-        <w:t xml:space="preserve">, </w:t>
+        <w:t>26</w:t>
+      </w:r>
+      <w:r>
+        <w:rPr>
+          <w:rFonts w:ascii="Garamond" w:hAnsi="Garamond"/>
+        </w:rPr>
+        <w:t>(4), 520–532. https://doi.org/10.1111/faf.12895</w:t>
+      </w:r>
+    </w:p>
+    <w:p>
+      <w:pPr>
+        <w:pStyle w:val="Bibliography"/>
+        <w:rPr>
+          <w:rFonts w:ascii="Garamond" w:hAnsi="Garamond"/>
+        </w:rPr>
+      </w:pPr>
+      <w:r>
+        <w:rPr>
+          <w:rFonts w:ascii="Garamond" w:hAnsi="Garamond"/>
+        </w:rPr>
+        <w:t xml:space="preserve">Lipka, C., &amp; Elison, T. (2015). </w:t>
       </w:r>
       <w:r>
         <w:rPr>
@@ -7322,13 +7896,13 @@
           <w:i/>
           <w:iCs/>
         </w:rPr>
-        <w:t>26</w:t>
-      </w:r>
-      <w:r>
-        <w:rPr>
-          <w:rFonts w:ascii="Garamond" w:hAnsi="Garamond"/>
-        </w:rPr>
-        <w:t>(4), 520–532. https://doi.org/10.1111/faf.12895</w:t>
+        <w:t>Characterization of the 2012 and 2013 salmon runs in the Kuskokwim River based on the test fishery at Bethel.</w:t>
+      </w:r>
+      <w:r>
+        <w:rPr>
+          <w:rFonts w:ascii="Garamond" w:hAnsi="Garamond"/>
+        </w:rPr>
+        <w:t xml:space="preserve"> (Fishery Data Series No. 16-06 Anchorage). Alaska Department of Fish and Game.</w:t>
       </w:r>
     </w:p>
     <w:p>
@@ -7342,7 +7916,7 @@
         <w:rPr>
           <w:rFonts w:ascii="Garamond" w:hAnsi="Garamond"/>
         </w:rPr>
-        <w:t xml:space="preserve">Lipka, C., &amp; Elison, T. (2015). </w:t>
+        <w:t xml:space="preserve">Luck, G., Daily, G., &amp; Ehrlich, P. (2003). Population diversity and ecosystem services. </w:t>
       </w:r>
       <w:r>
         <w:rPr>
@@ -7350,28 +7924,13 @@
           <w:i/>
           <w:iCs/>
         </w:rPr>
-        <w:t>Characterization of the 2012 and 2013 salmon runs in the Kuskokwim River based on the test fishery at Bethel.</w:t>
-      </w:r>
-      <w:r>
-        <w:rPr>
-          <w:rFonts w:ascii="Garamond" w:hAnsi="Garamond"/>
-        </w:rPr>
-        <w:t xml:space="preserve"> (Fishery Data Series No. 16-06 Anchorage). Alaska Department of Fish and Game.</w:t>
-      </w:r>
-    </w:p>
-    <w:p>
-      <w:pPr>
-        <w:pStyle w:val="Bibliography"/>
-        <w:rPr>
-          <w:rFonts w:ascii="Garamond" w:hAnsi="Garamond"/>
-        </w:rPr>
-      </w:pPr>
-      <w:r>
-        <w:rPr>
-          <w:rFonts w:ascii="Garamond" w:hAnsi="Garamond"/>
-        </w:rPr>
-        <w:lastRenderedPageBreak/>
-        <w:t xml:space="preserve">Luck, G., Daily, G., &amp; Ehrlich, P. (2003). Population diversity and ecosystem services. </w:t>
+        <w:t>Trends in Ecology &amp; Evolution</w:t>
+      </w:r>
+      <w:r>
+        <w:rPr>
+          <w:rFonts w:ascii="Garamond" w:hAnsi="Garamond"/>
+        </w:rPr>
+        <w:t xml:space="preserve">, </w:t>
       </w:r>
       <w:r>
         <w:rPr>
@@ -7379,13 +7938,27 @@
           <w:i/>
           <w:iCs/>
         </w:rPr>
-        <w:t>Trends in Ecology &amp; Evolution</w:t>
-      </w:r>
-      <w:r>
-        <w:rPr>
-          <w:rFonts w:ascii="Garamond" w:hAnsi="Garamond"/>
-        </w:rPr>
-        <w:t xml:space="preserve">, </w:t>
+        <w:t>18</w:t>
+      </w:r>
+      <w:r>
+        <w:rPr>
+          <w:rFonts w:ascii="Garamond" w:hAnsi="Garamond"/>
+        </w:rPr>
+        <w:t>, 331–336. https://doi.org/10.1016/S0169-5347(03)00100-9</w:t>
+      </w:r>
+    </w:p>
+    <w:p>
+      <w:pPr>
+        <w:pStyle w:val="Bibliography"/>
+        <w:rPr>
+          <w:rFonts w:ascii="Garamond" w:hAnsi="Garamond"/>
+        </w:rPr>
+      </w:pPr>
+      <w:r>
+        <w:rPr>
+          <w:rFonts w:ascii="Garamond" w:hAnsi="Garamond"/>
+        </w:rPr>
+        <w:t xml:space="preserve">Makhlouf, B., Cline, T. J., Fernandez, D., Seeb, L., Lee, E., Gilk-Baumer, S., Whited, D., Zimmerman, C. E., &amp; Schindler, D. E. (2025). Combining genetic and isotope frameworks improves reconstruction of fish provenance across riverscapes. </w:t>
       </w:r>
       <w:r>
         <w:rPr>
@@ -7393,27 +7966,13 @@
           <w:i/>
           <w:iCs/>
         </w:rPr>
-        <w:t>18</w:t>
-      </w:r>
-      <w:r>
-        <w:rPr>
-          <w:rFonts w:ascii="Garamond" w:hAnsi="Garamond"/>
-        </w:rPr>
-        <w:t>, 331–336. https://doi.org/10.1016/S0169-5347(03)00100-9</w:t>
-      </w:r>
-    </w:p>
-    <w:p>
-      <w:pPr>
-        <w:pStyle w:val="Bibliography"/>
-        <w:rPr>
-          <w:rFonts w:ascii="Garamond" w:hAnsi="Garamond"/>
-        </w:rPr>
-      </w:pPr>
-      <w:r>
-        <w:rPr>
-          <w:rFonts w:ascii="Garamond" w:hAnsi="Garamond"/>
-        </w:rPr>
-        <w:t xml:space="preserve">Makhlouf, B., Cline, T. J., Fernandez, D., Seeb, L., Lee, E., Gilk-Baumer, S., Whited, D., Zimmerman, C. E., &amp; Schindler, D. E. (2025). Combining genetic and isotope frameworks improves reconstruction of fish provenance across riverscapes. </w:t>
+        <w:t>Limnology and Oceanography Letters</w:t>
+      </w:r>
+      <w:r>
+        <w:rPr>
+          <w:rFonts w:ascii="Garamond" w:hAnsi="Garamond"/>
+        </w:rPr>
+        <w:t xml:space="preserve">, </w:t>
       </w:r>
       <w:r>
         <w:rPr>
@@ -7421,13 +7980,27 @@
           <w:i/>
           <w:iCs/>
         </w:rPr>
-        <w:t>Limnology and Oceanography Letters</w:t>
-      </w:r>
-      <w:r>
-        <w:rPr>
-          <w:rFonts w:ascii="Garamond" w:hAnsi="Garamond"/>
-        </w:rPr>
-        <w:t xml:space="preserve">, </w:t>
+        <w:t>n/a</w:t>
+      </w:r>
+      <w:r>
+        <w:rPr>
+          <w:rFonts w:ascii="Garamond" w:hAnsi="Garamond"/>
+        </w:rPr>
+        <w:t>(n/a). https://doi.org/10.1002/lol2.70025</w:t>
+      </w:r>
+    </w:p>
+    <w:p>
+      <w:pPr>
+        <w:pStyle w:val="Bibliography"/>
+        <w:rPr>
+          <w:rFonts w:ascii="Garamond" w:hAnsi="Garamond"/>
+        </w:rPr>
+      </w:pPr>
+      <w:r>
+        <w:rPr>
+          <w:rFonts w:ascii="Garamond" w:hAnsi="Garamond"/>
+        </w:rPr>
+        <w:t xml:space="preserve">Moore, J. W., Connors, B. M., &amp; Hodgson, E. E. (2021). Conservation risks and portfolio effects in mixed-stock fisheries. </w:t>
       </w:r>
       <w:r>
         <w:rPr>
@@ -7435,27 +8008,13 @@
           <w:i/>
           <w:iCs/>
         </w:rPr>
-        <w:t>n/a</w:t>
-      </w:r>
-      <w:r>
-        <w:rPr>
-          <w:rFonts w:ascii="Garamond" w:hAnsi="Garamond"/>
-        </w:rPr>
-        <w:t>(n/a). https://doi.org/10.1002/lol2.70025</w:t>
-      </w:r>
-    </w:p>
-    <w:p>
-      <w:pPr>
-        <w:pStyle w:val="Bibliography"/>
-        <w:rPr>
-          <w:rFonts w:ascii="Garamond" w:hAnsi="Garamond"/>
-        </w:rPr>
-      </w:pPr>
-      <w:r>
-        <w:rPr>
-          <w:rFonts w:ascii="Garamond" w:hAnsi="Garamond"/>
-        </w:rPr>
-        <w:t xml:space="preserve">Moore, J. W., Connors, B. M., &amp; Hodgson, E. E. (2021). Conservation risks and portfolio effects in mixed-stock fisheries. </w:t>
+        <w:t>Fish and Fisheries</w:t>
+      </w:r>
+      <w:r>
+        <w:rPr>
+          <w:rFonts w:ascii="Garamond" w:hAnsi="Garamond"/>
+        </w:rPr>
+        <w:t xml:space="preserve">, </w:t>
       </w:r>
       <w:r>
         <w:rPr>
@@ -7463,13 +8022,27 @@
           <w:i/>
           <w:iCs/>
         </w:rPr>
-        <w:t>Fish and Fisheries</w:t>
-      </w:r>
-      <w:r>
-        <w:rPr>
-          <w:rFonts w:ascii="Garamond" w:hAnsi="Garamond"/>
-        </w:rPr>
-        <w:t xml:space="preserve">, </w:t>
+        <w:t>22</w:t>
+      </w:r>
+      <w:r>
+        <w:rPr>
+          <w:rFonts w:ascii="Garamond" w:hAnsi="Garamond"/>
+        </w:rPr>
+        <w:t>(5), 1024–1040. https://doi.org/10.1111/faf.12567</w:t>
+      </w:r>
+    </w:p>
+    <w:p>
+      <w:pPr>
+        <w:pStyle w:val="Bibliography"/>
+        <w:rPr>
+          <w:rFonts w:ascii="Garamond" w:hAnsi="Garamond"/>
+        </w:rPr>
+      </w:pPr>
+      <w:r>
+        <w:rPr>
+          <w:rFonts w:ascii="Garamond" w:hAnsi="Garamond"/>
+        </w:rPr>
+        <w:t xml:space="preserve">Mundy, P. R. (1982). Computation of Migratory Timing Statistics for Adult Chinook Salmon in the Yukon River, Alaska, and Their Relevance to Fisheries Management. </w:t>
       </w:r>
       <w:r>
         <w:rPr>
@@ -7477,27 +8050,13 @@
           <w:i/>
           <w:iCs/>
         </w:rPr>
-        <w:t>22</w:t>
-      </w:r>
-      <w:r>
-        <w:rPr>
-          <w:rFonts w:ascii="Garamond" w:hAnsi="Garamond"/>
-        </w:rPr>
-        <w:t>(5), 1024–1040. https://doi.org/10.1111/faf.12567</w:t>
-      </w:r>
-    </w:p>
-    <w:p>
-      <w:pPr>
-        <w:pStyle w:val="Bibliography"/>
-        <w:rPr>
-          <w:rFonts w:ascii="Garamond" w:hAnsi="Garamond"/>
-        </w:rPr>
-      </w:pPr>
-      <w:r>
-        <w:rPr>
-          <w:rFonts w:ascii="Garamond" w:hAnsi="Garamond"/>
-        </w:rPr>
-        <w:t xml:space="preserve">Mundy, P. R. (1982). Computation of Migratory Timing Statistics for Adult Chinook Salmon in the Yukon River, Alaska, and Their Relevance to Fisheries Management. </w:t>
+        <w:t>North American Journal of Fisheries Management</w:t>
+      </w:r>
+      <w:r>
+        <w:rPr>
+          <w:rFonts w:ascii="Garamond" w:hAnsi="Garamond"/>
+        </w:rPr>
+        <w:t xml:space="preserve">, </w:t>
       </w:r>
       <w:r>
         <w:rPr>
@@ -7505,13 +8064,27 @@
           <w:i/>
           <w:iCs/>
         </w:rPr>
-        <w:t>North American Journal of Fisheries Management</w:t>
-      </w:r>
-      <w:r>
-        <w:rPr>
-          <w:rFonts w:ascii="Garamond" w:hAnsi="Garamond"/>
-        </w:rPr>
-        <w:t xml:space="preserve">, </w:t>
+        <w:t>2</w:t>
+      </w:r>
+      <w:r>
+        <w:rPr>
+          <w:rFonts w:ascii="Garamond" w:hAnsi="Garamond"/>
+        </w:rPr>
+        <w:t>(4), 359–370. https://doi.org/10.1577/1548-8659(1982)2%253C359:COMTSF%253E2.0.CO;2</w:t>
+      </w:r>
+    </w:p>
+    <w:p>
+      <w:pPr>
+        <w:pStyle w:val="Bibliography"/>
+        <w:rPr>
+          <w:rFonts w:ascii="Garamond" w:hAnsi="Garamond"/>
+        </w:rPr>
+      </w:pPr>
+      <w:r>
+        <w:rPr>
+          <w:rFonts w:ascii="Garamond" w:hAnsi="Garamond"/>
+        </w:rPr>
+        <w:t xml:space="preserve">Nesbitt, H. K., &amp; Moore, J. W. (2016). Species and population diversity in Pacific salmon fisheries underpin indigenous food security. </w:t>
       </w:r>
       <w:r>
         <w:rPr>
@@ -7519,27 +8092,13 @@
           <w:i/>
           <w:iCs/>
         </w:rPr>
-        <w:t>2</w:t>
-      </w:r>
-      <w:r>
-        <w:rPr>
-          <w:rFonts w:ascii="Garamond" w:hAnsi="Garamond"/>
-        </w:rPr>
-        <w:t>(4), 359–370. https://doi.org/10.1577/1548-8659(1982)2%253C359:COMTSF%253E2.0.CO;2</w:t>
-      </w:r>
-    </w:p>
-    <w:p>
-      <w:pPr>
-        <w:pStyle w:val="Bibliography"/>
-        <w:rPr>
-          <w:rFonts w:ascii="Garamond" w:hAnsi="Garamond"/>
-        </w:rPr>
-      </w:pPr>
-      <w:r>
-        <w:rPr>
-          <w:rFonts w:ascii="Garamond" w:hAnsi="Garamond"/>
-        </w:rPr>
-        <w:t xml:space="preserve">Nesbitt, H. K., &amp; Moore, J. W. (2016). Species and population diversity in Pacific salmon fisheries underpin indigenous food security. </w:t>
+        <w:t>Journal of Applied Ecology</w:t>
+      </w:r>
+      <w:r>
+        <w:rPr>
+          <w:rFonts w:ascii="Garamond" w:hAnsi="Garamond"/>
+        </w:rPr>
+        <w:t xml:space="preserve">, </w:t>
       </w:r>
       <w:r>
         <w:rPr>
@@ -7547,13 +8106,28 @@
           <w:i/>
           <w:iCs/>
         </w:rPr>
-        <w:t>Journal of Applied Ecology</w:t>
-      </w:r>
-      <w:r>
-        <w:rPr>
-          <w:rFonts w:ascii="Garamond" w:hAnsi="Garamond"/>
-        </w:rPr>
-        <w:t xml:space="preserve">, </w:t>
+        <w:t>53</w:t>
+      </w:r>
+      <w:r>
+        <w:rPr>
+          <w:rFonts w:ascii="Garamond" w:hAnsi="Garamond"/>
+        </w:rPr>
+        <w:t>(5), 1489–1499. https://doi.org/10.1111/1365-2664.12717</w:t>
+      </w:r>
+    </w:p>
+    <w:p>
+      <w:pPr>
+        <w:pStyle w:val="Bibliography"/>
+        <w:rPr>
+          <w:rFonts w:ascii="Garamond" w:hAnsi="Garamond"/>
+        </w:rPr>
+      </w:pPr>
+      <w:r>
+        <w:rPr>
+          <w:rFonts w:ascii="Garamond" w:hAnsi="Garamond"/>
+        </w:rPr>
+        <w:lastRenderedPageBreak/>
+        <w:t xml:space="preserve">Ohlberger, J., Ward, E. J., Schindler, D. E., &amp; Lewis, B. (2018). Demographic changes in Chinook salmon across the Northeast Pacific Ocean. </w:t>
       </w:r>
       <w:r>
         <w:rPr>
@@ -7561,27 +8135,13 @@
           <w:i/>
           <w:iCs/>
         </w:rPr>
-        <w:t>53</w:t>
-      </w:r>
-      <w:r>
-        <w:rPr>
-          <w:rFonts w:ascii="Garamond" w:hAnsi="Garamond"/>
-        </w:rPr>
-        <w:t>(5), 1489–1499. https://doi.org/10.1111/1365-2664.12717</w:t>
-      </w:r>
-    </w:p>
-    <w:p>
-      <w:pPr>
-        <w:pStyle w:val="Bibliography"/>
-        <w:rPr>
-          <w:rFonts w:ascii="Garamond" w:hAnsi="Garamond"/>
-        </w:rPr>
-      </w:pPr>
-      <w:r>
-        <w:rPr>
-          <w:rFonts w:ascii="Garamond" w:hAnsi="Garamond"/>
-        </w:rPr>
-        <w:t xml:space="preserve">Ohlberger, J., Ward, E. J., Schindler, D. E., &amp; Lewis, B. (2018). Demographic changes in Chinook salmon across the Northeast Pacific Ocean. </w:t>
+        <w:t>Fish and Fisheries</w:t>
+      </w:r>
+      <w:r>
+        <w:rPr>
+          <w:rFonts w:ascii="Garamond" w:hAnsi="Garamond"/>
+        </w:rPr>
+        <w:t xml:space="preserve">, </w:t>
       </w:r>
       <w:r>
         <w:rPr>
@@ -7589,13 +8149,27 @@
           <w:i/>
           <w:iCs/>
         </w:rPr>
-        <w:t>Fish and Fisheries</w:t>
-      </w:r>
-      <w:r>
-        <w:rPr>
-          <w:rFonts w:ascii="Garamond" w:hAnsi="Garamond"/>
-        </w:rPr>
-        <w:t xml:space="preserve">, </w:t>
+        <w:t>19</w:t>
+      </w:r>
+      <w:r>
+        <w:rPr>
+          <w:rFonts w:ascii="Garamond" w:hAnsi="Garamond"/>
+        </w:rPr>
+        <w:t>(3), 533–546. https://doi.org/10.1111/faf.12272</w:t>
+      </w:r>
+    </w:p>
+    <w:p>
+      <w:pPr>
+        <w:pStyle w:val="Bibliography"/>
+        <w:rPr>
+          <w:rFonts w:ascii="Garamond" w:hAnsi="Garamond"/>
+        </w:rPr>
+      </w:pPr>
+      <w:r>
+        <w:rPr>
+          <w:rFonts w:ascii="Garamond" w:hAnsi="Garamond"/>
+        </w:rPr>
+        <w:t xml:space="preserve">Quinn, T. P. (2018). </w:t>
       </w:r>
       <w:r>
         <w:rPr>
@@ -7603,13 +8177,13 @@
           <w:i/>
           <w:iCs/>
         </w:rPr>
-        <w:t>19</w:t>
-      </w:r>
-      <w:r>
-        <w:rPr>
-          <w:rFonts w:ascii="Garamond" w:hAnsi="Garamond"/>
-        </w:rPr>
-        <w:t>(3), 533–546. https://doi.org/10.1111/faf.12272</w:t>
+        <w:t>The Behavior and Ecology of Pacific Salmon and Trout</w:t>
+      </w:r>
+      <w:r>
+        <w:rPr>
+          <w:rFonts w:ascii="Garamond" w:hAnsi="Garamond"/>
+        </w:rPr>
+        <w:t>. American Fisheries Society, University of Washington Press.</w:t>
       </w:r>
     </w:p>
     <w:p>
@@ -7623,7 +8197,7 @@
         <w:rPr>
           <w:rFonts w:ascii="Garamond" w:hAnsi="Garamond"/>
         </w:rPr>
-        <w:t xml:space="preserve">Quinn, T. P. (2018). </w:t>
+        <w:t xml:space="preserve">Schindler, D. E., Armstrong, J. B., &amp; Reed, T. E. (2015). The portfolio concept in ecology and evolution. </w:t>
       </w:r>
       <w:r>
         <w:rPr>
@@ -7631,27 +8205,13 @@
           <w:i/>
           <w:iCs/>
         </w:rPr>
-        <w:t>The Behavior and Ecology of Pacific Salmon and Trout</w:t>
-      </w:r>
-      <w:r>
-        <w:rPr>
-          <w:rFonts w:ascii="Garamond" w:hAnsi="Garamond"/>
-        </w:rPr>
-        <w:t>. American Fisheries Society, University of Washington Press.</w:t>
-      </w:r>
-    </w:p>
-    <w:p>
-      <w:pPr>
-        <w:pStyle w:val="Bibliography"/>
-        <w:rPr>
-          <w:rFonts w:ascii="Garamond" w:hAnsi="Garamond"/>
-        </w:rPr>
-      </w:pPr>
-      <w:r>
-        <w:rPr>
-          <w:rFonts w:ascii="Garamond" w:hAnsi="Garamond"/>
-        </w:rPr>
-        <w:t xml:space="preserve">Schindler, D. E., Armstrong, J. B., &amp; Reed, T. E. (2015). The portfolio concept in ecology and evolution. </w:t>
+        <w:t>Frontiers in Ecology and the Environment</w:t>
+      </w:r>
+      <w:r>
+        <w:rPr>
+          <w:rFonts w:ascii="Garamond" w:hAnsi="Garamond"/>
+        </w:rPr>
+        <w:t xml:space="preserve">, </w:t>
       </w:r>
       <w:r>
         <w:rPr>
@@ -7659,20 +8219,6 @@
           <w:i/>
           <w:iCs/>
         </w:rPr>
-        <w:t>Frontiers in Ecology and the Environment</w:t>
-      </w:r>
-      <w:r>
-        <w:rPr>
-          <w:rFonts w:ascii="Garamond" w:hAnsi="Garamond"/>
-        </w:rPr>
-        <w:t xml:space="preserve">, </w:t>
-      </w:r>
-      <w:r>
-        <w:rPr>
-          <w:rFonts w:ascii="Garamond" w:hAnsi="Garamond"/>
-          <w:i/>
-          <w:iCs/>
-        </w:rPr>
         <w:t>13</w:t>
       </w:r>
       <w:r>
@@ -7694,7 +8240,6 @@
         <w:rPr>
           <w:rFonts w:ascii="Garamond" w:hAnsi="Garamond"/>
         </w:rPr>
-        <w:lastRenderedPageBreak/>
         <w:t xml:space="preserve">Schindler, D. E., Hilborn, R., Chasco, B., Boatright, C. P., Quinn, T. P., Rogers, L. A., &amp; Webster, M. S. (2010). Population diversity and the portfolio effect in an exploited species. </w:t>
       </w:r>
       <w:r>
@@ -7897,7 +8442,14 @@
         <w:rPr>
           <w:rFonts w:ascii="Garamond" w:hAnsi="Garamond"/>
         </w:rPr>
-        <w:t xml:space="preserve">Vander Zanden, H. B., Tucker, A. D., Hart, K. M., Lamont, M. M., Fujisaki, I., Addison, D. S., Mansfield, K. L., Phillips, K. F., Wunder, M. B., Bowen, G. J., Pajuelo, M., Bolten, A. B., &amp; Bjorndal, K. A. (2015). Determining origin in a migratory marine vertebrate: A novel method to integrate stable isotopes and satellite tracking. </w:t>
+        <w:t xml:space="preserve">Vander Zanden, H. B., Tucker, A. D., Hart, K. M., Lamont, M. M., Fujisaki, I., Addison, D. S., Mansfield, K. L., Phillips, K. F., Wunder, M. B., Bowen, G. J., Pajuelo, M., Bolten, A. B., &amp; </w:t>
+      </w:r>
+      <w:r>
+        <w:rPr>
+          <w:rFonts w:ascii="Garamond" w:hAnsi="Garamond"/>
+        </w:rPr>
+        <w:lastRenderedPageBreak/>
+        <w:t xml:space="preserve">Bjorndal, K. A. (2015). Determining origin in a migratory marine vertebrate: A novel method to integrate stable isotopes and satellite tracking. </w:t>
       </w:r>
       <w:r>
         <w:rPr>
@@ -7981,7 +8533,6 @@
         <w:rPr>
           <w:rFonts w:ascii="Garamond" w:hAnsi="Garamond"/>
         </w:rPr>
-        <w:lastRenderedPageBreak/>
         <w:t xml:space="preserve">Wunder, M. B. (2010). Using Isoscapes to Model Probability Surfaces for Determining Geographic Origins. In J. B. West, G. J. Bowen, T. E. Dawson, &amp; K. P. Tu (Eds.), </w:t>
       </w:r>
       <w:r>
@@ -8072,7 +8623,7 @@
 
 <file path=word/comments.xml><?xml version="1.0" encoding="utf-8"?>
 <w:comments xmlns:wpc="http://schemas.microsoft.com/office/word/2010/wordprocessingCanvas" xmlns:cx="http://schemas.microsoft.com/office/drawing/2014/chartex" xmlns:cx1="http://schemas.microsoft.com/office/drawing/2015/9/8/chartex" xmlns:cx2="http://schemas.microsoft.com/office/drawing/2015/10/21/chartex" xmlns:cx3="http://schemas.microsoft.com/office/drawing/2016/5/9/chartex" xmlns:cx4="http://schemas.microsoft.com/office/drawing/2016/5/10/chartex" xmlns:cx5="http://schemas.microsoft.com/office/drawing/2016/5/11/chartex" xmlns:cx6="http://schemas.microsoft.com/office/drawing/2016/5/12/chartex" xmlns:cx7="http://schemas.microsoft.com/office/drawing/2016/5/13/chartex" xmlns:cx8="http://schemas.microsoft.com/office/drawing/2016/5/14/chartex" xmlns:mc="http://schemas.openxmlformats.org/markup-compatibility/2006" xmlns:aink="http://schemas.microsoft.com/office/drawing/2016/ink" xmlns:am3d="http://schemas.microsoft.com/office/drawing/2017/model3d" xmlns:o="urn:schemas-microsoft-com:office:office" xmlns:oel="http://schemas.microsoft.com/office/2019/extlst" xmlns:r="http://schemas.openxmlformats.org/officeDocument/2006/relationships" xmlns:m="http://schemas.openxmlformats.org/officeDocument/2006/math" xmlns:v="urn:schemas-microsoft-com:vml" xmlns:wp14="http://schemas.microsoft.com/office/word/2010/wordprocessingDrawing" xmlns:wp="http://schemas.openxmlformats.org/drawingml/2006/wordprocessingDrawing" xmlns:w10="urn:schemas-microsoft-com:office:word" xmlns:w="http://schemas.openxmlformats.org/wordprocessingml/2006/main" xmlns:w14="http://schemas.microsoft.com/office/word/2010/wordml" xmlns:w15="http://schemas.microsoft.com/office/word/2012/wordml" xmlns:w16cex="http://schemas.microsoft.com/office/word/2018/wordml/cex" xmlns:w16cid="http://schemas.microsoft.com/office/word/2016/wordml/cid" xmlns:w16="http://schemas.microsoft.com/office/word/2018/wordml" xmlns:w16du="http://schemas.microsoft.com/office/word/2023/wordml/word16du" xmlns:w16sdtdh="http://schemas.microsoft.com/office/word/2020/wordml/sdtdatahash" xmlns:w16sdtfl="http://schemas.microsoft.com/office/word/2024/wordml/sdtformatlock" xmlns:w16se="http://schemas.microsoft.com/office/word/2015/wordml/symex" xmlns:wpg="http://schemas.microsoft.com/office/word/2010/wordprocessingGroup" xmlns:wpi="http://schemas.microsoft.com/office/word/2010/wordprocessingInk" xmlns:wne="http://schemas.microsoft.com/office/word/2006/wordml" xmlns:wps="http://schemas.microsoft.com/office/word/2010/wordprocessingShape" mc:Ignorable="w14 w15 w16se w16cid w16 w16cex w16sdtdh w16sdtfl w16du wp14">
-  <w:comment w:id="68" w:author="Benjamin J. Makhlouf" w:date="2026-06-18T14:12:00Z" w:initials="BM">
+  <w:comment w:id="69" w:author="Benjamin J. Makhlouf" w:date="2026-06-18T14:12:00Z" w:initials="BM">
     <w:p>
       <w:pPr>
         <w:pStyle w:val="CommentText"/>
@@ -8088,7 +8639,7 @@
       </w:r>
     </w:p>
   </w:comment>
-  <w:comment w:id="193" w:author="Benjamin J. Makhlouf" w:date="2026-06-23T10:24:00Z" w:initials="BM">
+  <w:comment w:id="242" w:author="Benjamin J. Makhlouf" w:date="2026-06-23T10:24:00Z" w:initials="BM">
     <w:p>
       <w:pPr>
         <w:pStyle w:val="CommentText"/>
@@ -8104,7 +8655,7 @@
       </w:r>
     </w:p>
   </w:comment>
-  <w:comment w:id="194" w:author="Benjamin J. Makhlouf" w:date="2026-07-08T11:58:00Z" w:initials="BM">
+  <w:comment w:id="243" w:author="Benjamin J. Makhlouf" w:date="2026-07-08T11:58:00Z" w:initials="BM">
     <w:p>
       <w:pPr>
         <w:pStyle w:val="CommentText"/>
@@ -8120,7 +8671,7 @@
       </w:r>
     </w:p>
   </w:comment>
-  <w:comment w:id="195" w:author="Benjamin J. Makhlouf" w:date="2026-07-08T12:46:00Z" w:initials="BM">
+  <w:comment w:id="244" w:author="Benjamin J. Makhlouf" w:date="2026-07-08T12:46:00Z" w:initials="BM">
     <w:p>
       <w:pPr>
         <w:pStyle w:val="CommentText"/>
@@ -8136,7 +8687,7 @@
       </w:r>
     </w:p>
   </w:comment>
-  <w:comment w:id="196" w:author="Benjamin J. Makhlouf" w:date="2026-07-08T15:18:00Z" w:initials="BM">
+  <w:comment w:id="245" w:author="Benjamin J. Makhlouf" w:date="2026-07-08T15:18:00Z" w:initials="BM">
     <w:p>
       <w:pPr>
         <w:pStyle w:val="CommentText"/>
@@ -8152,7 +8703,7 @@
       </w:r>
     </w:p>
   </w:comment>
-  <w:comment w:id="197" w:author="Benjamin J. Makhlouf" w:date="2026-07-08T15:19:00Z" w:initials="BM">
+  <w:comment w:id="246" w:author="Benjamin J. Makhlouf" w:date="2026-07-08T15:19:00Z" w:initials="BM">
     <w:p>
       <w:pPr>
         <w:pStyle w:val="CommentText"/>
@@ -8168,7 +8719,7 @@
       </w:r>
     </w:p>
   </w:comment>
-  <w:comment w:id="198" w:author="Benjamin J. Makhlouf" w:date="2026-07-08T12:00:00Z" w:initials="BM">
+  <w:comment w:id="247" w:author="Benjamin J. Makhlouf" w:date="2026-07-08T12:00:00Z" w:initials="BM">
     <w:p>
       <w:pPr>
         <w:pStyle w:val="CommentText"/>
@@ -8184,7 +8735,7 @@
       </w:r>
     </w:p>
   </w:comment>
-  <w:comment w:id="199" w:author="Benjamin J. Makhlouf" w:date="2026-07-08T12:39:00Z" w:initials="BM">
+  <w:comment w:id="248" w:author="Benjamin J. Makhlouf" w:date="2026-07-08T12:39:00Z" w:initials="BM">
     <w:p>
       <w:pPr>
         <w:pStyle w:val="CommentText"/>
@@ -10330,7 +10881,6 @@
   <w:style w:type="character" w:default="1" w:styleId="DefaultParagraphFont">
     <w:name w:val="Default Paragraph Font"/>
     <w:uiPriority w:val="1"/>
-    <w:semiHidden/>
     <w:unhideWhenUsed/>
   </w:style>
   <w:style w:type="table" w:default="1" w:styleId="TableNormal">

</xml_diff>